<commit_message>
Adicionamos mais conteudo ao site
</commit_message>
<xml_diff>
--- a/Apostila/Apostila Space for Men.docx
+++ b/Apostila/Apostila Space for Men.docx
@@ -146,13 +146,13 @@
               <wp:anchor distT="0" distB="0" distL="114300" distR="114300" simplePos="0" relativeHeight="251659264" behindDoc="0" locked="0" layoutInCell="1" allowOverlap="1">
                 <wp:simplePos x="0" y="0"/>
                 <wp:positionH relativeFrom="column">
-                  <wp:posOffset>1930484</wp:posOffset>
+                  <wp:posOffset>2638425</wp:posOffset>
                 </wp:positionH>
                 <wp:positionV relativeFrom="paragraph">
-                  <wp:posOffset>22776</wp:posOffset>
+                  <wp:posOffset>55880</wp:posOffset>
                 </wp:positionV>
-                <wp:extent cx="681487" cy="1319842"/>
-                <wp:effectExtent l="0" t="0" r="61595" b="52070"/>
+                <wp:extent cx="242570" cy="1143000"/>
+                <wp:effectExtent l="38100" t="0" r="24130" b="57150"/>
                 <wp:wrapNone/>
                 <wp:docPr id="2" name="Conector de Seta Reta 2"/>
                 <wp:cNvGraphicFramePr/>
@@ -161,9 +161,9 @@
                     <wps:wsp>
                       <wps:cNvCnPr/>
                       <wps:spPr>
-                        <a:xfrm>
+                        <a:xfrm flipH="1">
                           <a:off x="0" y="0"/>
-                          <a:ext cx="681487" cy="1319842"/>
+                          <a:ext cx="242570" cy="1143000"/>
                         </a:xfrm>
                         <a:prstGeom prst="straightConnector1">
                           <a:avLst/>
@@ -201,11 +201,11 @@
           </mc:Choice>
           <mc:Fallback>
             <w:pict>
-              <v:shapetype w14:anchorId="09EA8229" id="_x0000_t32" coordsize="21600,21600" o:spt="32" o:oned="t" path="m,l21600,21600e" filled="f">
+              <v:shapetype w14:anchorId="770D2714" id="_x0000_t32" coordsize="21600,21600" o:spt="32" o:oned="t" path="m,l21600,21600e" filled="f">
                 <v:path arrowok="t" fillok="f" o:connecttype="none"/>
                 <o:lock v:ext="edit" shapetype="t"/>
               </v:shapetype>
-              <v:shape id="Conector de Seta Reta 2" o:spid="_x0000_s1026" type="#_x0000_t32" style="position:absolute;margin-left:152pt;margin-top:1.8pt;width:53.65pt;height:103.9pt;z-index:251659264;visibility:visible;mso-wrap-style:square;mso-width-percent:0;mso-height-percent:0;mso-wrap-distance-left:9pt;mso-wrap-distance-top:0;mso-wrap-distance-right:9pt;mso-wrap-distance-bottom:0;mso-position-horizontal:absolute;mso-position-horizontal-relative:text;mso-position-vertical:absolute;mso-position-vertical-relative:text;mso-width-percent:0;mso-height-percent:0;mso-width-relative:margin;mso-height-relative:margin" o:gfxdata="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" strokecolor="#4472c4 [3204]" strokeweight=".5pt">
+              <v:shape id="Conector de Seta Reta 2" o:spid="_x0000_s1026" type="#_x0000_t32" style="position:absolute;margin-left:207.75pt;margin-top:4.4pt;width:19.1pt;height:90pt;flip:x;z-index:251659264;visibility:visible;mso-wrap-style:square;mso-width-percent:0;mso-height-percent:0;mso-wrap-distance-left:9pt;mso-wrap-distance-top:0;mso-wrap-distance-right:9pt;mso-wrap-distance-bottom:0;mso-position-horizontal:absolute;mso-position-horizontal-relative:text;mso-position-vertical:absolute;mso-position-vertical-relative:text;mso-width-percent:0;mso-height-percent:0;mso-width-relative:margin;mso-height-relative:margin" o:gfxdata="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" strokecolor="#4472c4 [3204]" strokeweight=".5pt">
                 <v:stroke endarrow="block" joinstyle="miter"/>
               </v:shape>
             </w:pict>
@@ -404,16 +404,25 @@
       </w:pPr>
       <w:r>
         <w:rPr>
+          <w:sz w:val="20"/>
+          <w:szCs w:val="20"/>
+        </w:rPr>
+        <w:t>2 – Criamos dois arquivos index.html e style.css para estrutura e trabalhar com nossa página web.</w:t>
+      </w:r>
+    </w:p>
+    <w:p>
+      <w:r>
+        <w:rPr>
           <w:noProof/>
         </w:rPr>
         <w:drawing>
           <wp:anchor distT="0" distB="0" distL="114300" distR="114300" simplePos="0" relativeHeight="251661312" behindDoc="0" locked="0" layoutInCell="1" allowOverlap="1" wp14:anchorId="4D1F269F">
             <wp:simplePos x="0" y="0"/>
             <wp:positionH relativeFrom="page">
-              <wp:posOffset>1051727</wp:posOffset>
+              <wp:align>left</wp:align>
             </wp:positionH>
             <wp:positionV relativeFrom="paragraph">
-              <wp:posOffset>178459</wp:posOffset>
+              <wp:posOffset>5838825</wp:posOffset>
             </wp:positionV>
             <wp:extent cx="2225040" cy="1625600"/>
             <wp:effectExtent l="0" t="0" r="3810" b="0"/>
@@ -470,20 +479,12 @@
           </wp:anchor>
         </w:drawing>
       </w:r>
-      <w:r>
-        <w:rPr>
-          <w:sz w:val="20"/>
-          <w:szCs w:val="20"/>
-        </w:rPr>
-        <w:t>2 – Criamos dois arquivos index.html e style.css para estrutura e trabalhar com nossa página web.</w:t>
-      </w:r>
     </w:p>
     <w:p/>
     <w:p/>
     <w:p/>
     <w:p/>
     <w:p/>
-    <w:p/>
     <w:p>
       <w:pPr>
         <w:rPr>
@@ -501,12 +502,12 @@
           <wp:anchor distT="0" distB="0" distL="114300" distR="114300" simplePos="0" relativeHeight="251664384" behindDoc="0" locked="0" layoutInCell="1" allowOverlap="1" wp14:anchorId="1AB68171">
             <wp:simplePos x="0" y="0"/>
             <wp:positionH relativeFrom="margin">
-              <wp:align>center</wp:align>
+              <wp:posOffset>635</wp:posOffset>
             </wp:positionH>
             <wp:positionV relativeFrom="paragraph">
-              <wp:posOffset>308914</wp:posOffset>
+              <wp:posOffset>156210</wp:posOffset>
             </wp:positionV>
-            <wp:extent cx="5400000" cy="108000"/>
+            <wp:extent cx="5399405" cy="107950"/>
             <wp:effectExtent l="0" t="0" r="0" b="6350"/>
             <wp:wrapNone/>
             <wp:docPr id="7" name="Imagem 7"/>
@@ -535,7 +536,7 @@
                   <pic:spPr>
                     <a:xfrm>
                       <a:off x="0" y="0"/>
-                      <a:ext cx="5400000" cy="108000"/>
+                      <a:ext cx="5399405" cy="107950"/>
                     </a:xfrm>
                     <a:prstGeom prst="rect">
                       <a:avLst/>
@@ -644,17 +645,9 @@
           <w:szCs w:val="18"/>
         </w:rPr>
         <w:drawing>
-          <wp:anchor distT="0" distB="0" distL="114300" distR="114300" simplePos="0" relativeHeight="251662336" behindDoc="0" locked="0" layoutInCell="1" allowOverlap="1" wp14:anchorId="6687CE0A">
-            <wp:simplePos x="0" y="0"/>
-            <wp:positionH relativeFrom="margin">
-              <wp:posOffset>-635</wp:posOffset>
-            </wp:positionH>
-            <wp:positionV relativeFrom="paragraph">
-              <wp:posOffset>29210</wp:posOffset>
-            </wp:positionV>
-            <wp:extent cx="1648800" cy="648000"/>
+          <wp:inline distT="0" distB="0" distL="0" distR="0" wp14:anchorId="6687CE0A">
+            <wp:extent cx="1648460" cy="647700"/>
             <wp:effectExtent l="0" t="0" r="8890" b="0"/>
-            <wp:wrapNone/>
             <wp:docPr id="8" name="Imagem 8"/>
             <wp:cNvGraphicFramePr>
               <a:graphicFrameLocks xmlns:a="http://schemas.openxmlformats.org/drawingml/2006/main" noChangeAspect="1"/>
@@ -681,7 +674,7 @@
                   <pic:spPr>
                     <a:xfrm>
                       <a:off x="0" y="0"/>
-                      <a:ext cx="1648800" cy="648000"/>
+                      <a:ext cx="1648460" cy="647700"/>
                     </a:xfrm>
                     <a:prstGeom prst="rect">
                       <a:avLst/>
@@ -690,13 +683,7 @@
                 </pic:pic>
               </a:graphicData>
             </a:graphic>
-            <wp14:sizeRelH relativeFrom="margin">
-              <wp14:pctWidth>0</wp14:pctWidth>
-            </wp14:sizeRelH>
-            <wp14:sizeRelV relativeFrom="margin">
-              <wp14:pctHeight>0</wp14:pctHeight>
-            </wp14:sizeRelV>
-          </wp:anchor>
+          </wp:inline>
         </w:drawing>
       </w:r>
     </w:p>
@@ -711,17 +698,24 @@
     <w:p>
       <w:pPr>
         <w:rPr>
-          <w:noProof/>
-        </w:rPr>
-      </w:pPr>
-      <w:r>
-        <w:rPr>
-          <w:sz w:val="18"/>
-          <w:szCs w:val="18"/>
-        </w:rPr>
-        <w:lastRenderedPageBreak/>
+          <w:sz w:val="18"/>
+          <w:szCs w:val="18"/>
+        </w:rPr>
+      </w:pPr>
+      <w:r>
+        <w:rPr>
+          <w:sz w:val="18"/>
+          <w:szCs w:val="18"/>
+        </w:rPr>
         <w:t>4 – Adicionamos a imagem banner ao nosso site utilizando o seguinte comando:</w:t>
       </w:r>
+    </w:p>
+    <w:p>
+      <w:pPr>
+        <w:rPr>
+          <w:noProof/>
+        </w:rPr>
+      </w:pPr>
       <w:r>
         <w:rPr>
           <w:noProof/>
@@ -780,6 +774,58 @@
       </w:pPr>
       <w:r>
         <w:rPr>
+          <w:sz w:val="18"/>
+          <w:szCs w:val="18"/>
+        </w:rPr>
+        <w:t xml:space="preserve">5 – Adicionamos </w:t>
+      </w:r>
+      <w:r>
+        <w:rPr>
+          <w:sz w:val="18"/>
+          <w:szCs w:val="18"/>
+        </w:rPr>
+        <w:t>um id</w:t>
+      </w:r>
+      <w:r>
+        <w:rPr>
+          <w:sz w:val="18"/>
+          <w:szCs w:val="18"/>
+        </w:rPr>
+        <w:t xml:space="preserve"> </w:t>
+      </w:r>
+      <w:r>
+        <w:rPr>
+          <w:sz w:val="18"/>
+          <w:szCs w:val="18"/>
+        </w:rPr>
+        <w:t xml:space="preserve">na imagem para que ela ocupe 100% de largura da nossa </w:t>
+      </w:r>
+      <w:proofErr w:type="spellStart"/>
+      <w:r>
+        <w:rPr>
+          <w:sz w:val="18"/>
+          <w:szCs w:val="18"/>
+        </w:rPr>
+        <w:t>pagina</w:t>
+      </w:r>
+      <w:proofErr w:type="spellEnd"/>
+      <w:r>
+        <w:rPr>
+          <w:sz w:val="18"/>
+          <w:szCs w:val="18"/>
+        </w:rPr>
+        <w:t>.</w:t>
+      </w:r>
+    </w:p>
+    <w:p>
+      <w:pPr>
+        <w:rPr>
+          <w:sz w:val="18"/>
+          <w:szCs w:val="18"/>
+        </w:rPr>
+      </w:pPr>
+      <w:r>
+        <w:rPr>
           <w:noProof/>
           <w:sz w:val="18"/>
           <w:szCs w:val="18"/>
@@ -791,9 +837,9 @@
               <wp:align>left</wp:align>
             </wp:positionH>
             <wp:positionV relativeFrom="paragraph">
-              <wp:posOffset>332105</wp:posOffset>
+              <wp:posOffset>9754870</wp:posOffset>
             </wp:positionV>
-            <wp:extent cx="1467055" cy="476316"/>
+            <wp:extent cx="1466850" cy="476250"/>
             <wp:effectExtent l="0" t="0" r="0" b="0"/>
             <wp:wrapSquare wrapText="bothSides"/>
             <wp:docPr id="13" name="Imagem 13"/>
@@ -834,33 +880,36 @@
           </wp:anchor>
         </w:drawing>
       </w:r>
-      <w:r>
-        <w:rPr>
-          <w:sz w:val="18"/>
-          <w:szCs w:val="18"/>
-        </w:rPr>
-        <w:t xml:space="preserve">5 – Adicionamos </w:t>
-      </w:r>
-      <w:r>
-        <w:rPr>
-          <w:sz w:val="18"/>
-          <w:szCs w:val="18"/>
-        </w:rPr>
-        <w:t>um id</w:t>
-      </w:r>
-      <w:r>
-        <w:rPr>
-          <w:sz w:val="18"/>
-          <w:szCs w:val="18"/>
-        </w:rPr>
-        <w:t xml:space="preserve"> </w:t>
-      </w:r>
-      <w:r>
-        <w:rPr>
-          <w:sz w:val="18"/>
-          <w:szCs w:val="18"/>
-        </w:rPr>
-        <w:t xml:space="preserve">na imagem para que ela ocupe 100% de largura da nossa </w:t>
+    </w:p>
+    <w:p>
+      <w:pPr>
+        <w:rPr>
+          <w:sz w:val="18"/>
+          <w:szCs w:val="18"/>
+        </w:rPr>
+      </w:pPr>
+    </w:p>
+    <w:p>
+      <w:pPr>
+        <w:rPr>
+          <w:sz w:val="18"/>
+          <w:szCs w:val="18"/>
+        </w:rPr>
+      </w:pPr>
+    </w:p>
+    <w:p>
+      <w:pPr>
+        <w:rPr>
+          <w:sz w:val="18"/>
+          <w:szCs w:val="18"/>
+        </w:rPr>
+      </w:pPr>
+      <w:r>
+        <w:rPr>
+          <w:sz w:val="18"/>
+          <w:szCs w:val="18"/>
+        </w:rPr>
+        <w:t xml:space="preserve">6 – Centralizamos o titulo principal da nossa </w:t>
       </w:r>
       <w:proofErr w:type="spellStart"/>
       <w:r>
@@ -878,67 +927,12 @@
         </w:rPr>
         <w:t>.</w:t>
       </w:r>
-      <w:r>
-        <w:rPr>
-          <w:noProof/>
-          <w:sz w:val="18"/>
-          <w:szCs w:val="18"/>
-        </w:rPr>
-        <w:drawing>
-          <wp:inline distT="0" distB="0" distL="0" distR="0" wp14:anchorId="40B9682A" wp14:editId="14B26030">
-            <wp:extent cx="3248478" cy="171474"/>
-            <wp:effectExtent l="0" t="0" r="0" b="0"/>
-            <wp:docPr id="11" name="Imagem 11"/>
-            <wp:cNvGraphicFramePr>
-              <a:graphicFrameLocks xmlns:a="http://schemas.openxmlformats.org/drawingml/2006/main" noChangeAspect="1"/>
-            </wp:cNvGraphicFramePr>
-            <a:graphic xmlns:a="http://schemas.openxmlformats.org/drawingml/2006/main">
-              <a:graphicData uri="http://schemas.openxmlformats.org/drawingml/2006/picture">
-                <pic:pic xmlns:pic="http://schemas.openxmlformats.org/drawingml/2006/picture">
-                  <pic:nvPicPr>
-                    <pic:cNvPr id="1" name=""/>
-                    <pic:cNvPicPr/>
-                  </pic:nvPicPr>
-                  <pic:blipFill>
-                    <a:blip r:embed="rId13"/>
-                    <a:stretch>
-                      <a:fillRect/>
-                    </a:stretch>
-                  </pic:blipFill>
-                  <pic:spPr>
-                    <a:xfrm>
-                      <a:off x="0" y="0"/>
-                      <a:ext cx="3248478" cy="171474"/>
-                    </a:xfrm>
-                    <a:prstGeom prst="rect">
-                      <a:avLst/>
-                    </a:prstGeom>
-                  </pic:spPr>
-                </pic:pic>
-              </a:graphicData>
-            </a:graphic>
-          </wp:inline>
-        </w:drawing>
-      </w:r>
-    </w:p>
-    <w:p>
-      <w:pPr>
-        <w:rPr>
-          <w:sz w:val="18"/>
-          <w:szCs w:val="18"/>
-        </w:rPr>
-      </w:pPr>
-    </w:p>
-    <w:p>
-      <w:pPr>
-        <w:rPr>
-          <w:sz w:val="18"/>
-          <w:szCs w:val="18"/>
-        </w:rPr>
-      </w:pPr>
-    </w:p>
-    <w:p>
-      <w:pPr>
+    </w:p>
+    <w:p>
+      <w:pPr>
+        <w:tabs>
+          <w:tab w:val="left" w:pos="1200"/>
+        </w:tabs>
         <w:rPr>
           <w:sz w:val="18"/>
           <w:szCs w:val="18"/>
@@ -957,7 +951,7 @@
               <wp:align>left</wp:align>
             </wp:positionH>
             <wp:positionV relativeFrom="paragraph">
-              <wp:posOffset>165100</wp:posOffset>
+              <wp:posOffset>10968355</wp:posOffset>
             </wp:positionV>
             <wp:extent cx="1552575" cy="495300"/>
             <wp:effectExtent l="0" t="0" r="9525" b="0"/>
@@ -974,7 +968,7 @@
                     <pic:cNvPicPr/>
                   </pic:nvPicPr>
                   <pic:blipFill>
-                    <a:blip r:embed="rId14">
+                    <a:blip r:embed="rId13">
                       <a:extLst>
                         <a:ext uri="{28A0092B-C50C-407E-A947-70E740481C1C}">
                           <a14:useLocalDpi xmlns:a14="http://schemas.microsoft.com/office/drawing/2010/main" val="0"/>
@@ -1005,7 +999,46 @@
           <w:sz w:val="18"/>
           <w:szCs w:val="18"/>
         </w:rPr>
-        <w:t xml:space="preserve">6 – Centralizamos o titulo principal da nossa </w:t>
+        <w:tab/>
+      </w:r>
+    </w:p>
+    <w:p>
+      <w:pPr>
+        <w:tabs>
+          <w:tab w:val="left" w:pos="1200"/>
+        </w:tabs>
+        <w:rPr>
+          <w:sz w:val="18"/>
+          <w:szCs w:val="18"/>
+        </w:rPr>
+      </w:pPr>
+    </w:p>
+    <w:p>
+      <w:pPr>
+        <w:tabs>
+          <w:tab w:val="left" w:pos="1200"/>
+        </w:tabs>
+        <w:rPr>
+          <w:sz w:val="18"/>
+          <w:szCs w:val="18"/>
+        </w:rPr>
+      </w:pPr>
+    </w:p>
+    <w:p>
+      <w:pPr>
+        <w:tabs>
+          <w:tab w:val="left" w:pos="1200"/>
+        </w:tabs>
+        <w:rPr>
+          <w:noProof/>
+        </w:rPr>
+      </w:pPr>
+      <w:r>
+        <w:rPr>
+          <w:sz w:val="18"/>
+          <w:szCs w:val="18"/>
+        </w:rPr>
+        <w:t xml:space="preserve">7 – No parágrafo da missão inserimos uma </w:t>
       </w:r>
       <w:proofErr w:type="spellStart"/>
       <w:r>
@@ -1013,7 +1046,7 @@
           <w:sz w:val="18"/>
           <w:szCs w:val="18"/>
         </w:rPr>
-        <w:t>pagina</w:t>
+        <w:t>class</w:t>
       </w:r>
       <w:proofErr w:type="spellEnd"/>
       <w:r>
@@ -1021,45 +1054,75 @@
           <w:sz w:val="18"/>
           <w:szCs w:val="18"/>
         </w:rPr>
-        <w:t>.</w:t>
-      </w:r>
-    </w:p>
-    <w:p>
-      <w:pPr>
-        <w:tabs>
-          <w:tab w:val="left" w:pos="1200"/>
-        </w:tabs>
-        <w:rPr>
-          <w:sz w:val="18"/>
-          <w:szCs w:val="18"/>
-        </w:rPr>
-      </w:pPr>
-      <w:r>
-        <w:rPr>
-          <w:sz w:val="18"/>
-          <w:szCs w:val="18"/>
-        </w:rPr>
-        <w:tab/>
-      </w:r>
-    </w:p>
-    <w:p>
-      <w:pPr>
-        <w:tabs>
-          <w:tab w:val="left" w:pos="1200"/>
-        </w:tabs>
-        <w:rPr>
-          <w:sz w:val="18"/>
-          <w:szCs w:val="18"/>
-        </w:rPr>
-      </w:pPr>
-    </w:p>
-    <w:p>
-      <w:pPr>
-        <w:tabs>
-          <w:tab w:val="left" w:pos="1200"/>
-        </w:tabs>
-        <w:rPr>
-          <w:noProof/>
+        <w:t xml:space="preserve"> e aumentamos o tamanho da fonte.</w:t>
+      </w:r>
+      <w:r>
+        <w:rPr>
+          <w:noProof/>
+        </w:rPr>
+        <w:t xml:space="preserve"> </w:t>
+      </w:r>
+    </w:p>
+    <w:p>
+      <w:pPr>
+        <w:tabs>
+          <w:tab w:val="left" w:pos="1200"/>
+        </w:tabs>
+        <w:rPr>
+          <w:noProof/>
+        </w:rPr>
+      </w:pPr>
+      <w:r>
+        <w:rPr>
+          <w:noProof/>
+          <w:sz w:val="18"/>
+          <w:szCs w:val="18"/>
+        </w:rPr>
+        <w:drawing>
+          <wp:inline distT="0" distB="0" distL="0" distR="0" wp14:anchorId="6B00959D" wp14:editId="1F9D93FC">
+            <wp:extent cx="5400040" cy="120015"/>
+            <wp:effectExtent l="0" t="0" r="0" b="0"/>
+            <wp:docPr id="15" name="Imagem 15"/>
+            <wp:cNvGraphicFramePr>
+              <a:graphicFrameLocks xmlns:a="http://schemas.openxmlformats.org/drawingml/2006/main" noChangeAspect="1"/>
+            </wp:cNvGraphicFramePr>
+            <a:graphic xmlns:a="http://schemas.openxmlformats.org/drawingml/2006/main">
+              <a:graphicData uri="http://schemas.openxmlformats.org/drawingml/2006/picture">
+                <pic:pic xmlns:pic="http://schemas.openxmlformats.org/drawingml/2006/picture">
+                  <pic:nvPicPr>
+                    <pic:cNvPr id="1" name=""/>
+                    <pic:cNvPicPr/>
+                  </pic:nvPicPr>
+                  <pic:blipFill>
+                    <a:blip r:embed="rId14"/>
+                    <a:stretch>
+                      <a:fillRect/>
+                    </a:stretch>
+                  </pic:blipFill>
+                  <pic:spPr>
+                    <a:xfrm>
+                      <a:off x="0" y="0"/>
+                      <a:ext cx="5400040" cy="120015"/>
+                    </a:xfrm>
+                    <a:prstGeom prst="rect">
+                      <a:avLst/>
+                    </a:prstGeom>
+                  </pic:spPr>
+                </pic:pic>
+              </a:graphicData>
+            </a:graphic>
+          </wp:inline>
+        </w:drawing>
+      </w:r>
+    </w:p>
+    <w:p>
+      <w:pPr>
+        <w:tabs>
+          <w:tab w:val="left" w:pos="1200"/>
+        </w:tabs>
+        <w:rPr>
+          <w:sz w:val="18"/>
+          <w:szCs w:val="18"/>
         </w:rPr>
       </w:pPr>
       <w:r>
@@ -1075,9 +1138,9 @@
               <wp:align>left</wp:align>
             </wp:positionH>
             <wp:positionV relativeFrom="paragraph">
-              <wp:posOffset>303530</wp:posOffset>
+              <wp:posOffset>12334240</wp:posOffset>
             </wp:positionV>
-            <wp:extent cx="1333686" cy="466790"/>
+            <wp:extent cx="1333500" cy="466725"/>
             <wp:effectExtent l="0" t="0" r="0" b="9525"/>
             <wp:wrapSquare wrapText="bothSides"/>
             <wp:docPr id="16" name="Imagem 16"/>
@@ -1118,28 +1181,40 @@
           </wp:anchor>
         </w:drawing>
       </w:r>
-      <w:r>
-        <w:rPr>
-          <w:sz w:val="18"/>
-          <w:szCs w:val="18"/>
-        </w:rPr>
-        <w:t xml:space="preserve">7 – No parágrafo da missão inserimos uma </w:t>
-      </w:r>
-      <w:proofErr w:type="spellStart"/>
-      <w:r>
-        <w:rPr>
-          <w:sz w:val="18"/>
-          <w:szCs w:val="18"/>
-        </w:rPr>
-        <w:t>class</w:t>
-      </w:r>
-      <w:proofErr w:type="spellEnd"/>
-      <w:r>
-        <w:rPr>
-          <w:sz w:val="18"/>
-          <w:szCs w:val="18"/>
-        </w:rPr>
-        <w:t xml:space="preserve"> e aumentamos o tamanho da fonte.</w:t>
+    </w:p>
+    <w:p>
+      <w:pPr>
+        <w:tabs>
+          <w:tab w:val="left" w:pos="1200"/>
+        </w:tabs>
+        <w:rPr>
+          <w:sz w:val="18"/>
+          <w:szCs w:val="18"/>
+        </w:rPr>
+      </w:pPr>
+    </w:p>
+    <w:p>
+      <w:pPr>
+        <w:tabs>
+          <w:tab w:val="left" w:pos="1200"/>
+        </w:tabs>
+        <w:rPr>
+          <w:noProof/>
+        </w:rPr>
+      </w:pPr>
+      <w:r>
+        <w:rPr>
+          <w:sz w:val="18"/>
+          <w:szCs w:val="18"/>
+        </w:rPr>
+        <w:t xml:space="preserve">8 – Adicionamos ao site um subtítulo </w:t>
+      </w:r>
+      <w:r>
+        <w:rPr>
+          <w:sz w:val="18"/>
+          <w:szCs w:val="18"/>
+        </w:rPr>
+        <w:t>h2 e criamos uma lista não ordenada.</w:t>
       </w:r>
       <w:r>
         <w:rPr>
@@ -1147,6 +1222,17 @@
         </w:rPr>
         <w:t xml:space="preserve"> </w:t>
       </w:r>
+    </w:p>
+    <w:p>
+      <w:pPr>
+        <w:tabs>
+          <w:tab w:val="left" w:pos="1200"/>
+        </w:tabs>
+        <w:rPr>
+          <w:sz w:val="18"/>
+          <w:szCs w:val="18"/>
+        </w:rPr>
+      </w:pPr>
       <w:r>
         <w:rPr>
           <w:noProof/>
@@ -1154,10 +1240,10 @@
           <w:szCs w:val="18"/>
         </w:rPr>
         <w:drawing>
-          <wp:inline distT="0" distB="0" distL="0" distR="0" wp14:anchorId="6B00959D" wp14:editId="1F9D93FC">
-            <wp:extent cx="5400040" cy="120015"/>
-            <wp:effectExtent l="0" t="0" r="0" b="0"/>
-            <wp:docPr id="15" name="Imagem 15"/>
+          <wp:inline distT="0" distB="0" distL="0" distR="0" wp14:anchorId="33FF1521" wp14:editId="5BDA718C">
+            <wp:extent cx="2467319" cy="1247949"/>
+            <wp:effectExtent l="0" t="0" r="9525" b="9525"/>
+            <wp:docPr id="17" name="Imagem 17"/>
             <wp:cNvGraphicFramePr>
               <a:graphicFrameLocks xmlns:a="http://schemas.openxmlformats.org/drawingml/2006/main" noChangeAspect="1"/>
             </wp:cNvGraphicFramePr>
@@ -1177,100 +1263,6 @@
                   <pic:spPr>
                     <a:xfrm>
                       <a:off x="0" y="0"/>
-                      <a:ext cx="5400040" cy="120015"/>
-                    </a:xfrm>
-                    <a:prstGeom prst="rect">
-                      <a:avLst/>
-                    </a:prstGeom>
-                  </pic:spPr>
-                </pic:pic>
-              </a:graphicData>
-            </a:graphic>
-          </wp:inline>
-        </w:drawing>
-      </w:r>
-    </w:p>
-    <w:p>
-      <w:pPr>
-        <w:tabs>
-          <w:tab w:val="left" w:pos="1200"/>
-        </w:tabs>
-        <w:rPr>
-          <w:sz w:val="18"/>
-          <w:szCs w:val="18"/>
-        </w:rPr>
-      </w:pPr>
-    </w:p>
-    <w:p>
-      <w:pPr>
-        <w:tabs>
-          <w:tab w:val="left" w:pos="1200"/>
-        </w:tabs>
-        <w:rPr>
-          <w:sz w:val="18"/>
-          <w:szCs w:val="18"/>
-        </w:rPr>
-      </w:pPr>
-    </w:p>
-    <w:p>
-      <w:pPr>
-        <w:tabs>
-          <w:tab w:val="left" w:pos="1200"/>
-        </w:tabs>
-        <w:rPr>
-          <w:noProof/>
-        </w:rPr>
-      </w:pPr>
-      <w:r>
-        <w:rPr>
-          <w:sz w:val="18"/>
-          <w:szCs w:val="18"/>
-        </w:rPr>
-        <w:t xml:space="preserve">8 – Adicionamos ao site um subtítulo </w:t>
-      </w:r>
-      <w:r>
-        <w:rPr>
-          <w:sz w:val="18"/>
-          <w:szCs w:val="18"/>
-        </w:rPr>
-        <w:t>h2 e criamos uma lista não ordenada.</w:t>
-      </w:r>
-      <w:r>
-        <w:rPr>
-          <w:noProof/>
-        </w:rPr>
-        <w:t xml:space="preserve"> </w:t>
-      </w:r>
-      <w:r>
-        <w:rPr>
-          <w:noProof/>
-          <w:sz w:val="18"/>
-          <w:szCs w:val="18"/>
-        </w:rPr>
-        <w:drawing>
-          <wp:inline distT="0" distB="0" distL="0" distR="0" wp14:anchorId="6BD6CE29" wp14:editId="3D52FF2C">
-            <wp:extent cx="2467319" cy="1247949"/>
-            <wp:effectExtent l="0" t="0" r="9525" b="9525"/>
-            <wp:docPr id="17" name="Imagem 17"/>
-            <wp:cNvGraphicFramePr>
-              <a:graphicFrameLocks xmlns:a="http://schemas.openxmlformats.org/drawingml/2006/main" noChangeAspect="1"/>
-            </wp:cNvGraphicFramePr>
-            <a:graphic xmlns:a="http://schemas.openxmlformats.org/drawingml/2006/main">
-              <a:graphicData uri="http://schemas.openxmlformats.org/drawingml/2006/picture">
-                <pic:pic xmlns:pic="http://schemas.openxmlformats.org/drawingml/2006/picture">
-                  <pic:nvPicPr>
-                    <pic:cNvPr id="1" name=""/>
-                    <pic:cNvPicPr/>
-                  </pic:nvPicPr>
-                  <pic:blipFill>
-                    <a:blip r:embed="rId17"/>
-                    <a:stretch>
-                      <a:fillRect/>
-                    </a:stretch>
-                  </pic:blipFill>
-                  <pic:spPr>
-                    <a:xfrm>
-                      <a:off x="0" y="0"/>
                       <a:ext cx="2467319" cy="1247949"/>
                     </a:xfrm>
                     <a:prstGeom prst="rect">
@@ -1290,7 +1282,8 @@
           <w:tab w:val="left" w:pos="1200"/>
         </w:tabs>
         <w:rPr>
-          <w:noProof/>
+          <w:sz w:val="18"/>
+          <w:szCs w:val="18"/>
         </w:rPr>
       </w:pPr>
       <w:r>
@@ -1332,6 +1325,16 @@
         </w:rPr>
         <w:t>.</w:t>
       </w:r>
+    </w:p>
+    <w:p>
+      <w:pPr>
+        <w:tabs>
+          <w:tab w:val="left" w:pos="1200"/>
+        </w:tabs>
+        <w:rPr>
+          <w:noProof/>
+        </w:rPr>
+      </w:pPr>
       <w:r>
         <w:rPr>
           <w:noProof/>
@@ -1358,7 +1361,7 @@
                     <pic:cNvPicPr/>
                   </pic:nvPicPr>
                   <pic:blipFill>
-                    <a:blip r:embed="rId18"/>
+                    <a:blip r:embed="rId17"/>
                     <a:stretch>
                       <a:fillRect/>
                     </a:stretch>
@@ -1417,7 +1420,7 @@
                     <pic:cNvPicPr/>
                   </pic:nvPicPr>
                   <pic:blipFill>
-                    <a:blip r:embed="rId19">
+                    <a:blip r:embed="rId18">
                       <a:extLst>
                         <a:ext uri="{28A0092B-C50C-407E-A947-70E740481C1C}">
                           <a14:useLocalDpi xmlns:a14="http://schemas.microsoft.com/office/drawing/2010/main" val="0"/>
@@ -1461,7 +1464,8 @@
           <w:tab w:val="left" w:pos="1200"/>
         </w:tabs>
         <w:rPr>
-          <w:noProof/>
+          <w:sz w:val="18"/>
+          <w:szCs w:val="18"/>
         </w:rPr>
       </w:pPr>
       <w:r>
@@ -1492,6 +1496,16 @@
         </w:rPr>
         <w:t>Inserimos a imagem benefícios em nosso site utilizando o seguinte código:</w:t>
       </w:r>
+    </w:p>
+    <w:p>
+      <w:pPr>
+        <w:tabs>
+          <w:tab w:val="left" w:pos="1200"/>
+        </w:tabs>
+        <w:rPr>
+          <w:noProof/>
+        </w:rPr>
+      </w:pPr>
       <w:r>
         <w:rPr>
           <w:noProof/>
@@ -1500,6 +1514,7 @@
       </w:r>
       <w:r>
         <w:rPr>
+          <w:noProof/>
           <w:sz w:val="18"/>
           <w:szCs w:val="18"/>
         </w:rPr>
@@ -1519,7 +1534,7 @@
                     <pic:cNvPicPr/>
                   </pic:nvPicPr>
                   <pic:blipFill>
-                    <a:blip r:embed="rId20"/>
+                    <a:blip r:embed="rId19"/>
                     <a:stretch>
                       <a:fillRect/>
                     </a:stretch>
@@ -1557,6 +1572,46 @@
           <w:sz w:val="18"/>
           <w:szCs w:val="18"/>
         </w:rPr>
+        <w:t xml:space="preserve">11- </w:t>
+      </w:r>
+      <w:r>
+        <w:rPr>
+          <w:noProof/>
+          <w:sz w:val="18"/>
+          <w:szCs w:val="18"/>
+        </w:rPr>
+        <w:t xml:space="preserve">Para colocar a lista ao lado da imagem alteramos a natureza da lista usando display: inline-block e para centralizar a lista no topo </w:t>
+      </w:r>
+      <w:r>
+        <w:rPr>
+          <w:noProof/>
+          <w:sz w:val="18"/>
+          <w:szCs w:val="18"/>
+        </w:rPr>
+        <w:t>utilizamos o código vertical-align: top.</w:t>
+      </w:r>
+      <w:r>
+        <w:rPr>
+          <w:noProof/>
+        </w:rPr>
+        <w:t xml:space="preserve"> </w:t>
+      </w:r>
+    </w:p>
+    <w:p>
+      <w:pPr>
+        <w:tabs>
+          <w:tab w:val="left" w:pos="1200"/>
+        </w:tabs>
+        <w:rPr>
+          <w:noProof/>
+        </w:rPr>
+      </w:pPr>
+      <w:r>
+        <w:rPr>
+          <w:noProof/>
+          <w:sz w:val="18"/>
+          <w:szCs w:val="18"/>
+        </w:rPr>
         <w:drawing>
           <wp:anchor distT="0" distB="0" distL="114300" distR="114300" simplePos="0" relativeHeight="251669504" behindDoc="0" locked="0" layoutInCell="1" allowOverlap="1" wp14:anchorId="4903E6A0">
             <wp:simplePos x="0" y="0"/>
@@ -1564,7 +1619,7 @@
               <wp:align>left</wp:align>
             </wp:positionH>
             <wp:positionV relativeFrom="paragraph">
-              <wp:posOffset>340360</wp:posOffset>
+              <wp:posOffset>17272635</wp:posOffset>
             </wp:positionV>
             <wp:extent cx="1400175" cy="488950"/>
             <wp:effectExtent l="0" t="0" r="0" b="6350"/>
@@ -1581,7 +1636,7 @@
                     <pic:cNvPicPr/>
                   </pic:nvPicPr>
                   <pic:blipFill>
-                    <a:blip r:embed="rId21">
+                    <a:blip r:embed="rId20">
                       <a:extLst>
                         <a:ext uri="{28A0092B-C50C-407E-A947-70E740481C1C}">
                           <a14:useLocalDpi xmlns:a14="http://schemas.microsoft.com/office/drawing/2010/main" val="0"/>
@@ -1613,36 +1668,6 @@
           </wp:anchor>
         </w:drawing>
       </w:r>
-      <w:r>
-        <w:rPr>
-          <w:noProof/>
-          <w:sz w:val="18"/>
-          <w:szCs w:val="18"/>
-        </w:rPr>
-        <w:t xml:space="preserve">11- </w:t>
-      </w:r>
-      <w:r>
-        <w:rPr>
-          <w:noProof/>
-          <w:sz w:val="18"/>
-          <w:szCs w:val="18"/>
-        </w:rPr>
-        <w:t xml:space="preserve">Para colocar a lista ao lado da imagem alteramos a natureza da lista usando display: inline-block e para centralizar a lista no topo </w:t>
-      </w:r>
-      <w:r>
-        <w:rPr>
-          <w:noProof/>
-          <w:sz w:val="18"/>
-          <w:szCs w:val="18"/>
-        </w:rPr>
-        <w:t>utilizamos o código vertical-align: top.</w:t>
-      </w:r>
-      <w:r>
-        <w:rPr>
-          <w:noProof/>
-        </w:rPr>
-        <w:t xml:space="preserve"> </w:t>
-      </w:r>
     </w:p>
     <w:p>
       <w:pPr>
@@ -1674,7 +1699,7 @@
               <wp:align>left</wp:align>
             </wp:positionH>
             <wp:positionV relativeFrom="paragraph">
-              <wp:posOffset>166370</wp:posOffset>
+              <wp:posOffset>17750155</wp:posOffset>
             </wp:positionV>
             <wp:extent cx="2019300" cy="1125220"/>
             <wp:effectExtent l="0" t="0" r="0" b="0"/>
@@ -1691,7 +1716,7 @@
                     <pic:cNvPicPr/>
                   </pic:nvPicPr>
                   <pic:blipFill>
-                    <a:blip r:embed="rId22" cstate="print">
+                    <a:blip r:embed="rId21" cstate="print">
                       <a:extLst>
                         <a:ext uri="{28A0092B-C50C-407E-A947-70E740481C1C}">
                           <a14:useLocalDpi xmlns:a14="http://schemas.microsoft.com/office/drawing/2010/main" val="0"/>
@@ -1761,16 +1786,8 @@
         </w:tabs>
         <w:rPr>
           <w:noProof/>
-        </w:rPr>
-      </w:pPr>
-    </w:p>
-    <w:p>
-      <w:pPr>
-        <w:tabs>
-          <w:tab w:val="left" w:pos="1200"/>
-        </w:tabs>
-        <w:rPr>
-          <w:noProof/>
+          <w:sz w:val="18"/>
+          <w:szCs w:val="18"/>
         </w:rPr>
       </w:pPr>
       <w:r>
@@ -1789,6 +1806,16 @@
         </w:rPr>
         <w:t>15% do lado direito conforme a imagem do código.</w:t>
       </w:r>
+    </w:p>
+    <w:p>
+      <w:pPr>
+        <w:tabs>
+          <w:tab w:val="left" w:pos="1200"/>
+        </w:tabs>
+        <w:rPr>
+          <w:noProof/>
+        </w:rPr>
+      </w:pPr>
       <w:r>
         <w:rPr>
           <w:noProof/>
@@ -1806,6 +1833,84 @@
             <wp:extent cx="1810003" cy="933580"/>
             <wp:effectExtent l="0" t="0" r="0" b="0"/>
             <wp:docPr id="21" name="Imagem 21"/>
+            <wp:cNvGraphicFramePr>
+              <a:graphicFrameLocks xmlns:a="http://schemas.openxmlformats.org/drawingml/2006/main" noChangeAspect="1"/>
+            </wp:cNvGraphicFramePr>
+            <a:graphic xmlns:a="http://schemas.openxmlformats.org/drawingml/2006/main">
+              <a:graphicData uri="http://schemas.openxmlformats.org/drawingml/2006/picture">
+                <pic:pic xmlns:pic="http://schemas.openxmlformats.org/drawingml/2006/picture">
+                  <pic:nvPicPr>
+                    <pic:cNvPr id="1" name=""/>
+                    <pic:cNvPicPr/>
+                  </pic:nvPicPr>
+                  <pic:blipFill>
+                    <a:blip r:embed="rId22"/>
+                    <a:stretch>
+                      <a:fillRect/>
+                    </a:stretch>
+                  </pic:blipFill>
+                  <pic:spPr>
+                    <a:xfrm>
+                      <a:off x="0" y="0"/>
+                      <a:ext cx="1810003" cy="933580"/>
+                    </a:xfrm>
+                    <a:prstGeom prst="rect">
+                      <a:avLst/>
+                    </a:prstGeom>
+                  </pic:spPr>
+                </pic:pic>
+              </a:graphicData>
+            </a:graphic>
+          </wp:inline>
+        </w:drawing>
+      </w:r>
+    </w:p>
+    <w:p>
+      <w:pPr>
+        <w:tabs>
+          <w:tab w:val="left" w:pos="1200"/>
+        </w:tabs>
+        <w:rPr>
+          <w:noProof/>
+          <w:sz w:val="18"/>
+          <w:szCs w:val="18"/>
+        </w:rPr>
+      </w:pPr>
+      <w:r>
+        <w:rPr>
+          <w:noProof/>
+          <w:sz w:val="18"/>
+          <w:szCs w:val="18"/>
+        </w:rPr>
+        <w:t>13- Em nosso site criamos duas divs uma para parte principal e a outra para parte dos beneficios.</w:t>
+      </w:r>
+    </w:p>
+    <w:p>
+      <w:pPr>
+        <w:tabs>
+          <w:tab w:val="left" w:pos="1200"/>
+        </w:tabs>
+        <w:rPr>
+          <w:noProof/>
+        </w:rPr>
+      </w:pPr>
+      <w:r>
+        <w:rPr>
+          <w:noProof/>
+        </w:rPr>
+        <w:t xml:space="preserve"> </w:t>
+      </w:r>
+      <w:r>
+        <w:rPr>
+          <w:noProof/>
+          <w:sz w:val="18"/>
+          <w:szCs w:val="18"/>
+        </w:rPr>
+        <w:drawing>
+          <wp:inline distT="0" distB="0" distL="0" distR="0" wp14:anchorId="1FA8DF3D" wp14:editId="5283689B">
+            <wp:extent cx="5400040" cy="1984375"/>
+            <wp:effectExtent l="0" t="0" r="0" b="0"/>
+            <wp:docPr id="22" name="Imagem 22"/>
             <wp:cNvGraphicFramePr>
               <a:graphicFrameLocks xmlns:a="http://schemas.openxmlformats.org/drawingml/2006/main" noChangeAspect="1"/>
             </wp:cNvGraphicFramePr>
@@ -1825,72 +1930,6 @@
                   <pic:spPr>
                     <a:xfrm>
                       <a:off x="0" y="0"/>
-                      <a:ext cx="1810003" cy="933580"/>
-                    </a:xfrm>
-                    <a:prstGeom prst="rect">
-                      <a:avLst/>
-                    </a:prstGeom>
-                  </pic:spPr>
-                </pic:pic>
-              </a:graphicData>
-            </a:graphic>
-          </wp:inline>
-        </w:drawing>
-      </w:r>
-    </w:p>
-    <w:p>
-      <w:pPr>
-        <w:tabs>
-          <w:tab w:val="left" w:pos="1200"/>
-        </w:tabs>
-        <w:rPr>
-          <w:noProof/>
-        </w:rPr>
-      </w:pPr>
-      <w:r>
-        <w:rPr>
-          <w:noProof/>
-          <w:sz w:val="18"/>
-          <w:szCs w:val="18"/>
-        </w:rPr>
-        <w:t>13- Em nosso site criamos duas divs uma para parte principal e a outra para parte dos beneficios.</w:t>
-      </w:r>
-      <w:r>
-        <w:rPr>
-          <w:noProof/>
-        </w:rPr>
-        <w:t xml:space="preserve"> </w:t>
-      </w:r>
-      <w:r>
-        <w:rPr>
-          <w:noProof/>
-          <w:sz w:val="18"/>
-          <w:szCs w:val="18"/>
-        </w:rPr>
-        <w:drawing>
-          <wp:inline distT="0" distB="0" distL="0" distR="0" wp14:anchorId="1FA8DF3D" wp14:editId="5283689B">
-            <wp:extent cx="5400040" cy="1984375"/>
-            <wp:effectExtent l="0" t="0" r="0" b="0"/>
-            <wp:docPr id="22" name="Imagem 22"/>
-            <wp:cNvGraphicFramePr>
-              <a:graphicFrameLocks xmlns:a="http://schemas.openxmlformats.org/drawingml/2006/main" noChangeAspect="1"/>
-            </wp:cNvGraphicFramePr>
-            <a:graphic xmlns:a="http://schemas.openxmlformats.org/drawingml/2006/main">
-              <a:graphicData uri="http://schemas.openxmlformats.org/drawingml/2006/picture">
-                <pic:pic xmlns:pic="http://schemas.openxmlformats.org/drawingml/2006/picture">
-                  <pic:nvPicPr>
-                    <pic:cNvPr id="1" name=""/>
-                    <pic:cNvPicPr/>
-                  </pic:nvPicPr>
-                  <pic:blipFill>
-                    <a:blip r:embed="rId24"/>
-                    <a:stretch>
-                      <a:fillRect/>
-                    </a:stretch>
-                  </pic:blipFill>
-                  <pic:spPr>
-                    <a:xfrm>
-                      <a:off x="0" y="0"/>
                       <a:ext cx="5400040" cy="1984375"/>
                     </a:xfrm>
                     <a:prstGeom prst="rect">
@@ -1919,6 +1958,46 @@
           <w:sz w:val="18"/>
           <w:szCs w:val="18"/>
         </w:rPr>
+        <w:t xml:space="preserve">14- </w:t>
+      </w:r>
+      <w:r>
+        <w:rPr>
+          <w:noProof/>
+          <w:sz w:val="18"/>
+          <w:szCs w:val="18"/>
+        </w:rPr>
+        <w:t>N</w:t>
+      </w:r>
+      <w:r>
+        <w:rPr>
+          <w:noProof/>
+          <w:sz w:val="18"/>
+          <w:szCs w:val="18"/>
+        </w:rPr>
+        <w:t>a div principal colocamos um espaço interno para todos os lados e colocamos e deixamos uma cor de fundo conforme imagem do código abaixo.</w:t>
+      </w:r>
+      <w:r>
+        <w:rPr>
+          <w:noProof/>
+        </w:rPr>
+        <w:t xml:space="preserve"> </w:t>
+      </w:r>
+    </w:p>
+    <w:p>
+      <w:pPr>
+        <w:tabs>
+          <w:tab w:val="left" w:pos="1200"/>
+        </w:tabs>
+        <w:rPr>
+          <w:noProof/>
+        </w:rPr>
+      </w:pPr>
+      <w:r>
+        <w:rPr>
+          <w:noProof/>
+          <w:sz w:val="18"/>
+          <w:szCs w:val="18"/>
+        </w:rPr>
         <w:drawing>
           <wp:anchor distT="0" distB="0" distL="114300" distR="114300" simplePos="0" relativeHeight="251671552" behindDoc="0" locked="0" layoutInCell="1" allowOverlap="1" wp14:anchorId="4567D994">
             <wp:simplePos x="0" y="0"/>
@@ -1926,9 +2005,9 @@
               <wp:align>left</wp:align>
             </wp:positionH>
             <wp:positionV relativeFrom="paragraph">
-              <wp:posOffset>334645</wp:posOffset>
+              <wp:posOffset>23065740</wp:posOffset>
             </wp:positionV>
-            <wp:extent cx="1875600" cy="572400"/>
+            <wp:extent cx="1875155" cy="572135"/>
             <wp:effectExtent l="0" t="0" r="0" b="0"/>
             <wp:wrapSquare wrapText="bothSides"/>
             <wp:docPr id="23" name="Imagem 23"/>
@@ -1943,7 +2022,7 @@
                     <pic:cNvPicPr/>
                   </pic:nvPicPr>
                   <pic:blipFill>
-                    <a:blip r:embed="rId25">
+                    <a:blip r:embed="rId24">
                       <a:extLst>
                         <a:ext uri="{28A0092B-C50C-407E-A947-70E740481C1C}">
                           <a14:useLocalDpi xmlns:a14="http://schemas.microsoft.com/office/drawing/2010/main" val="0"/>
@@ -1975,13 +2054,45 @@
           </wp:anchor>
         </w:drawing>
       </w:r>
-      <w:r>
-        <w:rPr>
-          <w:noProof/>
-          <w:sz w:val="18"/>
-          <w:szCs w:val="18"/>
-        </w:rPr>
-        <w:t xml:space="preserve">14- </w:t>
+    </w:p>
+    <w:p>
+      <w:pPr>
+        <w:tabs>
+          <w:tab w:val="left" w:pos="1200"/>
+        </w:tabs>
+        <w:rPr>
+          <w:noProof/>
+        </w:rPr>
+      </w:pPr>
+    </w:p>
+    <w:p>
+      <w:pPr>
+        <w:tabs>
+          <w:tab w:val="left" w:pos="1200"/>
+        </w:tabs>
+        <w:rPr>
+          <w:noProof/>
+        </w:rPr>
+      </w:pPr>
+    </w:p>
+    <w:p>
+      <w:pPr>
+        <w:tabs>
+          <w:tab w:val="left" w:pos="1200"/>
+        </w:tabs>
+        <w:rPr>
+          <w:noProof/>
+          <w:sz w:val="18"/>
+          <w:szCs w:val="18"/>
+        </w:rPr>
+      </w:pPr>
+      <w:r>
+        <w:rPr>
+          <w:noProof/>
+          <w:sz w:val="18"/>
+          <w:szCs w:val="18"/>
+        </w:rPr>
+        <w:t xml:space="preserve">15- </w:t>
       </w:r>
       <w:r>
         <w:rPr>
@@ -1997,34 +2108,8 @@
           <w:sz w:val="18"/>
           <w:szCs w:val="18"/>
         </w:rPr>
-        <w:t>a div principal colocamos um espaço interno para todos os lados e colocamos e deixamos uma cor de fundo conforme imagem do código abaixo.</w:t>
-      </w:r>
-      <w:r>
-        <w:rPr>
-          <w:noProof/>
-        </w:rPr>
-        <w:t xml:space="preserve"> </w:t>
-      </w:r>
-    </w:p>
-    <w:p>
-      <w:pPr>
-        <w:tabs>
-          <w:tab w:val="left" w:pos="1200"/>
-        </w:tabs>
-        <w:rPr>
-          <w:noProof/>
-        </w:rPr>
-      </w:pPr>
-    </w:p>
-    <w:p>
-      <w:pPr>
-        <w:tabs>
-          <w:tab w:val="left" w:pos="1200"/>
-        </w:tabs>
-        <w:rPr>
-          <w:noProof/>
-        </w:rPr>
-      </w:pPr>
+        <w:t xml:space="preserve">a div beneficios colocamos o espaço interno de 20px </w:t>
+      </w:r>
     </w:p>
     <w:p>
       <w:pPr>
@@ -2050,12 +2135,144 @@
               <wp:align>left</wp:align>
             </wp:positionH>
             <wp:positionV relativeFrom="paragraph">
-              <wp:posOffset>236855</wp:posOffset>
+              <wp:posOffset>24230330</wp:posOffset>
             </wp:positionV>
             <wp:extent cx="1076325" cy="495300"/>
             <wp:effectExtent l="0" t="0" r="9525" b="0"/>
             <wp:wrapSquare wrapText="bothSides"/>
             <wp:docPr id="24" name="Imagem 24"/>
+            <wp:cNvGraphicFramePr>
+              <a:graphicFrameLocks xmlns:a="http://schemas.openxmlformats.org/drawingml/2006/main" noChangeAspect="1"/>
+            </wp:cNvGraphicFramePr>
+            <a:graphic xmlns:a="http://schemas.openxmlformats.org/drawingml/2006/main">
+              <a:graphicData uri="http://schemas.openxmlformats.org/drawingml/2006/picture">
+                <pic:pic xmlns:pic="http://schemas.openxmlformats.org/drawingml/2006/picture">
+                  <pic:nvPicPr>
+                    <pic:cNvPr id="1" name=""/>
+                    <pic:cNvPicPr/>
+                  </pic:nvPicPr>
+                  <pic:blipFill>
+                    <a:blip r:embed="rId25">
+                      <a:extLst>
+                        <a:ext uri="{28A0092B-C50C-407E-A947-70E740481C1C}">
+                          <a14:useLocalDpi xmlns:a14="http://schemas.microsoft.com/office/drawing/2010/main" val="0"/>
+                        </a:ext>
+                      </a:extLst>
+                    </a:blip>
+                    <a:stretch>
+                      <a:fillRect/>
+                    </a:stretch>
+                  </pic:blipFill>
+                  <pic:spPr>
+                    <a:xfrm>
+                      <a:off x="0" y="0"/>
+                      <a:ext cx="1076325" cy="495300"/>
+                    </a:xfrm>
+                    <a:prstGeom prst="rect">
+                      <a:avLst/>
+                    </a:prstGeom>
+                  </pic:spPr>
+                </pic:pic>
+              </a:graphicData>
+            </a:graphic>
+          </wp:anchor>
+        </w:drawing>
+      </w:r>
+    </w:p>
+    <w:p>
+      <w:pPr>
+        <w:tabs>
+          <w:tab w:val="left" w:pos="1200"/>
+        </w:tabs>
+        <w:rPr>
+          <w:noProof/>
+          <w:sz w:val="18"/>
+          <w:szCs w:val="18"/>
+        </w:rPr>
+      </w:pPr>
+    </w:p>
+    <w:p>
+      <w:pPr>
+        <w:tabs>
+          <w:tab w:val="left" w:pos="1200"/>
+        </w:tabs>
+        <w:rPr>
+          <w:noProof/>
+          <w:sz w:val="18"/>
+          <w:szCs w:val="18"/>
+        </w:rPr>
+      </w:pPr>
+    </w:p>
+    <w:p>
+      <w:pPr>
+        <w:tabs>
+          <w:tab w:val="left" w:pos="1200"/>
+        </w:tabs>
+        <w:rPr>
+          <w:noProof/>
+          <w:sz w:val="18"/>
+          <w:szCs w:val="18"/>
+        </w:rPr>
+      </w:pPr>
+      <w:r>
+        <w:rPr>
+          <w:noProof/>
+          <w:sz w:val="18"/>
+          <w:szCs w:val="18"/>
+        </w:rPr>
+        <w:t xml:space="preserve">16- </w:t>
+      </w:r>
+      <w:r>
+        <w:rPr>
+          <w:noProof/>
+          <w:sz w:val="18"/>
+          <w:szCs w:val="18"/>
+        </w:rPr>
+        <w:t>Centralizamos o subtitulo h2</w:t>
+      </w:r>
+    </w:p>
+    <w:p>
+      <w:pPr>
+        <w:tabs>
+          <w:tab w:val="left" w:pos="1200"/>
+        </w:tabs>
+        <w:rPr>
+          <w:noProof/>
+          <w:sz w:val="18"/>
+          <w:szCs w:val="18"/>
+        </w:rPr>
+      </w:pPr>
+    </w:p>
+    <w:p>
+      <w:pPr>
+        <w:tabs>
+          <w:tab w:val="left" w:pos="1200"/>
+        </w:tabs>
+        <w:rPr>
+          <w:noProof/>
+          <w:sz w:val="18"/>
+          <w:szCs w:val="18"/>
+        </w:rPr>
+      </w:pPr>
+      <w:r>
+        <w:rPr>
+          <w:noProof/>
+          <w:sz w:val="18"/>
+          <w:szCs w:val="18"/>
+        </w:rPr>
+        <w:drawing>
+          <wp:anchor distT="0" distB="0" distL="114300" distR="114300" simplePos="0" relativeHeight="251673600" behindDoc="0" locked="0" layoutInCell="1" allowOverlap="1" wp14:anchorId="4684BB31">
+            <wp:simplePos x="0" y="0"/>
+            <wp:positionH relativeFrom="margin">
+              <wp:align>left</wp:align>
+            </wp:positionH>
+            <wp:positionV relativeFrom="paragraph">
+              <wp:posOffset>25462865</wp:posOffset>
+            </wp:positionV>
+            <wp:extent cx="1276350" cy="428625"/>
+            <wp:effectExtent l="0" t="0" r="0" b="9525"/>
+            <wp:wrapSquare wrapText="bothSides"/>
+            <wp:docPr id="25" name="Imagem 25"/>
             <wp:cNvGraphicFramePr>
               <a:graphicFrameLocks xmlns:a="http://schemas.openxmlformats.org/drawingml/2006/main" noChangeAspect="1"/>
             </wp:cNvGraphicFramePr>
@@ -2081,122 +2298,6 @@
                   <pic:spPr>
                     <a:xfrm>
                       <a:off x="0" y="0"/>
-                      <a:ext cx="1076325" cy="495300"/>
-                    </a:xfrm>
-                    <a:prstGeom prst="rect">
-                      <a:avLst/>
-                    </a:prstGeom>
-                  </pic:spPr>
-                </pic:pic>
-              </a:graphicData>
-            </a:graphic>
-          </wp:anchor>
-        </w:drawing>
-      </w:r>
-      <w:r>
-        <w:rPr>
-          <w:noProof/>
-          <w:sz w:val="18"/>
-          <w:szCs w:val="18"/>
-        </w:rPr>
-        <w:t xml:space="preserve">15- </w:t>
-      </w:r>
-      <w:r>
-        <w:rPr>
-          <w:noProof/>
-          <w:sz w:val="18"/>
-          <w:szCs w:val="18"/>
-        </w:rPr>
-        <w:t>N</w:t>
-      </w:r>
-      <w:r>
-        <w:rPr>
-          <w:noProof/>
-          <w:sz w:val="18"/>
-          <w:szCs w:val="18"/>
-        </w:rPr>
-        <w:t xml:space="preserve">a div beneficios colocamos o espaço interno de 20px </w:t>
-      </w:r>
-    </w:p>
-    <w:p>
-      <w:pPr>
-        <w:tabs>
-          <w:tab w:val="left" w:pos="1200"/>
-        </w:tabs>
-        <w:rPr>
-          <w:noProof/>
-          <w:sz w:val="18"/>
-          <w:szCs w:val="18"/>
-        </w:rPr>
-      </w:pPr>
-    </w:p>
-    <w:p>
-      <w:pPr>
-        <w:tabs>
-          <w:tab w:val="left" w:pos="1200"/>
-        </w:tabs>
-        <w:rPr>
-          <w:noProof/>
-          <w:sz w:val="18"/>
-          <w:szCs w:val="18"/>
-        </w:rPr>
-      </w:pPr>
-    </w:p>
-    <w:p>
-      <w:pPr>
-        <w:tabs>
-          <w:tab w:val="left" w:pos="1200"/>
-        </w:tabs>
-        <w:rPr>
-          <w:noProof/>
-          <w:sz w:val="18"/>
-          <w:szCs w:val="18"/>
-        </w:rPr>
-      </w:pPr>
-      <w:r>
-        <w:rPr>
-          <w:noProof/>
-          <w:sz w:val="18"/>
-          <w:szCs w:val="18"/>
-        </w:rPr>
-        <w:drawing>
-          <wp:anchor distT="0" distB="0" distL="114300" distR="114300" simplePos="0" relativeHeight="251673600" behindDoc="0" locked="0" layoutInCell="1" allowOverlap="1" wp14:anchorId="4684BB31">
-            <wp:simplePos x="0" y="0"/>
-            <wp:positionH relativeFrom="margin">
-              <wp:align>left</wp:align>
-            </wp:positionH>
-            <wp:positionV relativeFrom="paragraph">
-              <wp:posOffset>304165</wp:posOffset>
-            </wp:positionV>
-            <wp:extent cx="1276350" cy="428625"/>
-            <wp:effectExtent l="0" t="0" r="0" b="9525"/>
-            <wp:wrapSquare wrapText="bothSides"/>
-            <wp:docPr id="25" name="Imagem 25"/>
-            <wp:cNvGraphicFramePr>
-              <a:graphicFrameLocks xmlns:a="http://schemas.openxmlformats.org/drawingml/2006/main" noChangeAspect="1"/>
-            </wp:cNvGraphicFramePr>
-            <a:graphic xmlns:a="http://schemas.openxmlformats.org/drawingml/2006/main">
-              <a:graphicData uri="http://schemas.openxmlformats.org/drawingml/2006/picture">
-                <pic:pic xmlns:pic="http://schemas.openxmlformats.org/drawingml/2006/picture">
-                  <pic:nvPicPr>
-                    <pic:cNvPr id="1" name=""/>
-                    <pic:cNvPicPr/>
-                  </pic:nvPicPr>
-                  <pic:blipFill>
-                    <a:blip r:embed="rId27">
-                      <a:extLst>
-                        <a:ext uri="{28A0092B-C50C-407E-A947-70E740481C1C}">
-                          <a14:useLocalDpi xmlns:a14="http://schemas.microsoft.com/office/drawing/2010/main" val="0"/>
-                        </a:ext>
-                      </a:extLst>
-                    </a:blip>
-                    <a:stretch>
-                      <a:fillRect/>
-                    </a:stretch>
-                  </pic:blipFill>
-                  <pic:spPr>
-                    <a:xfrm>
-                      <a:off x="0" y="0"/>
                       <a:ext cx="1276350" cy="428625"/>
                     </a:xfrm>
                     <a:prstGeom prst="rect">
@@ -2209,54 +2310,28 @@
           </wp:anchor>
         </w:drawing>
       </w:r>
-      <w:r>
-        <w:rPr>
-          <w:noProof/>
-          <w:sz w:val="18"/>
-          <w:szCs w:val="18"/>
-        </w:rPr>
-        <w:t xml:space="preserve">16- </w:t>
-      </w:r>
-      <w:r>
-        <w:rPr>
-          <w:noProof/>
-          <w:sz w:val="18"/>
-          <w:szCs w:val="18"/>
-        </w:rPr>
-        <w:t>Centralizamos o subtitulo h2</w:t>
-      </w:r>
-    </w:p>
-    <w:p>
-      <w:pPr>
-        <w:tabs>
-          <w:tab w:val="left" w:pos="1200"/>
-        </w:tabs>
-        <w:rPr>
-          <w:noProof/>
-          <w:sz w:val="18"/>
-          <w:szCs w:val="18"/>
-        </w:rPr>
-      </w:pPr>
-    </w:p>
-    <w:p>
-      <w:pPr>
-        <w:tabs>
-          <w:tab w:val="left" w:pos="1200"/>
-        </w:tabs>
-        <w:rPr>
-          <w:noProof/>
-          <w:sz w:val="18"/>
-          <w:szCs w:val="18"/>
-        </w:rPr>
-      </w:pPr>
-    </w:p>
-    <w:p>
-      <w:pPr>
-        <w:tabs>
-          <w:tab w:val="left" w:pos="1200"/>
-        </w:tabs>
-        <w:rPr>
-          <w:noProof/>
+    </w:p>
+    <w:p>
+      <w:pPr>
+        <w:tabs>
+          <w:tab w:val="left" w:pos="1200"/>
+        </w:tabs>
+        <w:rPr>
+          <w:noProof/>
+          <w:sz w:val="18"/>
+          <w:szCs w:val="18"/>
+        </w:rPr>
+      </w:pPr>
+    </w:p>
+    <w:p>
+      <w:pPr>
+        <w:tabs>
+          <w:tab w:val="left" w:pos="1200"/>
+        </w:tabs>
+        <w:rPr>
+          <w:noProof/>
+          <w:sz w:val="18"/>
+          <w:szCs w:val="18"/>
         </w:rPr>
       </w:pPr>
       <w:r>
@@ -2275,6 +2350,16 @@
         </w:rPr>
         <w:t>criamos os arquivos produto.html e produto.css dentro da pasta do projeto.</w:t>
       </w:r>
+    </w:p>
+    <w:p>
+      <w:pPr>
+        <w:tabs>
+          <w:tab w:val="left" w:pos="1200"/>
+        </w:tabs>
+        <w:rPr>
+          <w:noProof/>
+        </w:rPr>
+      </w:pPr>
       <w:r>
         <w:rPr>
           <w:noProof/>
@@ -2303,7 +2388,7 @@
                     <pic:cNvPicPr/>
                   </pic:nvPicPr>
                   <pic:blipFill>
-                    <a:blip r:embed="rId28"/>
+                    <a:blip r:embed="rId27"/>
                     <a:stretch>
                       <a:fillRect/>
                     </a:stretch>
@@ -2331,10 +2416,821 @@
         </w:tabs>
         <w:rPr>
           <w:noProof/>
-          <w:sz w:val="18"/>
-          <w:szCs w:val="18"/>
-        </w:rPr>
-      </w:pPr>
+        </w:rPr>
+      </w:pPr>
+      <w:r>
+        <w:rPr>
+          <w:noProof/>
+          <w:sz w:val="18"/>
+          <w:szCs w:val="18"/>
+        </w:rPr>
+        <w:t xml:space="preserve">18- </w:t>
+      </w:r>
+      <w:r>
+        <w:rPr>
+          <w:noProof/>
+          <w:sz w:val="18"/>
+          <w:szCs w:val="18"/>
+        </w:rPr>
+        <w:t>No Header inserimos a tag h1 com a imagem com logo e abaixo fizemos uma lista não ordenada com os itens que posterior será o menu da página onde colocamos a tag a para ancorar o link com as paginas do projeto conforme a imagem.</w:t>
+      </w:r>
+      <w:r>
+        <w:rPr>
+          <w:noProof/>
+        </w:rPr>
+        <w:t xml:space="preserve"> </w:t>
+      </w:r>
+    </w:p>
+    <w:p>
+      <w:pPr>
+        <w:tabs>
+          <w:tab w:val="left" w:pos="1200"/>
+        </w:tabs>
+        <w:rPr>
+          <w:noProof/>
+        </w:rPr>
+      </w:pPr>
+      <w:r>
+        <w:rPr>
+          <w:noProof/>
+          <w:sz w:val="18"/>
+          <w:szCs w:val="18"/>
+        </w:rPr>
+        <w:drawing>
+          <wp:anchor distT="0" distB="0" distL="114300" distR="114300" simplePos="0" relativeHeight="251674624" behindDoc="0" locked="0" layoutInCell="1" allowOverlap="1" wp14:anchorId="3A70756F">
+            <wp:simplePos x="0" y="0"/>
+            <wp:positionH relativeFrom="margin">
+              <wp:align>left</wp:align>
+            </wp:positionH>
+            <wp:positionV relativeFrom="paragraph">
+              <wp:posOffset>27983180</wp:posOffset>
+            </wp:positionV>
+            <wp:extent cx="2667000" cy="1266825"/>
+            <wp:effectExtent l="0" t="0" r="0" b="9525"/>
+            <wp:wrapSquare wrapText="bothSides"/>
+            <wp:docPr id="5" name="Imagem 5"/>
+            <wp:cNvGraphicFramePr>
+              <a:graphicFrameLocks xmlns:a="http://schemas.openxmlformats.org/drawingml/2006/main" noChangeAspect="1"/>
+            </wp:cNvGraphicFramePr>
+            <a:graphic xmlns:a="http://schemas.openxmlformats.org/drawingml/2006/main">
+              <a:graphicData uri="http://schemas.openxmlformats.org/drawingml/2006/picture">
+                <pic:pic xmlns:pic="http://schemas.openxmlformats.org/drawingml/2006/picture">
+                  <pic:nvPicPr>
+                    <pic:cNvPr id="1" name=""/>
+                    <pic:cNvPicPr/>
+                  </pic:nvPicPr>
+                  <pic:blipFill>
+                    <a:blip r:embed="rId28">
+                      <a:extLst>
+                        <a:ext uri="{28A0092B-C50C-407E-A947-70E740481C1C}">
+                          <a14:useLocalDpi xmlns:a14="http://schemas.microsoft.com/office/drawing/2010/main" val="0"/>
+                        </a:ext>
+                      </a:extLst>
+                    </a:blip>
+                    <a:stretch>
+                      <a:fillRect/>
+                    </a:stretch>
+                  </pic:blipFill>
+                  <pic:spPr>
+                    <a:xfrm>
+                      <a:off x="0" y="0"/>
+                      <a:ext cx="2667000" cy="1266825"/>
+                    </a:xfrm>
+                    <a:prstGeom prst="rect">
+                      <a:avLst/>
+                    </a:prstGeom>
+                  </pic:spPr>
+                </pic:pic>
+              </a:graphicData>
+            </a:graphic>
+          </wp:anchor>
+        </w:drawing>
+      </w:r>
+    </w:p>
+    <w:p>
+      <w:pPr>
+        <w:tabs>
+          <w:tab w:val="left" w:pos="1200"/>
+        </w:tabs>
+        <w:rPr>
+          <w:noProof/>
+          <w:sz w:val="18"/>
+          <w:szCs w:val="18"/>
+        </w:rPr>
+      </w:pPr>
+    </w:p>
+    <w:p>
+      <w:pPr>
+        <w:tabs>
+          <w:tab w:val="left" w:pos="1200"/>
+        </w:tabs>
+        <w:rPr>
+          <w:noProof/>
+          <w:sz w:val="18"/>
+          <w:szCs w:val="18"/>
+        </w:rPr>
+      </w:pPr>
+    </w:p>
+    <w:p>
+      <w:pPr>
+        <w:tabs>
+          <w:tab w:val="left" w:pos="1200"/>
+        </w:tabs>
+        <w:rPr>
+          <w:noProof/>
+          <w:sz w:val="18"/>
+          <w:szCs w:val="18"/>
+        </w:rPr>
+      </w:pPr>
+    </w:p>
+    <w:p>
+      <w:pPr>
+        <w:tabs>
+          <w:tab w:val="left" w:pos="1200"/>
+        </w:tabs>
+        <w:rPr>
+          <w:noProof/>
+          <w:sz w:val="18"/>
+          <w:szCs w:val="18"/>
+        </w:rPr>
+      </w:pPr>
+    </w:p>
+    <w:p>
+      <w:pPr>
+        <w:tabs>
+          <w:tab w:val="left" w:pos="1200"/>
+        </w:tabs>
+        <w:rPr>
+          <w:noProof/>
+          <w:sz w:val="18"/>
+          <w:szCs w:val="18"/>
+        </w:rPr>
+      </w:pPr>
+    </w:p>
+    <w:p>
+      <w:pPr>
+        <w:tabs>
+          <w:tab w:val="left" w:pos="1200"/>
+        </w:tabs>
+        <w:rPr>
+          <w:noProof/>
+          <w:sz w:val="18"/>
+          <w:szCs w:val="18"/>
+        </w:rPr>
+      </w:pPr>
+      <w:r>
+        <w:rPr>
+          <w:noProof/>
+          <w:sz w:val="18"/>
+          <w:szCs w:val="18"/>
+        </w:rPr>
+        <w:t xml:space="preserve">19- </w:t>
+      </w:r>
+      <w:r>
+        <w:rPr>
+          <w:noProof/>
+          <w:sz w:val="18"/>
+          <w:szCs w:val="18"/>
+        </w:rPr>
+        <w:t>No Header botamos uma cor de fundo</w:t>
+      </w:r>
+    </w:p>
+    <w:p>
+      <w:pPr>
+        <w:tabs>
+          <w:tab w:val="left" w:pos="1200"/>
+        </w:tabs>
+        <w:rPr>
+          <w:noProof/>
+          <w:sz w:val="18"/>
+          <w:szCs w:val="18"/>
+        </w:rPr>
+      </w:pPr>
+      <w:r>
+        <w:rPr>
+          <w:noProof/>
+          <w:sz w:val="18"/>
+          <w:szCs w:val="18"/>
+        </w:rPr>
+        <w:drawing>
+          <wp:inline distT="0" distB="0" distL="0" distR="0" wp14:anchorId="49E6D1B3" wp14:editId="3CCB871C">
+            <wp:extent cx="2000529" cy="381053"/>
+            <wp:effectExtent l="0" t="0" r="0" b="0"/>
+            <wp:docPr id="9" name="Imagem 9"/>
+            <wp:cNvGraphicFramePr>
+              <a:graphicFrameLocks xmlns:a="http://schemas.openxmlformats.org/drawingml/2006/main" noChangeAspect="1"/>
+            </wp:cNvGraphicFramePr>
+            <a:graphic xmlns:a="http://schemas.openxmlformats.org/drawingml/2006/main">
+              <a:graphicData uri="http://schemas.openxmlformats.org/drawingml/2006/picture">
+                <pic:pic xmlns:pic="http://schemas.openxmlformats.org/drawingml/2006/picture">
+                  <pic:nvPicPr>
+                    <pic:cNvPr id="1" name=""/>
+                    <pic:cNvPicPr/>
+                  </pic:nvPicPr>
+                  <pic:blipFill>
+                    <a:blip r:embed="rId29"/>
+                    <a:stretch>
+                      <a:fillRect/>
+                    </a:stretch>
+                  </pic:blipFill>
+                  <pic:spPr>
+                    <a:xfrm>
+                      <a:off x="0" y="0"/>
+                      <a:ext cx="2000529" cy="381053"/>
+                    </a:xfrm>
+                    <a:prstGeom prst="rect">
+                      <a:avLst/>
+                    </a:prstGeom>
+                  </pic:spPr>
+                </pic:pic>
+              </a:graphicData>
+            </a:graphic>
+          </wp:inline>
+        </w:drawing>
+      </w:r>
+      <w:r>
+        <w:rPr>
+          <w:noProof/>
+          <w:sz w:val="18"/>
+          <w:szCs w:val="18"/>
+        </w:rPr>
+        <w:tab/>
+      </w:r>
+      <w:r>
+        <w:rPr>
+          <w:noProof/>
+          <w:sz w:val="18"/>
+          <w:szCs w:val="18"/>
+        </w:rPr>
+        <w:tab/>
+      </w:r>
+      <w:r>
+        <w:rPr>
+          <w:noProof/>
+          <w:sz w:val="18"/>
+          <w:szCs w:val="18"/>
+        </w:rPr>
+        <w:tab/>
+      </w:r>
+      <w:r>
+        <w:rPr>
+          <w:noProof/>
+          <w:sz w:val="18"/>
+          <w:szCs w:val="18"/>
+        </w:rPr>
+        <w:tab/>
+      </w:r>
+    </w:p>
+    <w:p>
+      <w:pPr>
+        <w:tabs>
+          <w:tab w:val="left" w:pos="1200"/>
+        </w:tabs>
+        <w:rPr>
+          <w:noProof/>
+          <w:sz w:val="18"/>
+          <w:szCs w:val="18"/>
+        </w:rPr>
+      </w:pPr>
+      <w:r>
+        <w:rPr>
+          <w:noProof/>
+          <w:sz w:val="18"/>
+          <w:szCs w:val="18"/>
+        </w:rPr>
+        <w:t>20- Adicionamos a tag nav a nossa lista</w:t>
+      </w:r>
+      <w:r>
+        <w:rPr>
+          <w:noProof/>
+          <w:sz w:val="18"/>
+          <w:szCs w:val="18"/>
+        </w:rPr>
+        <w:t>, indicando que é que é um menu de navegação.</w:t>
+      </w:r>
+    </w:p>
+    <w:p>
+      <w:pPr>
+        <w:tabs>
+          <w:tab w:val="left" w:pos="1200"/>
+        </w:tabs>
+        <w:rPr>
+          <w:noProof/>
+          <w:sz w:val="18"/>
+          <w:szCs w:val="18"/>
+        </w:rPr>
+      </w:pPr>
+      <w:r>
+        <w:rPr>
+          <w:noProof/>
+          <w:sz w:val="18"/>
+          <w:szCs w:val="18"/>
+        </w:rPr>
+        <w:drawing>
+          <wp:inline distT="0" distB="0" distL="0" distR="0" wp14:anchorId="39A1EB31" wp14:editId="47226991">
+            <wp:extent cx="2905530" cy="885949"/>
+            <wp:effectExtent l="0" t="0" r="0" b="9525"/>
+            <wp:docPr id="27" name="Imagem 27"/>
+            <wp:cNvGraphicFramePr>
+              <a:graphicFrameLocks xmlns:a="http://schemas.openxmlformats.org/drawingml/2006/main" noChangeAspect="1"/>
+            </wp:cNvGraphicFramePr>
+            <a:graphic xmlns:a="http://schemas.openxmlformats.org/drawingml/2006/main">
+              <a:graphicData uri="http://schemas.openxmlformats.org/drawingml/2006/picture">
+                <pic:pic xmlns:pic="http://schemas.openxmlformats.org/drawingml/2006/picture">
+                  <pic:nvPicPr>
+                    <pic:cNvPr id="1" name=""/>
+                    <pic:cNvPicPr/>
+                  </pic:nvPicPr>
+                  <pic:blipFill>
+                    <a:blip r:embed="rId30"/>
+                    <a:stretch>
+                      <a:fillRect/>
+                    </a:stretch>
+                  </pic:blipFill>
+                  <pic:spPr>
+                    <a:xfrm>
+                      <a:off x="0" y="0"/>
+                      <a:ext cx="2905530" cy="885949"/>
+                    </a:xfrm>
+                    <a:prstGeom prst="rect">
+                      <a:avLst/>
+                    </a:prstGeom>
+                  </pic:spPr>
+                </pic:pic>
+              </a:graphicData>
+            </a:graphic>
+          </wp:inline>
+        </w:drawing>
+      </w:r>
+    </w:p>
+    <w:p>
+      <w:pPr>
+        <w:tabs>
+          <w:tab w:val="left" w:pos="1200"/>
+        </w:tabs>
+        <w:rPr>
+          <w:noProof/>
+          <w:sz w:val="18"/>
+          <w:szCs w:val="18"/>
+        </w:rPr>
+      </w:pPr>
+      <w:r>
+        <w:rPr>
+          <w:noProof/>
+          <w:sz w:val="18"/>
+          <w:szCs w:val="18"/>
+        </w:rPr>
+        <mc:AlternateContent>
+          <mc:Choice Requires="wps">
+            <w:drawing>
+              <wp:anchor distT="0" distB="0" distL="114300" distR="114300" simplePos="0" relativeHeight="251676672" behindDoc="0" locked="0" layoutInCell="1" allowOverlap="1">
+                <wp:simplePos x="0" y="0"/>
+                <wp:positionH relativeFrom="column">
+                  <wp:posOffset>1304925</wp:posOffset>
+                </wp:positionH>
+                <wp:positionV relativeFrom="paragraph">
+                  <wp:posOffset>192405</wp:posOffset>
+                </wp:positionV>
+                <wp:extent cx="2676525" cy="361950"/>
+                <wp:effectExtent l="38100" t="0" r="28575" b="76200"/>
+                <wp:wrapNone/>
+                <wp:docPr id="30" name="Conector de Seta Reta 30"/>
+                <wp:cNvGraphicFramePr/>
+                <a:graphic xmlns:a="http://schemas.openxmlformats.org/drawingml/2006/main">
+                  <a:graphicData uri="http://schemas.microsoft.com/office/word/2010/wordprocessingShape">
+                    <wps:wsp>
+                      <wps:cNvCnPr/>
+                      <wps:spPr>
+                        <a:xfrm flipH="1">
+                          <a:off x="0" y="0"/>
+                          <a:ext cx="2676525" cy="361950"/>
+                        </a:xfrm>
+                        <a:prstGeom prst="straightConnector1">
+                          <a:avLst/>
+                        </a:prstGeom>
+                        <a:ln>
+                          <a:tailEnd type="triangle"/>
+                        </a:ln>
+                      </wps:spPr>
+                      <wps:style>
+                        <a:lnRef idx="1">
+                          <a:schemeClr val="accent1"/>
+                        </a:lnRef>
+                        <a:fillRef idx="0">
+                          <a:schemeClr val="accent1"/>
+                        </a:fillRef>
+                        <a:effectRef idx="0">
+                          <a:schemeClr val="accent1"/>
+                        </a:effectRef>
+                        <a:fontRef idx="minor">
+                          <a:schemeClr val="tx1"/>
+                        </a:fontRef>
+                      </wps:style>
+                      <wps:bodyPr/>
+                    </wps:wsp>
+                  </a:graphicData>
+                </a:graphic>
+              </wp:anchor>
+            </w:drawing>
+          </mc:Choice>
+          <mc:Fallback>
+            <w:pict>
+              <v:shape w14:anchorId="40BB2EF2" id="Conector de Seta Reta 30" o:spid="_x0000_s1026" type="#_x0000_t32" style="position:absolute;margin-left:102.75pt;margin-top:15.15pt;width:210.75pt;height:28.5pt;flip:x;z-index:251676672;visibility:visible;mso-wrap-style:square;mso-wrap-distance-left:9pt;mso-wrap-distance-top:0;mso-wrap-distance-right:9pt;mso-wrap-distance-bottom:0;mso-position-horizontal:absolute;mso-position-horizontal-relative:text;mso-position-vertical:absolute;mso-position-vertical-relative:text" o:gfxdata="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" strokecolor="#4472c4 [3204]" strokeweight=".5pt">
+                <v:stroke endarrow="block" joinstyle="miter"/>
+              </v:shape>
+            </w:pict>
+          </mc:Fallback>
+        </mc:AlternateContent>
+      </w:r>
+      <w:r>
+        <w:rPr>
+          <w:noProof/>
+          <w:sz w:val="18"/>
+          <w:szCs w:val="18"/>
+        </w:rPr>
+        <mc:AlternateContent>
+          <mc:Choice Requires="wps">
+            <w:drawing>
+              <wp:anchor distT="0" distB="0" distL="114300" distR="114300" simplePos="0" relativeHeight="251675648" behindDoc="0" locked="0" layoutInCell="1" allowOverlap="1">
+                <wp:simplePos x="0" y="0"/>
+                <wp:positionH relativeFrom="column">
+                  <wp:posOffset>1095375</wp:posOffset>
+                </wp:positionH>
+                <wp:positionV relativeFrom="paragraph">
+                  <wp:posOffset>211455</wp:posOffset>
+                </wp:positionV>
+                <wp:extent cx="1533525" cy="219075"/>
+                <wp:effectExtent l="38100" t="0" r="28575" b="85725"/>
+                <wp:wrapNone/>
+                <wp:docPr id="29" name="Conector de Seta Reta 29"/>
+                <wp:cNvGraphicFramePr/>
+                <a:graphic xmlns:a="http://schemas.openxmlformats.org/drawingml/2006/main">
+                  <a:graphicData uri="http://schemas.microsoft.com/office/word/2010/wordprocessingShape">
+                    <wps:wsp>
+                      <wps:cNvCnPr/>
+                      <wps:spPr>
+                        <a:xfrm flipH="1">
+                          <a:off x="0" y="0"/>
+                          <a:ext cx="1533525" cy="219075"/>
+                        </a:xfrm>
+                        <a:prstGeom prst="straightConnector1">
+                          <a:avLst/>
+                        </a:prstGeom>
+                        <a:ln>
+                          <a:tailEnd type="triangle"/>
+                        </a:ln>
+                      </wps:spPr>
+                      <wps:style>
+                        <a:lnRef idx="1">
+                          <a:schemeClr val="accent1"/>
+                        </a:lnRef>
+                        <a:fillRef idx="0">
+                          <a:schemeClr val="accent1"/>
+                        </a:fillRef>
+                        <a:effectRef idx="0">
+                          <a:schemeClr val="accent1"/>
+                        </a:effectRef>
+                        <a:fontRef idx="minor">
+                          <a:schemeClr val="tx1"/>
+                        </a:fontRef>
+                      </wps:style>
+                      <wps:bodyPr/>
+                    </wps:wsp>
+                  </a:graphicData>
+                </a:graphic>
+              </wp:anchor>
+            </w:drawing>
+          </mc:Choice>
+          <mc:Fallback>
+            <w:pict>
+              <v:shape w14:anchorId="3D75E553" id="Conector de Seta Reta 29" o:spid="_x0000_s1026" type="#_x0000_t32" style="position:absolute;margin-left:86.25pt;margin-top:16.65pt;width:120.75pt;height:17.25pt;flip:x;z-index:251675648;visibility:visible;mso-wrap-style:square;mso-wrap-distance-left:9pt;mso-wrap-distance-top:0;mso-wrap-distance-right:9pt;mso-wrap-distance-bottom:0;mso-position-horizontal:absolute;mso-position-horizontal-relative:text;mso-position-vertical:absolute;mso-position-vertical-relative:text" o:gfxdata="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" strokecolor="#4472c4 [3204]" strokeweight=".5pt">
+                <v:stroke endarrow="block" joinstyle="miter"/>
+              </v:shape>
+            </w:pict>
+          </mc:Fallback>
+        </mc:AlternateContent>
+      </w:r>
+      <w:r>
+        <w:rPr>
+          <w:noProof/>
+          <w:sz w:val="18"/>
+          <w:szCs w:val="18"/>
+        </w:rPr>
+        <w:t xml:space="preserve">21- </w:t>
+      </w:r>
+      <w:r>
+        <w:rPr>
+          <w:noProof/>
+          <w:sz w:val="18"/>
+          <w:szCs w:val="18"/>
+        </w:rPr>
+        <w:t>No Css utilizamos a nav li para coçocar os itens um ao lado do outro e colocamos espaço entre os itens.</w:t>
+      </w:r>
+    </w:p>
+    <w:p>
+      <w:pPr>
+        <w:tabs>
+          <w:tab w:val="left" w:pos="1200"/>
+        </w:tabs>
+        <w:rPr>
+          <w:noProof/>
+          <w:sz w:val="18"/>
+          <w:szCs w:val="18"/>
+        </w:rPr>
+      </w:pPr>
+      <w:r>
+        <w:rPr>
+          <w:noProof/>
+          <w:sz w:val="18"/>
+          <w:szCs w:val="18"/>
+        </w:rPr>
+        <w:drawing>
+          <wp:inline distT="0" distB="0" distL="0" distR="0" wp14:anchorId="7445FE99" wp14:editId="1A900F8E">
+            <wp:extent cx="1381318" cy="543001"/>
+            <wp:effectExtent l="0" t="0" r="9525" b="9525"/>
+            <wp:docPr id="28" name="Imagem 28"/>
+            <wp:cNvGraphicFramePr>
+              <a:graphicFrameLocks xmlns:a="http://schemas.openxmlformats.org/drawingml/2006/main" noChangeAspect="1"/>
+            </wp:cNvGraphicFramePr>
+            <a:graphic xmlns:a="http://schemas.openxmlformats.org/drawingml/2006/main">
+              <a:graphicData uri="http://schemas.openxmlformats.org/drawingml/2006/picture">
+                <pic:pic xmlns:pic="http://schemas.openxmlformats.org/drawingml/2006/picture">
+                  <pic:nvPicPr>
+                    <pic:cNvPr id="1" name=""/>
+                    <pic:cNvPicPr/>
+                  </pic:nvPicPr>
+                  <pic:blipFill>
+                    <a:blip r:embed="rId31"/>
+                    <a:stretch>
+                      <a:fillRect/>
+                    </a:stretch>
+                  </pic:blipFill>
+                  <pic:spPr>
+                    <a:xfrm>
+                      <a:off x="0" y="0"/>
+                      <a:ext cx="1381318" cy="543001"/>
+                    </a:xfrm>
+                    <a:prstGeom prst="rect">
+                      <a:avLst/>
+                    </a:prstGeom>
+                  </pic:spPr>
+                </pic:pic>
+              </a:graphicData>
+            </a:graphic>
+          </wp:inline>
+        </w:drawing>
+      </w:r>
+    </w:p>
+    <w:p>
+      <w:pPr>
+        <w:tabs>
+          <w:tab w:val="left" w:pos="1200"/>
+        </w:tabs>
+        <w:rPr>
+          <w:noProof/>
+          <w:sz w:val="18"/>
+          <w:szCs w:val="18"/>
+        </w:rPr>
+      </w:pPr>
+      <w:r>
+        <w:rPr>
+          <w:noProof/>
+          <w:sz w:val="18"/>
+          <w:szCs w:val="18"/>
+        </w:rPr>
+        <w:drawing>
+          <wp:anchor distT="0" distB="0" distL="114300" distR="114300" simplePos="0" relativeHeight="251677696" behindDoc="1" locked="0" layoutInCell="1" allowOverlap="1" wp14:anchorId="7AD145E2">
+            <wp:simplePos x="0" y="0"/>
+            <wp:positionH relativeFrom="column">
+              <wp:posOffset>3368040</wp:posOffset>
+            </wp:positionH>
+            <wp:positionV relativeFrom="paragraph">
+              <wp:posOffset>212725</wp:posOffset>
+            </wp:positionV>
+            <wp:extent cx="1695450" cy="942975"/>
+            <wp:effectExtent l="0" t="0" r="0" b="9525"/>
+            <wp:wrapNone/>
+            <wp:docPr id="31" name="Imagem 31"/>
+            <wp:cNvGraphicFramePr>
+              <a:graphicFrameLocks xmlns:a="http://schemas.openxmlformats.org/drawingml/2006/main" noChangeAspect="1"/>
+            </wp:cNvGraphicFramePr>
+            <a:graphic xmlns:a="http://schemas.openxmlformats.org/drawingml/2006/main">
+              <a:graphicData uri="http://schemas.openxmlformats.org/drawingml/2006/picture">
+                <pic:pic xmlns:pic="http://schemas.openxmlformats.org/drawingml/2006/picture">
+                  <pic:nvPicPr>
+                    <pic:cNvPr id="1" name=""/>
+                    <pic:cNvPicPr/>
+                  </pic:nvPicPr>
+                  <pic:blipFill>
+                    <a:blip r:embed="rId32">
+                      <a:extLst>
+                        <a:ext uri="{28A0092B-C50C-407E-A947-70E740481C1C}">
+                          <a14:useLocalDpi xmlns:a14="http://schemas.microsoft.com/office/drawing/2010/main" val="0"/>
+                        </a:ext>
+                      </a:extLst>
+                    </a:blip>
+                    <a:stretch>
+                      <a:fillRect/>
+                    </a:stretch>
+                  </pic:blipFill>
+                  <pic:spPr>
+                    <a:xfrm>
+                      <a:off x="0" y="0"/>
+                      <a:ext cx="1695450" cy="942975"/>
+                    </a:xfrm>
+                    <a:prstGeom prst="rect">
+                      <a:avLst/>
+                    </a:prstGeom>
+                  </pic:spPr>
+                </pic:pic>
+              </a:graphicData>
+            </a:graphic>
+          </wp:anchor>
+        </w:drawing>
+      </w:r>
+      <w:r>
+        <w:rPr>
+          <w:noProof/>
+          <w:sz w:val="18"/>
+          <w:szCs w:val="18"/>
+        </w:rPr>
+        <w:t>22-</w:t>
+      </w:r>
+      <w:r>
+        <w:rPr>
+          <w:noProof/>
+          <w:sz w:val="18"/>
+          <w:szCs w:val="18"/>
+        </w:rPr>
+        <w:t xml:space="preserve"> Ainda no css utilizamos o nav a estilizamos os textos da seguinte forma:</w:t>
+      </w:r>
+    </w:p>
+    <w:p>
+      <w:pPr>
+        <w:pStyle w:val="PargrafodaLista"/>
+        <w:numPr>
+          <w:ilvl w:val="0"/>
+          <w:numId w:val="8"/>
+        </w:numPr>
+        <w:tabs>
+          <w:tab w:val="left" w:pos="1200"/>
+        </w:tabs>
+        <w:rPr>
+          <w:b/>
+          <w:noProof/>
+          <w:sz w:val="18"/>
+          <w:szCs w:val="18"/>
+        </w:rPr>
+      </w:pPr>
+      <w:r>
+        <w:rPr>
+          <w:b/>
+          <w:noProof/>
+          <w:sz w:val="18"/>
+          <w:szCs w:val="18"/>
+        </w:rPr>
+        <w:t>Aumentamos o tamanho da fonte.</w:t>
+      </w:r>
+    </w:p>
+    <w:p>
+      <w:pPr>
+        <w:pStyle w:val="PargrafodaLista"/>
+        <w:numPr>
+          <w:ilvl w:val="0"/>
+          <w:numId w:val="8"/>
+        </w:numPr>
+        <w:tabs>
+          <w:tab w:val="left" w:pos="1200"/>
+        </w:tabs>
+        <w:rPr>
+          <w:b/>
+          <w:noProof/>
+          <w:sz w:val="18"/>
+          <w:szCs w:val="18"/>
+        </w:rPr>
+      </w:pPr>
+      <w:r>
+        <w:rPr>
+          <w:b/>
+          <w:noProof/>
+          <w:sz w:val="18"/>
+          <w:szCs w:val="18"/>
+        </w:rPr>
+        <w:t>Deixamos a fonte em negrito e encorpamos o texto.</w:t>
+      </w:r>
+    </w:p>
+    <w:p>
+      <w:pPr>
+        <w:pStyle w:val="PargrafodaLista"/>
+        <w:numPr>
+          <w:ilvl w:val="0"/>
+          <w:numId w:val="8"/>
+        </w:numPr>
+        <w:tabs>
+          <w:tab w:val="left" w:pos="1200"/>
+        </w:tabs>
+        <w:rPr>
+          <w:b/>
+          <w:noProof/>
+          <w:sz w:val="18"/>
+          <w:szCs w:val="18"/>
+        </w:rPr>
+      </w:pPr>
+      <w:r>
+        <w:rPr>
+          <w:b/>
+          <w:noProof/>
+          <w:sz w:val="18"/>
+          <w:szCs w:val="18"/>
+        </w:rPr>
+        <w:t>Transformamos o texto em maiusculo.</w:t>
+      </w:r>
+    </w:p>
+    <w:p>
+      <w:pPr>
+        <w:pStyle w:val="PargrafodaLista"/>
+        <w:numPr>
+          <w:ilvl w:val="0"/>
+          <w:numId w:val="8"/>
+        </w:numPr>
+        <w:tabs>
+          <w:tab w:val="left" w:pos="1200"/>
+        </w:tabs>
+        <w:rPr>
+          <w:b/>
+          <w:noProof/>
+          <w:sz w:val="18"/>
+          <w:szCs w:val="18"/>
+        </w:rPr>
+      </w:pPr>
+      <w:r>
+        <w:rPr>
+          <w:b/>
+          <w:noProof/>
+          <w:sz w:val="18"/>
+          <w:szCs w:val="18"/>
+        </w:rPr>
+        <w:t>Colocamos a cor preta no texto.</w:t>
+      </w:r>
+    </w:p>
+    <w:p>
+      <w:pPr>
+        <w:pStyle w:val="PargrafodaLista"/>
+        <w:numPr>
+          <w:ilvl w:val="0"/>
+          <w:numId w:val="8"/>
+        </w:numPr>
+        <w:tabs>
+          <w:tab w:val="left" w:pos="1200"/>
+        </w:tabs>
+        <w:rPr>
+          <w:b/>
+          <w:noProof/>
+          <w:sz w:val="18"/>
+          <w:szCs w:val="18"/>
+        </w:rPr>
+      </w:pPr>
+      <w:r>
+        <w:rPr>
+          <w:b/>
+          <w:noProof/>
+          <w:sz w:val="18"/>
+          <w:szCs w:val="18"/>
+        </w:rPr>
+        <w:t>Tiramos o sublinhado.</w:t>
+      </w:r>
+    </w:p>
+    <w:p>
+      <w:pPr>
+        <w:tabs>
+          <w:tab w:val="left" w:pos="1200"/>
+        </w:tabs>
+        <w:rPr>
+          <w:noProof/>
+          <w:sz w:val="18"/>
+          <w:szCs w:val="18"/>
+        </w:rPr>
+      </w:pPr>
+    </w:p>
+    <w:p>
+      <w:pPr>
+        <w:tabs>
+          <w:tab w:val="left" w:pos="1200"/>
+        </w:tabs>
+        <w:rPr>
+          <w:noProof/>
+          <w:sz w:val="18"/>
+          <w:szCs w:val="18"/>
+        </w:rPr>
+      </w:pPr>
+      <w:r>
+        <w:rPr>
+          <w:noProof/>
+          <w:sz w:val="18"/>
+          <w:szCs w:val="18"/>
+        </w:rPr>
+        <w:t xml:space="preserve">23- </w:t>
+      </w:r>
       <w:bookmarkStart w:id="0" w:name="_GoBack"/>
       <w:bookmarkEnd w:id="0"/>
     </w:p>
@@ -2755,6 +3651,119 @@
     </w:lvl>
   </w:abstractNum>
   <w:abstractNum w:abstractNumId="4" w15:restartNumberingAfterBreak="0">
+    <w:nsid w:val="4ACE0979"/>
+    <w:multiLevelType w:val="hybridMultilevel"/>
+    <w:tmpl w:val="18364C28"/>
+    <w:lvl w:ilvl="0" w:tplc="04160001">
+      <w:start w:val="1"/>
+      <w:numFmt w:val="bullet"/>
+      <w:lvlText w:val=""/>
+      <w:lvlJc w:val="left"/>
+      <w:pPr>
+        <w:ind w:left="720" w:hanging="360"/>
+      </w:pPr>
+      <w:rPr>
+        <w:rFonts w:ascii="Symbol" w:hAnsi="Symbol" w:hint="default"/>
+      </w:rPr>
+    </w:lvl>
+    <w:lvl w:ilvl="1" w:tplc="04160003" w:tentative="1">
+      <w:start w:val="1"/>
+      <w:numFmt w:val="bullet"/>
+      <w:lvlText w:val="o"/>
+      <w:lvlJc w:val="left"/>
+      <w:pPr>
+        <w:ind w:left="1440" w:hanging="360"/>
+      </w:pPr>
+      <w:rPr>
+        <w:rFonts w:ascii="Courier New" w:hAnsi="Courier New" w:cs="Courier New" w:hint="default"/>
+      </w:rPr>
+    </w:lvl>
+    <w:lvl w:ilvl="2" w:tplc="04160005" w:tentative="1">
+      <w:start w:val="1"/>
+      <w:numFmt w:val="bullet"/>
+      <w:lvlText w:val=""/>
+      <w:lvlJc w:val="left"/>
+      <w:pPr>
+        <w:ind w:left="2160" w:hanging="360"/>
+      </w:pPr>
+      <w:rPr>
+        <w:rFonts w:ascii="Wingdings" w:hAnsi="Wingdings" w:hint="default"/>
+      </w:rPr>
+    </w:lvl>
+    <w:lvl w:ilvl="3" w:tplc="04160001" w:tentative="1">
+      <w:start w:val="1"/>
+      <w:numFmt w:val="bullet"/>
+      <w:lvlText w:val=""/>
+      <w:lvlJc w:val="left"/>
+      <w:pPr>
+        <w:ind w:left="2880" w:hanging="360"/>
+      </w:pPr>
+      <w:rPr>
+        <w:rFonts w:ascii="Symbol" w:hAnsi="Symbol" w:hint="default"/>
+      </w:rPr>
+    </w:lvl>
+    <w:lvl w:ilvl="4" w:tplc="04160003" w:tentative="1">
+      <w:start w:val="1"/>
+      <w:numFmt w:val="bullet"/>
+      <w:lvlText w:val="o"/>
+      <w:lvlJc w:val="left"/>
+      <w:pPr>
+        <w:ind w:left="3600" w:hanging="360"/>
+      </w:pPr>
+      <w:rPr>
+        <w:rFonts w:ascii="Courier New" w:hAnsi="Courier New" w:cs="Courier New" w:hint="default"/>
+      </w:rPr>
+    </w:lvl>
+    <w:lvl w:ilvl="5" w:tplc="04160005" w:tentative="1">
+      <w:start w:val="1"/>
+      <w:numFmt w:val="bullet"/>
+      <w:lvlText w:val=""/>
+      <w:lvlJc w:val="left"/>
+      <w:pPr>
+        <w:ind w:left="4320" w:hanging="360"/>
+      </w:pPr>
+      <w:rPr>
+        <w:rFonts w:ascii="Wingdings" w:hAnsi="Wingdings" w:hint="default"/>
+      </w:rPr>
+    </w:lvl>
+    <w:lvl w:ilvl="6" w:tplc="04160001" w:tentative="1">
+      <w:start w:val="1"/>
+      <w:numFmt w:val="bullet"/>
+      <w:lvlText w:val=""/>
+      <w:lvlJc w:val="left"/>
+      <w:pPr>
+        <w:ind w:left="5040" w:hanging="360"/>
+      </w:pPr>
+      <w:rPr>
+        <w:rFonts w:ascii="Symbol" w:hAnsi="Symbol" w:hint="default"/>
+      </w:rPr>
+    </w:lvl>
+    <w:lvl w:ilvl="7" w:tplc="04160003" w:tentative="1">
+      <w:start w:val="1"/>
+      <w:numFmt w:val="bullet"/>
+      <w:lvlText w:val="o"/>
+      <w:lvlJc w:val="left"/>
+      <w:pPr>
+        <w:ind w:left="5760" w:hanging="360"/>
+      </w:pPr>
+      <w:rPr>
+        <w:rFonts w:ascii="Courier New" w:hAnsi="Courier New" w:cs="Courier New" w:hint="default"/>
+      </w:rPr>
+    </w:lvl>
+    <w:lvl w:ilvl="8" w:tplc="04160005" w:tentative="1">
+      <w:start w:val="1"/>
+      <w:numFmt w:val="bullet"/>
+      <w:lvlText w:val=""/>
+      <w:lvlJc w:val="left"/>
+      <w:pPr>
+        <w:ind w:left="6480" w:hanging="360"/>
+      </w:pPr>
+      <w:rPr>
+        <w:rFonts w:ascii="Wingdings" w:hAnsi="Wingdings" w:hint="default"/>
+      </w:rPr>
+    </w:lvl>
+  </w:abstractNum>
+  <w:abstractNum w:abstractNumId="5" w15:restartNumberingAfterBreak="0">
     <w:nsid w:val="4EAE1D47"/>
     <w:multiLevelType w:val="hybridMultilevel"/>
     <w:tmpl w:val="A2901A7E"/>
@@ -2867,7 +3876,7 @@
       </w:rPr>
     </w:lvl>
   </w:abstractNum>
-  <w:abstractNum w:abstractNumId="5" w15:restartNumberingAfterBreak="0">
+  <w:abstractNum w:abstractNumId="6" w15:restartNumberingAfterBreak="0">
     <w:nsid w:val="5DC804A5"/>
     <w:multiLevelType w:val="hybridMultilevel"/>
     <w:tmpl w:val="22187F68"/>
@@ -2956,7 +3965,7 @@
       </w:pPr>
     </w:lvl>
   </w:abstractNum>
-  <w:abstractNum w:abstractNumId="6" w15:restartNumberingAfterBreak="0">
+  <w:abstractNum w:abstractNumId="7" w15:restartNumberingAfterBreak="0">
     <w:nsid w:val="62CC0746"/>
     <w:multiLevelType w:val="hybridMultilevel"/>
     <w:tmpl w:val="0B4E1364"/>
@@ -3052,10 +4061,10 @@
     <w:abstractNumId w:val="2"/>
   </w:num>
   <w:num w:numId="3">
-    <w:abstractNumId w:val="5"/>
+    <w:abstractNumId w:val="6"/>
   </w:num>
   <w:num w:numId="4">
-    <w:abstractNumId w:val="6"/>
+    <w:abstractNumId w:val="7"/>
   </w:num>
   <w:num w:numId="5">
     <w:abstractNumId w:val="1"/>
@@ -3064,6 +4073,9 @@
     <w:abstractNumId w:val="0"/>
   </w:num>
   <w:num w:numId="7">
+    <w:abstractNumId w:val="5"/>
+  </w:num>
+  <w:num w:numId="8">
     <w:abstractNumId w:val="4"/>
   </w:num>
 </w:numbering>

</xml_diff>

<commit_message>
adicionamos o css reset e finalizamos menu
</commit_message>
<xml_diff>
--- a/Apostila/Apostila Space for Men.docx
+++ b/Apostila/Apostila Space for Men.docx
@@ -111,7 +111,7 @@
         </w:rPr>
         <w:t xml:space="preserve"> desejado no caso foi o </w:t>
       </w:r>
-      <w:hyperlink r:id="rId5" w:history="1">
+      <w:hyperlink r:id="rId6" w:history="1">
         <w:r>
           <w:rPr>
             <w:rStyle w:val="Hyperlink"/>
@@ -266,7 +266,7 @@
                     <pic:cNvPicPr/>
                   </pic:nvPicPr>
                   <pic:blipFill>
-                    <a:blip r:embed="rId6" cstate="print">
+                    <a:blip r:embed="rId7" cstate="print">
                       <a:extLst>
                         <a:ext uri="{28A0092B-C50C-407E-A947-70E740481C1C}">
                           <a14:useLocalDpi xmlns:a14="http://schemas.microsoft.com/office/drawing/2010/main" val="0"/>
@@ -374,7 +374,7 @@
                     <pic:cNvPicPr/>
                   </pic:nvPicPr>
                   <pic:blipFill>
-                    <a:blip r:embed="rId7"/>
+                    <a:blip r:embed="rId8"/>
                     <a:stretch>
                       <a:fillRect/>
                     </a:stretch>
@@ -447,7 +447,7 @@
                     <pic:cNvPicPr/>
                   </pic:nvPicPr>
                   <pic:blipFill>
-                    <a:blip r:embed="rId8">
+                    <a:blip r:embed="rId9">
                       <a:extLst>
                         <a:ext uri="{28A0092B-C50C-407E-A947-70E740481C1C}">
                           <a14:useLocalDpi xmlns:a14="http://schemas.microsoft.com/office/drawing/2010/main" val="0"/>
@@ -522,7 +522,7 @@
                     <pic:cNvPicPr/>
                   </pic:nvPicPr>
                   <pic:blipFill>
-                    <a:blip r:embed="rId9">
+                    <a:blip r:embed="rId10">
                       <a:extLst>
                         <a:ext uri="{28A0092B-C50C-407E-A947-70E740481C1C}">
                           <a14:useLocalDpi xmlns:a14="http://schemas.microsoft.com/office/drawing/2010/main" val="0"/>
@@ -591,15 +591,13 @@
         </w:rPr>
         <w:t xml:space="preserve"> </w:t>
       </w:r>
-      <w:proofErr w:type="spellStart"/>
-      <w:r>
-        <w:rPr>
-          <w:sz w:val="18"/>
-          <w:szCs w:val="18"/>
-        </w:rPr>
-        <w:t>referencia</w:t>
-      </w:r>
-      <w:proofErr w:type="spellEnd"/>
+      <w:r>
+        <w:rPr>
+          <w:sz w:val="18"/>
+          <w:szCs w:val="18"/>
+        </w:rPr>
+        <w:t>referência</w:t>
+      </w:r>
       <w:r>
         <w:rPr>
           <w:sz w:val="18"/>
@@ -660,7 +658,7 @@
                     <pic:cNvPicPr/>
                   </pic:nvPicPr>
                   <pic:blipFill>
-                    <a:blip r:embed="rId10">
+                    <a:blip r:embed="rId11">
                       <a:extLst>
                         <a:ext uri="{28A0092B-C50C-407E-A947-70E740481C1C}">
                           <a14:useLocalDpi xmlns:a14="http://schemas.microsoft.com/office/drawing/2010/main" val="0"/>
@@ -744,7 +742,7 @@
                     <pic:cNvPicPr/>
                   </pic:nvPicPr>
                   <pic:blipFill>
-                    <a:blip r:embed="rId11"/>
+                    <a:blip r:embed="rId12"/>
                     <a:stretch>
                       <a:fillRect/>
                     </a:stretch>
@@ -800,15 +798,13 @@
         </w:rPr>
         <w:t xml:space="preserve">na imagem para que ela ocupe 100% de largura da nossa </w:t>
       </w:r>
-      <w:proofErr w:type="spellStart"/>
-      <w:r>
-        <w:rPr>
-          <w:sz w:val="18"/>
-          <w:szCs w:val="18"/>
-        </w:rPr>
-        <w:t>pagina</w:t>
-      </w:r>
-      <w:proofErr w:type="spellEnd"/>
+      <w:r>
+        <w:rPr>
+          <w:sz w:val="18"/>
+          <w:szCs w:val="18"/>
+        </w:rPr>
+        <w:t>página</w:t>
+      </w:r>
       <w:r>
         <w:rPr>
           <w:sz w:val="18"/>
@@ -843,120 +839,6 @@
             <wp:effectExtent l="0" t="0" r="0" b="0"/>
             <wp:wrapSquare wrapText="bothSides"/>
             <wp:docPr id="13" name="Imagem 13"/>
-            <wp:cNvGraphicFramePr>
-              <a:graphicFrameLocks xmlns:a="http://schemas.openxmlformats.org/drawingml/2006/main" noChangeAspect="1"/>
-            </wp:cNvGraphicFramePr>
-            <a:graphic xmlns:a="http://schemas.openxmlformats.org/drawingml/2006/main">
-              <a:graphicData uri="http://schemas.openxmlformats.org/drawingml/2006/picture">
-                <pic:pic xmlns:pic="http://schemas.openxmlformats.org/drawingml/2006/picture">
-                  <pic:nvPicPr>
-                    <pic:cNvPr id="1" name=""/>
-                    <pic:cNvPicPr/>
-                  </pic:nvPicPr>
-                  <pic:blipFill>
-                    <a:blip r:embed="rId12">
-                      <a:extLst>
-                        <a:ext uri="{28A0092B-C50C-407E-A947-70E740481C1C}">
-                          <a14:useLocalDpi xmlns:a14="http://schemas.microsoft.com/office/drawing/2010/main" val="0"/>
-                        </a:ext>
-                      </a:extLst>
-                    </a:blip>
-                    <a:stretch>
-                      <a:fillRect/>
-                    </a:stretch>
-                  </pic:blipFill>
-                  <pic:spPr>
-                    <a:xfrm>
-                      <a:off x="0" y="0"/>
-                      <a:ext cx="1467055" cy="476316"/>
-                    </a:xfrm>
-                    <a:prstGeom prst="rect">
-                      <a:avLst/>
-                    </a:prstGeom>
-                  </pic:spPr>
-                </pic:pic>
-              </a:graphicData>
-            </a:graphic>
-          </wp:anchor>
-        </w:drawing>
-      </w:r>
-    </w:p>
-    <w:p>
-      <w:pPr>
-        <w:rPr>
-          <w:sz w:val="18"/>
-          <w:szCs w:val="18"/>
-        </w:rPr>
-      </w:pPr>
-    </w:p>
-    <w:p>
-      <w:pPr>
-        <w:rPr>
-          <w:sz w:val="18"/>
-          <w:szCs w:val="18"/>
-        </w:rPr>
-      </w:pPr>
-    </w:p>
-    <w:p>
-      <w:pPr>
-        <w:rPr>
-          <w:sz w:val="18"/>
-          <w:szCs w:val="18"/>
-        </w:rPr>
-      </w:pPr>
-      <w:r>
-        <w:rPr>
-          <w:sz w:val="18"/>
-          <w:szCs w:val="18"/>
-        </w:rPr>
-        <w:t xml:space="preserve">6 – Centralizamos o titulo principal da nossa </w:t>
-      </w:r>
-      <w:proofErr w:type="spellStart"/>
-      <w:r>
-        <w:rPr>
-          <w:sz w:val="18"/>
-          <w:szCs w:val="18"/>
-        </w:rPr>
-        <w:t>pagina</w:t>
-      </w:r>
-      <w:proofErr w:type="spellEnd"/>
-      <w:r>
-        <w:rPr>
-          <w:sz w:val="18"/>
-          <w:szCs w:val="18"/>
-        </w:rPr>
-        <w:t>.</w:t>
-      </w:r>
-    </w:p>
-    <w:p>
-      <w:pPr>
-        <w:tabs>
-          <w:tab w:val="left" w:pos="1200"/>
-        </w:tabs>
-        <w:rPr>
-          <w:sz w:val="18"/>
-          <w:szCs w:val="18"/>
-        </w:rPr>
-      </w:pPr>
-      <w:r>
-        <w:rPr>
-          <w:noProof/>
-          <w:sz w:val="18"/>
-          <w:szCs w:val="18"/>
-        </w:rPr>
-        <w:drawing>
-          <wp:anchor distT="0" distB="0" distL="114300" distR="114300" simplePos="0" relativeHeight="251666432" behindDoc="0" locked="0" layoutInCell="1" allowOverlap="1" wp14:anchorId="1157043F">
-            <wp:simplePos x="0" y="0"/>
-            <wp:positionH relativeFrom="margin">
-              <wp:align>left</wp:align>
-            </wp:positionH>
-            <wp:positionV relativeFrom="paragraph">
-              <wp:posOffset>10968355</wp:posOffset>
-            </wp:positionV>
-            <wp:extent cx="1552575" cy="495300"/>
-            <wp:effectExtent l="0" t="0" r="9525" b="0"/>
-            <wp:wrapSquare wrapText="bothSides"/>
-            <wp:docPr id="14" name="Imagem 14"/>
             <wp:cNvGraphicFramePr>
               <a:graphicFrameLocks xmlns:a="http://schemas.openxmlformats.org/drawingml/2006/main" noChangeAspect="1"/>
             </wp:cNvGraphicFramePr>
@@ -982,6 +864,118 @@
                   <pic:spPr>
                     <a:xfrm>
                       <a:off x="0" y="0"/>
+                      <a:ext cx="1467055" cy="476316"/>
+                    </a:xfrm>
+                    <a:prstGeom prst="rect">
+                      <a:avLst/>
+                    </a:prstGeom>
+                  </pic:spPr>
+                </pic:pic>
+              </a:graphicData>
+            </a:graphic>
+          </wp:anchor>
+        </w:drawing>
+      </w:r>
+    </w:p>
+    <w:p>
+      <w:pPr>
+        <w:rPr>
+          <w:sz w:val="18"/>
+          <w:szCs w:val="18"/>
+        </w:rPr>
+      </w:pPr>
+    </w:p>
+    <w:p>
+      <w:pPr>
+        <w:rPr>
+          <w:sz w:val="18"/>
+          <w:szCs w:val="18"/>
+        </w:rPr>
+      </w:pPr>
+    </w:p>
+    <w:p>
+      <w:pPr>
+        <w:rPr>
+          <w:sz w:val="18"/>
+          <w:szCs w:val="18"/>
+        </w:rPr>
+      </w:pPr>
+      <w:r>
+        <w:rPr>
+          <w:sz w:val="18"/>
+          <w:szCs w:val="18"/>
+        </w:rPr>
+        <w:t xml:space="preserve">6 – Centralizamos o titulo principal da nossa </w:t>
+      </w:r>
+      <w:r>
+        <w:rPr>
+          <w:sz w:val="18"/>
+          <w:szCs w:val="18"/>
+        </w:rPr>
+        <w:t>página</w:t>
+      </w:r>
+      <w:r>
+        <w:rPr>
+          <w:sz w:val="18"/>
+          <w:szCs w:val="18"/>
+        </w:rPr>
+        <w:t>.</w:t>
+      </w:r>
+    </w:p>
+    <w:p>
+      <w:pPr>
+        <w:tabs>
+          <w:tab w:val="left" w:pos="1200"/>
+        </w:tabs>
+        <w:rPr>
+          <w:sz w:val="18"/>
+          <w:szCs w:val="18"/>
+        </w:rPr>
+      </w:pPr>
+      <w:r>
+        <w:rPr>
+          <w:noProof/>
+          <w:sz w:val="18"/>
+          <w:szCs w:val="18"/>
+        </w:rPr>
+        <w:drawing>
+          <wp:anchor distT="0" distB="0" distL="114300" distR="114300" simplePos="0" relativeHeight="251666432" behindDoc="0" locked="0" layoutInCell="1" allowOverlap="1" wp14:anchorId="1157043F">
+            <wp:simplePos x="0" y="0"/>
+            <wp:positionH relativeFrom="margin">
+              <wp:align>left</wp:align>
+            </wp:positionH>
+            <wp:positionV relativeFrom="paragraph">
+              <wp:posOffset>10968355</wp:posOffset>
+            </wp:positionV>
+            <wp:extent cx="1552575" cy="495300"/>
+            <wp:effectExtent l="0" t="0" r="9525" b="0"/>
+            <wp:wrapSquare wrapText="bothSides"/>
+            <wp:docPr id="14" name="Imagem 14"/>
+            <wp:cNvGraphicFramePr>
+              <a:graphicFrameLocks xmlns:a="http://schemas.openxmlformats.org/drawingml/2006/main" noChangeAspect="1"/>
+            </wp:cNvGraphicFramePr>
+            <a:graphic xmlns:a="http://schemas.openxmlformats.org/drawingml/2006/main">
+              <a:graphicData uri="http://schemas.openxmlformats.org/drawingml/2006/picture">
+                <pic:pic xmlns:pic="http://schemas.openxmlformats.org/drawingml/2006/picture">
+                  <pic:nvPicPr>
+                    <pic:cNvPr id="1" name=""/>
+                    <pic:cNvPicPr/>
+                  </pic:nvPicPr>
+                  <pic:blipFill>
+                    <a:blip r:embed="rId14">
+                      <a:extLst>
+                        <a:ext uri="{28A0092B-C50C-407E-A947-70E740481C1C}">
+                          <a14:useLocalDpi xmlns:a14="http://schemas.microsoft.com/office/drawing/2010/main" val="0"/>
+                        </a:ext>
+                      </a:extLst>
+                    </a:blip>
+                    <a:stretch>
+                      <a:fillRect/>
+                    </a:stretch>
+                  </pic:blipFill>
+                  <pic:spPr>
+                    <a:xfrm>
+                      <a:off x="0" y="0"/>
                       <a:ext cx="1552575" cy="495300"/>
                     </a:xfrm>
                     <a:prstGeom prst="rect">
@@ -1094,7 +1088,7 @@
                     <pic:cNvPicPr/>
                   </pic:nvPicPr>
                   <pic:blipFill>
-                    <a:blip r:embed="rId14"/>
+                    <a:blip r:embed="rId15"/>
                     <a:stretch>
                       <a:fillRect/>
                     </a:stretch>
@@ -1155,7 +1149,7 @@
                     <pic:cNvPicPr/>
                   </pic:nvPicPr>
                   <pic:blipFill>
-                    <a:blip r:embed="rId15">
+                    <a:blip r:embed="rId16">
                       <a:extLst>
                         <a:ext uri="{28A0092B-C50C-407E-A947-70E740481C1C}">
                           <a14:useLocalDpi xmlns:a14="http://schemas.microsoft.com/office/drawing/2010/main" val="0"/>
@@ -1255,7 +1249,7 @@
                     <pic:cNvPicPr/>
                   </pic:nvPicPr>
                   <pic:blipFill>
-                    <a:blip r:embed="rId16"/>
+                    <a:blip r:embed="rId17"/>
                     <a:stretch>
                       <a:fillRect/>
                     </a:stretch>
@@ -1361,7 +1355,7 @@
                     <pic:cNvPicPr/>
                   </pic:nvPicPr>
                   <pic:blipFill>
-                    <a:blip r:embed="rId17"/>
+                    <a:blip r:embed="rId18"/>
                     <a:stretch>
                       <a:fillRect/>
                     </a:stretch>
@@ -1420,7 +1414,7 @@
                     <pic:cNvPicPr/>
                   </pic:nvPicPr>
                   <pic:blipFill>
-                    <a:blip r:embed="rId18">
+                    <a:blip r:embed="rId19">
                       <a:extLst>
                         <a:ext uri="{28A0092B-C50C-407E-A947-70E740481C1C}">
                           <a14:useLocalDpi xmlns:a14="http://schemas.microsoft.com/office/drawing/2010/main" val="0"/>
@@ -1534,7 +1528,7 @@
                     <pic:cNvPicPr/>
                   </pic:nvPicPr>
                   <pic:blipFill>
-                    <a:blip r:embed="rId19"/>
+                    <a:blip r:embed="rId20"/>
                     <a:stretch>
                       <a:fillRect/>
                     </a:stretch>
@@ -1636,7 +1630,7 @@
                     <pic:cNvPicPr/>
                   </pic:nvPicPr>
                   <pic:blipFill>
-                    <a:blip r:embed="rId20">
+                    <a:blip r:embed="rId21">
                       <a:extLst>
                         <a:ext uri="{28A0092B-C50C-407E-A947-70E740481C1C}">
                           <a14:useLocalDpi xmlns:a14="http://schemas.microsoft.com/office/drawing/2010/main" val="0"/>
@@ -1716,7 +1710,7 @@
                     <pic:cNvPicPr/>
                   </pic:nvPicPr>
                   <pic:blipFill>
-                    <a:blip r:embed="rId21" cstate="print">
+                    <a:blip r:embed="rId22" cstate="print">
                       <a:extLst>
                         <a:ext uri="{28A0092B-C50C-407E-A947-70E740481C1C}">
                           <a14:useLocalDpi xmlns:a14="http://schemas.microsoft.com/office/drawing/2010/main" val="0"/>
@@ -1844,7 +1838,7 @@
                     <pic:cNvPicPr/>
                   </pic:nvPicPr>
                   <pic:blipFill>
-                    <a:blip r:embed="rId22"/>
+                    <a:blip r:embed="rId23"/>
                     <a:stretch>
                       <a:fillRect/>
                     </a:stretch>
@@ -1922,7 +1916,7 @@
                     <pic:cNvPicPr/>
                   </pic:nvPicPr>
                   <pic:blipFill>
-                    <a:blip r:embed="rId23"/>
+                    <a:blip r:embed="rId24"/>
                     <a:stretch>
                       <a:fillRect/>
                     </a:stretch>
@@ -2022,7 +2016,7 @@
                     <pic:cNvPicPr/>
                   </pic:nvPicPr>
                   <pic:blipFill>
-                    <a:blip r:embed="rId24">
+                    <a:blip r:embed="rId25">
                       <a:extLst>
                         <a:ext uri="{28A0092B-C50C-407E-A947-70E740481C1C}">
                           <a14:useLocalDpi xmlns:a14="http://schemas.microsoft.com/office/drawing/2010/main" val="0"/>
@@ -2152,7 +2146,7 @@
                     <pic:cNvPicPr/>
                   </pic:nvPicPr>
                   <pic:blipFill>
-                    <a:blip r:embed="rId25">
+                    <a:blip r:embed="rId26">
                       <a:extLst>
                         <a:ext uri="{28A0092B-C50C-407E-A947-70E740481C1C}">
                           <a14:useLocalDpi xmlns:a14="http://schemas.microsoft.com/office/drawing/2010/main" val="0"/>
@@ -2284,7 +2278,7 @@
                     <pic:cNvPicPr/>
                   </pic:nvPicPr>
                   <pic:blipFill>
-                    <a:blip r:embed="rId26">
+                    <a:blip r:embed="rId27">
                       <a:extLst>
                         <a:ext uri="{28A0092B-C50C-407E-A947-70E740481C1C}">
                           <a14:useLocalDpi xmlns:a14="http://schemas.microsoft.com/office/drawing/2010/main" val="0"/>
@@ -2388,7 +2382,7 @@
                     <pic:cNvPicPr/>
                   </pic:nvPicPr>
                   <pic:blipFill>
-                    <a:blip r:embed="rId27"/>
+                    <a:blip r:embed="rId28"/>
                     <a:stretch>
                       <a:fillRect/>
                     </a:stretch>
@@ -2480,7 +2474,7 @@
                     <pic:cNvPicPr/>
                   </pic:nvPicPr>
                   <pic:blipFill>
-                    <a:blip r:embed="rId28">
+                    <a:blip r:embed="rId29">
                       <a:extLst>
                         <a:ext uri="{28A0092B-C50C-407E-A947-70E740481C1C}">
                           <a14:useLocalDpi xmlns:a14="http://schemas.microsoft.com/office/drawing/2010/main" val="0"/>
@@ -2628,7 +2622,7 @@
                     <pic:cNvPicPr/>
                   </pic:nvPicPr>
                   <pic:blipFill>
-                    <a:blip r:embed="rId29"/>
+                    <a:blip r:embed="rId30"/>
                     <a:stretch>
                       <a:fillRect/>
                     </a:stretch>
@@ -2742,7 +2736,7 @@
                     <pic:cNvPicPr/>
                   </pic:nvPicPr>
                   <pic:blipFill>
-                    <a:blip r:embed="rId30"/>
+                    <a:blip r:embed="rId31"/>
                     <a:stretch>
                       <a:fillRect/>
                     </a:stretch>
@@ -2924,7 +2918,23 @@
           <w:sz w:val="18"/>
           <w:szCs w:val="18"/>
         </w:rPr>
-        <w:t>No Css utilizamos a nav li para coçocar os itens um ao lado do outro e colocamos espaço entre os itens.</w:t>
+        <w:t xml:space="preserve">No </w:t>
+      </w:r>
+      <w:r>
+        <w:rPr>
+          <w:noProof/>
+          <w:sz w:val="18"/>
+          <w:szCs w:val="18"/>
+        </w:rPr>
+        <w:t>c</w:t>
+      </w:r>
+      <w:r>
+        <w:rPr>
+          <w:noProof/>
+          <w:sz w:val="18"/>
+          <w:szCs w:val="18"/>
+        </w:rPr>
+        <w:t>ss utilizamos a nav li para coçocar os itens um ao lado do outro e colocamos espaço entre os itens.</w:t>
       </w:r>
     </w:p>
     <w:p>
@@ -2960,7 +2970,7 @@
                     <pic:cNvPicPr/>
                   </pic:nvPicPr>
                   <pic:blipFill>
-                    <a:blip r:embed="rId31"/>
+                    <a:blip r:embed="rId32"/>
                     <a:stretch>
                       <a:fillRect/>
                     </a:stretch>
@@ -3022,7 +3032,7 @@
                     <pic:cNvPicPr/>
                   </pic:nvPicPr>
                   <pic:blipFill>
-                    <a:blip r:embed="rId32">
+                    <a:blip r:embed="rId33">
                       <a:extLst>
                         <a:ext uri="{28A0092B-C50C-407E-A947-70E740481C1C}">
                           <a14:useLocalDpi xmlns:a14="http://schemas.microsoft.com/office/drawing/2010/main" val="0"/>
@@ -3231,8 +3241,652 @@
         </w:rPr>
         <w:t xml:space="preserve">23- </w:t>
       </w:r>
+      <w:r>
+        <w:rPr>
+          <w:noProof/>
+          <w:sz w:val="18"/>
+          <w:szCs w:val="18"/>
+        </w:rPr>
+        <w:t>Trabalhando com posicionamento</w:t>
+      </w:r>
+    </w:p>
+    <w:p>
+      <w:pPr>
+        <w:pStyle w:val="PargrafodaLista"/>
+        <w:numPr>
+          <w:ilvl w:val="0"/>
+          <w:numId w:val="9"/>
+        </w:numPr>
+        <w:tabs>
+          <w:tab w:val="left" w:pos="1200"/>
+        </w:tabs>
+        <w:rPr>
+          <w:b/>
+          <w:noProof/>
+          <w:sz w:val="18"/>
+          <w:szCs w:val="18"/>
+        </w:rPr>
+      </w:pPr>
+      <w:r>
+        <w:rPr>
+          <w:b/>
+          <w:noProof/>
+          <w:sz w:val="18"/>
+          <w:szCs w:val="18"/>
+        </w:rPr>
+        <w:t>Static</w:t>
+      </w:r>
+    </w:p>
+    <w:p>
+      <w:pPr>
+        <w:pStyle w:val="PargrafodaLista"/>
+        <w:numPr>
+          <w:ilvl w:val="0"/>
+          <w:numId w:val="9"/>
+        </w:numPr>
+        <w:tabs>
+          <w:tab w:val="left" w:pos="1200"/>
+        </w:tabs>
+        <w:rPr>
+          <w:b/>
+          <w:noProof/>
+          <w:sz w:val="18"/>
+          <w:szCs w:val="18"/>
+        </w:rPr>
+      </w:pPr>
+      <w:r>
+        <w:rPr>
+          <w:b/>
+          <w:noProof/>
+          <w:sz w:val="18"/>
+          <w:szCs w:val="18"/>
+        </w:rPr>
+        <w:t>Relative</w:t>
+      </w:r>
+    </w:p>
+    <w:p>
+      <w:pPr>
+        <w:pStyle w:val="PargrafodaLista"/>
+        <w:numPr>
+          <w:ilvl w:val="0"/>
+          <w:numId w:val="9"/>
+        </w:numPr>
+        <w:tabs>
+          <w:tab w:val="left" w:pos="1200"/>
+        </w:tabs>
+        <w:rPr>
+          <w:b/>
+          <w:noProof/>
+          <w:sz w:val="18"/>
+          <w:szCs w:val="18"/>
+        </w:rPr>
+      </w:pPr>
+      <w:r>
+        <w:rPr>
+          <w:b/>
+          <w:noProof/>
+          <w:sz w:val="18"/>
+          <w:szCs w:val="18"/>
+        </w:rPr>
+        <w:t>Absolute</w:t>
+      </w:r>
+    </w:p>
+    <w:p>
+      <w:pPr>
+        <w:tabs>
+          <w:tab w:val="left" w:pos="1200"/>
+        </w:tabs>
+        <w:rPr>
+          <w:noProof/>
+          <w:sz w:val="18"/>
+          <w:szCs w:val="18"/>
+        </w:rPr>
+      </w:pPr>
+      <w:r>
+        <w:rPr>
+          <w:noProof/>
+          <w:sz w:val="18"/>
+          <w:szCs w:val="18"/>
+        </w:rPr>
+        <w:t xml:space="preserve">Na position </w:t>
+      </w:r>
+      <w:r>
+        <w:rPr>
+          <w:b/>
+          <w:noProof/>
+          <w:sz w:val="18"/>
+          <w:szCs w:val="18"/>
+        </w:rPr>
+        <w:t>static</w:t>
+      </w:r>
+      <w:r>
+        <w:rPr>
+          <w:noProof/>
+          <w:sz w:val="18"/>
+          <w:szCs w:val="18"/>
+        </w:rPr>
+        <w:t xml:space="preserve"> -&gt; como o nome diz a posição fica parada no ponto inicial.</w:t>
+      </w:r>
+    </w:p>
+    <w:p>
+      <w:pPr>
+        <w:tabs>
+          <w:tab w:val="left" w:pos="1200"/>
+        </w:tabs>
+        <w:rPr>
+          <w:noProof/>
+          <w:sz w:val="18"/>
+          <w:szCs w:val="18"/>
+        </w:rPr>
+      </w:pPr>
+      <w:r>
+        <w:rPr>
+          <w:noProof/>
+          <w:sz w:val="18"/>
+          <w:szCs w:val="18"/>
+        </w:rPr>
+        <w:t xml:space="preserve">Na position </w:t>
+      </w:r>
+      <w:r>
+        <w:rPr>
+          <w:b/>
+          <w:noProof/>
+          <w:sz w:val="18"/>
+          <w:szCs w:val="18"/>
+        </w:rPr>
+        <w:t>relative</w:t>
+      </w:r>
+      <w:r>
+        <w:rPr>
+          <w:noProof/>
+          <w:sz w:val="18"/>
+          <w:szCs w:val="18"/>
+        </w:rPr>
+        <w:t xml:space="preserve"> -&gt; ele anda conforme sua posição original.</w:t>
+      </w:r>
+    </w:p>
+    <w:p>
+      <w:pPr>
+        <w:tabs>
+          <w:tab w:val="left" w:pos="1200"/>
+        </w:tabs>
+        <w:rPr>
+          <w:noProof/>
+          <w:sz w:val="18"/>
+          <w:szCs w:val="18"/>
+        </w:rPr>
+      </w:pPr>
+      <w:r>
+        <w:rPr>
+          <w:noProof/>
+          <w:sz w:val="18"/>
+          <w:szCs w:val="18"/>
+        </w:rPr>
+        <w:t xml:space="preserve">Na position </w:t>
+      </w:r>
+      <w:r>
+        <w:rPr>
+          <w:b/>
+          <w:noProof/>
+          <w:sz w:val="18"/>
+          <w:szCs w:val="18"/>
+        </w:rPr>
+        <w:t>absolute</w:t>
+      </w:r>
+      <w:r>
+        <w:rPr>
+          <w:noProof/>
+          <w:sz w:val="18"/>
+          <w:szCs w:val="18"/>
+        </w:rPr>
+        <w:t xml:space="preserve"> -&gt; é absoluto ao site ignorando a posição inicial.</w:t>
+      </w:r>
+    </w:p>
+    <w:p>
+      <w:pPr>
+        <w:tabs>
+          <w:tab w:val="left" w:pos="1200"/>
+        </w:tabs>
+        <w:rPr>
+          <w:noProof/>
+          <w:sz w:val="18"/>
+          <w:szCs w:val="18"/>
+        </w:rPr>
+      </w:pPr>
+      <w:r>
+        <w:rPr>
+          <w:noProof/>
+          <w:sz w:val="18"/>
+          <w:szCs w:val="18"/>
+        </w:rPr>
+        <w:t>Para centralizar o menu utilizamos:</w:t>
+      </w:r>
+    </w:p>
+    <w:p>
+      <w:pPr>
+        <w:tabs>
+          <w:tab w:val="left" w:pos="1200"/>
+        </w:tabs>
+        <w:rPr>
+          <w:noProof/>
+          <w:sz w:val="18"/>
+          <w:szCs w:val="18"/>
+        </w:rPr>
+      </w:pPr>
+      <w:r>
+        <w:rPr>
+          <w:noProof/>
+          <w:sz w:val="18"/>
+          <w:szCs w:val="18"/>
+        </w:rPr>
+        <w:drawing>
+          <wp:inline distT="0" distB="0" distL="0" distR="0" wp14:anchorId="65E00149" wp14:editId="17F6DEFC">
+            <wp:extent cx="1981477" cy="1162212"/>
+            <wp:effectExtent l="0" t="0" r="0" b="0"/>
+            <wp:docPr id="11" name="Imagem 11"/>
+            <wp:cNvGraphicFramePr>
+              <a:graphicFrameLocks xmlns:a="http://schemas.openxmlformats.org/drawingml/2006/main" noChangeAspect="1"/>
+            </wp:cNvGraphicFramePr>
+            <a:graphic xmlns:a="http://schemas.openxmlformats.org/drawingml/2006/main">
+              <a:graphicData uri="http://schemas.openxmlformats.org/drawingml/2006/picture">
+                <pic:pic xmlns:pic="http://schemas.openxmlformats.org/drawingml/2006/picture">
+                  <pic:nvPicPr>
+                    <pic:cNvPr id="1" name=""/>
+                    <pic:cNvPicPr/>
+                  </pic:nvPicPr>
+                  <pic:blipFill>
+                    <a:blip r:embed="rId34"/>
+                    <a:stretch>
+                      <a:fillRect/>
+                    </a:stretch>
+                  </pic:blipFill>
+                  <pic:spPr>
+                    <a:xfrm>
+                      <a:off x="0" y="0"/>
+                      <a:ext cx="1981477" cy="1162212"/>
+                    </a:xfrm>
+                    <a:prstGeom prst="rect">
+                      <a:avLst/>
+                    </a:prstGeom>
+                  </pic:spPr>
+                </pic:pic>
+              </a:graphicData>
+            </a:graphic>
+          </wp:inline>
+        </w:drawing>
+      </w:r>
+    </w:p>
+    <w:p>
+      <w:pPr>
+        <w:tabs>
+          <w:tab w:val="left" w:pos="1200"/>
+        </w:tabs>
+        <w:rPr>
+          <w:noProof/>
+          <w:sz w:val="18"/>
+          <w:szCs w:val="18"/>
+        </w:rPr>
+      </w:pPr>
+      <w:r>
+        <w:rPr>
+          <w:noProof/>
+          <w:sz w:val="18"/>
+          <w:szCs w:val="18"/>
+        </w:rPr>
+        <w:t xml:space="preserve">24- </w:t>
+      </w:r>
+      <w:r>
+        <w:rPr>
+          <w:noProof/>
+          <w:sz w:val="18"/>
+          <w:szCs w:val="18"/>
+        </w:rPr>
+        <w:t>Para r</w:t>
+      </w:r>
+      <w:r>
+        <w:rPr>
+          <w:noProof/>
+          <w:sz w:val="18"/>
+          <w:szCs w:val="18"/>
+        </w:rPr>
+        <w:t>esetar o css do navegador utilizamos o reset.css que pegamos do seguinte site:</w:t>
+      </w:r>
+    </w:p>
+    <w:p>
+      <w:pPr>
+        <w:tabs>
+          <w:tab w:val="left" w:pos="1200"/>
+        </w:tabs>
+        <w:rPr>
+          <w:noProof/>
+          <w:sz w:val="18"/>
+          <w:szCs w:val="18"/>
+        </w:rPr>
+      </w:pPr>
+      <w:hyperlink r:id="rId35" w:history="1">
+        <w:r>
+          <w:rPr>
+            <w:rStyle w:val="Hyperlink"/>
+            <w:noProof/>
+            <w:sz w:val="18"/>
+            <w:szCs w:val="18"/>
+          </w:rPr>
+          <w:t>https://meyerweb.com/eric/tools/css/reset/</w:t>
+        </w:r>
+      </w:hyperlink>
+    </w:p>
+    <w:p>
+      <w:pPr>
+        <w:tabs>
+          <w:tab w:val="left" w:pos="1200"/>
+        </w:tabs>
+        <w:rPr>
+          <w:noProof/>
+          <w:sz w:val="18"/>
+          <w:szCs w:val="18"/>
+        </w:rPr>
+      </w:pPr>
+      <w:r>
+        <w:rPr>
+          <w:noProof/>
+          <w:sz w:val="18"/>
+          <w:szCs w:val="18"/>
+        </w:rPr>
+        <w:t>obs: O reset.css deve sempre ficar na parte de cima do nosso css (da página)</w:t>
+      </w:r>
+    </w:p>
+    <w:p>
+      <w:pPr>
+        <w:tabs>
+          <w:tab w:val="left" w:pos="1200"/>
+        </w:tabs>
+        <w:rPr>
+          <w:noProof/>
+          <w:sz w:val="18"/>
+          <w:szCs w:val="18"/>
+        </w:rPr>
+      </w:pPr>
+      <w:r>
+        <w:rPr>
+          <w:noProof/>
+          <w:sz w:val="18"/>
+          <w:szCs w:val="18"/>
+        </w:rPr>
+        <w:drawing>
+          <wp:inline distT="0" distB="0" distL="0" distR="0" wp14:anchorId="5273BA84" wp14:editId="46B4C5F7">
+            <wp:extent cx="5887272" cy="1267002"/>
+            <wp:effectExtent l="0" t="0" r="0" b="9525"/>
+            <wp:docPr id="32" name="Imagem 32"/>
+            <wp:cNvGraphicFramePr>
+              <a:graphicFrameLocks xmlns:a="http://schemas.openxmlformats.org/drawingml/2006/main" noChangeAspect="1"/>
+            </wp:cNvGraphicFramePr>
+            <a:graphic xmlns:a="http://schemas.openxmlformats.org/drawingml/2006/main">
+              <a:graphicData uri="http://schemas.openxmlformats.org/drawingml/2006/picture">
+                <pic:pic xmlns:pic="http://schemas.openxmlformats.org/drawingml/2006/picture">
+                  <pic:nvPicPr>
+                    <pic:cNvPr id="1" name=""/>
+                    <pic:cNvPicPr/>
+                  </pic:nvPicPr>
+                  <pic:blipFill>
+                    <a:blip r:embed="rId36"/>
+                    <a:stretch>
+                      <a:fillRect/>
+                    </a:stretch>
+                  </pic:blipFill>
+                  <pic:spPr>
+                    <a:xfrm>
+                      <a:off x="0" y="0"/>
+                      <a:ext cx="5887272" cy="1267002"/>
+                    </a:xfrm>
+                    <a:prstGeom prst="rect">
+                      <a:avLst/>
+                    </a:prstGeom>
+                  </pic:spPr>
+                </pic:pic>
+              </a:graphicData>
+            </a:graphic>
+          </wp:inline>
+        </w:drawing>
+      </w:r>
+    </w:p>
+    <w:p>
+      <w:pPr>
+        <w:tabs>
+          <w:tab w:val="left" w:pos="1200"/>
+        </w:tabs>
+        <w:rPr>
+          <w:noProof/>
+          <w:sz w:val="18"/>
+          <w:szCs w:val="18"/>
+        </w:rPr>
+      </w:pPr>
+      <w:r>
+        <w:rPr>
+          <w:noProof/>
+          <w:sz w:val="18"/>
+          <w:szCs w:val="18"/>
+        </w:rPr>
+        <w:t xml:space="preserve">25-  </w:t>
+      </w:r>
+      <w:r>
+        <w:rPr>
+          <w:noProof/>
+          <w:sz w:val="18"/>
+          <w:szCs w:val="18"/>
+        </w:rPr>
+        <w:t>Para centralizar o logo</w:t>
+      </w:r>
+      <w:r>
+        <w:rPr>
+          <w:noProof/>
+          <w:sz w:val="18"/>
+          <w:szCs w:val="18"/>
+        </w:rPr>
+        <w:t xml:space="preserve"> e menu dentro do header utilizamos uma div chamada caixa.</w:t>
+      </w:r>
+    </w:p>
+    <w:p>
+      <w:pPr>
+        <w:tabs>
+          <w:tab w:val="left" w:pos="1200"/>
+        </w:tabs>
+        <w:rPr>
+          <w:noProof/>
+          <w:sz w:val="18"/>
+          <w:szCs w:val="18"/>
+        </w:rPr>
+      </w:pPr>
+      <w:r>
+        <w:rPr>
+          <w:noProof/>
+          <w:sz w:val="18"/>
+          <w:szCs w:val="18"/>
+        </w:rPr>
+        <w:drawing>
+          <wp:inline distT="0" distB="0" distL="0" distR="0" wp14:anchorId="04B5B805" wp14:editId="5BE5E100">
+            <wp:extent cx="4963218" cy="2162477"/>
+            <wp:effectExtent l="0" t="0" r="8890" b="9525"/>
+            <wp:docPr id="33" name="Imagem 33"/>
+            <wp:cNvGraphicFramePr>
+              <a:graphicFrameLocks xmlns:a="http://schemas.openxmlformats.org/drawingml/2006/main" noChangeAspect="1"/>
+            </wp:cNvGraphicFramePr>
+            <a:graphic xmlns:a="http://schemas.openxmlformats.org/drawingml/2006/main">
+              <a:graphicData uri="http://schemas.openxmlformats.org/drawingml/2006/picture">
+                <pic:pic xmlns:pic="http://schemas.openxmlformats.org/drawingml/2006/picture">
+                  <pic:nvPicPr>
+                    <pic:cNvPr id="1" name=""/>
+                    <pic:cNvPicPr/>
+                  </pic:nvPicPr>
+                  <pic:blipFill>
+                    <a:blip r:embed="rId37"/>
+                    <a:stretch>
+                      <a:fillRect/>
+                    </a:stretch>
+                  </pic:blipFill>
+                  <pic:spPr>
+                    <a:xfrm>
+                      <a:off x="0" y="0"/>
+                      <a:ext cx="4963218" cy="2162477"/>
+                    </a:xfrm>
+                    <a:prstGeom prst="rect">
+                      <a:avLst/>
+                    </a:prstGeom>
+                  </pic:spPr>
+                </pic:pic>
+              </a:graphicData>
+            </a:graphic>
+          </wp:inline>
+        </w:drawing>
+      </w:r>
+    </w:p>
+    <w:p>
+      <w:pPr>
+        <w:tabs>
+          <w:tab w:val="left" w:pos="1200"/>
+        </w:tabs>
+        <w:rPr>
+          <w:noProof/>
+          <w:sz w:val="18"/>
+          <w:szCs w:val="18"/>
+        </w:rPr>
+      </w:pPr>
+      <w:r>
+        <w:rPr>
+          <w:noProof/>
+          <w:sz w:val="18"/>
+          <w:szCs w:val="18"/>
+        </w:rPr>
+        <w:t xml:space="preserve">26- </w:t>
+      </w:r>
+      <w:r>
+        <w:rPr>
+          <w:noProof/>
+          <w:sz w:val="18"/>
+          <w:szCs w:val="18"/>
+        </w:rPr>
+        <w:t xml:space="preserve"> No css na div .caixa utilizamos:</w:t>
+      </w:r>
+    </w:p>
+    <w:p>
+      <w:pPr>
+        <w:pStyle w:val="PargrafodaLista"/>
+        <w:numPr>
+          <w:ilvl w:val="0"/>
+          <w:numId w:val="11"/>
+        </w:numPr>
+        <w:tabs>
+          <w:tab w:val="left" w:pos="1200"/>
+        </w:tabs>
+        <w:rPr>
+          <w:noProof/>
+          <w:sz w:val="18"/>
+          <w:szCs w:val="18"/>
+        </w:rPr>
+      </w:pPr>
+      <w:r>
+        <w:rPr>
+          <w:noProof/>
+          <w:sz w:val="18"/>
+          <w:szCs w:val="18"/>
+        </w:rPr>
+        <w:t>Definimos uma largura para div 940px</w:t>
+      </w:r>
+    </w:p>
+    <w:p>
+      <w:pPr>
+        <w:pStyle w:val="PargrafodaLista"/>
+        <w:numPr>
+          <w:ilvl w:val="0"/>
+          <w:numId w:val="11"/>
+        </w:numPr>
+        <w:tabs>
+          <w:tab w:val="left" w:pos="1200"/>
+        </w:tabs>
+        <w:rPr>
+          <w:noProof/>
+          <w:sz w:val="18"/>
+          <w:szCs w:val="18"/>
+        </w:rPr>
+      </w:pPr>
+      <w:r>
+        <w:rPr>
+          <w:noProof/>
+          <w:sz w:val="18"/>
+          <w:szCs w:val="18"/>
+        </w:rPr>
+        <w:t>Utilizamos margin: 0 auto para deixar tanto o logo como o menu centralizados</w:t>
+      </w:r>
+    </w:p>
+    <w:p>
+      <w:pPr>
+        <w:pStyle w:val="PargrafodaLista"/>
+        <w:numPr>
+          <w:ilvl w:val="0"/>
+          <w:numId w:val="11"/>
+        </w:numPr>
+        <w:tabs>
+          <w:tab w:val="left" w:pos="1200"/>
+        </w:tabs>
+        <w:rPr>
+          <w:noProof/>
+          <w:sz w:val="18"/>
+          <w:szCs w:val="18"/>
+        </w:rPr>
+      </w:pPr>
+      <w:r>
+        <w:rPr>
+          <w:noProof/>
+          <w:sz w:val="18"/>
+          <w:szCs w:val="18"/>
+        </w:rPr>
+        <w:t>E position relative para o menu andar conforme sua posição</w:t>
+      </w:r>
       <w:bookmarkStart w:id="0" w:name="_GoBack"/>
       <w:bookmarkEnd w:id="0"/>
+    </w:p>
+    <w:p>
+      <w:pPr>
+        <w:tabs>
+          <w:tab w:val="left" w:pos="1200"/>
+        </w:tabs>
+      </w:pPr>
+      <w:r>
+        <w:drawing>
+          <wp:inline distT="0" distB="0" distL="0" distR="0" wp14:anchorId="12404C75" wp14:editId="77B727BC">
+            <wp:extent cx="2029108" cy="1066949"/>
+            <wp:effectExtent l="0" t="0" r="9525" b="0"/>
+            <wp:docPr id="36" name="Imagem 36"/>
+            <wp:cNvGraphicFramePr>
+              <a:graphicFrameLocks xmlns:a="http://schemas.openxmlformats.org/drawingml/2006/main" noChangeAspect="1"/>
+            </wp:cNvGraphicFramePr>
+            <a:graphic xmlns:a="http://schemas.openxmlformats.org/drawingml/2006/main">
+              <a:graphicData uri="http://schemas.openxmlformats.org/drawingml/2006/picture">
+                <pic:pic xmlns:pic="http://schemas.openxmlformats.org/drawingml/2006/picture">
+                  <pic:nvPicPr>
+                    <pic:cNvPr id="1" name=""/>
+                    <pic:cNvPicPr/>
+                  </pic:nvPicPr>
+                  <pic:blipFill>
+                    <a:blip r:embed="rId38"/>
+                    <a:stretch>
+                      <a:fillRect/>
+                    </a:stretch>
+                  </pic:blipFill>
+                  <pic:spPr>
+                    <a:xfrm>
+                      <a:off x="0" y="0"/>
+                      <a:ext cx="2029108" cy="1066949"/>
+                    </a:xfrm>
+                    <a:prstGeom prst="rect">
+                      <a:avLst/>
+                    </a:prstGeom>
+                  </pic:spPr>
+                </pic:pic>
+              </a:graphicData>
+            </a:graphic>
+          </wp:inline>
+        </w:drawing>
+      </w:r>
     </w:p>
     <w:sectPr>
       <w:pgSz w:w="11906" w:h="16838"/>
@@ -3562,6 +4216,119 @@
     </w:lvl>
   </w:abstractNum>
   <w:abstractNum w:abstractNumId="3" w15:restartNumberingAfterBreak="0">
+    <w:nsid w:val="2CC94BA1"/>
+    <w:multiLevelType w:val="hybridMultilevel"/>
+    <w:tmpl w:val="9F866F98"/>
+    <w:lvl w:ilvl="0" w:tplc="04160001">
+      <w:start w:val="1"/>
+      <w:numFmt w:val="bullet"/>
+      <w:lvlText w:val=""/>
+      <w:lvlJc w:val="left"/>
+      <w:pPr>
+        <w:ind w:left="720" w:hanging="360"/>
+      </w:pPr>
+      <w:rPr>
+        <w:rFonts w:ascii="Symbol" w:hAnsi="Symbol" w:hint="default"/>
+      </w:rPr>
+    </w:lvl>
+    <w:lvl w:ilvl="1" w:tplc="04160003" w:tentative="1">
+      <w:start w:val="1"/>
+      <w:numFmt w:val="bullet"/>
+      <w:lvlText w:val="o"/>
+      <w:lvlJc w:val="left"/>
+      <w:pPr>
+        <w:ind w:left="1440" w:hanging="360"/>
+      </w:pPr>
+      <w:rPr>
+        <w:rFonts w:ascii="Courier New" w:hAnsi="Courier New" w:cs="Courier New" w:hint="default"/>
+      </w:rPr>
+    </w:lvl>
+    <w:lvl w:ilvl="2" w:tplc="04160005" w:tentative="1">
+      <w:start w:val="1"/>
+      <w:numFmt w:val="bullet"/>
+      <w:lvlText w:val=""/>
+      <w:lvlJc w:val="left"/>
+      <w:pPr>
+        <w:ind w:left="2160" w:hanging="360"/>
+      </w:pPr>
+      <w:rPr>
+        <w:rFonts w:ascii="Wingdings" w:hAnsi="Wingdings" w:hint="default"/>
+      </w:rPr>
+    </w:lvl>
+    <w:lvl w:ilvl="3" w:tplc="04160001" w:tentative="1">
+      <w:start w:val="1"/>
+      <w:numFmt w:val="bullet"/>
+      <w:lvlText w:val=""/>
+      <w:lvlJc w:val="left"/>
+      <w:pPr>
+        <w:ind w:left="2880" w:hanging="360"/>
+      </w:pPr>
+      <w:rPr>
+        <w:rFonts w:ascii="Symbol" w:hAnsi="Symbol" w:hint="default"/>
+      </w:rPr>
+    </w:lvl>
+    <w:lvl w:ilvl="4" w:tplc="04160003" w:tentative="1">
+      <w:start w:val="1"/>
+      <w:numFmt w:val="bullet"/>
+      <w:lvlText w:val="o"/>
+      <w:lvlJc w:val="left"/>
+      <w:pPr>
+        <w:ind w:left="3600" w:hanging="360"/>
+      </w:pPr>
+      <w:rPr>
+        <w:rFonts w:ascii="Courier New" w:hAnsi="Courier New" w:cs="Courier New" w:hint="default"/>
+      </w:rPr>
+    </w:lvl>
+    <w:lvl w:ilvl="5" w:tplc="04160005" w:tentative="1">
+      <w:start w:val="1"/>
+      <w:numFmt w:val="bullet"/>
+      <w:lvlText w:val=""/>
+      <w:lvlJc w:val="left"/>
+      <w:pPr>
+        <w:ind w:left="4320" w:hanging="360"/>
+      </w:pPr>
+      <w:rPr>
+        <w:rFonts w:ascii="Wingdings" w:hAnsi="Wingdings" w:hint="default"/>
+      </w:rPr>
+    </w:lvl>
+    <w:lvl w:ilvl="6" w:tplc="04160001" w:tentative="1">
+      <w:start w:val="1"/>
+      <w:numFmt w:val="bullet"/>
+      <w:lvlText w:val=""/>
+      <w:lvlJc w:val="left"/>
+      <w:pPr>
+        <w:ind w:left="5040" w:hanging="360"/>
+      </w:pPr>
+      <w:rPr>
+        <w:rFonts w:ascii="Symbol" w:hAnsi="Symbol" w:hint="default"/>
+      </w:rPr>
+    </w:lvl>
+    <w:lvl w:ilvl="7" w:tplc="04160003" w:tentative="1">
+      <w:start w:val="1"/>
+      <w:numFmt w:val="bullet"/>
+      <w:lvlText w:val="o"/>
+      <w:lvlJc w:val="left"/>
+      <w:pPr>
+        <w:ind w:left="5760" w:hanging="360"/>
+      </w:pPr>
+      <w:rPr>
+        <w:rFonts w:ascii="Courier New" w:hAnsi="Courier New" w:cs="Courier New" w:hint="default"/>
+      </w:rPr>
+    </w:lvl>
+    <w:lvl w:ilvl="8" w:tplc="04160005" w:tentative="1">
+      <w:start w:val="1"/>
+      <w:numFmt w:val="bullet"/>
+      <w:lvlText w:val=""/>
+      <w:lvlJc w:val="left"/>
+      <w:pPr>
+        <w:ind w:left="6480" w:hanging="360"/>
+      </w:pPr>
+      <w:rPr>
+        <w:rFonts w:ascii="Wingdings" w:hAnsi="Wingdings" w:hint="default"/>
+      </w:rPr>
+    </w:lvl>
+  </w:abstractNum>
+  <w:abstractNum w:abstractNumId="4" w15:restartNumberingAfterBreak="0">
     <w:nsid w:val="31C16482"/>
     <w:multiLevelType w:val="hybridMultilevel"/>
     <w:tmpl w:val="14CE9278"/>
@@ -3650,7 +4417,233 @@
       </w:pPr>
     </w:lvl>
   </w:abstractNum>
-  <w:abstractNum w:abstractNumId="4" w15:restartNumberingAfterBreak="0">
+  <w:abstractNum w:abstractNumId="5" w15:restartNumberingAfterBreak="0">
+    <w:nsid w:val="46F20102"/>
+    <w:multiLevelType w:val="hybridMultilevel"/>
+    <w:tmpl w:val="ACA029E8"/>
+    <w:lvl w:ilvl="0" w:tplc="5FBC47B0">
+      <w:start w:val="1"/>
+      <w:numFmt w:val="bullet"/>
+      <w:lvlText w:val=""/>
+      <w:lvlJc w:val="left"/>
+      <w:pPr>
+        <w:ind w:left="720" w:hanging="360"/>
+      </w:pPr>
+      <w:rPr>
+        <w:rFonts w:ascii="Symbol" w:hAnsi="Symbol" w:hint="default"/>
+      </w:rPr>
+    </w:lvl>
+    <w:lvl w:ilvl="1" w:tplc="04160003" w:tentative="1">
+      <w:start w:val="1"/>
+      <w:numFmt w:val="bullet"/>
+      <w:lvlText w:val="o"/>
+      <w:lvlJc w:val="left"/>
+      <w:pPr>
+        <w:ind w:left="1440" w:hanging="360"/>
+      </w:pPr>
+      <w:rPr>
+        <w:rFonts w:ascii="Courier New" w:hAnsi="Courier New" w:cs="Courier New" w:hint="default"/>
+      </w:rPr>
+    </w:lvl>
+    <w:lvl w:ilvl="2" w:tplc="04160005" w:tentative="1">
+      <w:start w:val="1"/>
+      <w:numFmt w:val="bullet"/>
+      <w:lvlText w:val=""/>
+      <w:lvlJc w:val="left"/>
+      <w:pPr>
+        <w:ind w:left="2160" w:hanging="360"/>
+      </w:pPr>
+      <w:rPr>
+        <w:rFonts w:ascii="Wingdings" w:hAnsi="Wingdings" w:hint="default"/>
+      </w:rPr>
+    </w:lvl>
+    <w:lvl w:ilvl="3" w:tplc="04160001" w:tentative="1">
+      <w:start w:val="1"/>
+      <w:numFmt w:val="bullet"/>
+      <w:lvlText w:val=""/>
+      <w:lvlJc w:val="left"/>
+      <w:pPr>
+        <w:ind w:left="2880" w:hanging="360"/>
+      </w:pPr>
+      <w:rPr>
+        <w:rFonts w:ascii="Symbol" w:hAnsi="Symbol" w:hint="default"/>
+      </w:rPr>
+    </w:lvl>
+    <w:lvl w:ilvl="4" w:tplc="04160003" w:tentative="1">
+      <w:start w:val="1"/>
+      <w:numFmt w:val="bullet"/>
+      <w:lvlText w:val="o"/>
+      <w:lvlJc w:val="left"/>
+      <w:pPr>
+        <w:ind w:left="3600" w:hanging="360"/>
+      </w:pPr>
+      <w:rPr>
+        <w:rFonts w:ascii="Courier New" w:hAnsi="Courier New" w:cs="Courier New" w:hint="default"/>
+      </w:rPr>
+    </w:lvl>
+    <w:lvl w:ilvl="5" w:tplc="04160005" w:tentative="1">
+      <w:start w:val="1"/>
+      <w:numFmt w:val="bullet"/>
+      <w:lvlText w:val=""/>
+      <w:lvlJc w:val="left"/>
+      <w:pPr>
+        <w:ind w:left="4320" w:hanging="360"/>
+      </w:pPr>
+      <w:rPr>
+        <w:rFonts w:ascii="Wingdings" w:hAnsi="Wingdings" w:hint="default"/>
+      </w:rPr>
+    </w:lvl>
+    <w:lvl w:ilvl="6" w:tplc="04160001" w:tentative="1">
+      <w:start w:val="1"/>
+      <w:numFmt w:val="bullet"/>
+      <w:lvlText w:val=""/>
+      <w:lvlJc w:val="left"/>
+      <w:pPr>
+        <w:ind w:left="5040" w:hanging="360"/>
+      </w:pPr>
+      <w:rPr>
+        <w:rFonts w:ascii="Symbol" w:hAnsi="Symbol" w:hint="default"/>
+      </w:rPr>
+    </w:lvl>
+    <w:lvl w:ilvl="7" w:tplc="04160003" w:tentative="1">
+      <w:start w:val="1"/>
+      <w:numFmt w:val="bullet"/>
+      <w:lvlText w:val="o"/>
+      <w:lvlJc w:val="left"/>
+      <w:pPr>
+        <w:ind w:left="5760" w:hanging="360"/>
+      </w:pPr>
+      <w:rPr>
+        <w:rFonts w:ascii="Courier New" w:hAnsi="Courier New" w:cs="Courier New" w:hint="default"/>
+      </w:rPr>
+    </w:lvl>
+    <w:lvl w:ilvl="8" w:tplc="04160005" w:tentative="1">
+      <w:start w:val="1"/>
+      <w:numFmt w:val="bullet"/>
+      <w:lvlText w:val=""/>
+      <w:lvlJc w:val="left"/>
+      <w:pPr>
+        <w:ind w:left="6480" w:hanging="360"/>
+      </w:pPr>
+      <w:rPr>
+        <w:rFonts w:ascii="Wingdings" w:hAnsi="Wingdings" w:hint="default"/>
+      </w:rPr>
+    </w:lvl>
+  </w:abstractNum>
+  <w:abstractNum w:abstractNumId="6" w15:restartNumberingAfterBreak="0">
+    <w:nsid w:val="487B6676"/>
+    <w:multiLevelType w:val="hybridMultilevel"/>
+    <w:tmpl w:val="26BEC63E"/>
+    <w:lvl w:ilvl="0" w:tplc="04160001">
+      <w:start w:val="1"/>
+      <w:numFmt w:val="bullet"/>
+      <w:lvlText w:val=""/>
+      <w:lvlJc w:val="left"/>
+      <w:pPr>
+        <w:ind w:left="720" w:hanging="360"/>
+      </w:pPr>
+      <w:rPr>
+        <w:rFonts w:ascii="Symbol" w:hAnsi="Symbol" w:hint="default"/>
+      </w:rPr>
+    </w:lvl>
+    <w:lvl w:ilvl="1" w:tplc="04160003" w:tentative="1">
+      <w:start w:val="1"/>
+      <w:numFmt w:val="bullet"/>
+      <w:lvlText w:val="o"/>
+      <w:lvlJc w:val="left"/>
+      <w:pPr>
+        <w:ind w:left="1440" w:hanging="360"/>
+      </w:pPr>
+      <w:rPr>
+        <w:rFonts w:ascii="Courier New" w:hAnsi="Courier New" w:cs="Courier New" w:hint="default"/>
+      </w:rPr>
+    </w:lvl>
+    <w:lvl w:ilvl="2" w:tplc="04160005" w:tentative="1">
+      <w:start w:val="1"/>
+      <w:numFmt w:val="bullet"/>
+      <w:lvlText w:val=""/>
+      <w:lvlJc w:val="left"/>
+      <w:pPr>
+        <w:ind w:left="2160" w:hanging="360"/>
+      </w:pPr>
+      <w:rPr>
+        <w:rFonts w:ascii="Wingdings" w:hAnsi="Wingdings" w:hint="default"/>
+      </w:rPr>
+    </w:lvl>
+    <w:lvl w:ilvl="3" w:tplc="04160001" w:tentative="1">
+      <w:start w:val="1"/>
+      <w:numFmt w:val="bullet"/>
+      <w:lvlText w:val=""/>
+      <w:lvlJc w:val="left"/>
+      <w:pPr>
+        <w:ind w:left="2880" w:hanging="360"/>
+      </w:pPr>
+      <w:rPr>
+        <w:rFonts w:ascii="Symbol" w:hAnsi="Symbol" w:hint="default"/>
+      </w:rPr>
+    </w:lvl>
+    <w:lvl w:ilvl="4" w:tplc="04160003" w:tentative="1">
+      <w:start w:val="1"/>
+      <w:numFmt w:val="bullet"/>
+      <w:lvlText w:val="o"/>
+      <w:lvlJc w:val="left"/>
+      <w:pPr>
+        <w:ind w:left="3600" w:hanging="360"/>
+      </w:pPr>
+      <w:rPr>
+        <w:rFonts w:ascii="Courier New" w:hAnsi="Courier New" w:cs="Courier New" w:hint="default"/>
+      </w:rPr>
+    </w:lvl>
+    <w:lvl w:ilvl="5" w:tplc="04160005" w:tentative="1">
+      <w:start w:val="1"/>
+      <w:numFmt w:val="bullet"/>
+      <w:lvlText w:val=""/>
+      <w:lvlJc w:val="left"/>
+      <w:pPr>
+        <w:ind w:left="4320" w:hanging="360"/>
+      </w:pPr>
+      <w:rPr>
+        <w:rFonts w:ascii="Wingdings" w:hAnsi="Wingdings" w:hint="default"/>
+      </w:rPr>
+    </w:lvl>
+    <w:lvl w:ilvl="6" w:tplc="04160001" w:tentative="1">
+      <w:start w:val="1"/>
+      <w:numFmt w:val="bullet"/>
+      <w:lvlText w:val=""/>
+      <w:lvlJc w:val="left"/>
+      <w:pPr>
+        <w:ind w:left="5040" w:hanging="360"/>
+      </w:pPr>
+      <w:rPr>
+        <w:rFonts w:ascii="Symbol" w:hAnsi="Symbol" w:hint="default"/>
+      </w:rPr>
+    </w:lvl>
+    <w:lvl w:ilvl="7" w:tplc="04160003" w:tentative="1">
+      <w:start w:val="1"/>
+      <w:numFmt w:val="bullet"/>
+      <w:lvlText w:val="o"/>
+      <w:lvlJc w:val="left"/>
+      <w:pPr>
+        <w:ind w:left="5760" w:hanging="360"/>
+      </w:pPr>
+      <w:rPr>
+        <w:rFonts w:ascii="Courier New" w:hAnsi="Courier New" w:cs="Courier New" w:hint="default"/>
+      </w:rPr>
+    </w:lvl>
+    <w:lvl w:ilvl="8" w:tplc="04160005" w:tentative="1">
+      <w:start w:val="1"/>
+      <w:numFmt w:val="bullet"/>
+      <w:lvlText w:val=""/>
+      <w:lvlJc w:val="left"/>
+      <w:pPr>
+        <w:ind w:left="6480" w:hanging="360"/>
+      </w:pPr>
+      <w:rPr>
+        <w:rFonts w:ascii="Wingdings" w:hAnsi="Wingdings" w:hint="default"/>
+      </w:rPr>
+    </w:lvl>
+  </w:abstractNum>
+  <w:abstractNum w:abstractNumId="7" w15:restartNumberingAfterBreak="0">
     <w:nsid w:val="4ACE0979"/>
     <w:multiLevelType w:val="hybridMultilevel"/>
     <w:tmpl w:val="18364C28"/>
@@ -3763,7 +4756,7 @@
       </w:rPr>
     </w:lvl>
   </w:abstractNum>
-  <w:abstractNum w:abstractNumId="5" w15:restartNumberingAfterBreak="0">
+  <w:abstractNum w:abstractNumId="8" w15:restartNumberingAfterBreak="0">
     <w:nsid w:val="4EAE1D47"/>
     <w:multiLevelType w:val="hybridMultilevel"/>
     <w:tmpl w:val="A2901A7E"/>
@@ -3876,7 +4869,7 @@
       </w:rPr>
     </w:lvl>
   </w:abstractNum>
-  <w:abstractNum w:abstractNumId="6" w15:restartNumberingAfterBreak="0">
+  <w:abstractNum w:abstractNumId="9" w15:restartNumberingAfterBreak="0">
     <w:nsid w:val="5DC804A5"/>
     <w:multiLevelType w:val="hybridMultilevel"/>
     <w:tmpl w:val="22187F68"/>
@@ -3965,7 +4958,7 @@
       </w:pPr>
     </w:lvl>
   </w:abstractNum>
-  <w:abstractNum w:abstractNumId="7" w15:restartNumberingAfterBreak="0">
+  <w:abstractNum w:abstractNumId="10" w15:restartNumberingAfterBreak="0">
     <w:nsid w:val="62CC0746"/>
     <w:multiLevelType w:val="hybridMultilevel"/>
     <w:tmpl w:val="0B4E1364"/>
@@ -4055,16 +5048,16 @@
     </w:lvl>
   </w:abstractNum>
   <w:num w:numId="1">
-    <w:abstractNumId w:val="3"/>
+    <w:abstractNumId w:val="4"/>
   </w:num>
   <w:num w:numId="2">
     <w:abstractNumId w:val="2"/>
   </w:num>
   <w:num w:numId="3">
-    <w:abstractNumId w:val="6"/>
+    <w:abstractNumId w:val="9"/>
   </w:num>
   <w:num w:numId="4">
-    <w:abstractNumId w:val="7"/>
+    <w:abstractNumId w:val="10"/>
   </w:num>
   <w:num w:numId="5">
     <w:abstractNumId w:val="1"/>
@@ -4073,10 +5066,19 @@
     <w:abstractNumId w:val="0"/>
   </w:num>
   <w:num w:numId="7">
+    <w:abstractNumId w:val="8"/>
+  </w:num>
+  <w:num w:numId="8">
+    <w:abstractNumId w:val="7"/>
+  </w:num>
+  <w:num w:numId="9">
+    <w:abstractNumId w:val="3"/>
+  </w:num>
+  <w:num w:numId="10">
     <w:abstractNumId w:val="5"/>
   </w:num>
-  <w:num w:numId="8">
-    <w:abstractNumId w:val="4"/>
+  <w:num w:numId="11">
+    <w:abstractNumId w:val="6"/>
   </w:num>
 </w:numbering>
 </file>
@@ -4482,7 +5484,6 @@
   <w:style w:type="character" w:default="1" w:styleId="Fontepargpadro">
     <w:name w:val="Default Paragraph Font"/>
     <w:uiPriority w:val="1"/>
-    <w:semiHidden/>
     <w:unhideWhenUsed/>
   </w:style>
   <w:style w:type="table" w:default="1" w:styleId="Tabelanormal">
@@ -4870,4 +5871,16 @@
     </a:ext>
   </a:extLst>
 </a:theme>
+</file>
+
+<file path=customXml/item1.xml><?xml version="1.0" encoding="utf-8"?>
+<b:Sources xmlns:b="http://schemas.openxmlformats.org/officeDocument/2006/bibliography" xmlns="http://schemas.openxmlformats.org/officeDocument/2006/bibliography" SelectedStyle="\APASixthEditionOfficeOnline.xsl" StyleName="APA" Version="6"/>
+</file>
+
+<file path=customXml/itemProps1.xml><?xml version="1.0" encoding="utf-8"?>
+<ds:datastoreItem xmlns:ds="http://schemas.openxmlformats.org/officeDocument/2006/customXml" ds:itemID="{96712832-A752-49FA-A2AE-C0E0737C307C}">
+  <ds:schemaRefs>
+    <ds:schemaRef ds:uri="http://schemas.openxmlformats.org/officeDocument/2006/bibliography"/>
+  </ds:schemaRefs>
+</ds:datastoreItem>
 </file>
</xml_diff>

<commit_message>
estamos finalizando o site
</commit_message>
<xml_diff>
--- a/Apostila/Apostila Space for Men.docx
+++ b/Apostila/Apostila Space for Men.docx
@@ -201,7 +201,7 @@
           </mc:Choice>
           <mc:Fallback>
             <w:pict>
-              <v:shapetype w14:anchorId="770D2714" id="_x0000_t32" coordsize="21600,21600" o:spt="32" o:oned="t" path="m,l21600,21600e" filled="f">
+              <v:shapetype w14:anchorId="67599DFF" id="_x0000_t32" coordsize="21600,21600" o:spt="32" o:oned="t" path="m,l21600,21600e" filled="f">
                 <v:path arrowok="t" fillok="f" o:connecttype="none"/>
                 <o:lock v:ext="edit" shapetype="t"/>
               </v:shapetype>
@@ -486,17 +486,9 @@
     <w:p/>
     <w:p/>
     <w:p>
-      <w:pPr>
-        <w:rPr>
-          <w:sz w:val="18"/>
-          <w:szCs w:val="18"/>
-        </w:rPr>
-      </w:pPr>
-      <w:r>
-        <w:rPr>
-          <w:noProof/>
-          <w:sz w:val="18"/>
-          <w:szCs w:val="18"/>
+      <w:r>
+        <w:rPr>
+          <w:noProof/>
         </w:rPr>
         <w:drawing>
           <wp:anchor distT="0" distB="0" distL="114300" distR="114300" simplePos="0" relativeHeight="251664384" behindDoc="0" locked="0" layoutInCell="1" allowOverlap="1" wp14:anchorId="1AB68171">
@@ -555,92 +547,52 @@
         </w:drawing>
       </w:r>
       <w:r>
-        <w:rPr>
-          <w:sz w:val="18"/>
-          <w:szCs w:val="18"/>
-        </w:rPr>
         <w:t xml:space="preserve">3 – No style.css utilizamos o </w:t>
       </w:r>
       <w:proofErr w:type="spellStart"/>
       <w:r>
-        <w:rPr>
-          <w:sz w:val="18"/>
-          <w:szCs w:val="18"/>
-        </w:rPr>
         <w:t>css</w:t>
       </w:r>
       <w:proofErr w:type="spellEnd"/>
       <w:r>
-        <w:rPr>
-          <w:sz w:val="18"/>
-          <w:szCs w:val="18"/>
-        </w:rPr>
         <w:t xml:space="preserve"> </w:t>
       </w:r>
       <w:r>
-        <w:rPr>
-          <w:sz w:val="18"/>
-          <w:szCs w:val="18"/>
-        </w:rPr>
         <w:t>por</w:t>
       </w:r>
       <w:r>
-        <w:rPr>
-          <w:sz w:val="18"/>
-          <w:szCs w:val="18"/>
-        </w:rPr>
         <w:t xml:space="preserve"> </w:t>
       </w:r>
       <w:r>
-        <w:rPr>
-          <w:sz w:val="18"/>
-          <w:szCs w:val="18"/>
-        </w:rPr>
         <w:t>referência</w:t>
       </w:r>
       <w:r>
-        <w:rPr>
-          <w:sz w:val="18"/>
-          <w:szCs w:val="18"/>
-        </w:rPr>
         <w:t xml:space="preserve"> e utilizamos a regra da </w:t>
       </w:r>
       <w:proofErr w:type="spellStart"/>
       <w:r>
-        <w:rPr>
-          <w:sz w:val="18"/>
-          <w:szCs w:val="18"/>
-        </w:rPr>
         <w:t>tags</w:t>
       </w:r>
       <w:proofErr w:type="spellEnd"/>
       <w:r>
-        <w:rPr>
-          <w:sz w:val="18"/>
-          <w:szCs w:val="18"/>
-        </w:rPr>
-        <w:t xml:space="preserve"> alinhada que a primeira que abre e a ultima que fecha conforme a imagem</w:t>
-      </w:r>
-      <w:r>
-        <w:rPr>
-          <w:sz w:val="18"/>
-          <w:szCs w:val="18"/>
-        </w:rPr>
+        <w:t xml:space="preserve"> alinhada que a primeira que abre e a </w:t>
+      </w:r>
+      <w:proofErr w:type="spellStart"/>
+      <w:r>
+        <w:t>ultima</w:t>
+      </w:r>
+      <w:proofErr w:type="spellEnd"/>
+      <w:r>
+        <w:t xml:space="preserve"> que fecha conforme a imagem</w:t>
+      </w:r>
+      <w:r>
         <w:t>.</w:t>
       </w:r>
     </w:p>
     <w:p>
-      <w:pPr>
-        <w:rPr>
-          <w:sz w:val="18"/>
-          <w:szCs w:val="18"/>
-        </w:rPr>
-      </w:pPr>
-      <w:r>
-        <w:rPr>
-          <w:noProof/>
-          <w:sz w:val="18"/>
-          <w:szCs w:val="18"/>
+      <w:r>
+        <w:rPr>
+          <w:noProof/>
         </w:rPr>
         <w:drawing>
           <wp:inline distT="0" distB="0" distL="0" distR="0" wp14:anchorId="6687CE0A">
@@ -685,26 +637,9 @@
         </w:drawing>
       </w:r>
     </w:p>
-    <w:p>
-      <w:pPr>
-        <w:rPr>
-          <w:sz w:val="18"/>
-          <w:szCs w:val="18"/>
-        </w:rPr>
-      </w:pPr>
-    </w:p>
-    <w:p>
-      <w:pPr>
-        <w:rPr>
-          <w:sz w:val="18"/>
-          <w:szCs w:val="18"/>
-        </w:rPr>
-      </w:pPr>
-      <w:r>
-        <w:rPr>
-          <w:sz w:val="18"/>
-          <w:szCs w:val="18"/>
-        </w:rPr>
+    <w:p/>
+    <w:p>
+      <w:r>
         <w:t>4 – Adicionamos a imagem banner ao nosso site utilizando o seguinte comando:</w:t>
       </w:r>
     </w:p>
@@ -723,8 +658,6 @@
       <w:r>
         <w:rPr>
           <w:noProof/>
-          <w:sz w:val="18"/>
-          <w:szCs w:val="18"/>
         </w:rPr>
         <w:drawing>
           <wp:inline distT="0" distB="0" distL="0" distR="0" wp14:anchorId="42B4324D" wp14:editId="02492868">
@@ -764,67 +697,29 @@
       </w:r>
     </w:p>
     <w:p>
-      <w:pPr>
-        <w:rPr>
-          <w:sz w:val="18"/>
-          <w:szCs w:val="18"/>
-        </w:rPr>
-      </w:pPr>
-      <w:r>
-        <w:rPr>
-          <w:sz w:val="18"/>
-          <w:szCs w:val="18"/>
-        </w:rPr>
+      <w:r>
         <w:t xml:space="preserve">5 – Adicionamos </w:t>
       </w:r>
       <w:r>
-        <w:rPr>
-          <w:sz w:val="18"/>
-          <w:szCs w:val="18"/>
-        </w:rPr>
         <w:t>um id</w:t>
       </w:r>
       <w:r>
-        <w:rPr>
-          <w:sz w:val="18"/>
-          <w:szCs w:val="18"/>
-        </w:rPr>
         <w:t xml:space="preserve"> </w:t>
       </w:r>
       <w:r>
-        <w:rPr>
-          <w:sz w:val="18"/>
-          <w:szCs w:val="18"/>
-        </w:rPr>
         <w:t xml:space="preserve">na imagem para que ela ocupe 100% de largura da nossa </w:t>
       </w:r>
       <w:r>
-        <w:rPr>
-          <w:sz w:val="18"/>
-          <w:szCs w:val="18"/>
-        </w:rPr>
         <w:t>página</w:t>
       </w:r>
       <w:r>
-        <w:rPr>
-          <w:sz w:val="18"/>
-          <w:szCs w:val="18"/>
-        </w:rPr>
         <w:t>.</w:t>
       </w:r>
     </w:p>
     <w:p>
-      <w:pPr>
-        <w:rPr>
-          <w:sz w:val="18"/>
-          <w:szCs w:val="18"/>
-        </w:rPr>
-      </w:pPr>
-      <w:r>
-        <w:rPr>
-          <w:noProof/>
-          <w:sz w:val="18"/>
-          <w:szCs w:val="18"/>
+      <w:r>
+        <w:rPr>
+          <w:noProof/>
         </w:rPr>
         <w:drawing>
           <wp:anchor distT="0" distB="0" distL="114300" distR="114300" simplePos="0" relativeHeight="251665408" behindDoc="0" locked="0" layoutInCell="1" allowOverlap="1" wp14:anchorId="038C0CCB">
@@ -877,48 +772,24 @@
         </w:drawing>
       </w:r>
     </w:p>
-    <w:p>
-      <w:pPr>
-        <w:rPr>
-          <w:sz w:val="18"/>
-          <w:szCs w:val="18"/>
-        </w:rPr>
-      </w:pPr>
-    </w:p>
-    <w:p>
-      <w:pPr>
-        <w:rPr>
-          <w:sz w:val="18"/>
-          <w:szCs w:val="18"/>
-        </w:rPr>
-      </w:pPr>
-    </w:p>
-    <w:p>
-      <w:pPr>
-        <w:rPr>
-          <w:sz w:val="18"/>
-          <w:szCs w:val="18"/>
-        </w:rPr>
-      </w:pPr>
-      <w:r>
-        <w:rPr>
-          <w:sz w:val="18"/>
-          <w:szCs w:val="18"/>
-        </w:rPr>
-        <w:t xml:space="preserve">6 – Centralizamos o titulo principal da nossa </w:t>
-      </w:r>
-      <w:r>
-        <w:rPr>
-          <w:sz w:val="18"/>
-          <w:szCs w:val="18"/>
-        </w:rPr>
+    <w:p/>
+    <w:p/>
+    <w:p>
+      <w:r>
+        <w:t xml:space="preserve">6 – Centralizamos o </w:t>
+      </w:r>
+      <w:proofErr w:type="spellStart"/>
+      <w:r>
+        <w:t>titulo</w:t>
+      </w:r>
+      <w:proofErr w:type="spellEnd"/>
+      <w:r>
+        <w:t xml:space="preserve"> principal da nossa </w:t>
+      </w:r>
+      <w:r>
         <w:t>página</w:t>
       </w:r>
       <w:r>
-        <w:rPr>
-          <w:sz w:val="18"/>
-          <w:szCs w:val="18"/>
-        </w:rPr>
         <w:t>.</w:t>
       </w:r>
     </w:p>
@@ -927,16 +798,10 @@
         <w:tabs>
           <w:tab w:val="left" w:pos="1200"/>
         </w:tabs>
-        <w:rPr>
-          <w:sz w:val="18"/>
-          <w:szCs w:val="18"/>
-        </w:rPr>
-      </w:pPr>
-      <w:r>
-        <w:rPr>
-          <w:noProof/>
-          <w:sz w:val="18"/>
-          <w:szCs w:val="18"/>
+      </w:pPr>
+      <w:r>
+        <w:rPr>
+          <w:noProof/>
         </w:rPr>
         <w:drawing>
           <wp:anchor distT="0" distB="0" distL="114300" distR="114300" simplePos="0" relativeHeight="251666432" behindDoc="0" locked="0" layoutInCell="1" allowOverlap="1" wp14:anchorId="1157043F">
@@ -989,10 +854,6 @@
         </w:drawing>
       </w:r>
       <w:r>
-        <w:rPr>
-          <w:sz w:val="18"/>
-          <w:szCs w:val="18"/>
-        </w:rPr>
         <w:tab/>
       </w:r>
     </w:p>
@@ -1001,53 +862,33 @@
         <w:tabs>
           <w:tab w:val="left" w:pos="1200"/>
         </w:tabs>
-        <w:rPr>
-          <w:sz w:val="18"/>
-          <w:szCs w:val="18"/>
-        </w:rPr>
-      </w:pPr>
-    </w:p>
-    <w:p>
-      <w:pPr>
-        <w:tabs>
-          <w:tab w:val="left" w:pos="1200"/>
-        </w:tabs>
-        <w:rPr>
-          <w:sz w:val="18"/>
-          <w:szCs w:val="18"/>
-        </w:rPr>
-      </w:pPr>
-    </w:p>
-    <w:p>
-      <w:pPr>
-        <w:tabs>
-          <w:tab w:val="left" w:pos="1200"/>
-        </w:tabs>
-        <w:rPr>
-          <w:noProof/>
-        </w:rPr>
-      </w:pPr>
-      <w:r>
-        <w:rPr>
-          <w:sz w:val="18"/>
-          <w:szCs w:val="18"/>
-        </w:rPr>
+      </w:pPr>
+    </w:p>
+    <w:p>
+      <w:pPr>
+        <w:tabs>
+          <w:tab w:val="left" w:pos="1200"/>
+        </w:tabs>
+      </w:pPr>
+    </w:p>
+    <w:p>
+      <w:pPr>
+        <w:tabs>
+          <w:tab w:val="left" w:pos="1200"/>
+        </w:tabs>
+        <w:rPr>
+          <w:noProof/>
+        </w:rPr>
+      </w:pPr>
+      <w:r>
         <w:t xml:space="preserve">7 – No parágrafo da missão inserimos uma </w:t>
       </w:r>
       <w:proofErr w:type="spellStart"/>
       <w:r>
-        <w:rPr>
-          <w:sz w:val="18"/>
-          <w:szCs w:val="18"/>
-        </w:rPr>
         <w:t>class</w:t>
       </w:r>
       <w:proofErr w:type="spellEnd"/>
       <w:r>
-        <w:rPr>
-          <w:sz w:val="18"/>
-          <w:szCs w:val="18"/>
-        </w:rPr>
         <w:t xml:space="preserve"> e aumentamos o tamanho da fonte.</w:t>
       </w:r>
       <w:r>
@@ -1069,8 +910,6 @@
       <w:r>
         <w:rPr>
           <w:noProof/>
-          <w:sz w:val="18"/>
-          <w:szCs w:val="18"/>
         </w:rPr>
         <w:drawing>
           <wp:inline distT="0" distB="0" distL="0" distR="0" wp14:anchorId="6B00959D" wp14:editId="1F9D93FC">
@@ -1114,16 +953,10 @@
         <w:tabs>
           <w:tab w:val="left" w:pos="1200"/>
         </w:tabs>
-        <w:rPr>
-          <w:sz w:val="18"/>
-          <w:szCs w:val="18"/>
-        </w:rPr>
-      </w:pPr>
-      <w:r>
-        <w:rPr>
-          <w:noProof/>
-          <w:sz w:val="18"/>
-          <w:szCs w:val="18"/>
+      </w:pPr>
+      <w:r>
+        <w:rPr>
+          <w:noProof/>
         </w:rPr>
         <w:drawing>
           <wp:anchor distT="0" distB="0" distL="114300" distR="114300" simplePos="0" relativeHeight="251667456" behindDoc="0" locked="0" layoutInCell="1" allowOverlap="1" wp14:anchorId="2055FE4A">
@@ -1181,33 +1014,21 @@
         <w:tabs>
           <w:tab w:val="left" w:pos="1200"/>
         </w:tabs>
-        <w:rPr>
-          <w:sz w:val="18"/>
-          <w:szCs w:val="18"/>
-        </w:rPr>
-      </w:pPr>
-    </w:p>
-    <w:p>
-      <w:pPr>
-        <w:tabs>
-          <w:tab w:val="left" w:pos="1200"/>
-        </w:tabs>
-        <w:rPr>
-          <w:noProof/>
-        </w:rPr>
-      </w:pPr>
-      <w:r>
-        <w:rPr>
-          <w:sz w:val="18"/>
-          <w:szCs w:val="18"/>
-        </w:rPr>
+      </w:pPr>
+    </w:p>
+    <w:p>
+      <w:pPr>
+        <w:tabs>
+          <w:tab w:val="left" w:pos="1200"/>
+        </w:tabs>
+        <w:rPr>
+          <w:noProof/>
+        </w:rPr>
+      </w:pPr>
+      <w:r>
         <w:t xml:space="preserve">8 – Adicionamos ao site um subtítulo </w:t>
       </w:r>
       <w:r>
-        <w:rPr>
-          <w:sz w:val="18"/>
-          <w:szCs w:val="18"/>
-        </w:rPr>
         <w:t>h2 e criamos uma lista não ordenada.</w:t>
       </w:r>
       <w:r>
@@ -1222,16 +1043,10 @@
         <w:tabs>
           <w:tab w:val="left" w:pos="1200"/>
         </w:tabs>
-        <w:rPr>
-          <w:sz w:val="18"/>
-          <w:szCs w:val="18"/>
-        </w:rPr>
-      </w:pPr>
-      <w:r>
-        <w:rPr>
-          <w:noProof/>
-          <w:sz w:val="18"/>
-          <w:szCs w:val="18"/>
+      </w:pPr>
+      <w:r>
+        <w:rPr>
+          <w:noProof/>
         </w:rPr>
         <w:drawing>
           <wp:inline distT="0" distB="0" distL="0" distR="0" wp14:anchorId="33FF1521" wp14:editId="5BDA718C">
@@ -1275,48 +1090,24 @@
         <w:tabs>
           <w:tab w:val="left" w:pos="1200"/>
         </w:tabs>
-        <w:rPr>
-          <w:sz w:val="18"/>
-          <w:szCs w:val="18"/>
-        </w:rPr>
-      </w:pPr>
-      <w:r>
-        <w:rPr>
-          <w:sz w:val="18"/>
-          <w:szCs w:val="18"/>
-        </w:rPr>
+      </w:pPr>
+      <w:r>
         <w:t xml:space="preserve">9 – Na nossa lista não ordenada colocamos a mesma </w:t>
       </w:r>
       <w:proofErr w:type="spellStart"/>
       <w:r>
-        <w:rPr>
-          <w:sz w:val="18"/>
-          <w:szCs w:val="18"/>
-        </w:rPr>
         <w:t>class</w:t>
       </w:r>
       <w:proofErr w:type="spellEnd"/>
       <w:r>
-        <w:rPr>
-          <w:sz w:val="18"/>
-          <w:szCs w:val="18"/>
-        </w:rPr>
         <w:t xml:space="preserve"> para todos os itens para que assim os itens da lista possam ter o mesmo comportamento ou seja deixamos todos em </w:t>
       </w:r>
       <w:proofErr w:type="spellStart"/>
       <w:r>
-        <w:rPr>
-          <w:sz w:val="18"/>
-          <w:szCs w:val="18"/>
-        </w:rPr>
         <w:t>italics</w:t>
       </w:r>
       <w:proofErr w:type="spellEnd"/>
       <w:r>
-        <w:rPr>
-          <w:sz w:val="18"/>
-          <w:szCs w:val="18"/>
-        </w:rPr>
         <w:t>.</w:t>
       </w:r>
     </w:p>
@@ -1381,10 +1172,6 @@
         <w:tabs>
           <w:tab w:val="left" w:pos="1200"/>
         </w:tabs>
-        <w:rPr>
-          <w:sz w:val="18"/>
-          <w:szCs w:val="18"/>
-        </w:rPr>
       </w:pPr>
       <w:r>
         <w:rPr>
@@ -1446,48 +1233,24 @@
         <w:tabs>
           <w:tab w:val="left" w:pos="1200"/>
         </w:tabs>
-        <w:rPr>
-          <w:sz w:val="18"/>
-          <w:szCs w:val="18"/>
-        </w:rPr>
-      </w:pPr>
-    </w:p>
-    <w:p>
-      <w:pPr>
-        <w:tabs>
-          <w:tab w:val="left" w:pos="1200"/>
-        </w:tabs>
-        <w:rPr>
-          <w:sz w:val="18"/>
-          <w:szCs w:val="18"/>
-        </w:rPr>
-      </w:pPr>
-      <w:r>
-        <w:rPr>
-          <w:sz w:val="18"/>
-          <w:szCs w:val="18"/>
-        </w:rPr>
+      </w:pPr>
+    </w:p>
+    <w:p>
+      <w:pPr>
+        <w:tabs>
+          <w:tab w:val="left" w:pos="1200"/>
+        </w:tabs>
+      </w:pPr>
+      <w:r>
         <w:t xml:space="preserve">10 </w:t>
       </w:r>
       <w:r>
-        <w:rPr>
-          <w:sz w:val="18"/>
-          <w:szCs w:val="18"/>
-        </w:rPr>
         <w:t>–</w:t>
       </w:r>
       <w:r>
-        <w:rPr>
-          <w:sz w:val="18"/>
-          <w:szCs w:val="18"/>
-        </w:rPr>
         <w:t xml:space="preserve"> </w:t>
       </w:r>
       <w:r>
-        <w:rPr>
-          <w:sz w:val="18"/>
-          <w:szCs w:val="18"/>
-        </w:rPr>
         <w:t>Inserimos a imagem benefícios em nosso site utilizando o seguinte código:</w:t>
       </w:r>
     </w:p>
@@ -1509,8 +1272,6 @@
       <w:r>
         <w:rPr>
           <w:noProof/>
-          <w:sz w:val="18"/>
-          <w:szCs w:val="18"/>
         </w:rPr>
         <w:drawing>
           <wp:inline distT="0" distB="0" distL="0" distR="0" wp14:anchorId="43FCFF99" wp14:editId="713989A9">
@@ -1556,31 +1317,23 @@
         </w:tabs>
         <w:rPr>
           <w:noProof/>
-          <w:sz w:val="18"/>
-          <w:szCs w:val="18"/>
-        </w:rPr>
-      </w:pPr>
-      <w:r>
-        <w:rPr>
-          <w:noProof/>
-          <w:sz w:val="18"/>
-          <w:szCs w:val="18"/>
+        </w:rPr>
+      </w:pPr>
+      <w:r>
+        <w:rPr>
+          <w:noProof/>
         </w:rPr>
         <w:t xml:space="preserve">11- </w:t>
       </w:r>
       <w:r>
         <w:rPr>
           <w:noProof/>
-          <w:sz w:val="18"/>
-          <w:szCs w:val="18"/>
         </w:rPr>
         <w:t xml:space="preserve">Para colocar a lista ao lado da imagem alteramos a natureza da lista usando display: inline-block e para centralizar a lista no topo </w:t>
       </w:r>
       <w:r>
         <w:rPr>
           <w:noProof/>
-          <w:sz w:val="18"/>
-          <w:szCs w:val="18"/>
         </w:rPr>
         <w:t>utilizamos o código vertical-align: top.</w:t>
       </w:r>
@@ -1603,8 +1356,6 @@
       <w:r>
         <w:rPr>
           <w:noProof/>
-          <w:sz w:val="18"/>
-          <w:szCs w:val="18"/>
         </w:rPr>
         <w:drawing>
           <wp:anchor distT="0" distB="0" distL="114300" distR="114300" simplePos="0" relativeHeight="251669504" behindDoc="0" locked="0" layoutInCell="1" allowOverlap="1" wp14:anchorId="4903E6A0">
@@ -1780,23 +1531,17 @@
         </w:tabs>
         <w:rPr>
           <w:noProof/>
-          <w:sz w:val="18"/>
-          <w:szCs w:val="18"/>
-        </w:rPr>
-      </w:pPr>
-      <w:r>
-        <w:rPr>
-          <w:noProof/>
-          <w:sz w:val="18"/>
-          <w:szCs w:val="18"/>
+        </w:rPr>
+      </w:pPr>
+      <w:r>
+        <w:rPr>
+          <w:noProof/>
         </w:rPr>
         <w:t xml:space="preserve">12- Para colocar uma distancia entre a lista e a imagem definimos um tamanho paraa ela (ela vai ocupar 20% de largura) e um espaço externo de </w:t>
       </w:r>
       <w:r>
         <w:rPr>
           <w:noProof/>
-          <w:sz w:val="18"/>
-          <w:szCs w:val="18"/>
         </w:rPr>
         <w:t>15% do lado direito conforme a imagem do código.</w:t>
       </w:r>
@@ -1819,8 +1564,6 @@
       <w:r>
         <w:rPr>
           <w:noProof/>
-          <w:sz w:val="18"/>
-          <w:szCs w:val="18"/>
         </w:rPr>
         <w:drawing>
           <wp:inline distT="0" distB="0" distL="0" distR="0" wp14:anchorId="72347449" wp14:editId="6F8D6320">
@@ -1866,15 +1609,11 @@
         </w:tabs>
         <w:rPr>
           <w:noProof/>
-          <w:sz w:val="18"/>
-          <w:szCs w:val="18"/>
-        </w:rPr>
-      </w:pPr>
-      <w:r>
-        <w:rPr>
-          <w:noProof/>
-          <w:sz w:val="18"/>
-          <w:szCs w:val="18"/>
+        </w:rPr>
+      </w:pPr>
+      <w:r>
+        <w:rPr>
+          <w:noProof/>
         </w:rPr>
         <w:t>13- Em nosso site criamos duas divs uma para parte principal e a outra para parte dos beneficios.</w:t>
       </w:r>
@@ -1897,8 +1636,6 @@
       <w:r>
         <w:rPr>
           <w:noProof/>
-          <w:sz w:val="18"/>
-          <w:szCs w:val="18"/>
         </w:rPr>
         <w:drawing>
           <wp:inline distT="0" distB="0" distL="0" distR="0" wp14:anchorId="1FA8DF3D" wp14:editId="5283689B">
@@ -1949,24 +1686,18 @@
       <w:r>
         <w:rPr>
           <w:noProof/>
-          <w:sz w:val="18"/>
-          <w:szCs w:val="18"/>
         </w:rPr>
         <w:t xml:space="preserve">14- </w:t>
       </w:r>
       <w:r>
         <w:rPr>
           <w:noProof/>
-          <w:sz w:val="18"/>
-          <w:szCs w:val="18"/>
         </w:rPr>
         <w:t>N</w:t>
       </w:r>
       <w:r>
         <w:rPr>
           <w:noProof/>
-          <w:sz w:val="18"/>
-          <w:szCs w:val="18"/>
         </w:rPr>
         <w:t>a div principal colocamos um espaço interno para todos os lados e colocamos e deixamos uma cor de fundo conforme imagem do código abaixo.</w:t>
       </w:r>
@@ -1989,8 +1720,6 @@
       <w:r>
         <w:rPr>
           <w:noProof/>
-          <w:sz w:val="18"/>
-          <w:szCs w:val="18"/>
         </w:rPr>
         <w:drawing>
           <wp:anchor distT="0" distB="0" distL="114300" distR="114300" simplePos="0" relativeHeight="251671552" behindDoc="0" locked="0" layoutInCell="1" allowOverlap="1" wp14:anchorId="4567D994">
@@ -2076,31 +1805,23 @@
         </w:tabs>
         <w:rPr>
           <w:noProof/>
-          <w:sz w:val="18"/>
-          <w:szCs w:val="18"/>
-        </w:rPr>
-      </w:pPr>
-      <w:r>
-        <w:rPr>
-          <w:noProof/>
-          <w:sz w:val="18"/>
-          <w:szCs w:val="18"/>
+        </w:rPr>
+      </w:pPr>
+      <w:r>
+        <w:rPr>
+          <w:noProof/>
         </w:rPr>
         <w:t xml:space="preserve">15- </w:t>
       </w:r>
       <w:r>
         <w:rPr>
           <w:noProof/>
-          <w:sz w:val="18"/>
-          <w:szCs w:val="18"/>
         </w:rPr>
         <w:t>N</w:t>
       </w:r>
       <w:r>
         <w:rPr>
           <w:noProof/>
-          <w:sz w:val="18"/>
-          <w:szCs w:val="18"/>
         </w:rPr>
         <w:t xml:space="preserve">a div beneficios colocamos o espaço interno de 20px </w:t>
       </w:r>
@@ -2112,15 +1833,11 @@
         </w:tabs>
         <w:rPr>
           <w:noProof/>
-          <w:sz w:val="18"/>
-          <w:szCs w:val="18"/>
-        </w:rPr>
-      </w:pPr>
-      <w:r>
-        <w:rPr>
-          <w:noProof/>
-          <w:sz w:val="18"/>
-          <w:szCs w:val="18"/>
+        </w:rPr>
+      </w:pPr>
+      <w:r>
+        <w:rPr>
+          <w:noProof/>
         </w:rPr>
         <w:drawing>
           <wp:anchor distT="0" distB="0" distL="114300" distR="114300" simplePos="0" relativeHeight="251672576" behindDoc="0" locked="0" layoutInCell="1" allowOverlap="1" wp14:anchorId="3A389799">
@@ -2180,47 +1897,37 @@
         </w:tabs>
         <w:rPr>
           <w:noProof/>
-          <w:sz w:val="18"/>
-          <w:szCs w:val="18"/>
-        </w:rPr>
-      </w:pPr>
-    </w:p>
-    <w:p>
-      <w:pPr>
-        <w:tabs>
-          <w:tab w:val="left" w:pos="1200"/>
-        </w:tabs>
-        <w:rPr>
-          <w:noProof/>
-          <w:sz w:val="18"/>
-          <w:szCs w:val="18"/>
-        </w:rPr>
-      </w:pPr>
-    </w:p>
-    <w:p>
-      <w:pPr>
-        <w:tabs>
-          <w:tab w:val="left" w:pos="1200"/>
-        </w:tabs>
-        <w:rPr>
-          <w:noProof/>
-          <w:sz w:val="18"/>
-          <w:szCs w:val="18"/>
-        </w:rPr>
-      </w:pPr>
-      <w:r>
-        <w:rPr>
-          <w:noProof/>
-          <w:sz w:val="18"/>
-          <w:szCs w:val="18"/>
+        </w:rPr>
+      </w:pPr>
+    </w:p>
+    <w:p>
+      <w:pPr>
+        <w:tabs>
+          <w:tab w:val="left" w:pos="1200"/>
+        </w:tabs>
+        <w:rPr>
+          <w:noProof/>
+        </w:rPr>
+      </w:pPr>
+    </w:p>
+    <w:p>
+      <w:pPr>
+        <w:tabs>
+          <w:tab w:val="left" w:pos="1200"/>
+        </w:tabs>
+        <w:rPr>
+          <w:noProof/>
+        </w:rPr>
+      </w:pPr>
+      <w:r>
+        <w:rPr>
+          <w:noProof/>
         </w:rPr>
         <w:t xml:space="preserve">16- </w:t>
       </w:r>
       <w:r>
         <w:rPr>
           <w:noProof/>
-          <w:sz w:val="18"/>
-          <w:szCs w:val="18"/>
         </w:rPr>
         <w:t>Centralizamos o subtitulo h2</w:t>
       </w:r>
@@ -2232,27 +1939,21 @@
         </w:tabs>
         <w:rPr>
           <w:noProof/>
-          <w:sz w:val="18"/>
-          <w:szCs w:val="18"/>
-        </w:rPr>
-      </w:pPr>
-    </w:p>
-    <w:p>
-      <w:pPr>
-        <w:tabs>
-          <w:tab w:val="left" w:pos="1200"/>
-        </w:tabs>
-        <w:rPr>
-          <w:noProof/>
-          <w:sz w:val="18"/>
-          <w:szCs w:val="18"/>
-        </w:rPr>
-      </w:pPr>
-      <w:r>
-        <w:rPr>
-          <w:noProof/>
-          <w:sz w:val="18"/>
-          <w:szCs w:val="18"/>
+        </w:rPr>
+      </w:pPr>
+    </w:p>
+    <w:p>
+      <w:pPr>
+        <w:tabs>
+          <w:tab w:val="left" w:pos="1200"/>
+        </w:tabs>
+        <w:rPr>
+          <w:noProof/>
+        </w:rPr>
+      </w:pPr>
+      <w:r>
+        <w:rPr>
+          <w:noProof/>
         </w:rPr>
         <w:drawing>
           <wp:anchor distT="0" distB="0" distL="114300" distR="114300" simplePos="0" relativeHeight="251673600" behindDoc="0" locked="0" layoutInCell="1" allowOverlap="1" wp14:anchorId="4684BB31">
@@ -2312,35 +2013,27 @@
         </w:tabs>
         <w:rPr>
           <w:noProof/>
-          <w:sz w:val="18"/>
-          <w:szCs w:val="18"/>
-        </w:rPr>
-      </w:pPr>
-    </w:p>
-    <w:p>
-      <w:pPr>
-        <w:tabs>
-          <w:tab w:val="left" w:pos="1200"/>
-        </w:tabs>
-        <w:rPr>
-          <w:noProof/>
-          <w:sz w:val="18"/>
-          <w:szCs w:val="18"/>
-        </w:rPr>
-      </w:pPr>
-      <w:r>
-        <w:rPr>
-          <w:noProof/>
-          <w:sz w:val="18"/>
-          <w:szCs w:val="18"/>
+        </w:rPr>
+      </w:pPr>
+    </w:p>
+    <w:p>
+      <w:pPr>
+        <w:tabs>
+          <w:tab w:val="left" w:pos="1200"/>
+        </w:tabs>
+        <w:rPr>
+          <w:noProof/>
+        </w:rPr>
+      </w:pPr>
+      <w:r>
+        <w:rPr>
+          <w:noProof/>
         </w:rPr>
         <w:t xml:space="preserve">17- </w:t>
       </w:r>
       <w:r>
         <w:rPr>
           <w:noProof/>
-          <w:sz w:val="18"/>
-          <w:szCs w:val="18"/>
         </w:rPr>
         <w:t>criamos os arquivos produto.html e produto.css dentro da pasta do projeto.</w:t>
       </w:r>
@@ -2363,8 +2056,6 @@
       <w:r>
         <w:rPr>
           <w:noProof/>
-          <w:sz w:val="18"/>
-          <w:szCs w:val="18"/>
         </w:rPr>
         <w:drawing>
           <wp:inline distT="0" distB="0" distL="0" distR="0" wp14:anchorId="1C143C6B" wp14:editId="763051FC">
@@ -2415,16 +2106,12 @@
       <w:r>
         <w:rPr>
           <w:noProof/>
-          <w:sz w:val="18"/>
-          <w:szCs w:val="18"/>
         </w:rPr>
         <w:t xml:space="preserve">18- </w:t>
       </w:r>
       <w:r>
         <w:rPr>
           <w:noProof/>
-          <w:sz w:val="18"/>
-          <w:szCs w:val="18"/>
         </w:rPr>
         <w:t>No Header inserimos a tag h1 com a imagem com logo e abaixo fizemos uma lista não ordenada com os itens que posterior será o menu da página onde colocamos a tag a para ancorar o link com as paginas do projeto conforme a imagem.</w:t>
       </w:r>
@@ -2447,8 +2134,6 @@
       <w:r>
         <w:rPr>
           <w:noProof/>
-          <w:sz w:val="18"/>
-          <w:szCs w:val="18"/>
         </w:rPr>
         <w:drawing>
           <wp:anchor distT="0" distB="0" distL="114300" distR="114300" simplePos="0" relativeHeight="251674624" behindDoc="0" locked="0" layoutInCell="1" allowOverlap="1" wp14:anchorId="3A70756F">
@@ -2508,83 +2193,67 @@
         </w:tabs>
         <w:rPr>
           <w:noProof/>
-          <w:sz w:val="18"/>
-          <w:szCs w:val="18"/>
-        </w:rPr>
-      </w:pPr>
-    </w:p>
-    <w:p>
-      <w:pPr>
-        <w:tabs>
-          <w:tab w:val="left" w:pos="1200"/>
-        </w:tabs>
-        <w:rPr>
-          <w:noProof/>
-          <w:sz w:val="18"/>
-          <w:szCs w:val="18"/>
-        </w:rPr>
-      </w:pPr>
-    </w:p>
-    <w:p>
-      <w:pPr>
-        <w:tabs>
-          <w:tab w:val="left" w:pos="1200"/>
-        </w:tabs>
-        <w:rPr>
-          <w:noProof/>
-          <w:sz w:val="18"/>
-          <w:szCs w:val="18"/>
-        </w:rPr>
-      </w:pPr>
-    </w:p>
-    <w:p>
-      <w:pPr>
-        <w:tabs>
-          <w:tab w:val="left" w:pos="1200"/>
-        </w:tabs>
-        <w:rPr>
-          <w:noProof/>
-          <w:sz w:val="18"/>
-          <w:szCs w:val="18"/>
-        </w:rPr>
-      </w:pPr>
-    </w:p>
-    <w:p>
-      <w:pPr>
-        <w:tabs>
-          <w:tab w:val="left" w:pos="1200"/>
-        </w:tabs>
-        <w:rPr>
-          <w:noProof/>
-          <w:sz w:val="18"/>
-          <w:szCs w:val="18"/>
-        </w:rPr>
-      </w:pPr>
-    </w:p>
-    <w:p>
-      <w:pPr>
-        <w:tabs>
-          <w:tab w:val="left" w:pos="1200"/>
-        </w:tabs>
-        <w:rPr>
-          <w:noProof/>
-          <w:sz w:val="18"/>
-          <w:szCs w:val="18"/>
-        </w:rPr>
-      </w:pPr>
-      <w:r>
-        <w:rPr>
-          <w:noProof/>
-          <w:sz w:val="18"/>
-          <w:szCs w:val="18"/>
+        </w:rPr>
+      </w:pPr>
+    </w:p>
+    <w:p>
+      <w:pPr>
+        <w:tabs>
+          <w:tab w:val="left" w:pos="1200"/>
+        </w:tabs>
+        <w:rPr>
+          <w:noProof/>
+        </w:rPr>
+      </w:pPr>
+    </w:p>
+    <w:p>
+      <w:pPr>
+        <w:tabs>
+          <w:tab w:val="left" w:pos="1200"/>
+        </w:tabs>
+        <w:rPr>
+          <w:noProof/>
+        </w:rPr>
+      </w:pPr>
+    </w:p>
+    <w:p>
+      <w:pPr>
+        <w:tabs>
+          <w:tab w:val="left" w:pos="1200"/>
+        </w:tabs>
+        <w:rPr>
+          <w:noProof/>
+        </w:rPr>
+      </w:pPr>
+    </w:p>
+    <w:p>
+      <w:pPr>
+        <w:tabs>
+          <w:tab w:val="left" w:pos="1200"/>
+        </w:tabs>
+        <w:rPr>
+          <w:noProof/>
+        </w:rPr>
+      </w:pPr>
+    </w:p>
+    <w:p>
+      <w:pPr>
+        <w:tabs>
+          <w:tab w:val="left" w:pos="1200"/>
+        </w:tabs>
+        <w:rPr>
+          <w:noProof/>
+        </w:rPr>
+      </w:pPr>
+      <w:r>
+        <w:rPr>
+          <w:noProof/>
         </w:rPr>
         <w:t xml:space="preserve">19- </w:t>
       </w:r>
       <w:r>
         <w:rPr>
           <w:noProof/>
-          <w:sz w:val="18"/>
-          <w:szCs w:val="18"/>
         </w:rPr>
         <w:t>No Header botamos uma cor de fundo</w:t>
       </w:r>
@@ -2596,15 +2265,11 @@
         </w:tabs>
         <w:rPr>
           <w:noProof/>
-          <w:sz w:val="18"/>
-          <w:szCs w:val="18"/>
-        </w:rPr>
-      </w:pPr>
-      <w:r>
-        <w:rPr>
-          <w:noProof/>
-          <w:sz w:val="18"/>
-          <w:szCs w:val="18"/>
+        </w:rPr>
+      </w:pPr>
+      <w:r>
+        <w:rPr>
+          <w:noProof/>
         </w:rPr>
         <w:drawing>
           <wp:inline distT="0" distB="0" distL="0" distR="0" wp14:anchorId="49E6D1B3" wp14:editId="3CCB871C">
@@ -2645,32 +2310,24 @@
       <w:r>
         <w:rPr>
           <w:noProof/>
-          <w:sz w:val="18"/>
-          <w:szCs w:val="18"/>
         </w:rPr>
         <w:tab/>
       </w:r>
       <w:r>
         <w:rPr>
           <w:noProof/>
-          <w:sz w:val="18"/>
-          <w:szCs w:val="18"/>
         </w:rPr>
         <w:tab/>
       </w:r>
       <w:r>
         <w:rPr>
           <w:noProof/>
-          <w:sz w:val="18"/>
-          <w:szCs w:val="18"/>
         </w:rPr>
         <w:tab/>
       </w:r>
       <w:r>
         <w:rPr>
           <w:noProof/>
-          <w:sz w:val="18"/>
-          <w:szCs w:val="18"/>
         </w:rPr>
         <w:tab/>
       </w:r>
@@ -2682,23 +2339,17 @@
         </w:tabs>
         <w:rPr>
           <w:noProof/>
-          <w:sz w:val="18"/>
-          <w:szCs w:val="18"/>
-        </w:rPr>
-      </w:pPr>
-      <w:r>
-        <w:rPr>
-          <w:noProof/>
-          <w:sz w:val="18"/>
-          <w:szCs w:val="18"/>
+        </w:rPr>
+      </w:pPr>
+      <w:r>
+        <w:rPr>
+          <w:noProof/>
         </w:rPr>
         <w:t>20- Adicionamos a tag nav a nossa lista</w:t>
       </w:r>
       <w:r>
         <w:rPr>
           <w:noProof/>
-          <w:sz w:val="18"/>
-          <w:szCs w:val="18"/>
         </w:rPr>
         <w:t>, indicando que é que é um menu de navegação.</w:t>
       </w:r>
@@ -2710,15 +2361,11 @@
         </w:tabs>
         <w:rPr>
           <w:noProof/>
-          <w:sz w:val="18"/>
-          <w:szCs w:val="18"/>
-        </w:rPr>
-      </w:pPr>
-      <w:r>
-        <w:rPr>
-          <w:noProof/>
-          <w:sz w:val="18"/>
-          <w:szCs w:val="18"/>
+        </w:rPr>
+      </w:pPr>
+      <w:r>
+        <w:rPr>
+          <w:noProof/>
         </w:rPr>
         <w:drawing>
           <wp:inline distT="0" distB="0" distL="0" distR="0" wp14:anchorId="39A1EB31" wp14:editId="47226991">
@@ -2764,15 +2411,11 @@
         </w:tabs>
         <w:rPr>
           <w:noProof/>
-          <w:sz w:val="18"/>
-          <w:szCs w:val="18"/>
-        </w:rPr>
-      </w:pPr>
-      <w:r>
-        <w:rPr>
-          <w:noProof/>
-          <w:sz w:val="18"/>
-          <w:szCs w:val="18"/>
+        </w:rPr>
+      </w:pPr>
+      <w:r>
+        <w:rPr>
+          <w:noProof/>
         </w:rPr>
         <mc:AlternateContent>
           <mc:Choice Requires="wps">
@@ -2829,7 +2472,7 @@
           </mc:Choice>
           <mc:Fallback>
             <w:pict>
-              <v:shape w14:anchorId="40BB2EF2" id="Conector de Seta Reta 30" o:spid="_x0000_s1026" type="#_x0000_t32" style="position:absolute;margin-left:102.75pt;margin-top:15.15pt;width:210.75pt;height:28.5pt;flip:x;z-index:251676672;visibility:visible;mso-wrap-style:square;mso-wrap-distance-left:9pt;mso-wrap-distance-top:0;mso-wrap-distance-right:9pt;mso-wrap-distance-bottom:0;mso-position-horizontal:absolute;mso-position-horizontal-relative:text;mso-position-vertical:absolute;mso-position-vertical-relative:text" o:gfxdata="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" strokecolor="#4472c4 [3204]" strokeweight=".5pt">
+              <v:shape w14:anchorId="15325707" id="Conector de Seta Reta 30" o:spid="_x0000_s1026" type="#_x0000_t32" style="position:absolute;margin-left:102.75pt;margin-top:15.15pt;width:210.75pt;height:28.5pt;flip:x;z-index:251676672;visibility:visible;mso-wrap-style:square;mso-wrap-distance-left:9pt;mso-wrap-distance-top:0;mso-wrap-distance-right:9pt;mso-wrap-distance-bottom:0;mso-position-horizontal:absolute;mso-position-horizontal-relative:text;mso-position-vertical:absolute;mso-position-vertical-relative:text" o:gfxdata="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" strokecolor="#4472c4 [3204]" strokeweight=".5pt">
                 <v:stroke endarrow="block" joinstyle="miter"/>
               </v:shape>
             </w:pict>
@@ -2839,8 +2482,6 @@
       <w:r>
         <w:rPr>
           <w:noProof/>
-          <w:sz w:val="18"/>
-          <w:szCs w:val="18"/>
         </w:rPr>
         <mc:AlternateContent>
           <mc:Choice Requires="wps">
@@ -2897,7 +2538,7 @@
           </mc:Choice>
           <mc:Fallback>
             <w:pict>
-              <v:shape w14:anchorId="3D75E553" id="Conector de Seta Reta 29" o:spid="_x0000_s1026" type="#_x0000_t32" style="position:absolute;margin-left:86.25pt;margin-top:16.65pt;width:120.75pt;height:17.25pt;flip:x;z-index:251675648;visibility:visible;mso-wrap-style:square;mso-wrap-distance-left:9pt;mso-wrap-distance-top:0;mso-wrap-distance-right:9pt;mso-wrap-distance-bottom:0;mso-position-horizontal:absolute;mso-position-horizontal-relative:text;mso-position-vertical:absolute;mso-position-vertical-relative:text" o:gfxdata="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" strokecolor="#4472c4 [3204]" strokeweight=".5pt">
+              <v:shape w14:anchorId="75F687A0" id="Conector de Seta Reta 29" o:spid="_x0000_s1026" type="#_x0000_t32" style="position:absolute;margin-left:86.25pt;margin-top:16.65pt;width:120.75pt;height:17.25pt;flip:x;z-index:251675648;visibility:visible;mso-wrap-style:square;mso-wrap-distance-left:9pt;mso-wrap-distance-top:0;mso-wrap-distance-right:9pt;mso-wrap-distance-bottom:0;mso-position-horizontal:absolute;mso-position-horizontal-relative:text;mso-position-vertical:absolute;mso-position-vertical-relative:text" o:gfxdata="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" strokecolor="#4472c4 [3204]" strokeweight=".5pt">
                 <v:stroke endarrow="block" joinstyle="miter"/>
               </v:shape>
             </w:pict>
@@ -2907,32 +2548,24 @@
       <w:r>
         <w:rPr>
           <w:noProof/>
-          <w:sz w:val="18"/>
-          <w:szCs w:val="18"/>
         </w:rPr>
         <w:t xml:space="preserve">21- </w:t>
       </w:r>
       <w:r>
         <w:rPr>
           <w:noProof/>
-          <w:sz w:val="18"/>
-          <w:szCs w:val="18"/>
         </w:rPr>
         <w:t xml:space="preserve">No </w:t>
       </w:r>
       <w:r>
         <w:rPr>
           <w:noProof/>
-          <w:sz w:val="18"/>
-          <w:szCs w:val="18"/>
         </w:rPr>
         <w:t>c</w:t>
       </w:r>
       <w:r>
         <w:rPr>
           <w:noProof/>
-          <w:sz w:val="18"/>
-          <w:szCs w:val="18"/>
         </w:rPr>
         <w:t>ss utilizamos a nav li para coçocar os itens um ao lado do outro e colocamos espaço entre os itens.</w:t>
       </w:r>
@@ -2944,15 +2577,11 @@
         </w:tabs>
         <w:rPr>
           <w:noProof/>
-          <w:sz w:val="18"/>
-          <w:szCs w:val="18"/>
-        </w:rPr>
-      </w:pPr>
-      <w:r>
-        <w:rPr>
-          <w:noProof/>
-          <w:sz w:val="18"/>
-          <w:szCs w:val="18"/>
+        </w:rPr>
+      </w:pPr>
+      <w:r>
+        <w:rPr>
+          <w:noProof/>
         </w:rPr>
         <w:drawing>
           <wp:inline distT="0" distB="0" distL="0" distR="0" wp14:anchorId="7445FE99" wp14:editId="1A900F8E">
@@ -2998,15 +2627,11 @@
         </w:tabs>
         <w:rPr>
           <w:noProof/>
-          <w:sz w:val="18"/>
-          <w:szCs w:val="18"/>
-        </w:rPr>
-      </w:pPr>
-      <w:r>
-        <w:rPr>
-          <w:noProof/>
-          <w:sz w:val="18"/>
-          <w:szCs w:val="18"/>
+        </w:rPr>
+      </w:pPr>
+      <w:r>
+        <w:rPr>
+          <w:noProof/>
         </w:rPr>
         <w:drawing>
           <wp:anchor distT="0" distB="0" distL="114300" distR="114300" simplePos="0" relativeHeight="251677696" behindDoc="1" locked="0" layoutInCell="1" allowOverlap="1" wp14:anchorId="7AD145E2">
@@ -3061,16 +2686,12 @@
       <w:r>
         <w:rPr>
           <w:noProof/>
-          <w:sz w:val="18"/>
-          <w:szCs w:val="18"/>
         </w:rPr>
         <w:t>22-</w:t>
       </w:r>
       <w:r>
         <w:rPr>
           <w:noProof/>
-          <w:sz w:val="18"/>
-          <w:szCs w:val="18"/>
         </w:rPr>
         <w:t xml:space="preserve"> Ainda no css utilizamos o nav a estilizamos os textos da seguinte forma:</w:t>
       </w:r>
@@ -3088,16 +2709,12 @@
         <w:rPr>
           <w:b/>
           <w:noProof/>
-          <w:sz w:val="18"/>
-          <w:szCs w:val="18"/>
         </w:rPr>
       </w:pPr>
       <w:r>
         <w:rPr>
           <w:b/>
           <w:noProof/>
-          <w:sz w:val="18"/>
-          <w:szCs w:val="18"/>
         </w:rPr>
         <w:t>Aumentamos o tamanho da fonte.</w:t>
       </w:r>
@@ -3115,16 +2732,12 @@
         <w:rPr>
           <w:b/>
           <w:noProof/>
-          <w:sz w:val="18"/>
-          <w:szCs w:val="18"/>
         </w:rPr>
       </w:pPr>
       <w:r>
         <w:rPr>
           <w:b/>
           <w:noProof/>
-          <w:sz w:val="18"/>
-          <w:szCs w:val="18"/>
         </w:rPr>
         <w:t>Deixamos a fonte em negrito e encorpamos o texto.</w:t>
       </w:r>
@@ -3142,16 +2755,12 @@
         <w:rPr>
           <w:b/>
           <w:noProof/>
-          <w:sz w:val="18"/>
-          <w:szCs w:val="18"/>
         </w:rPr>
       </w:pPr>
       <w:r>
         <w:rPr>
           <w:b/>
           <w:noProof/>
-          <w:sz w:val="18"/>
-          <w:szCs w:val="18"/>
         </w:rPr>
         <w:t>Transformamos o texto em maiusculo.</w:t>
       </w:r>
@@ -3169,16 +2778,12 @@
         <w:rPr>
           <w:b/>
           <w:noProof/>
-          <w:sz w:val="18"/>
-          <w:szCs w:val="18"/>
         </w:rPr>
       </w:pPr>
       <w:r>
         <w:rPr>
           <w:b/>
           <w:noProof/>
-          <w:sz w:val="18"/>
-          <w:szCs w:val="18"/>
         </w:rPr>
         <w:t>Colocamos a cor preta no texto.</w:t>
       </w:r>
@@ -3196,16 +2801,12 @@
         <w:rPr>
           <w:b/>
           <w:noProof/>
-          <w:sz w:val="18"/>
-          <w:szCs w:val="18"/>
         </w:rPr>
       </w:pPr>
       <w:r>
         <w:rPr>
           <w:b/>
           <w:noProof/>
-          <w:sz w:val="18"/>
-          <w:szCs w:val="18"/>
         </w:rPr>
         <w:t>Tiramos o sublinhado.</w:t>
       </w:r>
@@ -3217,35 +2818,27 @@
         </w:tabs>
         <w:rPr>
           <w:noProof/>
-          <w:sz w:val="18"/>
-          <w:szCs w:val="18"/>
-        </w:rPr>
-      </w:pPr>
-    </w:p>
-    <w:p>
-      <w:pPr>
-        <w:tabs>
-          <w:tab w:val="left" w:pos="1200"/>
-        </w:tabs>
-        <w:rPr>
-          <w:noProof/>
-          <w:sz w:val="18"/>
-          <w:szCs w:val="18"/>
-        </w:rPr>
-      </w:pPr>
-      <w:r>
-        <w:rPr>
-          <w:noProof/>
-          <w:sz w:val="18"/>
-          <w:szCs w:val="18"/>
+        </w:rPr>
+      </w:pPr>
+    </w:p>
+    <w:p>
+      <w:pPr>
+        <w:tabs>
+          <w:tab w:val="left" w:pos="1200"/>
+        </w:tabs>
+        <w:rPr>
+          <w:noProof/>
+        </w:rPr>
+      </w:pPr>
+      <w:r>
+        <w:rPr>
+          <w:noProof/>
         </w:rPr>
         <w:t xml:space="preserve">23- </w:t>
       </w:r>
       <w:r>
         <w:rPr>
           <w:noProof/>
-          <w:sz w:val="18"/>
-          <w:szCs w:val="18"/>
         </w:rPr>
         <w:t>Trabalhando com posicionamento</w:t>
       </w:r>
@@ -3263,16 +2856,12 @@
         <w:rPr>
           <w:b/>
           <w:noProof/>
-          <w:sz w:val="18"/>
-          <w:szCs w:val="18"/>
         </w:rPr>
       </w:pPr>
       <w:r>
         <w:rPr>
           <w:b/>
           <w:noProof/>
-          <w:sz w:val="18"/>
-          <w:szCs w:val="18"/>
         </w:rPr>
         <w:t>Static</w:t>
       </w:r>
@@ -3290,16 +2879,12 @@
         <w:rPr>
           <w:b/>
           <w:noProof/>
-          <w:sz w:val="18"/>
-          <w:szCs w:val="18"/>
         </w:rPr>
       </w:pPr>
       <w:r>
         <w:rPr>
           <w:b/>
           <w:noProof/>
-          <w:sz w:val="18"/>
-          <w:szCs w:val="18"/>
         </w:rPr>
         <w:t>Relative</w:t>
       </w:r>
@@ -3317,16 +2902,12 @@
         <w:rPr>
           <w:b/>
           <w:noProof/>
-          <w:sz w:val="18"/>
-          <w:szCs w:val="18"/>
         </w:rPr>
       </w:pPr>
       <w:r>
         <w:rPr>
           <w:b/>
           <w:noProof/>
-          <w:sz w:val="18"/>
-          <w:szCs w:val="18"/>
         </w:rPr>
         <w:t>Absolute</w:t>
       </w:r>
@@ -3338,15 +2919,11 @@
         </w:tabs>
         <w:rPr>
           <w:noProof/>
-          <w:sz w:val="18"/>
-          <w:szCs w:val="18"/>
-        </w:rPr>
-      </w:pPr>
-      <w:r>
-        <w:rPr>
-          <w:noProof/>
-          <w:sz w:val="18"/>
-          <w:szCs w:val="18"/>
+        </w:rPr>
+      </w:pPr>
+      <w:r>
+        <w:rPr>
+          <w:noProof/>
         </w:rPr>
         <w:t xml:space="preserve">Na position </w:t>
       </w:r>
@@ -3354,16 +2931,12 @@
         <w:rPr>
           <w:b/>
           <w:noProof/>
-          <w:sz w:val="18"/>
-          <w:szCs w:val="18"/>
         </w:rPr>
         <w:t>static</w:t>
       </w:r>
       <w:r>
         <w:rPr>
           <w:noProof/>
-          <w:sz w:val="18"/>
-          <w:szCs w:val="18"/>
         </w:rPr>
         <w:t xml:space="preserve"> -&gt; como o nome diz a posição fica parada no ponto inicial.</w:t>
       </w:r>
@@ -3375,15 +2948,11 @@
         </w:tabs>
         <w:rPr>
           <w:noProof/>
-          <w:sz w:val="18"/>
-          <w:szCs w:val="18"/>
-        </w:rPr>
-      </w:pPr>
-      <w:r>
-        <w:rPr>
-          <w:noProof/>
-          <w:sz w:val="18"/>
-          <w:szCs w:val="18"/>
+        </w:rPr>
+      </w:pPr>
+      <w:r>
+        <w:rPr>
+          <w:noProof/>
         </w:rPr>
         <w:t xml:space="preserve">Na position </w:t>
       </w:r>
@@ -3391,16 +2960,12 @@
         <w:rPr>
           <w:b/>
           <w:noProof/>
-          <w:sz w:val="18"/>
-          <w:szCs w:val="18"/>
         </w:rPr>
         <w:t>relative</w:t>
       </w:r>
       <w:r>
         <w:rPr>
           <w:noProof/>
-          <w:sz w:val="18"/>
-          <w:szCs w:val="18"/>
         </w:rPr>
         <w:t xml:space="preserve"> -&gt; ele anda conforme sua posição original.</w:t>
       </w:r>
@@ -3412,15 +2977,11 @@
         </w:tabs>
         <w:rPr>
           <w:noProof/>
-          <w:sz w:val="18"/>
-          <w:szCs w:val="18"/>
-        </w:rPr>
-      </w:pPr>
-      <w:r>
-        <w:rPr>
-          <w:noProof/>
-          <w:sz w:val="18"/>
-          <w:szCs w:val="18"/>
+        </w:rPr>
+      </w:pPr>
+      <w:r>
+        <w:rPr>
+          <w:noProof/>
         </w:rPr>
         <w:t xml:space="preserve">Na position </w:t>
       </w:r>
@@ -3428,16 +2989,12 @@
         <w:rPr>
           <w:b/>
           <w:noProof/>
-          <w:sz w:val="18"/>
-          <w:szCs w:val="18"/>
         </w:rPr>
         <w:t>absolute</w:t>
       </w:r>
       <w:r>
         <w:rPr>
           <w:noProof/>
-          <w:sz w:val="18"/>
-          <w:szCs w:val="18"/>
         </w:rPr>
         <w:t xml:space="preserve"> -&gt; é absoluto ao site ignorando a posição inicial.</w:t>
       </w:r>
@@ -3449,15 +3006,11 @@
         </w:tabs>
         <w:rPr>
           <w:noProof/>
-          <w:sz w:val="18"/>
-          <w:szCs w:val="18"/>
-        </w:rPr>
-      </w:pPr>
-      <w:r>
-        <w:rPr>
-          <w:noProof/>
-          <w:sz w:val="18"/>
-          <w:szCs w:val="18"/>
+        </w:rPr>
+      </w:pPr>
+      <w:r>
+        <w:rPr>
+          <w:noProof/>
         </w:rPr>
         <w:t>Para centralizar o menu utilizamos:</w:t>
       </w:r>
@@ -3469,15 +3022,11 @@
         </w:tabs>
         <w:rPr>
           <w:noProof/>
-          <w:sz w:val="18"/>
-          <w:szCs w:val="18"/>
-        </w:rPr>
-      </w:pPr>
-      <w:r>
-        <w:rPr>
-          <w:noProof/>
-          <w:sz w:val="18"/>
-          <w:szCs w:val="18"/>
+        </w:rPr>
+      </w:pPr>
+      <w:r>
+        <w:rPr>
+          <w:noProof/>
         </w:rPr>
         <w:drawing>
           <wp:inline distT="0" distB="0" distL="0" distR="0" wp14:anchorId="65E00149" wp14:editId="17F6DEFC">
@@ -3523,31 +3072,23 @@
         </w:tabs>
         <w:rPr>
           <w:noProof/>
-          <w:sz w:val="18"/>
-          <w:szCs w:val="18"/>
-        </w:rPr>
-      </w:pPr>
-      <w:r>
-        <w:rPr>
-          <w:noProof/>
-          <w:sz w:val="18"/>
-          <w:szCs w:val="18"/>
+        </w:rPr>
+      </w:pPr>
+      <w:r>
+        <w:rPr>
+          <w:noProof/>
         </w:rPr>
         <w:t xml:space="preserve">24- </w:t>
       </w:r>
       <w:r>
         <w:rPr>
           <w:noProof/>
-          <w:sz w:val="18"/>
-          <w:szCs w:val="18"/>
         </w:rPr>
         <w:t>Para r</w:t>
       </w:r>
       <w:r>
         <w:rPr>
           <w:noProof/>
-          <w:sz w:val="18"/>
-          <w:szCs w:val="18"/>
         </w:rPr>
         <w:t>esetar o css do navegador utilizamos o reset.css que pegamos do seguinte site:</w:t>
       </w:r>
@@ -3559,8 +3100,6 @@
         </w:tabs>
         <w:rPr>
           <w:noProof/>
-          <w:sz w:val="18"/>
-          <w:szCs w:val="18"/>
         </w:rPr>
       </w:pPr>
       <w:hyperlink r:id="rId35" w:history="1">
@@ -3568,8 +3107,6 @@
           <w:rPr>
             <w:rStyle w:val="Hyperlink"/>
             <w:noProof/>
-            <w:sz w:val="18"/>
-            <w:szCs w:val="18"/>
           </w:rPr>
           <w:t>https://meyerweb.com/eric/tools/css/reset/</w:t>
         </w:r>
@@ -3582,15 +3119,11 @@
         </w:tabs>
         <w:rPr>
           <w:noProof/>
-          <w:sz w:val="18"/>
-          <w:szCs w:val="18"/>
-        </w:rPr>
-      </w:pPr>
-      <w:r>
-        <w:rPr>
-          <w:noProof/>
-          <w:sz w:val="18"/>
-          <w:szCs w:val="18"/>
+        </w:rPr>
+      </w:pPr>
+      <w:r>
+        <w:rPr>
+          <w:noProof/>
         </w:rPr>
         <w:t>obs: O reset.css deve sempre ficar na parte de cima do nosso css (da página)</w:t>
       </w:r>
@@ -3602,15 +3135,11 @@
         </w:tabs>
         <w:rPr>
           <w:noProof/>
-          <w:sz w:val="18"/>
-          <w:szCs w:val="18"/>
-        </w:rPr>
-      </w:pPr>
-      <w:r>
-        <w:rPr>
-          <w:noProof/>
-          <w:sz w:val="18"/>
-          <w:szCs w:val="18"/>
+        </w:rPr>
+      </w:pPr>
+      <w:r>
+        <w:rPr>
+          <w:noProof/>
         </w:rPr>
         <w:drawing>
           <wp:inline distT="0" distB="0" distL="0" distR="0" wp14:anchorId="5273BA84" wp14:editId="46B4C5F7">
@@ -3656,31 +3185,23 @@
         </w:tabs>
         <w:rPr>
           <w:noProof/>
-          <w:sz w:val="18"/>
-          <w:szCs w:val="18"/>
-        </w:rPr>
-      </w:pPr>
-      <w:r>
-        <w:rPr>
-          <w:noProof/>
-          <w:sz w:val="18"/>
-          <w:szCs w:val="18"/>
+        </w:rPr>
+      </w:pPr>
+      <w:r>
+        <w:rPr>
+          <w:noProof/>
         </w:rPr>
         <w:t xml:space="preserve">25-  </w:t>
       </w:r>
       <w:r>
         <w:rPr>
           <w:noProof/>
-          <w:sz w:val="18"/>
-          <w:szCs w:val="18"/>
         </w:rPr>
         <w:t>Para centralizar o logo</w:t>
       </w:r>
       <w:r>
         <w:rPr>
           <w:noProof/>
-          <w:sz w:val="18"/>
-          <w:szCs w:val="18"/>
         </w:rPr>
         <w:t xml:space="preserve"> e menu dentro do header utilizamos uma div chamada caixa.</w:t>
       </w:r>
@@ -3692,15 +3213,11 @@
         </w:tabs>
         <w:rPr>
           <w:noProof/>
-          <w:sz w:val="18"/>
-          <w:szCs w:val="18"/>
-        </w:rPr>
-      </w:pPr>
-      <w:r>
-        <w:rPr>
-          <w:noProof/>
-          <w:sz w:val="18"/>
-          <w:szCs w:val="18"/>
+        </w:rPr>
+      </w:pPr>
+      <w:r>
+        <w:rPr>
+          <w:noProof/>
         </w:rPr>
         <w:drawing>
           <wp:inline distT="0" distB="0" distL="0" distR="0" wp14:anchorId="04B5B805" wp14:editId="5BE5E100">
@@ -3746,23 +3263,17 @@
         </w:tabs>
         <w:rPr>
           <w:noProof/>
-          <w:sz w:val="18"/>
-          <w:szCs w:val="18"/>
-        </w:rPr>
-      </w:pPr>
-      <w:r>
-        <w:rPr>
-          <w:noProof/>
-          <w:sz w:val="18"/>
-          <w:szCs w:val="18"/>
+        </w:rPr>
+      </w:pPr>
+      <w:r>
+        <w:rPr>
+          <w:noProof/>
         </w:rPr>
         <w:t xml:space="preserve">26- </w:t>
       </w:r>
       <w:r>
         <w:rPr>
           <w:noProof/>
-          <w:sz w:val="18"/>
-          <w:szCs w:val="18"/>
         </w:rPr>
         <w:t xml:space="preserve"> No css na div .caixa utilizamos:</w:t>
       </w:r>
@@ -3779,15 +3290,11 @@
         </w:tabs>
         <w:rPr>
           <w:noProof/>
-          <w:sz w:val="18"/>
-          <w:szCs w:val="18"/>
-        </w:rPr>
-      </w:pPr>
-      <w:r>
-        <w:rPr>
-          <w:noProof/>
-          <w:sz w:val="18"/>
-          <w:szCs w:val="18"/>
+        </w:rPr>
+      </w:pPr>
+      <w:r>
+        <w:rPr>
+          <w:noProof/>
         </w:rPr>
         <w:t>Definimos uma largura para div 940px</w:t>
       </w:r>
@@ -3804,15 +3311,11 @@
         </w:tabs>
         <w:rPr>
           <w:noProof/>
-          <w:sz w:val="18"/>
-          <w:szCs w:val="18"/>
-        </w:rPr>
-      </w:pPr>
-      <w:r>
-        <w:rPr>
-          <w:noProof/>
-          <w:sz w:val="18"/>
-          <w:szCs w:val="18"/>
+        </w:rPr>
+      </w:pPr>
+      <w:r>
+        <w:rPr>
+          <w:noProof/>
         </w:rPr>
         <w:t>Utilizamos margin: 0 auto para deixar tanto o logo como o menu centralizados</w:t>
       </w:r>
@@ -3829,28 +3332,25 @@
         </w:tabs>
         <w:rPr>
           <w:noProof/>
-          <w:sz w:val="18"/>
-          <w:szCs w:val="18"/>
-        </w:rPr>
-      </w:pPr>
-      <w:r>
-        <w:rPr>
-          <w:noProof/>
-          <w:sz w:val="18"/>
-          <w:szCs w:val="18"/>
+        </w:rPr>
+      </w:pPr>
+      <w:r>
+        <w:rPr>
+          <w:noProof/>
         </w:rPr>
         <w:t>E position relative para o menu andar conforme sua posição</w:t>
       </w:r>
-      <w:bookmarkStart w:id="0" w:name="_GoBack"/>
-      <w:bookmarkEnd w:id="0"/>
-    </w:p>
-    <w:p>
-      <w:pPr>
-        <w:tabs>
-          <w:tab w:val="left" w:pos="1200"/>
-        </w:tabs>
-      </w:pPr>
-      <w:r>
+    </w:p>
+    <w:p>
+      <w:pPr>
+        <w:tabs>
+          <w:tab w:val="left" w:pos="1200"/>
+        </w:tabs>
+      </w:pPr>
+      <w:r>
+        <w:rPr>
+          <w:noProof/>
+        </w:rPr>
         <w:drawing>
           <wp:inline distT="0" distB="0" distL="0" distR="0" wp14:anchorId="12404C75" wp14:editId="77B727BC">
             <wp:extent cx="2029108" cy="1066949"/>
@@ -3876,6 +3376,447 @@
                     <a:xfrm>
                       <a:off x="0" y="0"/>
                       <a:ext cx="2029108" cy="1066949"/>
+                    </a:xfrm>
+                    <a:prstGeom prst="rect">
+                      <a:avLst/>
+                    </a:prstGeom>
+                  </pic:spPr>
+                </pic:pic>
+              </a:graphicData>
+            </a:graphic>
+          </wp:inline>
+        </w:drawing>
+      </w:r>
+    </w:p>
+    <w:p>
+      <w:pPr>
+        <w:tabs>
+          <w:tab w:val="left" w:pos="1200"/>
+        </w:tabs>
+        <w:rPr>
+          <w:noProof/>
+        </w:rPr>
+      </w:pPr>
+      <w:r>
+        <w:t xml:space="preserve">27- Trabalhamos com </w:t>
+      </w:r>
+      <w:proofErr w:type="spellStart"/>
+      <w:r>
+        <w:t>Main</w:t>
+      </w:r>
+      <w:proofErr w:type="spellEnd"/>
+      <w:r>
+        <w:t>, criamos uma lista não ordenada onde inserimos um subtítulo, imagem e parágrafos para cada item da lista conforme a imagem:</w:t>
+      </w:r>
+      <w:r>
+        <w:rPr>
+          <w:noProof/>
+        </w:rPr>
+        <w:t xml:space="preserve"> </w:t>
+      </w:r>
+      <w:r>
+        <w:drawing>
+          <wp:inline distT="0" distB="0" distL="0" distR="0" wp14:anchorId="717DCFB5" wp14:editId="752BFA21">
+            <wp:extent cx="5163271" cy="3953427"/>
+            <wp:effectExtent l="0" t="0" r="0" b="9525"/>
+            <wp:docPr id="34" name="Imagem 34"/>
+            <wp:cNvGraphicFramePr>
+              <a:graphicFrameLocks xmlns:a="http://schemas.openxmlformats.org/drawingml/2006/main" noChangeAspect="1"/>
+            </wp:cNvGraphicFramePr>
+            <a:graphic xmlns:a="http://schemas.openxmlformats.org/drawingml/2006/main">
+              <a:graphicData uri="http://schemas.openxmlformats.org/drawingml/2006/picture">
+                <pic:pic xmlns:pic="http://schemas.openxmlformats.org/drawingml/2006/picture">
+                  <pic:nvPicPr>
+                    <pic:cNvPr id="1" name=""/>
+                    <pic:cNvPicPr/>
+                  </pic:nvPicPr>
+                  <pic:blipFill>
+                    <a:blip r:embed="rId39"/>
+                    <a:stretch>
+                      <a:fillRect/>
+                    </a:stretch>
+                  </pic:blipFill>
+                  <pic:spPr>
+                    <a:xfrm>
+                      <a:off x="0" y="0"/>
+                      <a:ext cx="5163271" cy="3953427"/>
+                    </a:xfrm>
+                    <a:prstGeom prst="rect">
+                      <a:avLst/>
+                    </a:prstGeom>
+                  </pic:spPr>
+                </pic:pic>
+              </a:graphicData>
+            </a:graphic>
+          </wp:inline>
+        </w:drawing>
+      </w:r>
+    </w:p>
+    <w:p>
+      <w:pPr>
+        <w:tabs>
+          <w:tab w:val="left" w:pos="1200"/>
+        </w:tabs>
+      </w:pPr>
+      <w:r>
+        <w:t>28- Para colocar cada item da</w:t>
+      </w:r>
+      <w:r>
+        <w:t xml:space="preserve"> lista um do lado do outro inserimos uma </w:t>
+      </w:r>
+      <w:proofErr w:type="spellStart"/>
+      <w:r>
+        <w:t>class</w:t>
+      </w:r>
+      <w:proofErr w:type="spellEnd"/>
+      <w:r>
+        <w:t xml:space="preserve"> na lista (</w:t>
+      </w:r>
+      <w:proofErr w:type="spellStart"/>
+      <w:r>
+        <w:t>html</w:t>
+      </w:r>
+      <w:proofErr w:type="spellEnd"/>
+      <w:r>
+        <w:t xml:space="preserve">) e no </w:t>
+      </w:r>
+      <w:proofErr w:type="spellStart"/>
+      <w:r>
+        <w:t>css</w:t>
+      </w:r>
+      <w:proofErr w:type="spellEnd"/>
+      <w:r>
+        <w:t xml:space="preserve"> adicionamos o Display: </w:t>
+      </w:r>
+      <w:proofErr w:type="spellStart"/>
+      <w:r>
+        <w:t>inline-block</w:t>
+      </w:r>
+      <w:proofErr w:type="spellEnd"/>
+    </w:p>
+    <w:p>
+      <w:pPr>
+        <w:tabs>
+          <w:tab w:val="left" w:pos="1200"/>
+        </w:tabs>
+      </w:pPr>
+      <w:r>
+        <w:drawing>
+          <wp:inline distT="0" distB="0" distL="0" distR="0" wp14:anchorId="51BFCA95" wp14:editId="02CCD504">
+            <wp:extent cx="2229161" cy="771633"/>
+            <wp:effectExtent l="0" t="0" r="0" b="9525"/>
+            <wp:docPr id="35" name="Imagem 35"/>
+            <wp:cNvGraphicFramePr>
+              <a:graphicFrameLocks xmlns:a="http://schemas.openxmlformats.org/drawingml/2006/main" noChangeAspect="1"/>
+            </wp:cNvGraphicFramePr>
+            <a:graphic xmlns:a="http://schemas.openxmlformats.org/drawingml/2006/main">
+              <a:graphicData uri="http://schemas.openxmlformats.org/drawingml/2006/picture">
+                <pic:pic xmlns:pic="http://schemas.openxmlformats.org/drawingml/2006/picture">
+                  <pic:nvPicPr>
+                    <pic:cNvPr id="1" name=""/>
+                    <pic:cNvPicPr/>
+                  </pic:nvPicPr>
+                  <pic:blipFill>
+                    <a:blip r:embed="rId40"/>
+                    <a:stretch>
+                      <a:fillRect/>
+                    </a:stretch>
+                  </pic:blipFill>
+                  <pic:spPr>
+                    <a:xfrm>
+                      <a:off x="0" y="0"/>
+                      <a:ext cx="2229161" cy="771633"/>
+                    </a:xfrm>
+                    <a:prstGeom prst="rect">
+                      <a:avLst/>
+                    </a:prstGeom>
+                  </pic:spPr>
+                </pic:pic>
+              </a:graphicData>
+            </a:graphic>
+          </wp:inline>
+        </w:drawing>
+      </w:r>
+      <w:r>
+        <w:drawing>
+          <wp:inline distT="0" distB="0" distL="0" distR="0" wp14:anchorId="085AE878" wp14:editId="490231C3">
+            <wp:extent cx="1848108" cy="190527"/>
+            <wp:effectExtent l="0" t="0" r="0" b="0"/>
+            <wp:docPr id="37" name="Imagem 37"/>
+            <wp:cNvGraphicFramePr>
+              <a:graphicFrameLocks xmlns:a="http://schemas.openxmlformats.org/drawingml/2006/main" noChangeAspect="1"/>
+            </wp:cNvGraphicFramePr>
+            <a:graphic xmlns:a="http://schemas.openxmlformats.org/drawingml/2006/main">
+              <a:graphicData uri="http://schemas.openxmlformats.org/drawingml/2006/picture">
+                <pic:pic xmlns:pic="http://schemas.openxmlformats.org/drawingml/2006/picture">
+                  <pic:nvPicPr>
+                    <pic:cNvPr id="1" name=""/>
+                    <pic:cNvPicPr/>
+                  </pic:nvPicPr>
+                  <pic:blipFill>
+                    <a:blip r:embed="rId41"/>
+                    <a:stretch>
+                      <a:fillRect/>
+                    </a:stretch>
+                  </pic:blipFill>
+                  <pic:spPr>
+                    <a:xfrm>
+                      <a:off x="0" y="0"/>
+                      <a:ext cx="1848108" cy="190527"/>
+                    </a:xfrm>
+                    <a:prstGeom prst="rect">
+                      <a:avLst/>
+                    </a:prstGeom>
+                  </pic:spPr>
+                </pic:pic>
+              </a:graphicData>
+            </a:graphic>
+          </wp:inline>
+        </w:drawing>
+      </w:r>
+    </w:p>
+    <w:p>
+      <w:pPr>
+        <w:tabs>
+          <w:tab w:val="left" w:pos="1200"/>
+        </w:tabs>
+      </w:pPr>
+      <w:r>
+        <w:t xml:space="preserve">29- </w:t>
+      </w:r>
+      <w:r>
+        <w:t xml:space="preserve">Para centralizar a lista demos uma largura e utilizamos o </w:t>
+      </w:r>
+      <w:proofErr w:type="spellStart"/>
+      <w:r>
+        <w:t>margin</w:t>
+      </w:r>
+      <w:proofErr w:type="spellEnd"/>
+      <w:r>
+        <w:t xml:space="preserve">: 0 auto, e aumentamos o espaço interno com o </w:t>
+      </w:r>
+      <w:proofErr w:type="spellStart"/>
+      <w:r>
+        <w:t>padding</w:t>
+      </w:r>
+      <w:proofErr w:type="spellEnd"/>
+      <w:r>
+        <w:t>.</w:t>
+      </w:r>
+    </w:p>
+    <w:p>
+      <w:pPr>
+        <w:tabs>
+          <w:tab w:val="left" w:pos="1200"/>
+        </w:tabs>
+      </w:pPr>
+      <w:r>
+        <w:drawing>
+          <wp:inline distT="0" distB="0" distL="0" distR="0" wp14:anchorId="3E40DE62" wp14:editId="7DF16819">
+            <wp:extent cx="1714739" cy="943107"/>
+            <wp:effectExtent l="0" t="0" r="0" b="9525"/>
+            <wp:docPr id="38" name="Imagem 38"/>
+            <wp:cNvGraphicFramePr>
+              <a:graphicFrameLocks xmlns:a="http://schemas.openxmlformats.org/drawingml/2006/main" noChangeAspect="1"/>
+            </wp:cNvGraphicFramePr>
+            <a:graphic xmlns:a="http://schemas.openxmlformats.org/drawingml/2006/main">
+              <a:graphicData uri="http://schemas.openxmlformats.org/drawingml/2006/picture">
+                <pic:pic xmlns:pic="http://schemas.openxmlformats.org/drawingml/2006/picture">
+                  <pic:nvPicPr>
+                    <pic:cNvPr id="1" name=""/>
+                    <pic:cNvPicPr/>
+                  </pic:nvPicPr>
+                  <pic:blipFill>
+                    <a:blip r:embed="rId42"/>
+                    <a:stretch>
+                      <a:fillRect/>
+                    </a:stretch>
+                  </pic:blipFill>
+                  <pic:spPr>
+                    <a:xfrm>
+                      <a:off x="0" y="0"/>
+                      <a:ext cx="1714739" cy="943107"/>
+                    </a:xfrm>
+                    <a:prstGeom prst="rect">
+                      <a:avLst/>
+                    </a:prstGeom>
+                  </pic:spPr>
+                </pic:pic>
+              </a:graphicData>
+            </a:graphic>
+          </wp:inline>
+        </w:drawing>
+      </w:r>
+    </w:p>
+    <w:p>
+      <w:pPr>
+        <w:tabs>
+          <w:tab w:val="left" w:pos="1200"/>
+        </w:tabs>
+      </w:pPr>
+      <w:r>
+        <w:t xml:space="preserve">30- </w:t>
+      </w:r>
+      <w:r>
+        <w:t>Centralizamos o subtítulo dos itens da lista e definimos que cada item possui 30% de largura.</w:t>
+      </w:r>
+    </w:p>
+    <w:p>
+      <w:pPr>
+        <w:tabs>
+          <w:tab w:val="left" w:pos="1200"/>
+        </w:tabs>
+      </w:pPr>
+      <w:r>
+        <w:drawing>
+          <wp:inline distT="0" distB="0" distL="0" distR="0" wp14:anchorId="2A2FAC6C" wp14:editId="44A9672B">
+            <wp:extent cx="2400635" cy="962159"/>
+            <wp:effectExtent l="0" t="0" r="0" b="9525"/>
+            <wp:docPr id="39" name="Imagem 39"/>
+            <wp:cNvGraphicFramePr>
+              <a:graphicFrameLocks xmlns:a="http://schemas.openxmlformats.org/drawingml/2006/main" noChangeAspect="1"/>
+            </wp:cNvGraphicFramePr>
+            <a:graphic xmlns:a="http://schemas.openxmlformats.org/drawingml/2006/main">
+              <a:graphicData uri="http://schemas.openxmlformats.org/drawingml/2006/picture">
+                <pic:pic xmlns:pic="http://schemas.openxmlformats.org/drawingml/2006/picture">
+                  <pic:nvPicPr>
+                    <pic:cNvPr id="1" name=""/>
+                    <pic:cNvPicPr/>
+                  </pic:nvPicPr>
+                  <pic:blipFill>
+                    <a:blip r:embed="rId43"/>
+                    <a:stretch>
+                      <a:fillRect/>
+                    </a:stretch>
+                  </pic:blipFill>
+                  <pic:spPr>
+                    <a:xfrm>
+                      <a:off x="0" y="0"/>
+                      <a:ext cx="2400635" cy="962159"/>
+                    </a:xfrm>
+                    <a:prstGeom prst="rect">
+                      <a:avLst/>
+                    </a:prstGeom>
+                  </pic:spPr>
+                </pic:pic>
+              </a:graphicData>
+            </a:graphic>
+          </wp:inline>
+        </w:drawing>
+      </w:r>
+    </w:p>
+    <w:p>
+      <w:pPr>
+        <w:tabs>
+          <w:tab w:val="left" w:pos="1200"/>
+        </w:tabs>
+      </w:pPr>
+      <w:r>
+        <w:t>31- Para alinhar o texto na parte superior utilizamos o vertical-</w:t>
+      </w:r>
+      <w:proofErr w:type="spellStart"/>
+      <w:r>
+        <w:t>align</w:t>
+      </w:r>
+      <w:proofErr w:type="spellEnd"/>
+      <w:r>
+        <w:t>: top.</w:t>
+      </w:r>
+    </w:p>
+    <w:p>
+      <w:pPr>
+        <w:tabs>
+          <w:tab w:val="left" w:pos="1200"/>
+        </w:tabs>
+      </w:pPr>
+      <w:r>
+        <w:drawing>
+          <wp:inline distT="0" distB="0" distL="0" distR="0" wp14:anchorId="5DC52540" wp14:editId="3C238D27">
+            <wp:extent cx="2219635" cy="1209844"/>
+            <wp:effectExtent l="0" t="0" r="9525" b="9525"/>
+            <wp:docPr id="40" name="Imagem 40"/>
+            <wp:cNvGraphicFramePr>
+              <a:graphicFrameLocks xmlns:a="http://schemas.openxmlformats.org/drawingml/2006/main" noChangeAspect="1"/>
+            </wp:cNvGraphicFramePr>
+            <a:graphic xmlns:a="http://schemas.openxmlformats.org/drawingml/2006/main">
+              <a:graphicData uri="http://schemas.openxmlformats.org/drawingml/2006/picture">
+                <pic:pic xmlns:pic="http://schemas.openxmlformats.org/drawingml/2006/picture">
+                  <pic:nvPicPr>
+                    <pic:cNvPr id="1" name=""/>
+                    <pic:cNvPicPr/>
+                  </pic:nvPicPr>
+                  <pic:blipFill>
+                    <a:blip r:embed="rId44"/>
+                    <a:stretch>
+                      <a:fillRect/>
+                    </a:stretch>
+                  </pic:blipFill>
+                  <pic:spPr>
+                    <a:xfrm>
+                      <a:off x="0" y="0"/>
+                      <a:ext cx="2219635" cy="1209844"/>
+                    </a:xfrm>
+                    <a:prstGeom prst="rect">
+                      <a:avLst/>
+                    </a:prstGeom>
+                  </pic:spPr>
+                </pic:pic>
+              </a:graphicData>
+            </a:graphic>
+          </wp:inline>
+        </w:drawing>
+      </w:r>
+      <w:r>
+        <w:t xml:space="preserve"> </w:t>
+      </w:r>
+    </w:p>
+    <w:p>
+      <w:pPr>
+        <w:tabs>
+          <w:tab w:val="left" w:pos="1200"/>
+        </w:tabs>
+      </w:pPr>
+      <w:r>
+        <w:t xml:space="preserve">32- </w:t>
+      </w:r>
+      <w:r>
+        <w:t>Nos subtítulos de cada item aumentamos o tamanho da fonte e deixamos ela mais encorpada e negrito.</w:t>
+      </w:r>
+      <w:bookmarkStart w:id="0" w:name="_GoBack"/>
+      <w:bookmarkEnd w:id="0"/>
+    </w:p>
+    <w:p>
+      <w:pPr>
+        <w:tabs>
+          <w:tab w:val="left" w:pos="1200"/>
+        </w:tabs>
+      </w:pPr>
+      <w:r>
+        <w:drawing>
+          <wp:inline distT="0" distB="0" distL="0" distR="0" wp14:anchorId="5F46D2AB" wp14:editId="7CB6F6BD">
+            <wp:extent cx="1790950" cy="828791"/>
+            <wp:effectExtent l="0" t="0" r="0" b="9525"/>
+            <wp:docPr id="41" name="Imagem 41"/>
+            <wp:cNvGraphicFramePr>
+              <a:graphicFrameLocks xmlns:a="http://schemas.openxmlformats.org/drawingml/2006/main" noChangeAspect="1"/>
+            </wp:cNvGraphicFramePr>
+            <a:graphic xmlns:a="http://schemas.openxmlformats.org/drawingml/2006/main">
+              <a:graphicData uri="http://schemas.openxmlformats.org/drawingml/2006/picture">
+                <pic:pic xmlns:pic="http://schemas.openxmlformats.org/drawingml/2006/picture">
+                  <pic:nvPicPr>
+                    <pic:cNvPr id="1" name=""/>
+                    <pic:cNvPicPr/>
+                  </pic:nvPicPr>
+                  <pic:blipFill>
+                    <a:blip r:embed="rId45"/>
+                    <a:stretch>
+                      <a:fillRect/>
+                    </a:stretch>
+                  </pic:blipFill>
+                  <pic:spPr>
+                    <a:xfrm>
+                      <a:off x="0" y="0"/>
+                      <a:ext cx="1790950" cy="828791"/>
                     </a:xfrm>
                     <a:prstGeom prst="rect">
                       <a:avLst/>
@@ -5089,8 +5030,8 @@
     <w:rPrDefault>
       <w:rPr>
         <w:rFonts w:asciiTheme="minorHAnsi" w:eastAsiaTheme="minorHAnsi" w:hAnsiTheme="minorHAnsi" w:cstheme="minorBidi"/>
-        <w:sz w:val="22"/>
-        <w:szCs w:val="22"/>
+        <w:sz w:val="18"/>
+        <w:szCs w:val="18"/>
         <w:lang w:val="pt-BR" w:eastAsia="en-US" w:bidi="ar-SA"/>
       </w:rPr>
     </w:rPrDefault>
@@ -5484,6 +5425,7 @@
   <w:style w:type="character" w:default="1" w:styleId="Fontepargpadro">
     <w:name w:val="Default Paragraph Font"/>
     <w:uiPriority w:val="1"/>
+    <w:semiHidden/>
     <w:unhideWhenUsed/>
   </w:style>
   <w:style w:type="table" w:default="1" w:styleId="Tabelanormal">
@@ -5878,7 +5820,7 @@
 </file>
 
 <file path=customXml/itemProps1.xml><?xml version="1.0" encoding="utf-8"?>
-<ds:datastoreItem xmlns:ds="http://schemas.openxmlformats.org/officeDocument/2006/customXml" ds:itemID="{96712832-A752-49FA-A2AE-C0E0737C307C}">
+<ds:datastoreItem xmlns:ds="http://schemas.openxmlformats.org/officeDocument/2006/customXml" ds:itemID="{49EDE7E6-8A94-496B-8431-51611416EEDE}">
   <ds:schemaRefs>
     <ds:schemaRef ds:uri="http://schemas.openxmlformats.org/officeDocument/2006/bibliography"/>
   </ds:schemaRefs>

</xml_diff>

<commit_message>
adicionamos os arquivos contatos.html e contatos.css e adicionamos o input e label
</commit_message>
<xml_diff>
--- a/Apostila/Apostila Space for Men.docx
+++ b/Apostila/Apostila Space for Men.docx
@@ -3415,6 +3415,9 @@
         <w:t xml:space="preserve"> </w:t>
       </w:r>
       <w:r>
+        <w:rPr>
+          <w:noProof/>
+        </w:rPr>
         <w:drawing>
           <wp:inline distT="0" distB="0" distL="0" distR="0" wp14:anchorId="717DCFB5" wp14:editId="752BFA21">
             <wp:extent cx="5163271" cy="3953427"/>
@@ -3501,6 +3504,9 @@
         </w:tabs>
       </w:pPr>
       <w:r>
+        <w:rPr>
+          <w:noProof/>
+        </w:rPr>
         <w:drawing>
           <wp:inline distT="0" distB="0" distL="0" distR="0" wp14:anchorId="51BFCA95" wp14:editId="02CCD504">
             <wp:extent cx="2229161" cy="771633"/>
@@ -3538,6 +3544,9 @@
         </w:drawing>
       </w:r>
       <w:r>
+        <w:rPr>
+          <w:noProof/>
+        </w:rPr>
         <w:drawing>
           <wp:inline distT="0" distB="0" distL="0" distR="0" wp14:anchorId="085AE878" wp14:editId="490231C3">
             <wp:extent cx="1848108" cy="190527"/>
@@ -3611,6 +3620,9 @@
         </w:tabs>
       </w:pPr>
       <w:r>
+        <w:rPr>
+          <w:noProof/>
+        </w:rPr>
         <w:drawing>
           <wp:inline distT="0" distB="0" distL="0" distR="0" wp14:anchorId="3E40DE62" wp14:editId="7DF16819">
             <wp:extent cx="1714739" cy="943107"/>
@@ -3668,6 +3680,9 @@
         </w:tabs>
       </w:pPr>
       <w:r>
+        <w:rPr>
+          <w:noProof/>
+        </w:rPr>
         <w:drawing>
           <wp:inline distT="0" distB="0" distL="0" distR="0" wp14:anchorId="2A2FAC6C" wp14:editId="44A9672B">
             <wp:extent cx="2400635" cy="962159"/>
@@ -3730,6 +3745,9 @@
         </w:tabs>
       </w:pPr>
       <w:r>
+        <w:rPr>
+          <w:noProof/>
+        </w:rPr>
         <w:drawing>
           <wp:inline distT="0" distB="0" distL="0" distR="0" wp14:anchorId="5DC52540" wp14:editId="3C238D27">
             <wp:extent cx="2219635" cy="1209844"/>
@@ -3782,16 +3800,17 @@
       <w:r>
         <w:t>Nos subtítulos de cada item aumentamos o tamanho da fonte e deixamos ela mais encorpada e negrito.</w:t>
       </w:r>
-      <w:bookmarkStart w:id="0" w:name="_GoBack"/>
-      <w:bookmarkEnd w:id="0"/>
-    </w:p>
-    <w:p>
-      <w:pPr>
-        <w:tabs>
-          <w:tab w:val="left" w:pos="1200"/>
-        </w:tabs>
-      </w:pPr>
-      <w:r>
+    </w:p>
+    <w:p>
+      <w:pPr>
+        <w:tabs>
+          <w:tab w:val="left" w:pos="1200"/>
+        </w:tabs>
+      </w:pPr>
+      <w:r>
+        <w:rPr>
+          <w:noProof/>
+        </w:rPr>
         <w:drawing>
           <wp:inline distT="0" distB="0" distL="0" distR="0" wp14:anchorId="5F46D2AB" wp14:editId="7CB6F6BD">
             <wp:extent cx="1790950" cy="828791"/>
@@ -3828,6 +3847,1137 @@
           </wp:inline>
         </w:drawing>
       </w:r>
+    </w:p>
+    <w:p>
+      <w:pPr>
+        <w:tabs>
+          <w:tab w:val="left" w:pos="1200"/>
+        </w:tabs>
+      </w:pPr>
+      <w:r>
+        <w:t xml:space="preserve">33- </w:t>
+      </w:r>
+      <w:r>
+        <w:t xml:space="preserve">Adicionamos uma </w:t>
+      </w:r>
+      <w:proofErr w:type="spellStart"/>
+      <w:r>
+        <w:t>class</w:t>
+      </w:r>
+      <w:proofErr w:type="spellEnd"/>
+      <w:r>
+        <w:t xml:space="preserve"> tanto na descrição dos itens </w:t>
+      </w:r>
+      <w:r>
+        <w:t xml:space="preserve">como nos preços e no </w:t>
+      </w:r>
+      <w:proofErr w:type="spellStart"/>
+      <w:r>
+        <w:t>css</w:t>
+      </w:r>
+      <w:proofErr w:type="spellEnd"/>
+      <w:r>
+        <w:t xml:space="preserve"> aumentamos o tamanho da fonte e deixamos o preço mais encorpado (</w:t>
+      </w:r>
+      <w:proofErr w:type="spellStart"/>
+      <w:r>
+        <w:t>bold</w:t>
+      </w:r>
+      <w:proofErr w:type="spellEnd"/>
+      <w:r>
+        <w:t>)</w:t>
+      </w:r>
+      <w:r>
+        <w:rPr>
+          <w:noProof/>
+        </w:rPr>
+        <w:t xml:space="preserve"> </w:t>
+      </w:r>
+    </w:p>
+    <w:p>
+      <w:pPr>
+        <w:tabs>
+          <w:tab w:val="left" w:pos="1200"/>
+        </w:tabs>
+      </w:pPr>
+      <w:r>
+        <w:rPr>
+          <w:noProof/>
+        </w:rPr>
+        <w:drawing>
+          <wp:inline distT="0" distB="0" distL="0" distR="0" wp14:anchorId="6A36D838" wp14:editId="002A43C1">
+            <wp:extent cx="1933845" cy="1505160"/>
+            <wp:effectExtent l="0" t="0" r="9525" b="0"/>
+            <wp:docPr id="43" name="Imagem 43"/>
+            <wp:cNvGraphicFramePr>
+              <a:graphicFrameLocks xmlns:a="http://schemas.openxmlformats.org/drawingml/2006/main" noChangeAspect="1"/>
+            </wp:cNvGraphicFramePr>
+            <a:graphic xmlns:a="http://schemas.openxmlformats.org/drawingml/2006/main">
+              <a:graphicData uri="http://schemas.openxmlformats.org/drawingml/2006/picture">
+                <pic:pic xmlns:pic="http://schemas.openxmlformats.org/drawingml/2006/picture">
+                  <pic:nvPicPr>
+                    <pic:cNvPr id="1" name=""/>
+                    <pic:cNvPicPr/>
+                  </pic:nvPicPr>
+                  <pic:blipFill>
+                    <a:blip r:embed="rId46"/>
+                    <a:stretch>
+                      <a:fillRect/>
+                    </a:stretch>
+                  </pic:blipFill>
+                  <pic:spPr>
+                    <a:xfrm>
+                      <a:off x="0" y="0"/>
+                      <a:ext cx="1933845" cy="1505160"/>
+                    </a:xfrm>
+                    <a:prstGeom prst="rect">
+                      <a:avLst/>
+                    </a:prstGeom>
+                  </pic:spPr>
+                </pic:pic>
+              </a:graphicData>
+            </a:graphic>
+          </wp:inline>
+        </w:drawing>
+      </w:r>
+      <w:r>
+        <w:rPr>
+          <w:noProof/>
+        </w:rPr>
+        <w:drawing>
+          <wp:inline distT="0" distB="0" distL="0" distR="0" wp14:anchorId="234464D4" wp14:editId="0C28DAC5">
+            <wp:extent cx="7211431" cy="3591426"/>
+            <wp:effectExtent l="0" t="0" r="8890" b="9525"/>
+            <wp:docPr id="44" name="Imagem 44"/>
+            <wp:cNvGraphicFramePr>
+              <a:graphicFrameLocks xmlns:a="http://schemas.openxmlformats.org/drawingml/2006/main" noChangeAspect="1"/>
+            </wp:cNvGraphicFramePr>
+            <a:graphic xmlns:a="http://schemas.openxmlformats.org/drawingml/2006/main">
+              <a:graphicData uri="http://schemas.openxmlformats.org/drawingml/2006/picture">
+                <pic:pic xmlns:pic="http://schemas.openxmlformats.org/drawingml/2006/picture">
+                  <pic:nvPicPr>
+                    <pic:cNvPr id="1" name=""/>
+                    <pic:cNvPicPr/>
+                  </pic:nvPicPr>
+                  <pic:blipFill>
+                    <a:blip r:embed="rId47"/>
+                    <a:stretch>
+                      <a:fillRect/>
+                    </a:stretch>
+                  </pic:blipFill>
+                  <pic:spPr>
+                    <a:xfrm>
+                      <a:off x="0" y="0"/>
+                      <a:ext cx="7211431" cy="3591426"/>
+                    </a:xfrm>
+                    <a:prstGeom prst="rect">
+                      <a:avLst/>
+                    </a:prstGeom>
+                  </pic:spPr>
+                </pic:pic>
+              </a:graphicData>
+            </a:graphic>
+          </wp:inline>
+        </w:drawing>
+      </w:r>
+    </w:p>
+    <w:p>
+      <w:pPr>
+        <w:tabs>
+          <w:tab w:val="left" w:pos="1200"/>
+        </w:tabs>
+      </w:pPr>
+      <w:r>
+        <w:t xml:space="preserve">34- Adicionamos </w:t>
+      </w:r>
+      <w:r>
+        <w:t>uma cor de fundo para termos uma melhor visualização dos itens e demos um espaço entre eles de 1.5% tanto do lado direito como no lado esquerdo.</w:t>
+      </w:r>
+    </w:p>
+    <w:p>
+      <w:pPr>
+        <w:tabs>
+          <w:tab w:val="left" w:pos="1200"/>
+        </w:tabs>
+      </w:pPr>
+      <w:r>
+        <w:rPr>
+          <w:noProof/>
+        </w:rPr>
+        <w:drawing>
+          <wp:inline distT="0" distB="0" distL="0" distR="0" wp14:anchorId="1B593F5F" wp14:editId="2098D938">
+            <wp:extent cx="2543530" cy="1457528"/>
+            <wp:effectExtent l="0" t="0" r="9525" b="9525"/>
+            <wp:docPr id="45" name="Imagem 45"/>
+            <wp:cNvGraphicFramePr>
+              <a:graphicFrameLocks xmlns:a="http://schemas.openxmlformats.org/drawingml/2006/main" noChangeAspect="1"/>
+            </wp:cNvGraphicFramePr>
+            <a:graphic xmlns:a="http://schemas.openxmlformats.org/drawingml/2006/main">
+              <a:graphicData uri="http://schemas.openxmlformats.org/drawingml/2006/picture">
+                <pic:pic xmlns:pic="http://schemas.openxmlformats.org/drawingml/2006/picture">
+                  <pic:nvPicPr>
+                    <pic:cNvPr id="1" name=""/>
+                    <pic:cNvPicPr/>
+                  </pic:nvPicPr>
+                  <pic:blipFill>
+                    <a:blip r:embed="rId48"/>
+                    <a:stretch>
+                      <a:fillRect/>
+                    </a:stretch>
+                  </pic:blipFill>
+                  <pic:spPr>
+                    <a:xfrm>
+                      <a:off x="0" y="0"/>
+                      <a:ext cx="2543530" cy="1457528"/>
+                    </a:xfrm>
+                    <a:prstGeom prst="rect">
+                      <a:avLst/>
+                    </a:prstGeom>
+                  </pic:spPr>
+                </pic:pic>
+              </a:graphicData>
+            </a:graphic>
+          </wp:inline>
+        </w:drawing>
+      </w:r>
+    </w:p>
+    <w:p>
+      <w:pPr>
+        <w:tabs>
+          <w:tab w:val="left" w:pos="1200"/>
+        </w:tabs>
+      </w:pPr>
+      <w:r>
+        <w:t xml:space="preserve">35- </w:t>
+      </w:r>
+      <w:r>
+        <w:t xml:space="preserve">Nos produtos li ao trabalharmos com </w:t>
+      </w:r>
+      <w:proofErr w:type="spellStart"/>
+      <w:r>
+        <w:t>width</w:t>
+      </w:r>
+      <w:proofErr w:type="spellEnd"/>
+      <w:r>
+        <w:t xml:space="preserve"> 30% e </w:t>
+      </w:r>
+      <w:proofErr w:type="spellStart"/>
+      <w:r>
+        <w:t>margin</w:t>
+      </w:r>
+      <w:proofErr w:type="spellEnd"/>
+      <w:r>
+        <w:t xml:space="preserve">: 0 1.5% estamos utilizando 99% da largura que definimos. Ao adicionar </w:t>
+      </w:r>
+      <w:proofErr w:type="spellStart"/>
+      <w:r>
+        <w:t>padding</w:t>
+      </w:r>
+      <w:proofErr w:type="spellEnd"/>
+      <w:r>
+        <w:t>: 30px 20px vimos que quebrou o código por que ultrapassou o limite com os 20</w:t>
+      </w:r>
+      <w:proofErr w:type="gramStart"/>
+      <w:r>
+        <w:t>px  e</w:t>
+      </w:r>
+      <w:proofErr w:type="gramEnd"/>
+      <w:r>
+        <w:t xml:space="preserve"> ao adicionarmos box-</w:t>
+      </w:r>
+      <w:proofErr w:type="spellStart"/>
+      <w:r>
+        <w:t>sizing</w:t>
+      </w:r>
+      <w:proofErr w:type="spellEnd"/>
+      <w:r>
+        <w:t xml:space="preserve">: </w:t>
+      </w:r>
+      <w:proofErr w:type="spellStart"/>
+      <w:r>
+        <w:t>border</w:t>
+      </w:r>
+      <w:proofErr w:type="spellEnd"/>
+      <w:r>
+        <w:t>-box ela automaticamente ajustou o tamanho principalmente quando estamos utilizando porcentagem.</w:t>
+      </w:r>
+    </w:p>
+    <w:p>
+      <w:pPr>
+        <w:tabs>
+          <w:tab w:val="left" w:pos="1200"/>
+        </w:tabs>
+        <w:rPr>
+          <w:noProof/>
+        </w:rPr>
+      </w:pPr>
+      <w:r>
+        <w:rPr>
+          <w:noProof/>
+        </w:rPr>
+        <mc:AlternateContent>
+          <mc:Choice Requires="wps">
+            <w:drawing>
+              <wp:anchor distT="0" distB="0" distL="114300" distR="114300" simplePos="0" relativeHeight="251679744" behindDoc="0" locked="0" layoutInCell="1" allowOverlap="1">
+                <wp:simplePos x="0" y="0"/>
+                <wp:positionH relativeFrom="column">
+                  <wp:posOffset>1762124</wp:posOffset>
+                </wp:positionH>
+                <wp:positionV relativeFrom="paragraph">
+                  <wp:posOffset>1244600</wp:posOffset>
+                </wp:positionV>
+                <wp:extent cx="1038225" cy="133350"/>
+                <wp:effectExtent l="38100" t="0" r="28575" b="76200"/>
+                <wp:wrapNone/>
+                <wp:docPr id="48" name="Conector de Seta Reta 48"/>
+                <wp:cNvGraphicFramePr/>
+                <a:graphic xmlns:a="http://schemas.openxmlformats.org/drawingml/2006/main">
+                  <a:graphicData uri="http://schemas.microsoft.com/office/word/2010/wordprocessingShape">
+                    <wps:wsp>
+                      <wps:cNvCnPr/>
+                      <wps:spPr>
+                        <a:xfrm flipH="1">
+                          <a:off x="0" y="0"/>
+                          <a:ext cx="1038225" cy="133350"/>
+                        </a:xfrm>
+                        <a:prstGeom prst="straightConnector1">
+                          <a:avLst/>
+                        </a:prstGeom>
+                        <a:ln>
+                          <a:tailEnd type="triangle"/>
+                        </a:ln>
+                      </wps:spPr>
+                      <wps:style>
+                        <a:lnRef idx="1">
+                          <a:schemeClr val="accent1"/>
+                        </a:lnRef>
+                        <a:fillRef idx="0">
+                          <a:schemeClr val="accent1"/>
+                        </a:fillRef>
+                        <a:effectRef idx="0">
+                          <a:schemeClr val="accent1"/>
+                        </a:effectRef>
+                        <a:fontRef idx="minor">
+                          <a:schemeClr val="tx1"/>
+                        </a:fontRef>
+                      </wps:style>
+                      <wps:bodyPr/>
+                    </wps:wsp>
+                  </a:graphicData>
+                </a:graphic>
+                <wp14:sizeRelH relativeFrom="margin">
+                  <wp14:pctWidth>0</wp14:pctWidth>
+                </wp14:sizeRelH>
+                <wp14:sizeRelV relativeFrom="margin">
+                  <wp14:pctHeight>0</wp14:pctHeight>
+                </wp14:sizeRelV>
+              </wp:anchor>
+            </w:drawing>
+          </mc:Choice>
+          <mc:Fallback>
+            <w:pict>
+              <v:shapetype w14:anchorId="6C6A4B7E" id="_x0000_t32" coordsize="21600,21600" o:spt="32" o:oned="t" path="m,l21600,21600e" filled="f">
+                <v:path arrowok="t" fillok="f" o:connecttype="none"/>
+                <o:lock v:ext="edit" shapetype="t"/>
+              </v:shapetype>
+              <v:shape id="Conector de Seta Reta 48" o:spid="_x0000_s1026" type="#_x0000_t32" style="position:absolute;margin-left:138.75pt;margin-top:98pt;width:81.75pt;height:10.5pt;flip:x;z-index:251679744;visibility:visible;mso-wrap-style:square;mso-width-percent:0;mso-height-percent:0;mso-wrap-distance-left:9pt;mso-wrap-distance-top:0;mso-wrap-distance-right:9pt;mso-wrap-distance-bottom:0;mso-position-horizontal:absolute;mso-position-horizontal-relative:text;mso-position-vertical:absolute;mso-position-vertical-relative:text;mso-width-percent:0;mso-height-percent:0;mso-width-relative:margin;mso-height-relative:margin" o:gfxdata="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" strokecolor="#4472c4 [3204]" strokeweight=".5pt">
+                <v:stroke endarrow="block" joinstyle="miter"/>
+              </v:shape>
+            </w:pict>
+          </mc:Fallback>
+        </mc:AlternateContent>
+      </w:r>
+      <w:r>
+        <w:rPr>
+          <w:noProof/>
+        </w:rPr>
+        <mc:AlternateContent>
+          <mc:Choice Requires="wps">
+            <w:drawing>
+              <wp:anchor distT="0" distB="0" distL="114300" distR="114300" simplePos="0" relativeHeight="251678720" behindDoc="0" locked="0" layoutInCell="1" allowOverlap="1">
+                <wp:simplePos x="0" y="0"/>
+                <wp:positionH relativeFrom="column">
+                  <wp:posOffset>2057399</wp:posOffset>
+                </wp:positionH>
+                <wp:positionV relativeFrom="paragraph">
+                  <wp:posOffset>1463675</wp:posOffset>
+                </wp:positionV>
+                <wp:extent cx="895350" cy="104775"/>
+                <wp:effectExtent l="38100" t="0" r="19050" b="85725"/>
+                <wp:wrapNone/>
+                <wp:docPr id="47" name="Conector de Seta Reta 47"/>
+                <wp:cNvGraphicFramePr/>
+                <a:graphic xmlns:a="http://schemas.openxmlformats.org/drawingml/2006/main">
+                  <a:graphicData uri="http://schemas.microsoft.com/office/word/2010/wordprocessingShape">
+                    <wps:wsp>
+                      <wps:cNvCnPr/>
+                      <wps:spPr>
+                        <a:xfrm flipH="1">
+                          <a:off x="0" y="0"/>
+                          <a:ext cx="895350" cy="104775"/>
+                        </a:xfrm>
+                        <a:prstGeom prst="straightConnector1">
+                          <a:avLst/>
+                        </a:prstGeom>
+                        <a:ln>
+                          <a:tailEnd type="triangle"/>
+                        </a:ln>
+                      </wps:spPr>
+                      <wps:style>
+                        <a:lnRef idx="1">
+                          <a:schemeClr val="accent1"/>
+                        </a:lnRef>
+                        <a:fillRef idx="0">
+                          <a:schemeClr val="accent1"/>
+                        </a:fillRef>
+                        <a:effectRef idx="0">
+                          <a:schemeClr val="accent1"/>
+                        </a:effectRef>
+                        <a:fontRef idx="minor">
+                          <a:schemeClr val="tx1"/>
+                        </a:fontRef>
+                      </wps:style>
+                      <wps:bodyPr/>
+                    </wps:wsp>
+                  </a:graphicData>
+                </a:graphic>
+                <wp14:sizeRelH relativeFrom="margin">
+                  <wp14:pctWidth>0</wp14:pctWidth>
+                </wp14:sizeRelH>
+                <wp14:sizeRelV relativeFrom="margin">
+                  <wp14:pctHeight>0</wp14:pctHeight>
+                </wp14:sizeRelV>
+              </wp:anchor>
+            </w:drawing>
+          </mc:Choice>
+          <mc:Fallback>
+            <w:pict>
+              <v:shape w14:anchorId="215DE1A0" id="Conector de Seta Reta 47" o:spid="_x0000_s1026" type="#_x0000_t32" style="position:absolute;margin-left:162pt;margin-top:115.25pt;width:70.5pt;height:8.25pt;flip:x;z-index:251678720;visibility:visible;mso-wrap-style:square;mso-width-percent:0;mso-height-percent:0;mso-wrap-distance-left:9pt;mso-wrap-distance-top:0;mso-wrap-distance-right:9pt;mso-wrap-distance-bottom:0;mso-position-horizontal:absolute;mso-position-horizontal-relative:text;mso-position-vertical:absolute;mso-position-vertical-relative:text;mso-width-percent:0;mso-height-percent:0;mso-width-relative:margin;mso-height-relative:margin" o:gfxdata="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" strokecolor="#4472c4 [3204]" strokeweight=".5pt">
+                <v:stroke endarrow="block" joinstyle="miter"/>
+              </v:shape>
+            </w:pict>
+          </mc:Fallback>
+        </mc:AlternateContent>
+      </w:r>
+      <w:r>
+        <w:rPr>
+          <w:noProof/>
+        </w:rPr>
+        <w:t xml:space="preserve"> </w:t>
+      </w:r>
+      <w:r>
+        <w:rPr>
+          <w:noProof/>
+        </w:rPr>
+        <w:drawing>
+          <wp:inline distT="0" distB="0" distL="0" distR="0" wp14:anchorId="4A5AD7FD" wp14:editId="4EE980B2">
+            <wp:extent cx="2448267" cy="1895740"/>
+            <wp:effectExtent l="0" t="0" r="9525" b="9525"/>
+            <wp:docPr id="46" name="Imagem 46"/>
+            <wp:cNvGraphicFramePr>
+              <a:graphicFrameLocks xmlns:a="http://schemas.openxmlformats.org/drawingml/2006/main" noChangeAspect="1"/>
+            </wp:cNvGraphicFramePr>
+            <a:graphic xmlns:a="http://schemas.openxmlformats.org/drawingml/2006/main">
+              <a:graphicData uri="http://schemas.openxmlformats.org/drawingml/2006/picture">
+                <pic:pic xmlns:pic="http://schemas.openxmlformats.org/drawingml/2006/picture">
+                  <pic:nvPicPr>
+                    <pic:cNvPr id="1" name=""/>
+                    <pic:cNvPicPr/>
+                  </pic:nvPicPr>
+                  <pic:blipFill>
+                    <a:blip r:embed="rId49"/>
+                    <a:stretch>
+                      <a:fillRect/>
+                    </a:stretch>
+                  </pic:blipFill>
+                  <pic:spPr>
+                    <a:xfrm>
+                      <a:off x="0" y="0"/>
+                      <a:ext cx="2448267" cy="1895740"/>
+                    </a:xfrm>
+                    <a:prstGeom prst="rect">
+                      <a:avLst/>
+                    </a:prstGeom>
+                  </pic:spPr>
+                </pic:pic>
+              </a:graphicData>
+            </a:graphic>
+          </wp:inline>
+        </w:drawing>
+      </w:r>
+    </w:p>
+    <w:p>
+      <w:pPr>
+        <w:tabs>
+          <w:tab w:val="left" w:pos="1200"/>
+        </w:tabs>
+      </w:pPr>
+      <w:r>
+        <w:t xml:space="preserve">36- Em cada item do produto </w:t>
+      </w:r>
+      <w:r>
+        <w:t xml:space="preserve">adicionamos uma bordar e arredondamos os cantos e trabalhamos com o </w:t>
+      </w:r>
+      <w:proofErr w:type="spellStart"/>
+      <w:r>
+        <w:t>hover</w:t>
+      </w:r>
+      <w:proofErr w:type="spellEnd"/>
+      <w:r>
+        <w:t xml:space="preserve"> e o </w:t>
+      </w:r>
+      <w:proofErr w:type="spellStart"/>
+      <w:r>
+        <w:t>active</w:t>
+      </w:r>
+      <w:proofErr w:type="spellEnd"/>
+      <w:r>
+        <w:t xml:space="preserve"> que ao passar o mouse ele executa uma ação e ao clicar sobre a bordar executa outra ação.</w:t>
+      </w:r>
+    </w:p>
+    <w:p>
+      <w:pPr>
+        <w:tabs>
+          <w:tab w:val="left" w:pos="1200"/>
+        </w:tabs>
+      </w:pPr>
+      <w:r>
+        <w:rPr>
+          <w:noProof/>
+        </w:rPr>
+        <w:drawing>
+          <wp:inline distT="0" distB="0" distL="0" distR="0" wp14:anchorId="5CD9A499" wp14:editId="77150F7F">
+            <wp:extent cx="2962688" cy="3334215"/>
+            <wp:effectExtent l="0" t="0" r="9525" b="0"/>
+            <wp:docPr id="50" name="Imagem 50"/>
+            <wp:cNvGraphicFramePr>
+              <a:graphicFrameLocks xmlns:a="http://schemas.openxmlformats.org/drawingml/2006/main" noChangeAspect="1"/>
+            </wp:cNvGraphicFramePr>
+            <a:graphic xmlns:a="http://schemas.openxmlformats.org/drawingml/2006/main">
+              <a:graphicData uri="http://schemas.openxmlformats.org/drawingml/2006/picture">
+                <pic:pic xmlns:pic="http://schemas.openxmlformats.org/drawingml/2006/picture">
+                  <pic:nvPicPr>
+                    <pic:cNvPr id="1" name=""/>
+                    <pic:cNvPicPr/>
+                  </pic:nvPicPr>
+                  <pic:blipFill>
+                    <a:blip r:embed="rId50"/>
+                    <a:stretch>
+                      <a:fillRect/>
+                    </a:stretch>
+                  </pic:blipFill>
+                  <pic:spPr>
+                    <a:xfrm>
+                      <a:off x="0" y="0"/>
+                      <a:ext cx="2962688" cy="3334215"/>
+                    </a:xfrm>
+                    <a:prstGeom prst="rect">
+                      <a:avLst/>
+                    </a:prstGeom>
+                  </pic:spPr>
+                </pic:pic>
+              </a:graphicData>
+            </a:graphic>
+          </wp:inline>
+        </w:drawing>
+      </w:r>
+    </w:p>
+    <w:p>
+      <w:pPr>
+        <w:tabs>
+          <w:tab w:val="left" w:pos="1200"/>
+        </w:tabs>
+      </w:pPr>
+      <w:r>
+        <w:t xml:space="preserve">37- </w:t>
+      </w:r>
+      <w:r>
+        <w:t>Adicionamos um efeito no menu ao passar o mouse ele muda de cor e passa uma linha de baixo do título.</w:t>
+      </w:r>
+    </w:p>
+    <w:p>
+      <w:pPr>
+        <w:tabs>
+          <w:tab w:val="left" w:pos="1200"/>
+        </w:tabs>
+      </w:pPr>
+      <w:r>
+        <w:rPr>
+          <w:noProof/>
+        </w:rPr>
+        <w:drawing>
+          <wp:inline distT="0" distB="0" distL="0" distR="0" wp14:anchorId="6EB8FCF1" wp14:editId="199833E4">
+            <wp:extent cx="2362530" cy="809738"/>
+            <wp:effectExtent l="0" t="0" r="0" b="9525"/>
+            <wp:docPr id="51" name="Imagem 51"/>
+            <wp:cNvGraphicFramePr>
+              <a:graphicFrameLocks xmlns:a="http://schemas.openxmlformats.org/drawingml/2006/main" noChangeAspect="1"/>
+            </wp:cNvGraphicFramePr>
+            <a:graphic xmlns:a="http://schemas.openxmlformats.org/drawingml/2006/main">
+              <a:graphicData uri="http://schemas.openxmlformats.org/drawingml/2006/picture">
+                <pic:pic xmlns:pic="http://schemas.openxmlformats.org/drawingml/2006/picture">
+                  <pic:nvPicPr>
+                    <pic:cNvPr id="1" name=""/>
+                    <pic:cNvPicPr/>
+                  </pic:nvPicPr>
+                  <pic:blipFill>
+                    <a:blip r:embed="rId51"/>
+                    <a:stretch>
+                      <a:fillRect/>
+                    </a:stretch>
+                  </pic:blipFill>
+                  <pic:spPr>
+                    <a:xfrm>
+                      <a:off x="0" y="0"/>
+                      <a:ext cx="2362530" cy="809738"/>
+                    </a:xfrm>
+                    <a:prstGeom prst="rect">
+                      <a:avLst/>
+                    </a:prstGeom>
+                  </pic:spPr>
+                </pic:pic>
+              </a:graphicData>
+            </a:graphic>
+          </wp:inline>
+        </w:drawing>
+      </w:r>
+    </w:p>
+    <w:p>
+      <w:pPr>
+        <w:tabs>
+          <w:tab w:val="left" w:pos="1200"/>
+        </w:tabs>
+      </w:pPr>
+      <w:r>
+        <w:t xml:space="preserve">38- </w:t>
+      </w:r>
+      <w:r>
+        <w:t xml:space="preserve">Deixamos o nosso site mais interativo utilizando o </w:t>
+      </w:r>
+      <w:proofErr w:type="spellStart"/>
+      <w:r>
+        <w:t>hover</w:t>
+      </w:r>
+      <w:proofErr w:type="spellEnd"/>
+      <w:r>
+        <w:t xml:space="preserve"> aumentando o subtítulo</w:t>
+      </w:r>
+    </w:p>
+    <w:p>
+      <w:pPr>
+        <w:tabs>
+          <w:tab w:val="left" w:pos="1200"/>
+        </w:tabs>
+      </w:pPr>
+      <w:r>
+        <w:drawing>
+          <wp:inline distT="0" distB="0" distL="0" distR="0" wp14:anchorId="0E712884" wp14:editId="34A7C0F9">
+            <wp:extent cx="2029108" cy="647790"/>
+            <wp:effectExtent l="0" t="0" r="9525" b="0"/>
+            <wp:docPr id="42" name="Imagem 42"/>
+            <wp:cNvGraphicFramePr>
+              <a:graphicFrameLocks xmlns:a="http://schemas.openxmlformats.org/drawingml/2006/main" noChangeAspect="1"/>
+            </wp:cNvGraphicFramePr>
+            <a:graphic xmlns:a="http://schemas.openxmlformats.org/drawingml/2006/main">
+              <a:graphicData uri="http://schemas.openxmlformats.org/drawingml/2006/picture">
+                <pic:pic xmlns:pic="http://schemas.openxmlformats.org/drawingml/2006/picture">
+                  <pic:nvPicPr>
+                    <pic:cNvPr id="1" name=""/>
+                    <pic:cNvPicPr/>
+                  </pic:nvPicPr>
+                  <pic:blipFill>
+                    <a:blip r:embed="rId52"/>
+                    <a:stretch>
+                      <a:fillRect/>
+                    </a:stretch>
+                  </pic:blipFill>
+                  <pic:spPr>
+                    <a:xfrm>
+                      <a:off x="0" y="0"/>
+                      <a:ext cx="2029108" cy="647790"/>
+                    </a:xfrm>
+                    <a:prstGeom prst="rect">
+                      <a:avLst/>
+                    </a:prstGeom>
+                  </pic:spPr>
+                </pic:pic>
+              </a:graphicData>
+            </a:graphic>
+          </wp:inline>
+        </w:drawing>
+      </w:r>
+    </w:p>
+    <w:p>
+      <w:pPr>
+        <w:tabs>
+          <w:tab w:val="left" w:pos="1200"/>
+        </w:tabs>
+      </w:pPr>
+      <w:r>
+        <w:t xml:space="preserve">39- No </w:t>
+      </w:r>
+      <w:proofErr w:type="spellStart"/>
+      <w:r>
+        <w:t>footer</w:t>
+      </w:r>
+      <w:proofErr w:type="spellEnd"/>
+      <w:r>
+        <w:t xml:space="preserve"> adicionamos uma imagem de fundo que </w:t>
+      </w:r>
+      <w:proofErr w:type="gramStart"/>
+      <w:r>
+        <w:t>e</w:t>
+      </w:r>
+      <w:proofErr w:type="gramEnd"/>
+      <w:r>
+        <w:t xml:space="preserve"> feita direto no </w:t>
+      </w:r>
+      <w:proofErr w:type="spellStart"/>
+      <w:r>
+        <w:t>css</w:t>
+      </w:r>
+      <w:proofErr w:type="spellEnd"/>
+      <w:r>
+        <w:t xml:space="preserve"> e quando aplicamos uma imagem de fundo tem a tendência de replicar o conteúdo da imagem até completar o tamanho da área que aplicamos a ou seja no caso o </w:t>
+      </w:r>
+      <w:proofErr w:type="spellStart"/>
+      <w:r>
+        <w:t>footer</w:t>
+      </w:r>
+      <w:proofErr w:type="spellEnd"/>
+      <w:r>
+        <w:t>.</w:t>
+      </w:r>
+    </w:p>
+    <w:p>
+      <w:pPr>
+        <w:tabs>
+          <w:tab w:val="left" w:pos="1200"/>
+        </w:tabs>
+      </w:pPr>
+      <w:r>
+        <w:drawing>
+          <wp:inline distT="0" distB="0" distL="0" distR="0" wp14:anchorId="1A3D6A2A" wp14:editId="396DC15B">
+            <wp:extent cx="3191320" cy="981212"/>
+            <wp:effectExtent l="0" t="0" r="0" b="9525"/>
+            <wp:docPr id="49" name="Imagem 49"/>
+            <wp:cNvGraphicFramePr>
+              <a:graphicFrameLocks xmlns:a="http://schemas.openxmlformats.org/drawingml/2006/main" noChangeAspect="1"/>
+            </wp:cNvGraphicFramePr>
+            <a:graphic xmlns:a="http://schemas.openxmlformats.org/drawingml/2006/main">
+              <a:graphicData uri="http://schemas.openxmlformats.org/drawingml/2006/picture">
+                <pic:pic xmlns:pic="http://schemas.openxmlformats.org/drawingml/2006/picture">
+                  <pic:nvPicPr>
+                    <pic:cNvPr id="1" name=""/>
+                    <pic:cNvPicPr/>
+                  </pic:nvPicPr>
+                  <pic:blipFill>
+                    <a:blip r:embed="rId53"/>
+                    <a:stretch>
+                      <a:fillRect/>
+                    </a:stretch>
+                  </pic:blipFill>
+                  <pic:spPr>
+                    <a:xfrm>
+                      <a:off x="0" y="0"/>
+                      <a:ext cx="3191320" cy="981212"/>
+                    </a:xfrm>
+                    <a:prstGeom prst="rect">
+                      <a:avLst/>
+                    </a:prstGeom>
+                  </pic:spPr>
+                </pic:pic>
+              </a:graphicData>
+            </a:graphic>
+          </wp:inline>
+        </w:drawing>
+      </w:r>
+    </w:p>
+    <w:p>
+      <w:pPr>
+        <w:tabs>
+          <w:tab w:val="left" w:pos="1200"/>
+        </w:tabs>
+        <w:rPr>
+          <w:color w:val="FF0000"/>
+        </w:rPr>
+      </w:pPr>
+      <w:proofErr w:type="spellStart"/>
+      <w:r>
+        <w:t>Obs</w:t>
+      </w:r>
+      <w:proofErr w:type="spellEnd"/>
+      <w:r>
+        <w:t xml:space="preserve">: para que uma imagem de fundo não possa se repetir utilizamos o </w:t>
+      </w:r>
+      <w:r>
+        <w:rPr>
+          <w:color w:val="FF0000"/>
+        </w:rPr>
+        <w:t>background-</w:t>
+      </w:r>
+      <w:proofErr w:type="spellStart"/>
+      <w:r>
+        <w:rPr>
+          <w:color w:val="FF0000"/>
+        </w:rPr>
+        <w:t>repeat</w:t>
+      </w:r>
+      <w:proofErr w:type="spellEnd"/>
+      <w:r>
+        <w:rPr>
+          <w:color w:val="FF0000"/>
+        </w:rPr>
+        <w:t>: no-</w:t>
+      </w:r>
+      <w:proofErr w:type="spellStart"/>
+      <w:r>
+        <w:rPr>
+          <w:color w:val="FF0000"/>
+        </w:rPr>
+        <w:t>repeat</w:t>
+      </w:r>
+      <w:proofErr w:type="spellEnd"/>
+      <w:r>
+        <w:rPr>
+          <w:color w:val="FF0000"/>
+        </w:rPr>
+        <w:t>;</w:t>
+      </w:r>
+    </w:p>
+    <w:p>
+      <w:pPr>
+        <w:tabs>
+          <w:tab w:val="left" w:pos="1200"/>
+        </w:tabs>
+      </w:pPr>
+      <w:r>
+        <w:t xml:space="preserve">40- </w:t>
+      </w:r>
+      <w:r>
+        <w:t>Criamos</w:t>
+      </w:r>
+      <w:r>
+        <w:t xml:space="preserve"> </w:t>
+      </w:r>
+      <w:r>
+        <w:t xml:space="preserve">dois arquivos o contatos.html e o contatos.css no contatos.html copiamos o header do produto.html e colamos já no </w:t>
+      </w:r>
+      <w:proofErr w:type="spellStart"/>
+      <w:r>
+        <w:t>css</w:t>
+      </w:r>
+      <w:proofErr w:type="spellEnd"/>
+      <w:r>
+        <w:t xml:space="preserve"> repetimos o mesmo processo copiando toda a parte de configuração do menu, com isso não precisamos fazer novamente o menu e o </w:t>
+      </w:r>
+      <w:proofErr w:type="spellStart"/>
+      <w:r>
+        <w:t>footer</w:t>
+      </w:r>
+      <w:proofErr w:type="spellEnd"/>
+      <w:r>
+        <w:t xml:space="preserve"> porque já se encontram prontos.</w:t>
+      </w:r>
+    </w:p>
+    <w:p>
+      <w:pPr>
+        <w:tabs>
+          <w:tab w:val="left" w:pos="1200"/>
+        </w:tabs>
+        <w:rPr>
+          <w:noProof/>
+        </w:rPr>
+      </w:pPr>
+      <w:r>
+        <w:rPr>
+          <w:noProof/>
+        </w:rPr>
+        <w:drawing>
+          <wp:anchor distT="0" distB="0" distL="114300" distR="114300" simplePos="0" relativeHeight="251682816" behindDoc="1" locked="0" layoutInCell="1" allowOverlap="1" wp14:anchorId="37BE7237">
+            <wp:simplePos x="0" y="0"/>
+            <wp:positionH relativeFrom="column">
+              <wp:posOffset>6362700</wp:posOffset>
+            </wp:positionH>
+            <wp:positionV relativeFrom="page">
+              <wp:posOffset>933450</wp:posOffset>
+            </wp:positionV>
+            <wp:extent cx="1418590" cy="408940"/>
+            <wp:effectExtent l="0" t="0" r="0" b="0"/>
+            <wp:wrapTight wrapText="bothSides">
+              <wp:wrapPolygon edited="0">
+                <wp:start x="0" y="0"/>
+                <wp:lineTo x="0" y="20124"/>
+                <wp:lineTo x="21175" y="20124"/>
+                <wp:lineTo x="21175" y="0"/>
+                <wp:lineTo x="0" y="0"/>
+              </wp:wrapPolygon>
+            </wp:wrapTight>
+            <wp:docPr id="54" name="Imagem 54"/>
+            <wp:cNvGraphicFramePr>
+              <a:graphicFrameLocks xmlns:a="http://schemas.openxmlformats.org/drawingml/2006/main" noChangeAspect="1"/>
+            </wp:cNvGraphicFramePr>
+            <a:graphic xmlns:a="http://schemas.openxmlformats.org/drawingml/2006/main">
+              <a:graphicData uri="http://schemas.openxmlformats.org/drawingml/2006/picture">
+                <pic:pic xmlns:pic="http://schemas.openxmlformats.org/drawingml/2006/picture">
+                  <pic:nvPicPr>
+                    <pic:cNvPr id="1" name=""/>
+                    <pic:cNvPicPr/>
+                  </pic:nvPicPr>
+                  <pic:blipFill>
+                    <a:blip r:embed="rId54">
+                      <a:extLst>
+                        <a:ext uri="{28A0092B-C50C-407E-A947-70E740481C1C}">
+                          <a14:useLocalDpi xmlns:a14="http://schemas.microsoft.com/office/drawing/2010/main" val="0"/>
+                        </a:ext>
+                      </a:extLst>
+                    </a:blip>
+                    <a:stretch>
+                      <a:fillRect/>
+                    </a:stretch>
+                  </pic:blipFill>
+                  <pic:spPr>
+                    <a:xfrm>
+                      <a:off x="0" y="0"/>
+                      <a:ext cx="1418590" cy="408940"/>
+                    </a:xfrm>
+                    <a:prstGeom prst="rect">
+                      <a:avLst/>
+                    </a:prstGeom>
+                  </pic:spPr>
+                </pic:pic>
+              </a:graphicData>
+            </a:graphic>
+            <wp14:sizeRelH relativeFrom="margin">
+              <wp14:pctWidth>0</wp14:pctWidth>
+            </wp14:sizeRelH>
+            <wp14:sizeRelV relativeFrom="margin">
+              <wp14:pctHeight>0</wp14:pctHeight>
+            </wp14:sizeRelV>
+          </wp:anchor>
+        </w:drawing>
+      </w:r>
+      <w:r>
+        <w:drawing>
+          <wp:anchor distT="0" distB="0" distL="114300" distR="114300" simplePos="0" relativeHeight="251681792" behindDoc="0" locked="0" layoutInCell="1" allowOverlap="1" wp14:anchorId="49AC0C61">
+            <wp:simplePos x="0" y="0"/>
+            <wp:positionH relativeFrom="column">
+              <wp:align>left</wp:align>
+            </wp:positionH>
+            <wp:positionV relativeFrom="paragraph">
+              <wp:posOffset>72573515</wp:posOffset>
+            </wp:positionV>
+            <wp:extent cx="2790825" cy="5210810"/>
+            <wp:effectExtent l="0" t="0" r="9525" b="0"/>
+            <wp:wrapSquare wrapText="bothSides"/>
+            <wp:docPr id="52" name="Imagem 52"/>
+            <wp:cNvGraphicFramePr>
+              <a:graphicFrameLocks xmlns:a="http://schemas.openxmlformats.org/drawingml/2006/main" noChangeAspect="1"/>
+            </wp:cNvGraphicFramePr>
+            <a:graphic xmlns:a="http://schemas.openxmlformats.org/drawingml/2006/main">
+              <a:graphicData uri="http://schemas.openxmlformats.org/drawingml/2006/picture">
+                <pic:pic xmlns:pic="http://schemas.openxmlformats.org/drawingml/2006/picture">
+                  <pic:nvPicPr>
+                    <pic:cNvPr id="1" name=""/>
+                    <pic:cNvPicPr/>
+                  </pic:nvPicPr>
+                  <pic:blipFill>
+                    <a:blip r:embed="rId55">
+                      <a:extLst>
+                        <a:ext uri="{28A0092B-C50C-407E-A947-70E740481C1C}">
+                          <a14:useLocalDpi xmlns:a14="http://schemas.microsoft.com/office/drawing/2010/main" val="0"/>
+                        </a:ext>
+                      </a:extLst>
+                    </a:blip>
+                    <a:stretch>
+                      <a:fillRect/>
+                    </a:stretch>
+                  </pic:blipFill>
+                  <pic:spPr>
+                    <a:xfrm>
+                      <a:off x="0" y="0"/>
+                      <a:ext cx="2791215" cy="5210902"/>
+                    </a:xfrm>
+                    <a:prstGeom prst="rect">
+                      <a:avLst/>
+                    </a:prstGeom>
+                  </pic:spPr>
+                </pic:pic>
+              </a:graphicData>
+            </a:graphic>
+          </wp:anchor>
+        </w:drawing>
+      </w:r>
+      <w:r>
+        <w:rPr>
+          <w:noProof/>
+        </w:rPr>
+        <w:drawing>
+          <wp:inline distT="0" distB="0" distL="0" distR="0" wp14:anchorId="6CCD6AB6" wp14:editId="7718B536">
+            <wp:extent cx="5352381" cy="3876190"/>
+            <wp:effectExtent l="0" t="0" r="1270" b="0"/>
+            <wp:docPr id="53" name="Imagem 53"/>
+            <wp:cNvGraphicFramePr>
+              <a:graphicFrameLocks xmlns:a="http://schemas.openxmlformats.org/drawingml/2006/main" noChangeAspect="1"/>
+            </wp:cNvGraphicFramePr>
+            <a:graphic xmlns:a="http://schemas.openxmlformats.org/drawingml/2006/main">
+              <a:graphicData uri="http://schemas.openxmlformats.org/drawingml/2006/picture">
+                <pic:pic xmlns:pic="http://schemas.openxmlformats.org/drawingml/2006/picture">
+                  <pic:nvPicPr>
+                    <pic:cNvPr id="1" name=""/>
+                    <pic:cNvPicPr/>
+                  </pic:nvPicPr>
+                  <pic:blipFill>
+                    <a:blip r:embed="rId56"/>
+                    <a:stretch>
+                      <a:fillRect/>
+                    </a:stretch>
+                  </pic:blipFill>
+                  <pic:spPr>
+                    <a:xfrm>
+                      <a:off x="0" y="0"/>
+                      <a:ext cx="5352381" cy="3876190"/>
+                    </a:xfrm>
+                    <a:prstGeom prst="rect">
+                      <a:avLst/>
+                    </a:prstGeom>
+                  </pic:spPr>
+                </pic:pic>
+              </a:graphicData>
+            </a:graphic>
+          </wp:inline>
+        </w:drawing>
+      </w:r>
+    </w:p>
+    <w:p>
+      <w:pPr>
+        <w:tabs>
+          <w:tab w:val="left" w:pos="1200"/>
+        </w:tabs>
+        <w:rPr>
+          <w:noProof/>
+        </w:rPr>
+      </w:pPr>
+    </w:p>
+    <w:p>
+      <w:pPr>
+        <w:tabs>
+          <w:tab w:val="left" w:pos="1200"/>
+        </w:tabs>
+        <w:rPr>
+          <w:noProof/>
+        </w:rPr>
+      </w:pPr>
+    </w:p>
+    <w:p>
+      <w:pPr>
+        <w:tabs>
+          <w:tab w:val="left" w:pos="1200"/>
+        </w:tabs>
+        <w:rPr>
+          <w:noProof/>
+        </w:rPr>
+      </w:pPr>
+    </w:p>
+    <w:p>
+      <w:pPr>
+        <w:tabs>
+          <w:tab w:val="left" w:pos="1200"/>
+        </w:tabs>
+        <w:rPr>
+          <w:noProof/>
+        </w:rPr>
+      </w:pPr>
+    </w:p>
+    <w:p>
+      <w:pPr>
+        <w:tabs>
+          <w:tab w:val="left" w:pos="1200"/>
+        </w:tabs>
+        <w:rPr>
+          <w:noProof/>
+        </w:rPr>
+      </w:pPr>
+    </w:p>
+    <w:p>
+      <w:pPr>
+        <w:tabs>
+          <w:tab w:val="left" w:pos="1200"/>
+        </w:tabs>
+        <w:rPr>
+          <w:noProof/>
+        </w:rPr>
+      </w:pPr>
+      <w:r>
+        <w:rPr>
+          <w:noProof/>
+        </w:rPr>
+        <w:t>41- Dentro do main</w:t>
+      </w:r>
+      <w:r>
+        <w:rPr>
+          <w:noProof/>
+        </w:rPr>
+        <w:t xml:space="preserve"> adicionamos a tag form e inserimos os inputs tipo de texto e as label e juntamos a label com os inputs utilizando o for da label com mesmo nome do id dos inputs.</w:t>
+      </w:r>
+      <w:r>
+        <w:rPr>
+          <w:noProof/>
+        </w:rPr>
+        <w:t xml:space="preserve"> </w:t>
+      </w:r>
+      <w:r>
+        <w:rPr>
+          <w:noProof/>
+        </w:rPr>
+        <w:drawing>
+          <wp:inline distT="0" distB="0" distL="0" distR="0" wp14:anchorId="6D293543" wp14:editId="066D13CE">
+            <wp:extent cx="4667901" cy="1905266"/>
+            <wp:effectExtent l="0" t="0" r="0" b="0"/>
+            <wp:docPr id="55" name="Imagem 55"/>
+            <wp:cNvGraphicFramePr>
+              <a:graphicFrameLocks xmlns:a="http://schemas.openxmlformats.org/drawingml/2006/main" noChangeAspect="1"/>
+            </wp:cNvGraphicFramePr>
+            <a:graphic xmlns:a="http://schemas.openxmlformats.org/drawingml/2006/main">
+              <a:graphicData uri="http://schemas.openxmlformats.org/drawingml/2006/picture">
+                <pic:pic xmlns:pic="http://schemas.openxmlformats.org/drawingml/2006/picture">
+                  <pic:nvPicPr>
+                    <pic:cNvPr id="1" name=""/>
+                    <pic:cNvPicPr/>
+                  </pic:nvPicPr>
+                  <pic:blipFill>
+                    <a:blip r:embed="rId57"/>
+                    <a:stretch>
+                      <a:fillRect/>
+                    </a:stretch>
+                  </pic:blipFill>
+                  <pic:spPr>
+                    <a:xfrm>
+                      <a:off x="0" y="0"/>
+                      <a:ext cx="4667901" cy="1905266"/>
+                    </a:xfrm>
+                    <a:prstGeom prst="rect">
+                      <a:avLst/>
+                    </a:prstGeom>
+                  </pic:spPr>
+                </pic:pic>
+              </a:graphicData>
+            </a:graphic>
+          </wp:inline>
+        </w:drawing>
+      </w:r>
+    </w:p>
+    <w:p>
+      <w:pPr>
+        <w:tabs>
+          <w:tab w:val="left" w:pos="1200"/>
+        </w:tabs>
+        <w:rPr>
+          <w:noProof/>
+        </w:rPr>
+      </w:pPr>
+      <w:bookmarkStart w:id="0" w:name="_GoBack"/>
+      <w:bookmarkEnd w:id="0"/>
     </w:p>
     <w:sectPr>
       <w:pgSz w:w="11906" w:h="16838"/>
@@ -5820,7 +6970,7 @@
 </file>
 
 <file path=customXml/itemProps1.xml><?xml version="1.0" encoding="utf-8"?>
-<ds:datastoreItem xmlns:ds="http://schemas.openxmlformats.org/officeDocument/2006/customXml" ds:itemID="{49EDE7E6-8A94-496B-8431-51611416EEDE}">
+<ds:datastoreItem xmlns:ds="http://schemas.openxmlformats.org/officeDocument/2006/customXml" ds:itemID="{9E29CBA6-D164-46C1-92EB-D460D74D44CD}">
   <ds:schemaRefs>
     <ds:schemaRef ds:uri="http://schemas.openxmlformats.org/officeDocument/2006/bibliography"/>
   </ds:schemaRefs>

</xml_diff>

<commit_message>
adicionamos os label e os input
</commit_message>
<xml_diff>
--- a/Apostila/Apostila Space for Men.docx
+++ b/Apostila/Apostila Space for Men.docx
@@ -4470,6 +4470,9 @@
         </w:tabs>
       </w:pPr>
       <w:r>
+        <w:rPr>
+          <w:noProof/>
+        </w:rPr>
         <w:drawing>
           <wp:inline distT="0" distB="0" distL="0" distR="0" wp14:anchorId="0E712884" wp14:editId="34A7C0F9">
             <wp:extent cx="2029108" cy="647790"/>
@@ -4556,6 +4559,9 @@
         </w:tabs>
       </w:pPr>
       <w:r>
+        <w:rPr>
+          <w:noProof/>
+        </w:rPr>
         <w:drawing>
           <wp:inline distT="0" distB="0" distL="0" distR="0" wp14:anchorId="1A3D6A2A" wp14:editId="396DC15B">
             <wp:extent cx="3191320" cy="981212"/>
@@ -4758,6 +4764,9 @@
         </w:drawing>
       </w:r>
       <w:r>
+        <w:rPr>
+          <w:noProof/>
+        </w:rPr>
         <w:drawing>
           <wp:anchor distT="0" distB="0" distL="114300" distR="114300" simplePos="0" relativeHeight="251681792" behindDoc="0" locked="0" layoutInCell="1" allowOverlap="1" wp14:anchorId="49AC0C61">
             <wp:simplePos x="0" y="0"/>
@@ -4976,8 +4985,486 @@
           <w:noProof/>
         </w:rPr>
       </w:pPr>
+      <w:r>
+        <w:rPr>
+          <w:noProof/>
+        </w:rPr>
+        <w:t>42- Demos uma largura para o main  com isso para poder centralizar o formulario utilizando margin: 0 auto; e no form aumentamos o tamanho tanto para cima quanto para baixo usando o margin: 40px 0;.</w:t>
+      </w:r>
+    </w:p>
+    <w:p>
+      <w:pPr>
+        <w:tabs>
+          <w:tab w:val="left" w:pos="1200"/>
+        </w:tabs>
+        <w:rPr>
+          <w:noProof/>
+        </w:rPr>
+      </w:pPr>
+      <w:r>
+        <w:rPr>
+          <w:noProof/>
+        </w:rPr>
+        <w:drawing>
+          <wp:inline distT="0" distB="0" distL="0" distR="0" wp14:anchorId="5F00B016" wp14:editId="38701D8D">
+            <wp:extent cx="1657581" cy="1543265"/>
+            <wp:effectExtent l="0" t="0" r="0" b="0"/>
+            <wp:docPr id="56" name="Imagem 56"/>
+            <wp:cNvGraphicFramePr>
+              <a:graphicFrameLocks xmlns:a="http://schemas.openxmlformats.org/drawingml/2006/main" noChangeAspect="1"/>
+            </wp:cNvGraphicFramePr>
+            <a:graphic xmlns:a="http://schemas.openxmlformats.org/drawingml/2006/main">
+              <a:graphicData uri="http://schemas.openxmlformats.org/drawingml/2006/picture">
+                <pic:pic xmlns:pic="http://schemas.openxmlformats.org/drawingml/2006/picture">
+                  <pic:nvPicPr>
+                    <pic:cNvPr id="1" name=""/>
+                    <pic:cNvPicPr/>
+                  </pic:nvPicPr>
+                  <pic:blipFill>
+                    <a:blip r:embed="rId58"/>
+                    <a:stretch>
+                      <a:fillRect/>
+                    </a:stretch>
+                  </pic:blipFill>
+                  <pic:spPr>
+                    <a:xfrm>
+                      <a:off x="0" y="0"/>
+                      <a:ext cx="1657581" cy="1543265"/>
+                    </a:xfrm>
+                    <a:prstGeom prst="rect">
+                      <a:avLst/>
+                    </a:prstGeom>
+                  </pic:spPr>
+                </pic:pic>
+              </a:graphicData>
+            </a:graphic>
+          </wp:inline>
+        </w:drawing>
+      </w:r>
+    </w:p>
+    <w:p>
+      <w:pPr>
+        <w:tabs>
+          <w:tab w:val="left" w:pos="1200"/>
+        </w:tabs>
+        <w:rPr>
+          <w:noProof/>
+        </w:rPr>
+      </w:pPr>
+      <w:r>
+        <w:rPr>
+          <w:noProof/>
+        </w:rPr>
+        <w:t>43- Trabalhamos com a natureza da label e do inputs mudamos para block assim tanto a label como os inputs fica um acima do outro e demos um espaço entre eles utilizando o margin.</w:t>
+      </w:r>
+      <w:r>
+        <w:rPr>
+          <w:noProof/>
+        </w:rPr>
+        <w:t xml:space="preserve"> </w:t>
+      </w:r>
+    </w:p>
+    <w:p>
+      <w:pPr>
+        <w:tabs>
+          <w:tab w:val="left" w:pos="1200"/>
+        </w:tabs>
+        <w:rPr>
+          <w:noProof/>
+        </w:rPr>
+      </w:pPr>
+      <w:r>
+        <w:rPr>
+          <w:noProof/>
+        </w:rPr>
+        <w:drawing>
+          <wp:inline distT="0" distB="0" distL="0" distR="0" wp14:anchorId="4A88C998" wp14:editId="01FC2A70">
+            <wp:extent cx="1743318" cy="1505160"/>
+            <wp:effectExtent l="0" t="0" r="9525" b="0"/>
+            <wp:docPr id="58" name="Imagem 58"/>
+            <wp:cNvGraphicFramePr>
+              <a:graphicFrameLocks xmlns:a="http://schemas.openxmlformats.org/drawingml/2006/main" noChangeAspect="1"/>
+            </wp:cNvGraphicFramePr>
+            <a:graphic xmlns:a="http://schemas.openxmlformats.org/drawingml/2006/main">
+              <a:graphicData uri="http://schemas.openxmlformats.org/drawingml/2006/picture">
+                <pic:pic xmlns:pic="http://schemas.openxmlformats.org/drawingml/2006/picture">
+                  <pic:nvPicPr>
+                    <pic:cNvPr id="1" name=""/>
+                    <pic:cNvPicPr/>
+                  </pic:nvPicPr>
+                  <pic:blipFill>
+                    <a:blip r:embed="rId59"/>
+                    <a:stretch>
+                      <a:fillRect/>
+                    </a:stretch>
+                  </pic:blipFill>
+                  <pic:spPr>
+                    <a:xfrm>
+                      <a:off x="0" y="0"/>
+                      <a:ext cx="1743318" cy="1505160"/>
+                    </a:xfrm>
+                    <a:prstGeom prst="rect">
+                      <a:avLst/>
+                    </a:prstGeom>
+                  </pic:spPr>
+                </pic:pic>
+              </a:graphicData>
+            </a:graphic>
+          </wp:inline>
+        </w:drawing>
+      </w:r>
+    </w:p>
+    <w:p>
+      <w:pPr>
+        <w:tabs>
+          <w:tab w:val="left" w:pos="1200"/>
+        </w:tabs>
+        <w:rPr>
+          <w:noProof/>
+        </w:rPr>
+      </w:pPr>
+      <w:r>
+        <w:rPr>
+          <w:noProof/>
+        </w:rPr>
+        <w:t xml:space="preserve">44- </w:t>
+      </w:r>
+      <w:r>
+        <w:rPr>
+          <w:noProof/>
+        </w:rPr>
+        <w:t>Aumentamos o tamanho da label  e tambem os espaços internos dos inputs e demos uma largura para ocupar 50% da nossa pagina.</w:t>
+      </w:r>
+    </w:p>
+    <w:p>
+      <w:pPr>
+        <w:tabs>
+          <w:tab w:val="left" w:pos="1200"/>
+        </w:tabs>
+        <w:rPr>
+          <w:noProof/>
+        </w:rPr>
+      </w:pPr>
+      <w:r>
+        <w:rPr>
+          <w:noProof/>
+        </w:rPr>
+        <w:drawing>
+          <wp:inline distT="0" distB="0" distL="0" distR="0" wp14:anchorId="6C5AD920" wp14:editId="215FF5FD">
+            <wp:extent cx="1981477" cy="2000529"/>
+            <wp:effectExtent l="0" t="0" r="0" b="0"/>
+            <wp:docPr id="60" name="Imagem 60"/>
+            <wp:cNvGraphicFramePr>
+              <a:graphicFrameLocks xmlns:a="http://schemas.openxmlformats.org/drawingml/2006/main" noChangeAspect="1"/>
+            </wp:cNvGraphicFramePr>
+            <a:graphic xmlns:a="http://schemas.openxmlformats.org/drawingml/2006/main">
+              <a:graphicData uri="http://schemas.openxmlformats.org/drawingml/2006/picture">
+                <pic:pic xmlns:pic="http://schemas.openxmlformats.org/drawingml/2006/picture">
+                  <pic:nvPicPr>
+                    <pic:cNvPr id="1" name=""/>
+                    <pic:cNvPicPr/>
+                  </pic:nvPicPr>
+                  <pic:blipFill>
+                    <a:blip r:embed="rId60"/>
+                    <a:stretch>
+                      <a:fillRect/>
+                    </a:stretch>
+                  </pic:blipFill>
+                  <pic:spPr>
+                    <a:xfrm>
+                      <a:off x="0" y="0"/>
+                      <a:ext cx="1981477" cy="2000529"/>
+                    </a:xfrm>
+                    <a:prstGeom prst="rect">
+                      <a:avLst/>
+                    </a:prstGeom>
+                  </pic:spPr>
+                </pic:pic>
+              </a:graphicData>
+            </a:graphic>
+          </wp:inline>
+        </w:drawing>
+      </w:r>
+    </w:p>
+    <w:p>
+      <w:pPr>
+        <w:tabs>
+          <w:tab w:val="left" w:pos="1200"/>
+        </w:tabs>
+        <w:rPr>
+          <w:noProof/>
+        </w:rPr>
+      </w:pPr>
+      <w:r>
+        <w:rPr>
+          <w:noProof/>
+        </w:rPr>
+        <w:t xml:space="preserve">45- </w:t>
+      </w:r>
+      <w:r>
+        <w:rPr>
+          <w:noProof/>
+        </w:rPr>
+        <w:t>Adicionamos o</w:t>
+      </w:r>
+      <w:r>
+        <w:rPr>
+          <w:noProof/>
+        </w:rPr>
+        <w:t xml:space="preserve"> textarea o inputs que utilizamos para enviar mensagem mais longa de texto.</w:t>
+      </w:r>
+    </w:p>
+    <w:p>
+      <w:pPr>
+        <w:tabs>
+          <w:tab w:val="left" w:pos="1200"/>
+        </w:tabs>
+        <w:rPr>
+          <w:noProof/>
+        </w:rPr>
+      </w:pPr>
+      <w:r>
+        <w:rPr>
+          <w:noProof/>
+        </w:rPr>
+        <w:drawing>
+          <wp:inline distT="0" distB="0" distL="0" distR="0" wp14:anchorId="6B851B60" wp14:editId="568E2465">
+            <wp:extent cx="3658111" cy="457264"/>
+            <wp:effectExtent l="0" t="0" r="0" b="0"/>
+            <wp:docPr id="61" name="Imagem 61"/>
+            <wp:cNvGraphicFramePr>
+              <a:graphicFrameLocks xmlns:a="http://schemas.openxmlformats.org/drawingml/2006/main" noChangeAspect="1"/>
+            </wp:cNvGraphicFramePr>
+            <a:graphic xmlns:a="http://schemas.openxmlformats.org/drawingml/2006/main">
+              <a:graphicData uri="http://schemas.openxmlformats.org/drawingml/2006/picture">
+                <pic:pic xmlns:pic="http://schemas.openxmlformats.org/drawingml/2006/picture">
+                  <pic:nvPicPr>
+                    <pic:cNvPr id="1" name=""/>
+                    <pic:cNvPicPr/>
+                  </pic:nvPicPr>
+                  <pic:blipFill>
+                    <a:blip r:embed="rId61"/>
+                    <a:stretch>
+                      <a:fillRect/>
+                    </a:stretch>
+                  </pic:blipFill>
+                  <pic:spPr>
+                    <a:xfrm>
+                      <a:off x="0" y="0"/>
+                      <a:ext cx="3658111" cy="457264"/>
+                    </a:xfrm>
+                    <a:prstGeom prst="rect">
+                      <a:avLst/>
+                    </a:prstGeom>
+                  </pic:spPr>
+                </pic:pic>
+              </a:graphicData>
+            </a:graphic>
+          </wp:inline>
+        </w:drawing>
+      </w:r>
+      <w:r>
+        <w:rPr>
+          <w:noProof/>
+        </w:rPr>
+        <w:drawing>
+          <wp:inline distT="0" distB="0" distL="0" distR="0" wp14:anchorId="351A8708" wp14:editId="052350B8">
+            <wp:extent cx="4029074" cy="1723045"/>
+            <wp:effectExtent l="0" t="0" r="0" b="0"/>
+            <wp:docPr id="62" name="Imagem 62"/>
+            <wp:cNvGraphicFramePr>
+              <a:graphicFrameLocks xmlns:a="http://schemas.openxmlformats.org/drawingml/2006/main" noChangeAspect="1"/>
+            </wp:cNvGraphicFramePr>
+            <a:graphic xmlns:a="http://schemas.openxmlformats.org/drawingml/2006/main">
+              <a:graphicData uri="http://schemas.openxmlformats.org/drawingml/2006/picture">
+                <pic:pic xmlns:pic="http://schemas.openxmlformats.org/drawingml/2006/picture">
+                  <pic:nvPicPr>
+                    <pic:cNvPr id="1" name=""/>
+                    <pic:cNvPicPr/>
+                  </pic:nvPicPr>
+                  <pic:blipFill>
+                    <a:blip r:embed="rId62"/>
+                    <a:stretch>
+                      <a:fillRect/>
+                    </a:stretch>
+                  </pic:blipFill>
+                  <pic:spPr>
+                    <a:xfrm>
+                      <a:off x="0" y="0"/>
+                      <a:ext cx="4317190" cy="1846259"/>
+                    </a:xfrm>
+                    <a:prstGeom prst="rect">
+                      <a:avLst/>
+                    </a:prstGeom>
+                  </pic:spPr>
+                </pic:pic>
+              </a:graphicData>
+            </a:graphic>
+          </wp:inline>
+        </w:drawing>
+      </w:r>
+    </w:p>
+    <w:p>
+      <w:pPr>
+        <w:tabs>
+          <w:tab w:val="left" w:pos="1200"/>
+        </w:tabs>
+        <w:rPr>
+          <w:noProof/>
+        </w:rPr>
+      </w:pPr>
+      <w:r>
+        <w:rPr>
+          <w:noProof/>
+        </w:rPr>
+        <w:t xml:space="preserve">46- </w:t>
+      </w:r>
+      <w:r>
+        <w:rPr>
+          <w:noProof/>
+        </w:rPr>
+        <w:t>Adicionamos as labels e input radio.</w:t>
+      </w:r>
+    </w:p>
+    <w:p>
+      <w:pPr>
+        <w:tabs>
+          <w:tab w:val="left" w:pos="1200"/>
+        </w:tabs>
+        <w:rPr>
+          <w:noProof/>
+        </w:rPr>
+      </w:pPr>
+      <w:r>
+        <w:rPr>
+          <w:noProof/>
+        </w:rPr>
+        <w:drawing>
+          <wp:inline distT="0" distB="0" distL="0" distR="0" wp14:anchorId="6788912E" wp14:editId="3012E07E">
+            <wp:extent cx="3658111" cy="1629002"/>
+            <wp:effectExtent l="0" t="0" r="0" b="0"/>
+            <wp:docPr id="63" name="Imagem 63"/>
+            <wp:cNvGraphicFramePr>
+              <a:graphicFrameLocks xmlns:a="http://schemas.openxmlformats.org/drawingml/2006/main" noChangeAspect="1"/>
+            </wp:cNvGraphicFramePr>
+            <a:graphic xmlns:a="http://schemas.openxmlformats.org/drawingml/2006/main">
+              <a:graphicData uri="http://schemas.openxmlformats.org/drawingml/2006/picture">
+                <pic:pic xmlns:pic="http://schemas.openxmlformats.org/drawingml/2006/picture">
+                  <pic:nvPicPr>
+                    <pic:cNvPr id="1" name=""/>
+                    <pic:cNvPicPr/>
+                  </pic:nvPicPr>
+                  <pic:blipFill>
+                    <a:blip r:embed="rId63"/>
+                    <a:stretch>
+                      <a:fillRect/>
+                    </a:stretch>
+                  </pic:blipFill>
+                  <pic:spPr>
+                    <a:xfrm>
+                      <a:off x="0" y="0"/>
+                      <a:ext cx="3658111" cy="1629002"/>
+                    </a:xfrm>
+                    <a:prstGeom prst="rect">
+                      <a:avLst/>
+                    </a:prstGeom>
+                  </pic:spPr>
+                </pic:pic>
+              </a:graphicData>
+            </a:graphic>
+          </wp:inline>
+        </w:drawing>
+      </w:r>
+    </w:p>
+    <w:p>
+      <w:pPr>
+        <w:tabs>
+          <w:tab w:val="left" w:pos="1200"/>
+        </w:tabs>
+        <w:rPr>
+          <w:noProof/>
+        </w:rPr>
+      </w:pPr>
+      <w:r>
+        <w:rPr>
+          <w:noProof/>
+        </w:rPr>
+        <w:t xml:space="preserve">47- </w:t>
+      </w:r>
+      <w:r>
+        <w:rPr>
+          <w:noProof/>
+        </w:rPr>
+        <w:t>Inserimos a label e o input tipo checkbox.</w:t>
+      </w:r>
+    </w:p>
+    <w:p>
+      <w:pPr>
+        <w:tabs>
+          <w:tab w:val="left" w:pos="1200"/>
+        </w:tabs>
+        <w:rPr>
+          <w:noProof/>
+        </w:rPr>
+      </w:pPr>
+      <w:r>
+        <w:rPr>
+          <w:noProof/>
+        </w:rPr>
+        <w:drawing>
+          <wp:inline distT="0" distB="0" distL="0" distR="0" wp14:anchorId="35C1F57D" wp14:editId="57F79C80">
+            <wp:extent cx="5182323" cy="381053"/>
+            <wp:effectExtent l="0" t="0" r="0" b="0"/>
+            <wp:docPr id="64" name="Imagem 64"/>
+            <wp:cNvGraphicFramePr>
+              <a:graphicFrameLocks xmlns:a="http://schemas.openxmlformats.org/drawingml/2006/main" noChangeAspect="1"/>
+            </wp:cNvGraphicFramePr>
+            <a:graphic xmlns:a="http://schemas.openxmlformats.org/drawingml/2006/main">
+              <a:graphicData uri="http://schemas.openxmlformats.org/drawingml/2006/picture">
+                <pic:pic xmlns:pic="http://schemas.openxmlformats.org/drawingml/2006/picture">
+                  <pic:nvPicPr>
+                    <pic:cNvPr id="1" name=""/>
+                    <pic:cNvPicPr/>
+                  </pic:nvPicPr>
+                  <pic:blipFill>
+                    <a:blip r:embed="rId64"/>
+                    <a:stretch>
+                      <a:fillRect/>
+                    </a:stretch>
+                  </pic:blipFill>
+                  <pic:spPr>
+                    <a:xfrm>
+                      <a:off x="0" y="0"/>
+                      <a:ext cx="5182323" cy="381053"/>
+                    </a:xfrm>
+                    <a:prstGeom prst="rect">
+                      <a:avLst/>
+                    </a:prstGeom>
+                  </pic:spPr>
+                </pic:pic>
+              </a:graphicData>
+            </a:graphic>
+          </wp:inline>
+        </w:drawing>
+      </w:r>
       <w:bookmarkStart w:id="0" w:name="_GoBack"/>
       <w:bookmarkEnd w:id="0"/>
+    </w:p>
+    <w:p>
+      <w:pPr>
+        <w:tabs>
+          <w:tab w:val="left" w:pos="1200"/>
+        </w:tabs>
+        <w:rPr>
+          <w:noProof/>
+        </w:rPr>
+      </w:pPr>
+      <w:r>
+        <w:rPr>
+          <w:noProof/>
+        </w:rPr>
+        <w:t xml:space="preserve">  </w:t>
+      </w:r>
     </w:p>
     <w:sectPr>
       <w:pgSz w:w="11906" w:h="16838"/>
@@ -6970,7 +7457,7 @@
 </file>
 
 <file path=customXml/itemProps1.xml><?xml version="1.0" encoding="utf-8"?>
-<ds:datastoreItem xmlns:ds="http://schemas.openxmlformats.org/officeDocument/2006/customXml" ds:itemID="{9E29CBA6-D164-46C1-92EB-D460D74D44CD}">
+<ds:datastoreItem xmlns:ds="http://schemas.openxmlformats.org/officeDocument/2006/customXml" ds:itemID="{7C704E12-362E-4F94-B28D-DCDD4E08ACED}">
   <ds:schemaRefs>
     <ds:schemaRef ds:uri="http://schemas.openxmlformats.org/officeDocument/2006/bibliography"/>
   </ds:schemaRefs>

</xml_diff>

<commit_message>
Adicionamos os inputs correto e terminamos quase todo o input
</commit_message>
<xml_diff>
--- a/Apostila/Apostila Space for Men.docx
+++ b/Apostila/Apostila Space for Men.docx
@@ -4776,8 +4776,8 @@
             <wp:positionV relativeFrom="paragraph">
               <wp:posOffset>72573515</wp:posOffset>
             </wp:positionV>
-            <wp:extent cx="2790825" cy="5210810"/>
-            <wp:effectExtent l="0" t="0" r="9525" b="0"/>
+            <wp:extent cx="1897966" cy="3543300"/>
+            <wp:effectExtent l="0" t="0" r="7620" b="0"/>
             <wp:wrapSquare wrapText="bothSides"/>
             <wp:docPr id="52" name="Imagem 52"/>
             <wp:cNvGraphicFramePr>
@@ -4805,7 +4805,7 @@
                   <pic:spPr>
                     <a:xfrm>
                       <a:off x="0" y="0"/>
-                      <a:ext cx="2791215" cy="5210902"/>
+                      <a:ext cx="1906529" cy="3559286"/>
                     </a:xfrm>
                     <a:prstGeom prst="rect">
                       <a:avLst/>
@@ -4814,6 +4814,12 @@
                 </pic:pic>
               </a:graphicData>
             </a:graphic>
+            <wp14:sizeRelH relativeFrom="margin">
+              <wp14:pctWidth>0</wp14:pctWidth>
+            </wp14:sizeRelH>
+            <wp14:sizeRelV relativeFrom="margin">
+              <wp14:pctHeight>0</wp14:pctHeight>
+            </wp14:sizeRelV>
           </wp:anchor>
         </w:drawing>
       </w:r>
@@ -4867,56 +4873,6 @@
           <w:noProof/>
         </w:rPr>
       </w:pPr>
-    </w:p>
-    <w:p>
-      <w:pPr>
-        <w:tabs>
-          <w:tab w:val="left" w:pos="1200"/>
-        </w:tabs>
-        <w:rPr>
-          <w:noProof/>
-        </w:rPr>
-      </w:pPr>
-    </w:p>
-    <w:p>
-      <w:pPr>
-        <w:tabs>
-          <w:tab w:val="left" w:pos="1200"/>
-        </w:tabs>
-        <w:rPr>
-          <w:noProof/>
-        </w:rPr>
-      </w:pPr>
-    </w:p>
-    <w:p>
-      <w:pPr>
-        <w:tabs>
-          <w:tab w:val="left" w:pos="1200"/>
-        </w:tabs>
-        <w:rPr>
-          <w:noProof/>
-        </w:rPr>
-      </w:pPr>
-    </w:p>
-    <w:p>
-      <w:pPr>
-        <w:tabs>
-          <w:tab w:val="left" w:pos="1200"/>
-        </w:tabs>
-        <w:rPr>
-          <w:noProof/>
-        </w:rPr>
-      </w:pPr>
-    </w:p>
-    <w:p>
-      <w:pPr>
-        <w:tabs>
-          <w:tab w:val="left" w:pos="1200"/>
-        </w:tabs>
-        <w:rPr>
-          <w:noProof/>
-        </w:rPr>
-      </w:pPr>
       <w:r>
         <w:rPr>
           <w:noProof/>
@@ -5229,7 +5185,7 @@
         </w:rPr>
         <w:drawing>
           <wp:inline distT="0" distB="0" distL="0" distR="0" wp14:anchorId="6B851B60" wp14:editId="568E2465">
-            <wp:extent cx="3658111" cy="457264"/>
+            <wp:extent cx="3724275" cy="465535"/>
             <wp:effectExtent l="0" t="0" r="0" b="0"/>
             <wp:docPr id="61" name="Imagem 61"/>
             <wp:cNvGraphicFramePr>
@@ -5251,7 +5207,7 @@
                   <pic:spPr>
                     <a:xfrm>
                       <a:off x="0" y="0"/>
-                      <a:ext cx="3658111" cy="457264"/>
+                      <a:ext cx="3927550" cy="490944"/>
                     </a:xfrm>
                     <a:prstGeom prst="rect">
                       <a:avLst/>
@@ -5269,8 +5225,8 @@
         </w:rPr>
         <w:drawing>
           <wp:inline distT="0" distB="0" distL="0" distR="0" wp14:anchorId="351A8708" wp14:editId="052350B8">
-            <wp:extent cx="4029074" cy="1723045"/>
-            <wp:effectExtent l="0" t="0" r="0" b="0"/>
+            <wp:extent cx="2472055" cy="1057182"/>
+            <wp:effectExtent l="0" t="0" r="4445" b="0"/>
             <wp:docPr id="62" name="Imagem 62"/>
             <wp:cNvGraphicFramePr>
               <a:graphicFrameLocks xmlns:a="http://schemas.openxmlformats.org/drawingml/2006/main" noChangeAspect="1"/>
@@ -5291,7 +5247,7 @@
                   <pic:spPr>
                     <a:xfrm>
                       <a:off x="0" y="0"/>
-                      <a:ext cx="4317190" cy="1846259"/>
+                      <a:ext cx="2652757" cy="1134460"/>
                     </a:xfrm>
                     <a:prstGeom prst="rect">
                       <a:avLst/>
@@ -5447,24 +5403,758 @@
           </wp:inline>
         </w:drawing>
       </w:r>
+    </w:p>
+    <w:p>
+      <w:pPr>
+        <w:tabs>
+          <w:tab w:val="left" w:pos="1200"/>
+        </w:tabs>
+        <w:rPr>
+          <w:noProof/>
+        </w:rPr>
+      </w:pPr>
+      <w:r>
+        <w:rPr>
+          <w:noProof/>
+        </w:rPr>
+        <w:t xml:space="preserve">48- </w:t>
+      </w:r>
+      <w:r>
+        <w:rPr>
+          <w:noProof/>
+        </w:rPr>
+        <w:t xml:space="preserve">Para colocar os inputs </w:t>
+      </w:r>
+      <w:r>
+        <w:rPr>
+          <w:noProof/>
+        </w:rPr>
+        <w:t xml:space="preserve"> radio-box e o input-check-box na frente da label inserimos os inputs dentro da label conforme o código abaixo</w:t>
+      </w:r>
+    </w:p>
+    <w:p>
+      <w:pPr>
+        <w:tabs>
+          <w:tab w:val="left" w:pos="1200"/>
+        </w:tabs>
+        <w:rPr>
+          <w:noProof/>
+        </w:rPr>
+      </w:pPr>
+      <w:r>
+        <w:rPr>
+          <w:noProof/>
+        </w:rPr>
+        <w:drawing>
+          <wp:inline distT="0" distB="0" distL="0" distR="0" wp14:anchorId="7D280FF3" wp14:editId="0F10C699">
+            <wp:extent cx="7954485" cy="1438476"/>
+            <wp:effectExtent l="0" t="0" r="0" b="9525"/>
+            <wp:docPr id="57" name="Imagem 57"/>
+            <wp:cNvGraphicFramePr>
+              <a:graphicFrameLocks xmlns:a="http://schemas.openxmlformats.org/drawingml/2006/main" noChangeAspect="1"/>
+            </wp:cNvGraphicFramePr>
+            <a:graphic xmlns:a="http://schemas.openxmlformats.org/drawingml/2006/main">
+              <a:graphicData uri="http://schemas.openxmlformats.org/drawingml/2006/picture">
+                <pic:pic xmlns:pic="http://schemas.openxmlformats.org/drawingml/2006/picture">
+                  <pic:nvPicPr>
+                    <pic:cNvPr id="1" name=""/>
+                    <pic:cNvPicPr/>
+                  </pic:nvPicPr>
+                  <pic:blipFill>
+                    <a:blip r:embed="rId65"/>
+                    <a:stretch>
+                      <a:fillRect/>
+                    </a:stretch>
+                  </pic:blipFill>
+                  <pic:spPr>
+                    <a:xfrm>
+                      <a:off x="0" y="0"/>
+                      <a:ext cx="7954485" cy="1438476"/>
+                    </a:xfrm>
+                    <a:prstGeom prst="rect">
+                      <a:avLst/>
+                    </a:prstGeom>
+                  </pic:spPr>
+                </pic:pic>
+              </a:graphicData>
+            </a:graphic>
+          </wp:inline>
+        </w:drawing>
+      </w:r>
+    </w:p>
+    <w:p>
+      <w:pPr>
+        <w:tabs>
+          <w:tab w:val="left" w:pos="1200"/>
+        </w:tabs>
+        <w:rPr>
+          <w:noProof/>
+        </w:rPr>
+      </w:pPr>
+      <w:r>
+        <w:rPr>
+          <w:noProof/>
+        </w:rPr>
+        <w:t>49- Ao colocar os inputs dentro da label conforme o código acima se fez necessario criar uma class para formatar os outros inputs para coloca-los em block.</w:t>
+      </w:r>
+    </w:p>
+    <w:p>
+      <w:pPr>
+        <w:tabs>
+          <w:tab w:val="left" w:pos="1200"/>
+        </w:tabs>
+        <w:rPr>
+          <w:noProof/>
+        </w:rPr>
+      </w:pPr>
+      <w:r>
+        <w:rPr>
+          <w:noProof/>
+        </w:rPr>
+        <w:drawing>
+          <wp:inline distT="0" distB="0" distL="0" distR="0" wp14:anchorId="429343C2" wp14:editId="2FEAAFA6">
+            <wp:extent cx="1505160" cy="1047896"/>
+            <wp:effectExtent l="0" t="0" r="0" b="0"/>
+            <wp:docPr id="59" name="Imagem 59"/>
+            <wp:cNvGraphicFramePr>
+              <a:graphicFrameLocks xmlns:a="http://schemas.openxmlformats.org/drawingml/2006/main" noChangeAspect="1"/>
+            </wp:cNvGraphicFramePr>
+            <a:graphic xmlns:a="http://schemas.openxmlformats.org/drawingml/2006/main">
+              <a:graphicData uri="http://schemas.openxmlformats.org/drawingml/2006/picture">
+                <pic:pic xmlns:pic="http://schemas.openxmlformats.org/drawingml/2006/picture">
+                  <pic:nvPicPr>
+                    <pic:cNvPr id="1" name=""/>
+                    <pic:cNvPicPr/>
+                  </pic:nvPicPr>
+                  <pic:blipFill>
+                    <a:blip r:embed="rId66"/>
+                    <a:stretch>
+                      <a:fillRect/>
+                    </a:stretch>
+                  </pic:blipFill>
+                  <pic:spPr>
+                    <a:xfrm>
+                      <a:off x="0" y="0"/>
+                      <a:ext cx="1505160" cy="1047896"/>
+                    </a:xfrm>
+                    <a:prstGeom prst="rect">
+                      <a:avLst/>
+                    </a:prstGeom>
+                  </pic:spPr>
+                </pic:pic>
+              </a:graphicData>
+            </a:graphic>
+          </wp:inline>
+        </w:drawing>
+      </w:r>
+      <w:r>
+        <w:rPr>
+          <w:noProof/>
+        </w:rPr>
+        <w:drawing>
+          <wp:inline distT="0" distB="0" distL="0" distR="0" wp14:anchorId="2A78426A" wp14:editId="32D6A10D">
+            <wp:extent cx="2580759" cy="1045464"/>
+            <wp:effectExtent l="0" t="0" r="0" b="2540"/>
+            <wp:docPr id="65" name="Imagem 65"/>
+            <wp:cNvGraphicFramePr>
+              <a:graphicFrameLocks xmlns:a="http://schemas.openxmlformats.org/drawingml/2006/main" noChangeAspect="1"/>
+            </wp:cNvGraphicFramePr>
+            <a:graphic xmlns:a="http://schemas.openxmlformats.org/drawingml/2006/main">
+              <a:graphicData uri="http://schemas.openxmlformats.org/drawingml/2006/picture">
+                <pic:pic xmlns:pic="http://schemas.openxmlformats.org/drawingml/2006/picture">
+                  <pic:nvPicPr>
+                    <pic:cNvPr id="1" name=""/>
+                    <pic:cNvPicPr/>
+                  </pic:nvPicPr>
+                  <pic:blipFill>
+                    <a:blip r:embed="rId67"/>
+                    <a:stretch>
+                      <a:fillRect/>
+                    </a:stretch>
+                  </pic:blipFill>
+                  <pic:spPr>
+                    <a:xfrm>
+                      <a:off x="0" y="0"/>
+                      <a:ext cx="2644149" cy="1071143"/>
+                    </a:xfrm>
+                    <a:prstGeom prst="rect">
+                      <a:avLst/>
+                    </a:prstGeom>
+                  </pic:spPr>
+                </pic:pic>
+              </a:graphicData>
+            </a:graphic>
+          </wp:inline>
+        </w:drawing>
+      </w:r>
+    </w:p>
+    <w:p>
+      <w:pPr>
+        <w:tabs>
+          <w:tab w:val="left" w:pos="1200"/>
+        </w:tabs>
+        <w:rPr>
+          <w:noProof/>
+        </w:rPr>
+      </w:pPr>
+      <w:r>
+        <w:rPr>
+          <w:noProof/>
+        </w:rPr>
+        <w:t xml:space="preserve">50- </w:t>
+      </w:r>
+      <w:r>
+        <w:rPr>
+          <w:noProof/>
+        </w:rPr>
+        <w:t>Adicionamos o select</w:t>
+      </w:r>
+      <w:r>
+        <w:rPr>
+          <w:noProof/>
+        </w:rPr>
+        <w:t xml:space="preserve"> e a legend</w:t>
+      </w:r>
+      <w:r>
+        <w:rPr>
+          <w:noProof/>
+        </w:rPr>
+        <w:t xml:space="preserve"> na nossa página conforme o código abaixo</w:t>
+      </w:r>
+      <w:r>
+        <w:rPr>
+          <w:noProof/>
+        </w:rPr>
+        <w:t>:</w:t>
+      </w:r>
+    </w:p>
+    <w:p>
+      <w:pPr>
+        <w:tabs>
+          <w:tab w:val="left" w:pos="1200"/>
+        </w:tabs>
+        <w:rPr>
+          <w:noProof/>
+        </w:rPr>
+      </w:pPr>
+      <w:r>
+        <w:rPr>
+          <w:noProof/>
+        </w:rPr>
+        <w:drawing>
+          <wp:inline distT="0" distB="0" distL="0" distR="0" wp14:anchorId="4B2D24D0" wp14:editId="58C0A0F1">
+            <wp:extent cx="2590800" cy="782559"/>
+            <wp:effectExtent l="0" t="0" r="0" b="0"/>
+            <wp:docPr id="66" name="Imagem 66"/>
+            <wp:cNvGraphicFramePr>
+              <a:graphicFrameLocks xmlns:a="http://schemas.openxmlformats.org/drawingml/2006/main" noChangeAspect="1"/>
+            </wp:cNvGraphicFramePr>
+            <a:graphic xmlns:a="http://schemas.openxmlformats.org/drawingml/2006/main">
+              <a:graphicData uri="http://schemas.openxmlformats.org/drawingml/2006/picture">
+                <pic:pic xmlns:pic="http://schemas.openxmlformats.org/drawingml/2006/picture">
+                  <pic:nvPicPr>
+                    <pic:cNvPr id="1" name=""/>
+                    <pic:cNvPicPr/>
+                  </pic:nvPicPr>
+                  <pic:blipFill>
+                    <a:blip r:embed="rId68"/>
+                    <a:stretch>
+                      <a:fillRect/>
+                    </a:stretch>
+                  </pic:blipFill>
+                  <pic:spPr>
+                    <a:xfrm>
+                      <a:off x="0" y="0"/>
+                      <a:ext cx="2616429" cy="790300"/>
+                    </a:xfrm>
+                    <a:prstGeom prst="rect">
+                      <a:avLst/>
+                    </a:prstGeom>
+                  </pic:spPr>
+                </pic:pic>
+              </a:graphicData>
+            </a:graphic>
+          </wp:inline>
+        </w:drawing>
+      </w:r>
+      <w:r>
+        <w:rPr>
+          <w:noProof/>
+        </w:rPr>
+        <w:drawing>
+          <wp:inline distT="0" distB="0" distL="0" distR="0" wp14:anchorId="73634F9E" wp14:editId="6290D269">
+            <wp:extent cx="3848101" cy="782467"/>
+            <wp:effectExtent l="0" t="0" r="0" b="0"/>
+            <wp:docPr id="68" name="Imagem 68"/>
+            <wp:cNvGraphicFramePr>
+              <a:graphicFrameLocks xmlns:a="http://schemas.openxmlformats.org/drawingml/2006/main" noChangeAspect="1"/>
+            </wp:cNvGraphicFramePr>
+            <a:graphic xmlns:a="http://schemas.openxmlformats.org/drawingml/2006/main">
+              <a:graphicData uri="http://schemas.openxmlformats.org/drawingml/2006/picture">
+                <pic:pic xmlns:pic="http://schemas.openxmlformats.org/drawingml/2006/picture">
+                  <pic:nvPicPr>
+                    <pic:cNvPr id="1" name=""/>
+                    <pic:cNvPicPr/>
+                  </pic:nvPicPr>
+                  <pic:blipFill>
+                    <a:blip r:embed="rId69"/>
+                    <a:stretch>
+                      <a:fillRect/>
+                    </a:stretch>
+                  </pic:blipFill>
+                  <pic:spPr>
+                    <a:xfrm>
+                      <a:off x="0" y="0"/>
+                      <a:ext cx="3986792" cy="810668"/>
+                    </a:xfrm>
+                    <a:prstGeom prst="rect">
+                      <a:avLst/>
+                    </a:prstGeom>
+                  </pic:spPr>
+                </pic:pic>
+              </a:graphicData>
+            </a:graphic>
+          </wp:inline>
+        </w:drawing>
+      </w:r>
+    </w:p>
+    <w:p>
+      <w:pPr>
+        <w:tabs>
+          <w:tab w:val="left" w:pos="1200"/>
+        </w:tabs>
+        <w:rPr>
+          <w:noProof/>
+        </w:rPr>
+      </w:pPr>
+      <w:r>
+        <w:rPr>
+          <w:noProof/>
+        </w:rPr>
+        <w:t xml:space="preserve">51- </w:t>
+      </w:r>
+      <w:r>
+        <w:rPr>
+          <w:noProof/>
+        </w:rPr>
+        <w:t>Colocamos o espaço externo</w:t>
+      </w:r>
+      <w:r>
+        <w:rPr>
+          <w:noProof/>
+        </w:rPr>
+        <w:t xml:space="preserve"> parqa cima e para baixo no checkbox conforme código abaixo.</w:t>
+      </w:r>
+    </w:p>
+    <w:p>
+      <w:pPr>
+        <w:tabs>
+          <w:tab w:val="left" w:pos="1200"/>
+        </w:tabs>
+        <w:rPr>
+          <w:noProof/>
+        </w:rPr>
+      </w:pPr>
+      <w:r>
+        <w:rPr>
+          <w:noProof/>
+        </w:rPr>
+        <w:drawing>
+          <wp:inline distT="0" distB="0" distL="0" distR="0" wp14:anchorId="5E3F01DC" wp14:editId="0C34878E">
+            <wp:extent cx="1457213" cy="694559"/>
+            <wp:effectExtent l="0" t="0" r="0" b="0"/>
+            <wp:docPr id="71" name="Imagem 71"/>
+            <wp:cNvGraphicFramePr>
+              <a:graphicFrameLocks xmlns:a="http://schemas.openxmlformats.org/drawingml/2006/main" noChangeAspect="1"/>
+            </wp:cNvGraphicFramePr>
+            <a:graphic xmlns:a="http://schemas.openxmlformats.org/drawingml/2006/main">
+              <a:graphicData uri="http://schemas.openxmlformats.org/drawingml/2006/picture">
+                <pic:pic xmlns:pic="http://schemas.openxmlformats.org/drawingml/2006/picture">
+                  <pic:nvPicPr>
+                    <pic:cNvPr id="1" name=""/>
+                    <pic:cNvPicPr/>
+                  </pic:nvPicPr>
+                  <pic:blipFill>
+                    <a:blip r:embed="rId70"/>
+                    <a:stretch>
+                      <a:fillRect/>
+                    </a:stretch>
+                  </pic:blipFill>
+                  <pic:spPr>
+                    <a:xfrm>
+                      <a:off x="0" y="0"/>
+                      <a:ext cx="1469905" cy="700608"/>
+                    </a:xfrm>
+                    <a:prstGeom prst="rect">
+                      <a:avLst/>
+                    </a:prstGeom>
+                  </pic:spPr>
+                </pic:pic>
+              </a:graphicData>
+            </a:graphic>
+          </wp:inline>
+        </w:drawing>
+      </w:r>
+      <w:r>
+        <w:rPr>
+          <w:noProof/>
+        </w:rPr>
+        <w:drawing>
+          <wp:inline distT="0" distB="0" distL="0" distR="0" wp14:anchorId="416BE47A" wp14:editId="33368E90">
+            <wp:extent cx="2419350" cy="711574"/>
+            <wp:effectExtent l="0" t="0" r="0" b="0"/>
+            <wp:docPr id="72" name="Imagem 72"/>
+            <wp:cNvGraphicFramePr>
+              <a:graphicFrameLocks xmlns:a="http://schemas.openxmlformats.org/drawingml/2006/main" noChangeAspect="1"/>
+            </wp:cNvGraphicFramePr>
+            <a:graphic xmlns:a="http://schemas.openxmlformats.org/drawingml/2006/main">
+              <a:graphicData uri="http://schemas.openxmlformats.org/drawingml/2006/picture">
+                <pic:pic xmlns:pic="http://schemas.openxmlformats.org/drawingml/2006/picture">
+                  <pic:nvPicPr>
+                    <pic:cNvPr id="1" name=""/>
+                    <pic:cNvPicPr/>
+                  </pic:nvPicPr>
+                  <pic:blipFill>
+                    <a:blip r:embed="rId71"/>
+                    <a:stretch>
+                      <a:fillRect/>
+                    </a:stretch>
+                  </pic:blipFill>
+                  <pic:spPr>
+                    <a:xfrm>
+                      <a:off x="0" y="0"/>
+                      <a:ext cx="2538977" cy="746758"/>
+                    </a:xfrm>
+                    <a:prstGeom prst="rect">
+                      <a:avLst/>
+                    </a:prstGeom>
+                  </pic:spPr>
+                </pic:pic>
+              </a:graphicData>
+            </a:graphic>
+          </wp:inline>
+        </w:drawing>
+      </w:r>
+      <w:r>
+        <w:rPr>
+          <w:noProof/>
+        </w:rPr>
+        <w:drawing>
+          <wp:inline distT="0" distB="0" distL="0" distR="0" wp14:anchorId="1FA16CEB" wp14:editId="4B695F40">
+            <wp:extent cx="8885714" cy="438095"/>
+            <wp:effectExtent l="0" t="0" r="0" b="635"/>
+            <wp:docPr id="73" name="Imagem 73"/>
+            <wp:cNvGraphicFramePr>
+              <a:graphicFrameLocks xmlns:a="http://schemas.openxmlformats.org/drawingml/2006/main" noChangeAspect="1"/>
+            </wp:cNvGraphicFramePr>
+            <a:graphic xmlns:a="http://schemas.openxmlformats.org/drawingml/2006/main">
+              <a:graphicData uri="http://schemas.openxmlformats.org/drawingml/2006/picture">
+                <pic:pic xmlns:pic="http://schemas.openxmlformats.org/drawingml/2006/picture">
+                  <pic:nvPicPr>
+                    <pic:cNvPr id="1" name=""/>
+                    <pic:cNvPicPr/>
+                  </pic:nvPicPr>
+                  <pic:blipFill>
+                    <a:blip r:embed="rId72"/>
+                    <a:stretch>
+                      <a:fillRect/>
+                    </a:stretch>
+                  </pic:blipFill>
+                  <pic:spPr>
+                    <a:xfrm>
+                      <a:off x="0" y="0"/>
+                      <a:ext cx="8885714" cy="438095"/>
+                    </a:xfrm>
+                    <a:prstGeom prst="rect">
+                      <a:avLst/>
+                    </a:prstGeom>
+                  </pic:spPr>
+                </pic:pic>
+              </a:graphicData>
+            </a:graphic>
+          </wp:inline>
+        </w:drawing>
+      </w:r>
+    </w:p>
+    <w:p>
+      <w:pPr>
+        <w:tabs>
+          <w:tab w:val="left" w:pos="1200"/>
+        </w:tabs>
+        <w:rPr>
+          <w:noProof/>
+        </w:rPr>
+      </w:pPr>
+      <w:r>
+        <w:rPr>
+          <w:noProof/>
+        </w:rPr>
+        <w:t xml:space="preserve">52- </w:t>
+      </w:r>
+      <w:r>
+        <w:rPr>
+          <w:noProof/>
+        </w:rPr>
+        <w:t>Trocamos os tipos de inputs de text para os seus respectivos com por exemplo email, tel para telefone.</w:t>
+      </w:r>
+    </w:p>
+    <w:p>
+      <w:pPr>
+        <w:tabs>
+          <w:tab w:val="left" w:pos="1200"/>
+        </w:tabs>
+        <w:rPr>
+          <w:noProof/>
+        </w:rPr>
+      </w:pPr>
+      <w:r>
+        <w:rPr>
+          <w:noProof/>
+        </w:rPr>
+        <w:drawing>
+          <wp:inline distT="0" distB="0" distL="0" distR="0" wp14:anchorId="7FCBE914" wp14:editId="09DE9639">
+            <wp:extent cx="4134427" cy="1505160"/>
+            <wp:effectExtent l="0" t="0" r="0" b="0"/>
+            <wp:docPr id="74" name="Imagem 74"/>
+            <wp:cNvGraphicFramePr>
+              <a:graphicFrameLocks xmlns:a="http://schemas.openxmlformats.org/drawingml/2006/main" noChangeAspect="1"/>
+            </wp:cNvGraphicFramePr>
+            <a:graphic xmlns:a="http://schemas.openxmlformats.org/drawingml/2006/main">
+              <a:graphicData uri="http://schemas.openxmlformats.org/drawingml/2006/picture">
+                <pic:pic xmlns:pic="http://schemas.openxmlformats.org/drawingml/2006/picture">
+                  <pic:nvPicPr>
+                    <pic:cNvPr id="1" name=""/>
+                    <pic:cNvPicPr/>
+                  </pic:nvPicPr>
+                  <pic:blipFill>
+                    <a:blip r:embed="rId73"/>
+                    <a:stretch>
+                      <a:fillRect/>
+                    </a:stretch>
+                  </pic:blipFill>
+                  <pic:spPr>
+                    <a:xfrm>
+                      <a:off x="0" y="0"/>
+                      <a:ext cx="4134427" cy="1505160"/>
+                    </a:xfrm>
+                    <a:prstGeom prst="rect">
+                      <a:avLst/>
+                    </a:prstGeom>
+                  </pic:spPr>
+                </pic:pic>
+              </a:graphicData>
+            </a:graphic>
+          </wp:inline>
+        </w:drawing>
+      </w:r>
+    </w:p>
+    <w:p>
+      <w:pPr>
+        <w:tabs>
+          <w:tab w:val="left" w:pos="1200"/>
+        </w:tabs>
+        <w:rPr>
+          <w:noProof/>
+        </w:rPr>
+      </w:pPr>
+      <w:r>
+        <w:rPr>
+          <w:noProof/>
+        </w:rPr>
+        <w:t xml:space="preserve">53- </w:t>
+      </w:r>
+      <w:r>
+        <w:rPr>
+          <w:noProof/>
+        </w:rPr>
+        <w:t>Par deixar os capos de forma obrigatoria inserimos o código required conforme o código.</w:t>
+      </w:r>
+      <w:r>
+        <w:rPr>
+          <w:noProof/>
+        </w:rPr>
+        <w:t xml:space="preserve"> </w:t>
+      </w:r>
+    </w:p>
+    <w:p>
+      <w:pPr>
+        <w:tabs>
+          <w:tab w:val="left" w:pos="1200"/>
+        </w:tabs>
+        <w:rPr>
+          <w:noProof/>
+        </w:rPr>
+      </w:pPr>
+      <w:r>
+        <w:rPr>
+          <w:noProof/>
+        </w:rPr>
+        <w:drawing>
+          <wp:inline distT="0" distB="0" distL="0" distR="0" wp14:anchorId="15448ACB" wp14:editId="4A415B0F">
+            <wp:extent cx="4639322" cy="1543265"/>
+            <wp:effectExtent l="0" t="0" r="8890" b="0"/>
+            <wp:docPr id="75" name="Imagem 75"/>
+            <wp:cNvGraphicFramePr>
+              <a:graphicFrameLocks xmlns:a="http://schemas.openxmlformats.org/drawingml/2006/main" noChangeAspect="1"/>
+            </wp:cNvGraphicFramePr>
+            <a:graphic xmlns:a="http://schemas.openxmlformats.org/drawingml/2006/main">
+              <a:graphicData uri="http://schemas.openxmlformats.org/drawingml/2006/picture">
+                <pic:pic xmlns:pic="http://schemas.openxmlformats.org/drawingml/2006/picture">
+                  <pic:nvPicPr>
+                    <pic:cNvPr id="1" name=""/>
+                    <pic:cNvPicPr/>
+                  </pic:nvPicPr>
+                  <pic:blipFill>
+                    <a:blip r:embed="rId74"/>
+                    <a:stretch>
+                      <a:fillRect/>
+                    </a:stretch>
+                  </pic:blipFill>
+                  <pic:spPr>
+                    <a:xfrm>
+                      <a:off x="0" y="0"/>
+                      <a:ext cx="4639322" cy="1543265"/>
+                    </a:xfrm>
+                    <a:prstGeom prst="rect">
+                      <a:avLst/>
+                    </a:prstGeom>
+                  </pic:spPr>
+                </pic:pic>
+              </a:graphicData>
+            </a:graphic>
+          </wp:inline>
+        </w:drawing>
+      </w:r>
+    </w:p>
+    <w:p>
+      <w:pPr>
+        <w:tabs>
+          <w:tab w:val="left" w:pos="1200"/>
+        </w:tabs>
+        <w:rPr>
+          <w:noProof/>
+        </w:rPr>
+      </w:pPr>
+      <w:r>
+        <w:rPr>
+          <w:noProof/>
+        </w:rPr>
+        <w:t>54- Adicionamos o placeholder  para dar um exemplo de como deve ser preenchido o campo</w:t>
+      </w:r>
+      <w:r>
+        <w:rPr>
+          <w:noProof/>
+        </w:rPr>
+        <w:t>.</w:t>
+      </w:r>
+    </w:p>
+    <w:p>
+      <w:pPr>
+        <w:tabs>
+          <w:tab w:val="left" w:pos="1200"/>
+        </w:tabs>
+        <w:rPr>
+          <w:noProof/>
+        </w:rPr>
+      </w:pPr>
+      <w:r>
+        <w:rPr>
+          <w:noProof/>
+        </w:rPr>
+        <w:drawing>
+          <wp:inline distT="0" distB="0" distL="0" distR="0" wp14:anchorId="37898BF8" wp14:editId="17D77C1E">
+            <wp:extent cx="6648450" cy="904977"/>
+            <wp:effectExtent l="0" t="0" r="0" b="9525"/>
+            <wp:docPr id="76" name="Imagem 76"/>
+            <wp:cNvGraphicFramePr>
+              <a:graphicFrameLocks xmlns:a="http://schemas.openxmlformats.org/drawingml/2006/main" noChangeAspect="1"/>
+            </wp:cNvGraphicFramePr>
+            <a:graphic xmlns:a="http://schemas.openxmlformats.org/drawingml/2006/main">
+              <a:graphicData uri="http://schemas.openxmlformats.org/drawingml/2006/picture">
+                <pic:pic xmlns:pic="http://schemas.openxmlformats.org/drawingml/2006/picture">
+                  <pic:nvPicPr>
+                    <pic:cNvPr id="1" name=""/>
+                    <pic:cNvPicPr/>
+                  </pic:nvPicPr>
+                  <pic:blipFill>
+                    <a:blip r:embed="rId75"/>
+                    <a:stretch>
+                      <a:fillRect/>
+                    </a:stretch>
+                  </pic:blipFill>
+                  <pic:spPr>
+                    <a:xfrm>
+                      <a:off x="0" y="0"/>
+                      <a:ext cx="6699705" cy="911954"/>
+                    </a:xfrm>
+                    <a:prstGeom prst="rect">
+                      <a:avLst/>
+                    </a:prstGeom>
+                  </pic:spPr>
+                </pic:pic>
+              </a:graphicData>
+            </a:graphic>
+          </wp:inline>
+        </w:drawing>
+      </w:r>
+      <w:r>
+        <w:rPr>
+          <w:noProof/>
+        </w:rPr>
+        <w:drawing>
+          <wp:inline distT="0" distB="0" distL="0" distR="0" wp14:anchorId="3A786754" wp14:editId="5EEB0AF9">
+            <wp:extent cx="3053699" cy="908714"/>
+            <wp:effectExtent l="0" t="0" r="0" b="5715"/>
+            <wp:docPr id="77" name="Imagem 77"/>
+            <wp:cNvGraphicFramePr>
+              <a:graphicFrameLocks xmlns:a="http://schemas.openxmlformats.org/drawingml/2006/main" noChangeAspect="1"/>
+            </wp:cNvGraphicFramePr>
+            <a:graphic xmlns:a="http://schemas.openxmlformats.org/drawingml/2006/main">
+              <a:graphicData uri="http://schemas.openxmlformats.org/drawingml/2006/picture">
+                <pic:pic xmlns:pic="http://schemas.openxmlformats.org/drawingml/2006/picture">
+                  <pic:nvPicPr>
+                    <pic:cNvPr id="1" name=""/>
+                    <pic:cNvPicPr/>
+                  </pic:nvPicPr>
+                  <pic:blipFill>
+                    <a:blip r:embed="rId76"/>
+                    <a:stretch>
+                      <a:fillRect/>
+                    </a:stretch>
+                  </pic:blipFill>
+                  <pic:spPr>
+                    <a:xfrm>
+                      <a:off x="0" y="0"/>
+                      <a:ext cx="3255753" cy="968841"/>
+                    </a:xfrm>
+                    <a:prstGeom prst="rect">
+                      <a:avLst/>
+                    </a:prstGeom>
+                  </pic:spPr>
+                </pic:pic>
+              </a:graphicData>
+            </a:graphic>
+          </wp:inline>
+        </w:drawing>
+      </w:r>
+    </w:p>
+    <w:p>
+      <w:pPr>
+        <w:tabs>
+          <w:tab w:val="left" w:pos="1200"/>
+        </w:tabs>
+        <w:rPr>
+          <w:noProof/>
+        </w:rPr>
+      </w:pPr>
+      <w:r>
+        <w:rPr>
+          <w:noProof/>
+        </w:rPr>
+        <w:t>55-</w:t>
+      </w:r>
       <w:bookmarkStart w:id="0" w:name="_GoBack"/>
       <w:bookmarkEnd w:id="0"/>
-    </w:p>
-    <w:p>
-      <w:pPr>
-        <w:tabs>
-          <w:tab w:val="left" w:pos="1200"/>
-        </w:tabs>
-        <w:rPr>
-          <w:noProof/>
-        </w:rPr>
-      </w:pPr>
-      <w:r>
-        <w:rPr>
-          <w:noProof/>
-        </w:rPr>
-        <w:t xml:space="preserve">  </w:t>
-      </w:r>
     </w:p>
     <w:sectPr>
       <w:pgSz w:w="11906" w:h="16838"/>
@@ -7457,7 +8147,7 @@
 </file>
 
 <file path=customXml/itemProps1.xml><?xml version="1.0" encoding="utf-8"?>
-<ds:datastoreItem xmlns:ds="http://schemas.openxmlformats.org/officeDocument/2006/customXml" ds:itemID="{7C704E12-362E-4F94-B28D-DCDD4E08ACED}">
+<ds:datastoreItem xmlns:ds="http://schemas.openxmlformats.org/officeDocument/2006/customXml" ds:itemID="{658A618E-802D-4073-9653-FFA12DBE6ED4}">
   <ds:schemaRefs>
     <ds:schemaRef ds:uri="http://schemas.openxmlformats.org/officeDocument/2006/bibliography"/>
   </ds:schemaRefs>

</xml_diff>

<commit_message>
atualização do site do dia 02/10/26
</commit_message>
<xml_diff>
--- a/Apostila/Apostila Space for Men.docx
+++ b/Apostila/Apostila Space for Men.docx
@@ -485,6 +485,7 @@
     <w:p/>
     <w:p/>
     <w:p/>
+    <w:p/>
     <w:p>
       <w:r>
         <w:rPr>
@@ -3502,6 +3503,9 @@
         <w:tabs>
           <w:tab w:val="left" w:pos="1200"/>
         </w:tabs>
+        <w:rPr>
+          <w:noProof/>
+        </w:rPr>
       </w:pPr>
       <w:r>
         <w:rPr>
@@ -3543,6 +3547,13 @@
           </wp:inline>
         </w:drawing>
       </w:r>
+    </w:p>
+    <w:p>
+      <w:pPr>
+        <w:tabs>
+          <w:tab w:val="left" w:pos="1200"/>
+        </w:tabs>
+      </w:pPr>
       <w:r>
         <w:rPr>
           <w:noProof/>
@@ -5184,10 +5195,10 @@
           <w:noProof/>
         </w:rPr>
         <w:drawing>
-          <wp:inline distT="0" distB="0" distL="0" distR="0" wp14:anchorId="6B851B60" wp14:editId="568E2465">
-            <wp:extent cx="3724275" cy="465535"/>
-            <wp:effectExtent l="0" t="0" r="0" b="0"/>
-            <wp:docPr id="61" name="Imagem 61"/>
+          <wp:inline distT="0" distB="0" distL="0" distR="0" wp14:anchorId="25208025" wp14:editId="6AE0CD60">
+            <wp:extent cx="2472055" cy="1057182"/>
+            <wp:effectExtent l="0" t="0" r="4445" b="0"/>
+            <wp:docPr id="62" name="Imagem 62"/>
             <wp:cNvGraphicFramePr>
               <a:graphicFrameLocks xmlns:a="http://schemas.openxmlformats.org/drawingml/2006/main" noChangeAspect="1"/>
             </wp:cNvGraphicFramePr>
@@ -5207,7 +5218,7 @@
                   <pic:spPr>
                     <a:xfrm>
                       <a:off x="0" y="0"/>
-                      <a:ext cx="3927550" cy="490944"/>
+                      <a:ext cx="2652757" cy="1134460"/>
                     </a:xfrm>
                     <a:prstGeom prst="rect">
                       <a:avLst/>
@@ -5219,15 +5230,25 @@
           </wp:inline>
         </w:drawing>
       </w:r>
+    </w:p>
+    <w:p>
+      <w:pPr>
+        <w:tabs>
+          <w:tab w:val="left" w:pos="1200"/>
+        </w:tabs>
+        <w:rPr>
+          <w:noProof/>
+        </w:rPr>
+      </w:pPr>
       <w:r>
         <w:rPr>
           <w:noProof/>
         </w:rPr>
         <w:drawing>
-          <wp:inline distT="0" distB="0" distL="0" distR="0" wp14:anchorId="351A8708" wp14:editId="052350B8">
-            <wp:extent cx="2472055" cy="1057182"/>
-            <wp:effectExtent l="0" t="0" r="4445" b="0"/>
-            <wp:docPr id="62" name="Imagem 62"/>
+          <wp:inline distT="0" distB="0" distL="0" distR="0" wp14:anchorId="6B851B60" wp14:editId="568E2465">
+            <wp:extent cx="3724275" cy="465535"/>
+            <wp:effectExtent l="0" t="0" r="0" b="0"/>
+            <wp:docPr id="61" name="Imagem 61"/>
             <wp:cNvGraphicFramePr>
               <a:graphicFrameLocks xmlns:a="http://schemas.openxmlformats.org/drawingml/2006/main" noChangeAspect="1"/>
             </wp:cNvGraphicFramePr>
@@ -5247,7 +5268,7 @@
                   <pic:spPr>
                     <a:xfrm>
                       <a:off x="0" y="0"/>
-                      <a:ext cx="2652757" cy="1134460"/>
+                      <a:ext cx="3927550" cy="490944"/>
                     </a:xfrm>
                     <a:prstGeom prst="rect">
                       <a:avLst/>
@@ -6542,8 +6563,8 @@
         </w:rPr>
         <w:drawing>
           <wp:inline distT="0" distB="0" distL="0" distR="0" wp14:anchorId="31BD9559" wp14:editId="4DE66894">
-            <wp:extent cx="4486275" cy="1516268"/>
-            <wp:effectExtent l="0" t="0" r="0" b="8255"/>
+            <wp:extent cx="4621881" cy="1562100"/>
+            <wp:effectExtent l="0" t="0" r="7620" b="0"/>
             <wp:docPr id="84" name="Imagem 84"/>
             <wp:cNvGraphicFramePr>
               <a:graphicFrameLocks xmlns:a="http://schemas.openxmlformats.org/drawingml/2006/main" noChangeAspect="1"/>
@@ -6564,7 +6585,7 @@
                   <pic:spPr>
                     <a:xfrm>
                       <a:off x="0" y="0"/>
-                      <a:ext cx="4513227" cy="1525377"/>
+                      <a:ext cx="4651604" cy="1572146"/>
                     </a:xfrm>
                     <a:prstGeom prst="rect">
                       <a:avLst/>
@@ -7160,6 +7181,1027 @@
           <w:noProof/>
         </w:rPr>
       </w:pPr>
+      <w:r>
+        <w:rPr>
+          <w:noProof/>
+        </w:rPr>
+        <w:drawing>
+          <wp:inline distT="0" distB="0" distL="0" distR="0" wp14:anchorId="4211B084" wp14:editId="0C884CE1">
+            <wp:extent cx="1486107" cy="743054"/>
+            <wp:effectExtent l="0" t="0" r="0" b="0"/>
+            <wp:docPr id="78" name="Imagem 78"/>
+            <wp:cNvGraphicFramePr>
+              <a:graphicFrameLocks xmlns:a="http://schemas.openxmlformats.org/drawingml/2006/main" noChangeAspect="1"/>
+            </wp:cNvGraphicFramePr>
+            <a:graphic xmlns:a="http://schemas.openxmlformats.org/drawingml/2006/main">
+              <a:graphicData uri="http://schemas.openxmlformats.org/drawingml/2006/picture">
+                <pic:pic xmlns:pic="http://schemas.openxmlformats.org/drawingml/2006/picture">
+                  <pic:nvPicPr>
+                    <pic:cNvPr id="1" name=""/>
+                    <pic:cNvPicPr/>
+                  </pic:nvPicPr>
+                  <pic:blipFill>
+                    <a:blip r:embed="rId88"/>
+                    <a:stretch>
+                      <a:fillRect/>
+                    </a:stretch>
+                  </pic:blipFill>
+                  <pic:spPr>
+                    <a:xfrm>
+                      <a:off x="0" y="0"/>
+                      <a:ext cx="1486107" cy="743054"/>
+                    </a:xfrm>
+                    <a:prstGeom prst="rect">
+                      <a:avLst/>
+                    </a:prstGeom>
+                  </pic:spPr>
+                </pic:pic>
+              </a:graphicData>
+            </a:graphic>
+          </wp:inline>
+        </w:drawing>
+      </w:r>
+    </w:p>
+    <w:p>
+      <w:pPr>
+        <w:tabs>
+          <w:tab w:val="left" w:pos="1200"/>
+        </w:tabs>
+        <w:rPr>
+          <w:noProof/>
+        </w:rPr>
+      </w:pPr>
+      <w:r>
+        <w:rPr>
+          <w:noProof/>
+        </w:rPr>
+        <w:t>66- Na página do index.html trocamos as divs por section entendendo que as divs que foram trocados pelas sections tinha as  divisões falando do mesmo assunto por tal motivo utilizamos as sections ou seja (quando temos em nosso site uma divisão que fala sobre o mesmo assunto utilizamos o section ao invés de div.)</w:t>
+      </w:r>
+    </w:p>
+    <w:p>
+      <w:pPr>
+        <w:tabs>
+          <w:tab w:val="left" w:pos="1200"/>
+        </w:tabs>
+        <w:rPr>
+          <w:noProof/>
+        </w:rPr>
+      </w:pPr>
+      <w:r>
+        <w:rPr>
+          <w:noProof/>
+        </w:rPr>
+        <w:drawing>
+          <wp:inline distT="0" distB="0" distL="0" distR="0" wp14:anchorId="57800AB7" wp14:editId="5EE4AEEF">
+            <wp:extent cx="8306959" cy="2162477"/>
+            <wp:effectExtent l="0" t="0" r="0" b="9525"/>
+            <wp:docPr id="87" name="Imagem 87"/>
+            <wp:cNvGraphicFramePr>
+              <a:graphicFrameLocks xmlns:a="http://schemas.openxmlformats.org/drawingml/2006/main" noChangeAspect="1"/>
+            </wp:cNvGraphicFramePr>
+            <a:graphic xmlns:a="http://schemas.openxmlformats.org/drawingml/2006/main">
+              <a:graphicData uri="http://schemas.openxmlformats.org/drawingml/2006/picture">
+                <pic:pic xmlns:pic="http://schemas.openxmlformats.org/drawingml/2006/picture">
+                  <pic:nvPicPr>
+                    <pic:cNvPr id="1" name=""/>
+                    <pic:cNvPicPr/>
+                  </pic:nvPicPr>
+                  <pic:blipFill>
+                    <a:blip r:embed="rId89"/>
+                    <a:stretch>
+                      <a:fillRect/>
+                    </a:stretch>
+                  </pic:blipFill>
+                  <pic:spPr>
+                    <a:xfrm>
+                      <a:off x="0" y="0"/>
+                      <a:ext cx="8306959" cy="2162477"/>
+                    </a:xfrm>
+                    <a:prstGeom prst="rect">
+                      <a:avLst/>
+                    </a:prstGeom>
+                  </pic:spPr>
+                </pic:pic>
+              </a:graphicData>
+            </a:graphic>
+          </wp:inline>
+        </w:drawing>
+      </w:r>
+    </w:p>
+    <w:p>
+      <w:pPr>
+        <w:tabs>
+          <w:tab w:val="left" w:pos="1200"/>
+        </w:tabs>
+        <w:rPr>
+          <w:noProof/>
+        </w:rPr>
+      </w:pPr>
+      <w:r>
+        <w:rPr>
+          <w:noProof/>
+        </w:rPr>
+        <w:t xml:space="preserve">67- </w:t>
+      </w:r>
+      <w:r>
+        <w:rPr>
+          <w:noProof/>
+        </w:rPr>
+        <w:t>No subtitulo</w:t>
+      </w:r>
+      <w:r>
+        <w:rPr>
+          <w:noProof/>
+        </w:rPr>
+        <w:t xml:space="preserve"> h2 e h3 adicionamos uma class chamada titulo-principal e realizamos as seguintes configurações:</w:t>
+      </w:r>
+    </w:p>
+    <w:p>
+      <w:pPr>
+        <w:pStyle w:val="PargrafodaLista"/>
+        <w:numPr>
+          <w:ilvl w:val="0"/>
+          <w:numId w:val="15"/>
+        </w:numPr>
+        <w:tabs>
+          <w:tab w:val="left" w:pos="1200"/>
+        </w:tabs>
+        <w:rPr>
+          <w:noProof/>
+        </w:rPr>
+      </w:pPr>
+      <w:r>
+        <w:rPr>
+          <w:noProof/>
+        </w:rPr>
+        <w:t>Centralizamos os subtitulos</w:t>
+      </w:r>
+    </w:p>
+    <w:p>
+      <w:pPr>
+        <w:pStyle w:val="PargrafodaLista"/>
+        <w:numPr>
+          <w:ilvl w:val="0"/>
+          <w:numId w:val="15"/>
+        </w:numPr>
+        <w:tabs>
+          <w:tab w:val="left" w:pos="1200"/>
+        </w:tabs>
+        <w:rPr>
+          <w:noProof/>
+        </w:rPr>
+      </w:pPr>
+      <w:r>
+        <w:rPr>
+          <w:noProof/>
+        </w:rPr>
+        <w:t>Aumentamos a fonte utilizando a medida de (em que temos por referencia  que 1em e igual a 16px medida padrão do navegador então 2 em é igual a 32px</w:t>
+      </w:r>
+    </w:p>
+    <w:p>
+      <w:pPr>
+        <w:pStyle w:val="PargrafodaLista"/>
+        <w:numPr>
+          <w:ilvl w:val="0"/>
+          <w:numId w:val="15"/>
+        </w:numPr>
+        <w:tabs>
+          <w:tab w:val="left" w:pos="1200"/>
+        </w:tabs>
+        <w:rPr>
+          <w:noProof/>
+        </w:rPr>
+      </w:pPr>
+      <w:r>
+        <w:rPr>
+          <w:noProof/>
+        </w:rPr>
+        <w:t>E adicionamos umk espaço externo para baixo</w:t>
+      </w:r>
+    </w:p>
+    <w:p>
+      <w:pPr>
+        <w:tabs>
+          <w:tab w:val="left" w:pos="1200"/>
+        </w:tabs>
+        <w:rPr>
+          <w:noProof/>
+        </w:rPr>
+      </w:pPr>
+      <w:r>
+        <w:rPr>
+          <w:noProof/>
+        </w:rPr>
+        <w:drawing>
+          <wp:inline distT="0" distB="0" distL="0" distR="0" wp14:anchorId="7A603DB4" wp14:editId="3ABB0AA5">
+            <wp:extent cx="1762371" cy="885949"/>
+            <wp:effectExtent l="0" t="0" r="0" b="9525"/>
+            <wp:docPr id="88" name="Imagem 88"/>
+            <wp:cNvGraphicFramePr>
+              <a:graphicFrameLocks xmlns:a="http://schemas.openxmlformats.org/drawingml/2006/main" noChangeAspect="1"/>
+            </wp:cNvGraphicFramePr>
+            <a:graphic xmlns:a="http://schemas.openxmlformats.org/drawingml/2006/main">
+              <a:graphicData uri="http://schemas.openxmlformats.org/drawingml/2006/picture">
+                <pic:pic xmlns:pic="http://schemas.openxmlformats.org/drawingml/2006/picture">
+                  <pic:nvPicPr>
+                    <pic:cNvPr id="1" name=""/>
+                    <pic:cNvPicPr/>
+                  </pic:nvPicPr>
+                  <pic:blipFill>
+                    <a:blip r:embed="rId90"/>
+                    <a:stretch>
+                      <a:fillRect/>
+                    </a:stretch>
+                  </pic:blipFill>
+                  <pic:spPr>
+                    <a:xfrm>
+                      <a:off x="0" y="0"/>
+                      <a:ext cx="1762371" cy="885949"/>
+                    </a:xfrm>
+                    <a:prstGeom prst="rect">
+                      <a:avLst/>
+                    </a:prstGeom>
+                  </pic:spPr>
+                </pic:pic>
+              </a:graphicData>
+            </a:graphic>
+          </wp:inline>
+        </w:drawing>
+      </w:r>
+    </w:p>
+    <w:p>
+      <w:pPr>
+        <w:tabs>
+          <w:tab w:val="left" w:pos="1200"/>
+        </w:tabs>
+        <w:rPr>
+          <w:noProof/>
+        </w:rPr>
+      </w:pPr>
+      <w:r>
+        <w:rPr>
+          <w:noProof/>
+        </w:rPr>
+        <w:drawing>
+          <wp:inline distT="0" distB="0" distL="0" distR="0" wp14:anchorId="3B5F0EF5" wp14:editId="76B03550">
+            <wp:extent cx="2200582" cy="123842"/>
+            <wp:effectExtent l="0" t="0" r="9525" b="9525"/>
+            <wp:docPr id="89" name="Imagem 89"/>
+            <wp:cNvGraphicFramePr>
+              <a:graphicFrameLocks xmlns:a="http://schemas.openxmlformats.org/drawingml/2006/main" noChangeAspect="1"/>
+            </wp:cNvGraphicFramePr>
+            <a:graphic xmlns:a="http://schemas.openxmlformats.org/drawingml/2006/main">
+              <a:graphicData uri="http://schemas.openxmlformats.org/drawingml/2006/picture">
+                <pic:pic xmlns:pic="http://schemas.openxmlformats.org/drawingml/2006/picture">
+                  <pic:nvPicPr>
+                    <pic:cNvPr id="1" name=""/>
+                    <pic:cNvPicPr/>
+                  </pic:nvPicPr>
+                  <pic:blipFill>
+                    <a:blip r:embed="rId91"/>
+                    <a:stretch>
+                      <a:fillRect/>
+                    </a:stretch>
+                  </pic:blipFill>
+                  <pic:spPr>
+                    <a:xfrm>
+                      <a:off x="0" y="0"/>
+                      <a:ext cx="2200582" cy="123842"/>
+                    </a:xfrm>
+                    <a:prstGeom prst="rect">
+                      <a:avLst/>
+                    </a:prstGeom>
+                  </pic:spPr>
+                </pic:pic>
+              </a:graphicData>
+            </a:graphic>
+          </wp:inline>
+        </w:drawing>
+      </w:r>
+    </w:p>
+    <w:p>
+      <w:pPr>
+        <w:tabs>
+          <w:tab w:val="left" w:pos="1200"/>
+        </w:tabs>
+        <w:rPr>
+          <w:noProof/>
+        </w:rPr>
+      </w:pPr>
+      <w:r>
+        <w:rPr>
+          <w:noProof/>
+        </w:rPr>
+        <w:drawing>
+          <wp:inline distT="0" distB="0" distL="0" distR="0" wp14:anchorId="141ABD90" wp14:editId="540B8A3B">
+            <wp:extent cx="2105025" cy="183046"/>
+            <wp:effectExtent l="0" t="0" r="0" b="7620"/>
+            <wp:docPr id="91" name="Imagem 91"/>
+            <wp:cNvGraphicFramePr>
+              <a:graphicFrameLocks xmlns:a="http://schemas.openxmlformats.org/drawingml/2006/main" noChangeAspect="1"/>
+            </wp:cNvGraphicFramePr>
+            <a:graphic xmlns:a="http://schemas.openxmlformats.org/drawingml/2006/main">
+              <a:graphicData uri="http://schemas.openxmlformats.org/drawingml/2006/picture">
+                <pic:pic xmlns:pic="http://schemas.openxmlformats.org/drawingml/2006/picture">
+                  <pic:nvPicPr>
+                    <pic:cNvPr id="1" name=""/>
+                    <pic:cNvPicPr/>
+                  </pic:nvPicPr>
+                  <pic:blipFill>
+                    <a:blip r:embed="rId92"/>
+                    <a:stretch>
+                      <a:fillRect/>
+                    </a:stretch>
+                  </pic:blipFill>
+                  <pic:spPr>
+                    <a:xfrm>
+                      <a:off x="0" y="0"/>
+                      <a:ext cx="2125456" cy="184823"/>
+                    </a:xfrm>
+                    <a:prstGeom prst="rect">
+                      <a:avLst/>
+                    </a:prstGeom>
+                  </pic:spPr>
+                </pic:pic>
+              </a:graphicData>
+            </a:graphic>
+          </wp:inline>
+        </w:drawing>
+      </w:r>
+    </w:p>
+    <w:p>
+      <w:pPr>
+        <w:tabs>
+          <w:tab w:val="left" w:pos="1200"/>
+        </w:tabs>
+        <w:rPr>
+          <w:noProof/>
+        </w:rPr>
+      </w:pPr>
+      <w:r>
+        <w:rPr>
+          <w:noProof/>
+        </w:rPr>
+        <w:t>68- Na section principal onde tem os parágrafos demos um espaço para baixo conforme o código.</w:t>
+      </w:r>
+    </w:p>
+    <w:p>
+      <w:pPr>
+        <w:tabs>
+          <w:tab w:val="left" w:pos="1200"/>
+        </w:tabs>
+        <w:rPr>
+          <w:noProof/>
+        </w:rPr>
+      </w:pPr>
+      <w:r>
+        <w:rPr>
+          <w:noProof/>
+        </w:rPr>
+        <w:drawing>
+          <wp:inline distT="0" distB="0" distL="0" distR="0" wp14:anchorId="232BDCA4" wp14:editId="3C014A3A">
+            <wp:extent cx="1495634" cy="590632"/>
+            <wp:effectExtent l="0" t="0" r="9525" b="0"/>
+            <wp:docPr id="92" name="Imagem 92"/>
+            <wp:cNvGraphicFramePr>
+              <a:graphicFrameLocks xmlns:a="http://schemas.openxmlformats.org/drawingml/2006/main" noChangeAspect="1"/>
+            </wp:cNvGraphicFramePr>
+            <a:graphic xmlns:a="http://schemas.openxmlformats.org/drawingml/2006/main">
+              <a:graphicData uri="http://schemas.openxmlformats.org/drawingml/2006/picture">
+                <pic:pic xmlns:pic="http://schemas.openxmlformats.org/drawingml/2006/picture">
+                  <pic:nvPicPr>
+                    <pic:cNvPr id="1" name=""/>
+                    <pic:cNvPicPr/>
+                  </pic:nvPicPr>
+                  <pic:blipFill>
+                    <a:blip r:embed="rId93"/>
+                    <a:stretch>
+                      <a:fillRect/>
+                    </a:stretch>
+                  </pic:blipFill>
+                  <pic:spPr>
+                    <a:xfrm>
+                      <a:off x="0" y="0"/>
+                      <a:ext cx="1495634" cy="590632"/>
+                    </a:xfrm>
+                    <a:prstGeom prst="rect">
+                      <a:avLst/>
+                    </a:prstGeom>
+                  </pic:spPr>
+                </pic:pic>
+              </a:graphicData>
+            </a:graphic>
+          </wp:inline>
+        </w:drawing>
+      </w:r>
+    </w:p>
+    <w:p>
+      <w:pPr>
+        <w:tabs>
+          <w:tab w:val="left" w:pos="1200"/>
+        </w:tabs>
+        <w:rPr>
+          <w:noProof/>
+        </w:rPr>
+      </w:pPr>
+      <w:r>
+        <w:rPr>
+          <w:noProof/>
+        </w:rPr>
+        <w:t xml:space="preserve">69- </w:t>
+      </w:r>
+      <w:r>
+        <w:rPr>
+          <w:noProof/>
+        </w:rPr>
+        <w:t>Diminuimos o tamanho da imagem para ocupar 60% do espaço de largura da nossa página.</w:t>
+      </w:r>
+    </w:p>
+    <w:p>
+      <w:pPr>
+        <w:tabs>
+          <w:tab w:val="left" w:pos="1200"/>
+        </w:tabs>
+        <w:rPr>
+          <w:noProof/>
+        </w:rPr>
+      </w:pPr>
+      <w:r>
+        <w:rPr>
+          <w:noProof/>
+        </w:rPr>
+        <w:drawing>
+          <wp:inline distT="0" distB="0" distL="0" distR="0" wp14:anchorId="22DEC562" wp14:editId="508EC01C">
+            <wp:extent cx="1686160" cy="552527"/>
+            <wp:effectExtent l="0" t="0" r="9525" b="0"/>
+            <wp:docPr id="93" name="Imagem 93"/>
+            <wp:cNvGraphicFramePr>
+              <a:graphicFrameLocks xmlns:a="http://schemas.openxmlformats.org/drawingml/2006/main" noChangeAspect="1"/>
+            </wp:cNvGraphicFramePr>
+            <a:graphic xmlns:a="http://schemas.openxmlformats.org/drawingml/2006/main">
+              <a:graphicData uri="http://schemas.openxmlformats.org/drawingml/2006/picture">
+                <pic:pic xmlns:pic="http://schemas.openxmlformats.org/drawingml/2006/picture">
+                  <pic:nvPicPr>
+                    <pic:cNvPr id="1" name=""/>
+                    <pic:cNvPicPr/>
+                  </pic:nvPicPr>
+                  <pic:blipFill>
+                    <a:blip r:embed="rId94"/>
+                    <a:stretch>
+                      <a:fillRect/>
+                    </a:stretch>
+                  </pic:blipFill>
+                  <pic:spPr>
+                    <a:xfrm>
+                      <a:off x="0" y="0"/>
+                      <a:ext cx="1686160" cy="552527"/>
+                    </a:xfrm>
+                    <a:prstGeom prst="rect">
+                      <a:avLst/>
+                    </a:prstGeom>
+                  </pic:spPr>
+                </pic:pic>
+              </a:graphicData>
+            </a:graphic>
+          </wp:inline>
+        </w:drawing>
+      </w:r>
+    </w:p>
+    <w:p>
+      <w:pPr>
+        <w:tabs>
+          <w:tab w:val="left" w:pos="1200"/>
+        </w:tabs>
+        <w:rPr>
+          <w:noProof/>
+        </w:rPr>
+      </w:pPr>
+      <w:r>
+        <w:rPr>
+          <w:noProof/>
+        </w:rPr>
+        <w:t>70- inserimos na página a imagem utensilios  adicionamos uma class para diminuir o tamanho dela.</w:t>
+      </w:r>
+    </w:p>
+    <w:p>
+      <w:pPr>
+        <w:tabs>
+          <w:tab w:val="left" w:pos="1200"/>
+        </w:tabs>
+        <w:rPr>
+          <w:noProof/>
+        </w:rPr>
+      </w:pPr>
+      <w:r>
+        <w:rPr>
+          <w:noProof/>
+        </w:rPr>
+        <w:drawing>
+          <wp:inline distT="0" distB="0" distL="0" distR="0" wp14:anchorId="68CE64E5" wp14:editId="436A30F2">
+            <wp:extent cx="5020376" cy="171474"/>
+            <wp:effectExtent l="0" t="0" r="0" b="0"/>
+            <wp:docPr id="94" name="Imagem 94"/>
+            <wp:cNvGraphicFramePr>
+              <a:graphicFrameLocks xmlns:a="http://schemas.openxmlformats.org/drawingml/2006/main" noChangeAspect="1"/>
+            </wp:cNvGraphicFramePr>
+            <a:graphic xmlns:a="http://schemas.openxmlformats.org/drawingml/2006/main">
+              <a:graphicData uri="http://schemas.openxmlformats.org/drawingml/2006/picture">
+                <pic:pic xmlns:pic="http://schemas.openxmlformats.org/drawingml/2006/picture">
+                  <pic:nvPicPr>
+                    <pic:cNvPr id="1" name=""/>
+                    <pic:cNvPicPr/>
+                  </pic:nvPicPr>
+                  <pic:blipFill>
+                    <a:blip r:embed="rId95"/>
+                    <a:stretch>
+                      <a:fillRect/>
+                    </a:stretch>
+                  </pic:blipFill>
+                  <pic:spPr>
+                    <a:xfrm>
+                      <a:off x="0" y="0"/>
+                      <a:ext cx="5020376" cy="171474"/>
+                    </a:xfrm>
+                    <a:prstGeom prst="rect">
+                      <a:avLst/>
+                    </a:prstGeom>
+                  </pic:spPr>
+                </pic:pic>
+              </a:graphicData>
+            </a:graphic>
+          </wp:inline>
+        </w:drawing>
+      </w:r>
+    </w:p>
+    <w:p>
+      <w:pPr>
+        <w:tabs>
+          <w:tab w:val="left" w:pos="1200"/>
+        </w:tabs>
+        <w:rPr>
+          <w:noProof/>
+        </w:rPr>
+      </w:pPr>
+      <w:r>
+        <w:rPr>
+          <w:noProof/>
+        </w:rPr>
+        <w:drawing>
+          <wp:inline distT="0" distB="0" distL="0" distR="0" wp14:anchorId="52602C30" wp14:editId="6D871A62">
+            <wp:extent cx="1352739" cy="571580"/>
+            <wp:effectExtent l="0" t="0" r="0" b="0"/>
+            <wp:docPr id="95" name="Imagem 95"/>
+            <wp:cNvGraphicFramePr>
+              <a:graphicFrameLocks xmlns:a="http://schemas.openxmlformats.org/drawingml/2006/main" noChangeAspect="1"/>
+            </wp:cNvGraphicFramePr>
+            <a:graphic xmlns:a="http://schemas.openxmlformats.org/drawingml/2006/main">
+              <a:graphicData uri="http://schemas.openxmlformats.org/drawingml/2006/picture">
+                <pic:pic xmlns:pic="http://schemas.openxmlformats.org/drawingml/2006/picture">
+                  <pic:nvPicPr>
+                    <pic:cNvPr id="1" name=""/>
+                    <pic:cNvPicPr/>
+                  </pic:nvPicPr>
+                  <pic:blipFill>
+                    <a:blip r:embed="rId96"/>
+                    <a:stretch>
+                      <a:fillRect/>
+                    </a:stretch>
+                  </pic:blipFill>
+                  <pic:spPr>
+                    <a:xfrm>
+                      <a:off x="0" y="0"/>
+                      <a:ext cx="1352739" cy="571580"/>
+                    </a:xfrm>
+                    <a:prstGeom prst="rect">
+                      <a:avLst/>
+                    </a:prstGeom>
+                  </pic:spPr>
+                </pic:pic>
+              </a:graphicData>
+            </a:graphic>
+          </wp:inline>
+        </w:drawing>
+      </w:r>
+    </w:p>
+    <w:p>
+      <w:pPr>
+        <w:tabs>
+          <w:tab w:val="left" w:pos="1200"/>
+        </w:tabs>
+        <w:rPr>
+          <w:noProof/>
+        </w:rPr>
+      </w:pPr>
+      <w:r>
+        <w:rPr>
+          <w:noProof/>
+        </w:rPr>
+        <w:t>71- Para colocar o texto ao lado da imagem utilizamos a técnica float: left que faz o seguinte:</w:t>
+      </w:r>
+    </w:p>
+    <w:p>
+      <w:pPr>
+        <w:pStyle w:val="PargrafodaLista"/>
+        <w:numPr>
+          <w:ilvl w:val="0"/>
+          <w:numId w:val="16"/>
+        </w:numPr>
+        <w:tabs>
+          <w:tab w:val="left" w:pos="1200"/>
+        </w:tabs>
+        <w:rPr>
+          <w:noProof/>
+        </w:rPr>
+      </w:pPr>
+      <w:r>
+        <w:rPr>
+          <w:noProof/>
+        </w:rPr>
+        <w:t>Como o nome indica a imagem flutua e o texto abaixo sobe para ficar ao lado</w:t>
+      </w:r>
+    </w:p>
+    <w:p>
+      <w:pPr>
+        <w:tabs>
+          <w:tab w:val="left" w:pos="1200"/>
+        </w:tabs>
+        <w:rPr>
+          <w:noProof/>
+        </w:rPr>
+      </w:pPr>
+      <w:r>
+        <w:rPr>
+          <w:noProof/>
+        </w:rPr>
+        <w:drawing>
+          <wp:inline distT="0" distB="0" distL="0" distR="0" wp14:anchorId="546EF03E" wp14:editId="7C66B55C">
+            <wp:extent cx="2314575" cy="1337311"/>
+            <wp:effectExtent l="0" t="0" r="0" b="0"/>
+            <wp:docPr id="90" name="Imagem 90"/>
+            <wp:cNvGraphicFramePr>
+              <a:graphicFrameLocks xmlns:a="http://schemas.openxmlformats.org/drawingml/2006/main" noChangeAspect="1"/>
+            </wp:cNvGraphicFramePr>
+            <a:graphic xmlns:a="http://schemas.openxmlformats.org/drawingml/2006/main">
+              <a:graphicData uri="http://schemas.openxmlformats.org/drawingml/2006/picture">
+                <pic:pic xmlns:pic="http://schemas.openxmlformats.org/drawingml/2006/picture">
+                  <pic:nvPicPr>
+                    <pic:cNvPr id="1" name=""/>
+                    <pic:cNvPicPr/>
+                  </pic:nvPicPr>
+                  <pic:blipFill>
+                    <a:blip r:embed="rId97"/>
+                    <a:stretch>
+                      <a:fillRect/>
+                    </a:stretch>
+                  </pic:blipFill>
+                  <pic:spPr>
+                    <a:xfrm>
+                      <a:off x="0" y="0"/>
+                      <a:ext cx="2337440" cy="1350522"/>
+                    </a:xfrm>
+                    <a:prstGeom prst="rect">
+                      <a:avLst/>
+                    </a:prstGeom>
+                  </pic:spPr>
+                </pic:pic>
+              </a:graphicData>
+            </a:graphic>
+          </wp:inline>
+        </w:drawing>
+      </w:r>
+      <w:r>
+        <w:rPr>
+          <w:noProof/>
+        </w:rPr>
+        <w:drawing>
+          <wp:inline distT="0" distB="0" distL="0" distR="0" wp14:anchorId="2D06098B" wp14:editId="586907FF">
+            <wp:extent cx="7407660" cy="1316399"/>
+            <wp:effectExtent l="0" t="0" r="3175" b="0"/>
+            <wp:docPr id="96" name="Imagem 96"/>
+            <wp:cNvGraphicFramePr>
+              <a:graphicFrameLocks xmlns:a="http://schemas.openxmlformats.org/drawingml/2006/main" noChangeAspect="1"/>
+            </wp:cNvGraphicFramePr>
+            <a:graphic xmlns:a="http://schemas.openxmlformats.org/drawingml/2006/main">
+              <a:graphicData uri="http://schemas.openxmlformats.org/drawingml/2006/picture">
+                <pic:pic xmlns:pic="http://schemas.openxmlformats.org/drawingml/2006/picture">
+                  <pic:nvPicPr>
+                    <pic:cNvPr id="1" name=""/>
+                    <pic:cNvPicPr/>
+                  </pic:nvPicPr>
+                  <pic:blipFill>
+                    <a:blip r:embed="rId98"/>
+                    <a:stretch>
+                      <a:fillRect/>
+                    </a:stretch>
+                  </pic:blipFill>
+                  <pic:spPr>
+                    <a:xfrm>
+                      <a:off x="0" y="0"/>
+                      <a:ext cx="7745306" cy="1376401"/>
+                    </a:xfrm>
+                    <a:prstGeom prst="rect">
+                      <a:avLst/>
+                    </a:prstGeom>
+                  </pic:spPr>
+                </pic:pic>
+              </a:graphicData>
+            </a:graphic>
+          </wp:inline>
+        </w:drawing>
+      </w:r>
+    </w:p>
+    <w:p>
+      <w:pPr>
+        <w:tabs>
+          <w:tab w:val="left" w:pos="1200"/>
+        </w:tabs>
+        <w:rPr>
+          <w:noProof/>
+        </w:rPr>
+      </w:pPr>
+      <w:r>
+        <w:rPr>
+          <w:noProof/>
+        </w:rPr>
+        <w:t>72- Utilizamos o clear: left para retornar a posição dos elementos abaixo da imagem que utilizamos o float: left ou seja quando utilizamos o float: left ele sobe todos os elementos abaixo para retornar utilizamos o clear: left.</w:t>
+      </w:r>
+    </w:p>
+    <w:p>
+      <w:pPr>
+        <w:tabs>
+          <w:tab w:val="left" w:pos="1200"/>
+        </w:tabs>
+        <w:rPr>
+          <w:noProof/>
+        </w:rPr>
+      </w:pPr>
+      <w:r>
+        <w:rPr>
+          <w:noProof/>
+        </w:rPr>
+        <w:drawing>
+          <wp:inline distT="0" distB="0" distL="0" distR="0" wp14:anchorId="39DC6500" wp14:editId="6D5C1C2D">
+            <wp:extent cx="1848108" cy="1209844"/>
+            <wp:effectExtent l="0" t="0" r="0" b="9525"/>
+            <wp:docPr id="97" name="Imagem 97"/>
+            <wp:cNvGraphicFramePr>
+              <a:graphicFrameLocks xmlns:a="http://schemas.openxmlformats.org/drawingml/2006/main" noChangeAspect="1"/>
+            </wp:cNvGraphicFramePr>
+            <a:graphic xmlns:a="http://schemas.openxmlformats.org/drawingml/2006/main">
+              <a:graphicData uri="http://schemas.openxmlformats.org/drawingml/2006/picture">
+                <pic:pic xmlns:pic="http://schemas.openxmlformats.org/drawingml/2006/picture">
+                  <pic:nvPicPr>
+                    <pic:cNvPr id="1" name=""/>
+                    <pic:cNvPicPr/>
+                  </pic:nvPicPr>
+                  <pic:blipFill>
+                    <a:blip r:embed="rId99"/>
+                    <a:stretch>
+                      <a:fillRect/>
+                    </a:stretch>
+                  </pic:blipFill>
+                  <pic:spPr>
+                    <a:xfrm>
+                      <a:off x="0" y="0"/>
+                      <a:ext cx="1848108" cy="1209844"/>
+                    </a:xfrm>
+                    <a:prstGeom prst="rect">
+                      <a:avLst/>
+                    </a:prstGeom>
+                  </pic:spPr>
+                </pic:pic>
+              </a:graphicData>
+            </a:graphic>
+          </wp:inline>
+        </w:drawing>
+      </w:r>
+    </w:p>
+    <w:p>
+      <w:pPr>
+        <w:tabs>
+          <w:tab w:val="left" w:pos="1200"/>
+        </w:tabs>
+        <w:rPr>
+          <w:noProof/>
+        </w:rPr>
+      </w:pPr>
+      <w:r>
+        <w:rPr>
+          <w:noProof/>
+        </w:rPr>
+        <w:t xml:space="preserve">73- </w:t>
+      </w:r>
+      <w:r>
+        <w:rPr>
+          <w:noProof/>
+        </w:rPr>
+        <w:t>Para trocar a font do site realizamos os seguintes passos:</w:t>
+      </w:r>
+    </w:p>
+    <w:p>
+      <w:pPr>
+        <w:pStyle w:val="PargrafodaLista"/>
+        <w:numPr>
+          <w:ilvl w:val="0"/>
+          <w:numId w:val="16"/>
+        </w:numPr>
+        <w:tabs>
+          <w:tab w:val="left" w:pos="1200"/>
+        </w:tabs>
+        <w:rPr>
+          <w:noProof/>
+        </w:rPr>
+      </w:pPr>
+      <w:r>
+        <w:rPr>
+          <w:noProof/>
+        </w:rPr>
+        <w:t>Entrar no site google fonts (</w:t>
+      </w:r>
+      <w:hyperlink r:id="rId100" w:history="1">
+        <w:r>
+          <w:rPr>
+            <w:rStyle w:val="Hyperlink"/>
+            <w:noProof/>
+          </w:rPr>
+          <w:t>https://fonts.google.com</w:t>
+        </w:r>
+      </w:hyperlink>
+      <w:r>
+        <w:rPr>
+          <w:noProof/>
+        </w:rPr>
+        <w:t>).</w:t>
+      </w:r>
+    </w:p>
+    <w:p>
+      <w:pPr>
+        <w:pStyle w:val="PargrafodaLista"/>
+        <w:numPr>
+          <w:ilvl w:val="0"/>
+          <w:numId w:val="16"/>
+        </w:numPr>
+        <w:tabs>
+          <w:tab w:val="left" w:pos="1200"/>
+        </w:tabs>
+        <w:rPr>
+          <w:noProof/>
+        </w:rPr>
+      </w:pPr>
+      <w:r>
+        <w:rPr>
+          <w:noProof/>
+        </w:rPr>
+        <w:t>Escolhe a font desejada para aplicar ao site.</w:t>
+      </w:r>
+    </w:p>
+    <w:p>
+      <w:pPr>
+        <w:pStyle w:val="PargrafodaLista"/>
+        <w:numPr>
+          <w:ilvl w:val="0"/>
+          <w:numId w:val="16"/>
+        </w:numPr>
+        <w:tabs>
+          <w:tab w:val="left" w:pos="1200"/>
+        </w:tabs>
+        <w:rPr>
+          <w:noProof/>
+        </w:rPr>
+      </w:pPr>
+      <w:r>
+        <w:rPr>
+          <w:noProof/>
+        </w:rPr>
+        <w:t>Clicar no botão get fonts para copiar o link que será colado no head do html.</w:t>
+      </w:r>
+    </w:p>
+    <w:p>
+      <w:pPr>
+        <w:pStyle w:val="PargrafodaLista"/>
+        <w:numPr>
+          <w:ilvl w:val="0"/>
+          <w:numId w:val="16"/>
+        </w:numPr>
+        <w:tabs>
+          <w:tab w:val="left" w:pos="1200"/>
+        </w:tabs>
+        <w:rPr>
+          <w:noProof/>
+        </w:rPr>
+      </w:pPr>
+      <w:r>
+        <w:rPr>
+          <w:noProof/>
+        </w:rPr>
+        <w:t>Depois copiamos o link que será colocado no Css.</w:t>
+      </w:r>
+    </w:p>
+    <w:p>
+      <w:pPr>
+        <w:tabs>
+          <w:tab w:val="left" w:pos="1200"/>
+        </w:tabs>
+        <w:rPr>
+          <w:noProof/>
+        </w:rPr>
+      </w:pPr>
+      <w:r>
+        <w:rPr>
+          <w:noProof/>
+        </w:rPr>
+        <w:drawing>
+          <wp:inline distT="0" distB="0" distL="0" distR="0" wp14:anchorId="3AB45D2E" wp14:editId="417E46C5">
+            <wp:extent cx="8087854" cy="1676634"/>
+            <wp:effectExtent l="0" t="0" r="8890" b="0"/>
+            <wp:docPr id="98" name="Imagem 98"/>
+            <wp:cNvGraphicFramePr>
+              <a:graphicFrameLocks xmlns:a="http://schemas.openxmlformats.org/drawingml/2006/main" noChangeAspect="1"/>
+            </wp:cNvGraphicFramePr>
+            <a:graphic xmlns:a="http://schemas.openxmlformats.org/drawingml/2006/main">
+              <a:graphicData uri="http://schemas.openxmlformats.org/drawingml/2006/picture">
+                <pic:pic xmlns:pic="http://schemas.openxmlformats.org/drawingml/2006/picture">
+                  <pic:nvPicPr>
+                    <pic:cNvPr id="1" name=""/>
+                    <pic:cNvPicPr/>
+                  </pic:nvPicPr>
+                  <pic:blipFill>
+                    <a:blip r:embed="rId101"/>
+                    <a:stretch>
+                      <a:fillRect/>
+                    </a:stretch>
+                  </pic:blipFill>
+                  <pic:spPr>
+                    <a:xfrm>
+                      <a:off x="0" y="0"/>
+                      <a:ext cx="8087854" cy="1676634"/>
+                    </a:xfrm>
+                    <a:prstGeom prst="rect">
+                      <a:avLst/>
+                    </a:prstGeom>
+                  </pic:spPr>
+                </pic:pic>
+              </a:graphicData>
+            </a:graphic>
+          </wp:inline>
+        </w:drawing>
+      </w:r>
+      <w:r>
+        <w:rPr>
+          <w:noProof/>
+        </w:rPr>
+        <w:drawing>
+          <wp:inline distT="0" distB="0" distL="0" distR="0" wp14:anchorId="1654D83F" wp14:editId="1B5F9DB9">
+            <wp:extent cx="4382416" cy="828675"/>
+            <wp:effectExtent l="0" t="0" r="0" b="0"/>
+            <wp:docPr id="99" name="Imagem 99"/>
+            <wp:cNvGraphicFramePr>
+              <a:graphicFrameLocks xmlns:a="http://schemas.openxmlformats.org/drawingml/2006/main" noChangeAspect="1"/>
+            </wp:cNvGraphicFramePr>
+            <a:graphic xmlns:a="http://schemas.openxmlformats.org/drawingml/2006/main">
+              <a:graphicData uri="http://schemas.openxmlformats.org/drawingml/2006/picture">
+                <pic:pic xmlns:pic="http://schemas.openxmlformats.org/drawingml/2006/picture">
+                  <pic:nvPicPr>
+                    <pic:cNvPr id="1" name=""/>
+                    <pic:cNvPicPr/>
+                  </pic:nvPicPr>
+                  <pic:blipFill>
+                    <a:blip r:embed="rId102"/>
+                    <a:stretch>
+                      <a:fillRect/>
+                    </a:stretch>
+                  </pic:blipFill>
+                  <pic:spPr>
+                    <a:xfrm>
+                      <a:off x="0" y="0"/>
+                      <a:ext cx="4436665" cy="838933"/>
+                    </a:xfrm>
+                    <a:prstGeom prst="rect">
+                      <a:avLst/>
+                    </a:prstGeom>
+                  </pic:spPr>
+                </pic:pic>
+              </a:graphicData>
+            </a:graphic>
+          </wp:inline>
+        </w:drawing>
+      </w:r>
+    </w:p>
+    <w:p>
+      <w:pPr>
+        <w:tabs>
+          <w:tab w:val="left" w:pos="1200"/>
+        </w:tabs>
+        <w:rPr>
+          <w:noProof/>
+        </w:rPr>
+      </w:pPr>
+      <w:r>
+        <w:rPr>
+          <w:noProof/>
+        </w:rPr>
+        <w:t xml:space="preserve">74- </w:t>
+      </w:r>
       <w:bookmarkStart w:id="0" w:name="_GoBack"/>
       <w:bookmarkEnd w:id="0"/>
     </w:p>
@@ -7176,6 +8218,119 @@
 <file path=word/numbering.xml><?xml version="1.0" encoding="utf-8"?>
 <w:numbering xmlns:wpc="http://schemas.microsoft.com/office/word/2010/wordprocessingCanvas" xmlns:cx="http://schemas.microsoft.com/office/drawing/2014/chartex" xmlns:cx1="http://schemas.microsoft.com/office/drawing/2015/9/8/chartex" xmlns:cx2="http://schemas.microsoft.com/office/drawing/2015/10/21/chartex" xmlns:cx3="http://schemas.microsoft.com/office/drawing/2016/5/9/chartex" xmlns:cx4="http://schemas.microsoft.com/office/drawing/2016/5/10/chartex" xmlns:cx5="http://schemas.microsoft.com/office/drawing/2016/5/11/chartex" xmlns:cx6="http://schemas.microsoft.com/office/drawing/2016/5/12/chartex" xmlns:cx7="http://schemas.microsoft.com/office/drawing/2016/5/13/chartex" xmlns:cx8="http://schemas.microsoft.com/office/drawing/2016/5/14/chartex" xmlns:mc="http://schemas.openxmlformats.org/markup-compatibility/2006" xmlns:aink="http://schemas.microsoft.com/office/drawing/2016/ink" xmlns:am3d="http://schemas.microsoft.com/office/drawing/2017/model3d" xmlns:o="urn:schemas-microsoft-com:office:office" xmlns:r="http://schemas.openxmlformats.org/officeDocument/2006/relationships" xmlns:m="http://schemas.openxmlformats.org/officeDocument/2006/math" xmlns:v="urn:schemas-microsoft-com:vml" xmlns:wp14="http://schemas.microsoft.com/office/word/2010/wordprocessingDrawing" xmlns:wp="http://schemas.openxmlformats.org/drawingml/2006/wordprocessingDrawing" xmlns:w10="urn:schemas-microsoft-com:office:word" xmlns:w="http://schemas.openxmlformats.org/wordprocessingml/2006/main" xmlns:w14="http://schemas.microsoft.com/office/word/2010/wordml" xmlns:w15="http://schemas.microsoft.com/office/word/2012/wordml" xmlns:w16cid="http://schemas.microsoft.com/office/word/2016/wordml/cid" xmlns:w16se="http://schemas.microsoft.com/office/word/2015/wordml/symex" xmlns:wpg="http://schemas.microsoft.com/office/word/2010/wordprocessingGroup" xmlns:wpi="http://schemas.microsoft.com/office/word/2010/wordprocessingInk" xmlns:wne="http://schemas.microsoft.com/office/word/2006/wordml" xmlns:wps="http://schemas.microsoft.com/office/word/2010/wordprocessingShape" mc:Ignorable="w14 w15 w16se w16cid wp14">
   <w:abstractNum w:abstractNumId="0" w15:restartNumberingAfterBreak="0">
+    <w:nsid w:val="0A052435"/>
+    <w:multiLevelType w:val="hybridMultilevel"/>
+    <w:tmpl w:val="E6608B44"/>
+    <w:lvl w:ilvl="0" w:tplc="04160001">
+      <w:start w:val="1"/>
+      <w:numFmt w:val="bullet"/>
+      <w:lvlText w:val=""/>
+      <w:lvlJc w:val="left"/>
+      <w:pPr>
+        <w:ind w:left="720" w:hanging="360"/>
+      </w:pPr>
+      <w:rPr>
+        <w:rFonts w:ascii="Symbol" w:hAnsi="Symbol" w:hint="default"/>
+      </w:rPr>
+    </w:lvl>
+    <w:lvl w:ilvl="1" w:tplc="04160003" w:tentative="1">
+      <w:start w:val="1"/>
+      <w:numFmt w:val="bullet"/>
+      <w:lvlText w:val="o"/>
+      <w:lvlJc w:val="left"/>
+      <w:pPr>
+        <w:ind w:left="1440" w:hanging="360"/>
+      </w:pPr>
+      <w:rPr>
+        <w:rFonts w:ascii="Courier New" w:hAnsi="Courier New" w:cs="Courier New" w:hint="default"/>
+      </w:rPr>
+    </w:lvl>
+    <w:lvl w:ilvl="2" w:tplc="04160005" w:tentative="1">
+      <w:start w:val="1"/>
+      <w:numFmt w:val="bullet"/>
+      <w:lvlText w:val=""/>
+      <w:lvlJc w:val="left"/>
+      <w:pPr>
+        <w:ind w:left="2160" w:hanging="360"/>
+      </w:pPr>
+      <w:rPr>
+        <w:rFonts w:ascii="Wingdings" w:hAnsi="Wingdings" w:hint="default"/>
+      </w:rPr>
+    </w:lvl>
+    <w:lvl w:ilvl="3" w:tplc="04160001" w:tentative="1">
+      <w:start w:val="1"/>
+      <w:numFmt w:val="bullet"/>
+      <w:lvlText w:val=""/>
+      <w:lvlJc w:val="left"/>
+      <w:pPr>
+        <w:ind w:left="2880" w:hanging="360"/>
+      </w:pPr>
+      <w:rPr>
+        <w:rFonts w:ascii="Symbol" w:hAnsi="Symbol" w:hint="default"/>
+      </w:rPr>
+    </w:lvl>
+    <w:lvl w:ilvl="4" w:tplc="04160003" w:tentative="1">
+      <w:start w:val="1"/>
+      <w:numFmt w:val="bullet"/>
+      <w:lvlText w:val="o"/>
+      <w:lvlJc w:val="left"/>
+      <w:pPr>
+        <w:ind w:left="3600" w:hanging="360"/>
+      </w:pPr>
+      <w:rPr>
+        <w:rFonts w:ascii="Courier New" w:hAnsi="Courier New" w:cs="Courier New" w:hint="default"/>
+      </w:rPr>
+    </w:lvl>
+    <w:lvl w:ilvl="5" w:tplc="04160005" w:tentative="1">
+      <w:start w:val="1"/>
+      <w:numFmt w:val="bullet"/>
+      <w:lvlText w:val=""/>
+      <w:lvlJc w:val="left"/>
+      <w:pPr>
+        <w:ind w:left="4320" w:hanging="360"/>
+      </w:pPr>
+      <w:rPr>
+        <w:rFonts w:ascii="Wingdings" w:hAnsi="Wingdings" w:hint="default"/>
+      </w:rPr>
+    </w:lvl>
+    <w:lvl w:ilvl="6" w:tplc="04160001" w:tentative="1">
+      <w:start w:val="1"/>
+      <w:numFmt w:val="bullet"/>
+      <w:lvlText w:val=""/>
+      <w:lvlJc w:val="left"/>
+      <w:pPr>
+        <w:ind w:left="5040" w:hanging="360"/>
+      </w:pPr>
+      <w:rPr>
+        <w:rFonts w:ascii="Symbol" w:hAnsi="Symbol" w:hint="default"/>
+      </w:rPr>
+    </w:lvl>
+    <w:lvl w:ilvl="7" w:tplc="04160003" w:tentative="1">
+      <w:start w:val="1"/>
+      <w:numFmt w:val="bullet"/>
+      <w:lvlText w:val="o"/>
+      <w:lvlJc w:val="left"/>
+      <w:pPr>
+        <w:ind w:left="5760" w:hanging="360"/>
+      </w:pPr>
+      <w:rPr>
+        <w:rFonts w:ascii="Courier New" w:hAnsi="Courier New" w:cs="Courier New" w:hint="default"/>
+      </w:rPr>
+    </w:lvl>
+    <w:lvl w:ilvl="8" w:tplc="04160005" w:tentative="1">
+      <w:start w:val="1"/>
+      <w:numFmt w:val="bullet"/>
+      <w:lvlText w:val=""/>
+      <w:lvlJc w:val="left"/>
+      <w:pPr>
+        <w:ind w:left="6480" w:hanging="360"/>
+      </w:pPr>
+      <w:rPr>
+        <w:rFonts w:ascii="Wingdings" w:hAnsi="Wingdings" w:hint="default"/>
+      </w:rPr>
+    </w:lvl>
+  </w:abstractNum>
+  <w:abstractNum w:abstractNumId="1" w15:restartNumberingAfterBreak="0">
     <w:nsid w:val="14884D19"/>
     <w:multiLevelType w:val="hybridMultilevel"/>
     <w:tmpl w:val="ED209CFA"/>
@@ -7288,7 +8443,7 @@
       </w:rPr>
     </w:lvl>
   </w:abstractNum>
-  <w:abstractNum w:abstractNumId="1" w15:restartNumberingAfterBreak="0">
+  <w:abstractNum w:abstractNumId="2" w15:restartNumberingAfterBreak="0">
     <w:nsid w:val="17204E83"/>
     <w:multiLevelType w:val="hybridMultilevel"/>
     <w:tmpl w:val="7FD8E40E"/>
@@ -7401,7 +8556,7 @@
       </w:rPr>
     </w:lvl>
   </w:abstractNum>
-  <w:abstractNum w:abstractNumId="2" w15:restartNumberingAfterBreak="0">
+  <w:abstractNum w:abstractNumId="3" w15:restartNumberingAfterBreak="0">
     <w:nsid w:val="196D22BD"/>
     <w:multiLevelType w:val="hybridMultilevel"/>
     <w:tmpl w:val="B9F20A10"/>
@@ -7490,7 +8645,7 @@
       </w:pPr>
     </w:lvl>
   </w:abstractNum>
-  <w:abstractNum w:abstractNumId="3" w15:restartNumberingAfterBreak="0">
+  <w:abstractNum w:abstractNumId="4" w15:restartNumberingAfterBreak="0">
     <w:nsid w:val="205E65D3"/>
     <w:multiLevelType w:val="hybridMultilevel"/>
     <w:tmpl w:val="DF707FAA"/>
@@ -7603,7 +8758,120 @@
       </w:rPr>
     </w:lvl>
   </w:abstractNum>
-  <w:abstractNum w:abstractNumId="4" w15:restartNumberingAfterBreak="0">
+  <w:abstractNum w:abstractNumId="5" w15:restartNumberingAfterBreak="0">
+    <w:nsid w:val="2B535899"/>
+    <w:multiLevelType w:val="hybridMultilevel"/>
+    <w:tmpl w:val="3992E50E"/>
+    <w:lvl w:ilvl="0" w:tplc="04160001">
+      <w:start w:val="1"/>
+      <w:numFmt w:val="bullet"/>
+      <w:lvlText w:val=""/>
+      <w:lvlJc w:val="left"/>
+      <w:pPr>
+        <w:ind w:left="720" w:hanging="360"/>
+      </w:pPr>
+      <w:rPr>
+        <w:rFonts w:ascii="Symbol" w:hAnsi="Symbol" w:hint="default"/>
+      </w:rPr>
+    </w:lvl>
+    <w:lvl w:ilvl="1" w:tplc="04160003" w:tentative="1">
+      <w:start w:val="1"/>
+      <w:numFmt w:val="bullet"/>
+      <w:lvlText w:val="o"/>
+      <w:lvlJc w:val="left"/>
+      <w:pPr>
+        <w:ind w:left="1440" w:hanging="360"/>
+      </w:pPr>
+      <w:rPr>
+        <w:rFonts w:ascii="Courier New" w:hAnsi="Courier New" w:cs="Courier New" w:hint="default"/>
+      </w:rPr>
+    </w:lvl>
+    <w:lvl w:ilvl="2" w:tplc="04160005" w:tentative="1">
+      <w:start w:val="1"/>
+      <w:numFmt w:val="bullet"/>
+      <w:lvlText w:val=""/>
+      <w:lvlJc w:val="left"/>
+      <w:pPr>
+        <w:ind w:left="2160" w:hanging="360"/>
+      </w:pPr>
+      <w:rPr>
+        <w:rFonts w:ascii="Wingdings" w:hAnsi="Wingdings" w:hint="default"/>
+      </w:rPr>
+    </w:lvl>
+    <w:lvl w:ilvl="3" w:tplc="04160001" w:tentative="1">
+      <w:start w:val="1"/>
+      <w:numFmt w:val="bullet"/>
+      <w:lvlText w:val=""/>
+      <w:lvlJc w:val="left"/>
+      <w:pPr>
+        <w:ind w:left="2880" w:hanging="360"/>
+      </w:pPr>
+      <w:rPr>
+        <w:rFonts w:ascii="Symbol" w:hAnsi="Symbol" w:hint="default"/>
+      </w:rPr>
+    </w:lvl>
+    <w:lvl w:ilvl="4" w:tplc="04160003" w:tentative="1">
+      <w:start w:val="1"/>
+      <w:numFmt w:val="bullet"/>
+      <w:lvlText w:val="o"/>
+      <w:lvlJc w:val="left"/>
+      <w:pPr>
+        <w:ind w:left="3600" w:hanging="360"/>
+      </w:pPr>
+      <w:rPr>
+        <w:rFonts w:ascii="Courier New" w:hAnsi="Courier New" w:cs="Courier New" w:hint="default"/>
+      </w:rPr>
+    </w:lvl>
+    <w:lvl w:ilvl="5" w:tplc="04160005" w:tentative="1">
+      <w:start w:val="1"/>
+      <w:numFmt w:val="bullet"/>
+      <w:lvlText w:val=""/>
+      <w:lvlJc w:val="left"/>
+      <w:pPr>
+        <w:ind w:left="4320" w:hanging="360"/>
+      </w:pPr>
+      <w:rPr>
+        <w:rFonts w:ascii="Wingdings" w:hAnsi="Wingdings" w:hint="default"/>
+      </w:rPr>
+    </w:lvl>
+    <w:lvl w:ilvl="6" w:tplc="04160001" w:tentative="1">
+      <w:start w:val="1"/>
+      <w:numFmt w:val="bullet"/>
+      <w:lvlText w:val=""/>
+      <w:lvlJc w:val="left"/>
+      <w:pPr>
+        <w:ind w:left="5040" w:hanging="360"/>
+      </w:pPr>
+      <w:rPr>
+        <w:rFonts w:ascii="Symbol" w:hAnsi="Symbol" w:hint="default"/>
+      </w:rPr>
+    </w:lvl>
+    <w:lvl w:ilvl="7" w:tplc="04160003" w:tentative="1">
+      <w:start w:val="1"/>
+      <w:numFmt w:val="bullet"/>
+      <w:lvlText w:val="o"/>
+      <w:lvlJc w:val="left"/>
+      <w:pPr>
+        <w:ind w:left="5760" w:hanging="360"/>
+      </w:pPr>
+      <w:rPr>
+        <w:rFonts w:ascii="Courier New" w:hAnsi="Courier New" w:cs="Courier New" w:hint="default"/>
+      </w:rPr>
+    </w:lvl>
+    <w:lvl w:ilvl="8" w:tplc="04160005" w:tentative="1">
+      <w:start w:val="1"/>
+      <w:numFmt w:val="bullet"/>
+      <w:lvlText w:val=""/>
+      <w:lvlJc w:val="left"/>
+      <w:pPr>
+        <w:ind w:left="6480" w:hanging="360"/>
+      </w:pPr>
+      <w:rPr>
+        <w:rFonts w:ascii="Wingdings" w:hAnsi="Wingdings" w:hint="default"/>
+      </w:rPr>
+    </w:lvl>
+  </w:abstractNum>
+  <w:abstractNum w:abstractNumId="6" w15:restartNumberingAfterBreak="0">
     <w:nsid w:val="2CC94BA1"/>
     <w:multiLevelType w:val="hybridMultilevel"/>
     <w:tmpl w:val="9F866F98"/>
@@ -7716,7 +8984,7 @@
       </w:rPr>
     </w:lvl>
   </w:abstractNum>
-  <w:abstractNum w:abstractNumId="5" w15:restartNumberingAfterBreak="0">
+  <w:abstractNum w:abstractNumId="7" w15:restartNumberingAfterBreak="0">
     <w:nsid w:val="31C16482"/>
     <w:multiLevelType w:val="hybridMultilevel"/>
     <w:tmpl w:val="14CE9278"/>
@@ -7805,7 +9073,7 @@
       </w:pPr>
     </w:lvl>
   </w:abstractNum>
-  <w:abstractNum w:abstractNumId="6" w15:restartNumberingAfterBreak="0">
+  <w:abstractNum w:abstractNumId="8" w15:restartNumberingAfterBreak="0">
     <w:nsid w:val="34810174"/>
     <w:multiLevelType w:val="hybridMultilevel"/>
     <w:tmpl w:val="DDA49B54"/>
@@ -7918,7 +9186,120 @@
       </w:rPr>
     </w:lvl>
   </w:abstractNum>
-  <w:abstractNum w:abstractNumId="7" w15:restartNumberingAfterBreak="0">
+  <w:abstractNum w:abstractNumId="9" w15:restartNumberingAfterBreak="0">
+    <w:nsid w:val="3FEC0334"/>
+    <w:multiLevelType w:val="hybridMultilevel"/>
+    <w:tmpl w:val="2C1484FA"/>
+    <w:lvl w:ilvl="0" w:tplc="04160001">
+      <w:start w:val="1"/>
+      <w:numFmt w:val="bullet"/>
+      <w:lvlText w:val=""/>
+      <w:lvlJc w:val="left"/>
+      <w:pPr>
+        <w:ind w:left="720" w:hanging="360"/>
+      </w:pPr>
+      <w:rPr>
+        <w:rFonts w:ascii="Symbol" w:hAnsi="Symbol" w:hint="default"/>
+      </w:rPr>
+    </w:lvl>
+    <w:lvl w:ilvl="1" w:tplc="04160003" w:tentative="1">
+      <w:start w:val="1"/>
+      <w:numFmt w:val="bullet"/>
+      <w:lvlText w:val="o"/>
+      <w:lvlJc w:val="left"/>
+      <w:pPr>
+        <w:ind w:left="1440" w:hanging="360"/>
+      </w:pPr>
+      <w:rPr>
+        <w:rFonts w:ascii="Courier New" w:hAnsi="Courier New" w:cs="Courier New" w:hint="default"/>
+      </w:rPr>
+    </w:lvl>
+    <w:lvl w:ilvl="2" w:tplc="04160005" w:tentative="1">
+      <w:start w:val="1"/>
+      <w:numFmt w:val="bullet"/>
+      <w:lvlText w:val=""/>
+      <w:lvlJc w:val="left"/>
+      <w:pPr>
+        <w:ind w:left="2160" w:hanging="360"/>
+      </w:pPr>
+      <w:rPr>
+        <w:rFonts w:ascii="Wingdings" w:hAnsi="Wingdings" w:hint="default"/>
+      </w:rPr>
+    </w:lvl>
+    <w:lvl w:ilvl="3" w:tplc="04160001" w:tentative="1">
+      <w:start w:val="1"/>
+      <w:numFmt w:val="bullet"/>
+      <w:lvlText w:val=""/>
+      <w:lvlJc w:val="left"/>
+      <w:pPr>
+        <w:ind w:left="2880" w:hanging="360"/>
+      </w:pPr>
+      <w:rPr>
+        <w:rFonts w:ascii="Symbol" w:hAnsi="Symbol" w:hint="default"/>
+      </w:rPr>
+    </w:lvl>
+    <w:lvl w:ilvl="4" w:tplc="04160003" w:tentative="1">
+      <w:start w:val="1"/>
+      <w:numFmt w:val="bullet"/>
+      <w:lvlText w:val="o"/>
+      <w:lvlJc w:val="left"/>
+      <w:pPr>
+        <w:ind w:left="3600" w:hanging="360"/>
+      </w:pPr>
+      <w:rPr>
+        <w:rFonts w:ascii="Courier New" w:hAnsi="Courier New" w:cs="Courier New" w:hint="default"/>
+      </w:rPr>
+    </w:lvl>
+    <w:lvl w:ilvl="5" w:tplc="04160005" w:tentative="1">
+      <w:start w:val="1"/>
+      <w:numFmt w:val="bullet"/>
+      <w:lvlText w:val=""/>
+      <w:lvlJc w:val="left"/>
+      <w:pPr>
+        <w:ind w:left="4320" w:hanging="360"/>
+      </w:pPr>
+      <w:rPr>
+        <w:rFonts w:ascii="Wingdings" w:hAnsi="Wingdings" w:hint="default"/>
+      </w:rPr>
+    </w:lvl>
+    <w:lvl w:ilvl="6" w:tplc="04160001" w:tentative="1">
+      <w:start w:val="1"/>
+      <w:numFmt w:val="bullet"/>
+      <w:lvlText w:val=""/>
+      <w:lvlJc w:val="left"/>
+      <w:pPr>
+        <w:ind w:left="5040" w:hanging="360"/>
+      </w:pPr>
+      <w:rPr>
+        <w:rFonts w:ascii="Symbol" w:hAnsi="Symbol" w:hint="default"/>
+      </w:rPr>
+    </w:lvl>
+    <w:lvl w:ilvl="7" w:tplc="04160003" w:tentative="1">
+      <w:start w:val="1"/>
+      <w:numFmt w:val="bullet"/>
+      <w:lvlText w:val="o"/>
+      <w:lvlJc w:val="left"/>
+      <w:pPr>
+        <w:ind w:left="5760" w:hanging="360"/>
+      </w:pPr>
+      <w:rPr>
+        <w:rFonts w:ascii="Courier New" w:hAnsi="Courier New" w:cs="Courier New" w:hint="default"/>
+      </w:rPr>
+    </w:lvl>
+    <w:lvl w:ilvl="8" w:tplc="04160005" w:tentative="1">
+      <w:start w:val="1"/>
+      <w:numFmt w:val="bullet"/>
+      <w:lvlText w:val=""/>
+      <w:lvlJc w:val="left"/>
+      <w:pPr>
+        <w:ind w:left="6480" w:hanging="360"/>
+      </w:pPr>
+      <w:rPr>
+        <w:rFonts w:ascii="Wingdings" w:hAnsi="Wingdings" w:hint="default"/>
+      </w:rPr>
+    </w:lvl>
+  </w:abstractNum>
+  <w:abstractNum w:abstractNumId="10" w15:restartNumberingAfterBreak="0">
     <w:nsid w:val="46F20102"/>
     <w:multiLevelType w:val="hybridMultilevel"/>
     <w:tmpl w:val="ACA029E8"/>
@@ -8031,7 +9412,7 @@
       </w:rPr>
     </w:lvl>
   </w:abstractNum>
-  <w:abstractNum w:abstractNumId="8" w15:restartNumberingAfterBreak="0">
+  <w:abstractNum w:abstractNumId="11" w15:restartNumberingAfterBreak="0">
     <w:nsid w:val="487B6676"/>
     <w:multiLevelType w:val="hybridMultilevel"/>
     <w:tmpl w:val="26BEC63E"/>
@@ -8144,7 +9525,7 @@
       </w:rPr>
     </w:lvl>
   </w:abstractNum>
-  <w:abstractNum w:abstractNumId="9" w15:restartNumberingAfterBreak="0">
+  <w:abstractNum w:abstractNumId="12" w15:restartNumberingAfterBreak="0">
     <w:nsid w:val="4ACE0979"/>
     <w:multiLevelType w:val="hybridMultilevel"/>
     <w:tmpl w:val="18364C28"/>
@@ -8257,7 +9638,7 @@
       </w:rPr>
     </w:lvl>
   </w:abstractNum>
-  <w:abstractNum w:abstractNumId="10" w15:restartNumberingAfterBreak="0">
+  <w:abstractNum w:abstractNumId="13" w15:restartNumberingAfterBreak="0">
     <w:nsid w:val="4EAE1D47"/>
     <w:multiLevelType w:val="hybridMultilevel"/>
     <w:tmpl w:val="A2901A7E"/>
@@ -8370,7 +9751,7 @@
       </w:rPr>
     </w:lvl>
   </w:abstractNum>
-  <w:abstractNum w:abstractNumId="11" w15:restartNumberingAfterBreak="0">
+  <w:abstractNum w:abstractNumId="14" w15:restartNumberingAfterBreak="0">
     <w:nsid w:val="5DC804A5"/>
     <w:multiLevelType w:val="hybridMultilevel"/>
     <w:tmpl w:val="22187F68"/>
@@ -8459,7 +9840,7 @@
       </w:pPr>
     </w:lvl>
   </w:abstractNum>
-  <w:abstractNum w:abstractNumId="12" w15:restartNumberingAfterBreak="0">
+  <w:abstractNum w:abstractNumId="15" w15:restartNumberingAfterBreak="0">
     <w:nsid w:val="62CC0746"/>
     <w:multiLevelType w:val="hybridMultilevel"/>
     <w:tmpl w:val="0B4E1364"/>
@@ -8549,42 +9930,51 @@
     </w:lvl>
   </w:abstractNum>
   <w:num w:numId="1">
+    <w:abstractNumId w:val="7"/>
+  </w:num>
+  <w:num w:numId="2">
+    <w:abstractNumId w:val="4"/>
+  </w:num>
+  <w:num w:numId="3">
+    <w:abstractNumId w:val="14"/>
+  </w:num>
+  <w:num w:numId="4">
+    <w:abstractNumId w:val="15"/>
+  </w:num>
+  <w:num w:numId="5">
+    <w:abstractNumId w:val="3"/>
+  </w:num>
+  <w:num w:numId="6">
+    <w:abstractNumId w:val="2"/>
+  </w:num>
+  <w:num w:numId="7">
+    <w:abstractNumId w:val="13"/>
+  </w:num>
+  <w:num w:numId="8">
+    <w:abstractNumId w:val="12"/>
+  </w:num>
+  <w:num w:numId="9">
+    <w:abstractNumId w:val="6"/>
+  </w:num>
+  <w:num w:numId="10">
+    <w:abstractNumId w:val="10"/>
+  </w:num>
+  <w:num w:numId="11">
+    <w:abstractNumId w:val="11"/>
+  </w:num>
+  <w:num w:numId="12">
+    <w:abstractNumId w:val="8"/>
+  </w:num>
+  <w:num w:numId="13">
+    <w:abstractNumId w:val="1"/>
+  </w:num>
+  <w:num w:numId="14">
+    <w:abstractNumId w:val="9"/>
+  </w:num>
+  <w:num w:numId="15">
     <w:abstractNumId w:val="5"/>
   </w:num>
-  <w:num w:numId="2">
-    <w:abstractNumId w:val="3"/>
-  </w:num>
-  <w:num w:numId="3">
-    <w:abstractNumId w:val="11"/>
-  </w:num>
-  <w:num w:numId="4">
-    <w:abstractNumId w:val="12"/>
-  </w:num>
-  <w:num w:numId="5">
-    <w:abstractNumId w:val="2"/>
-  </w:num>
-  <w:num w:numId="6">
-    <w:abstractNumId w:val="1"/>
-  </w:num>
-  <w:num w:numId="7">
-    <w:abstractNumId w:val="10"/>
-  </w:num>
-  <w:num w:numId="8">
-    <w:abstractNumId w:val="9"/>
-  </w:num>
-  <w:num w:numId="9">
-    <w:abstractNumId w:val="4"/>
-  </w:num>
-  <w:num w:numId="10">
-    <w:abstractNumId w:val="7"/>
-  </w:num>
-  <w:num w:numId="11">
-    <w:abstractNumId w:val="8"/>
-  </w:num>
-  <w:num w:numId="12">
-    <w:abstractNumId w:val="6"/>
-  </w:num>
-  <w:num w:numId="13">
+  <w:num w:numId="16">
     <w:abstractNumId w:val="0"/>
   </w:num>
 </w:numbering>
@@ -9386,7 +10776,7 @@
 </file>
 
 <file path=customXml/itemProps1.xml><?xml version="1.0" encoding="utf-8"?>
-<ds:datastoreItem xmlns:ds="http://schemas.openxmlformats.org/officeDocument/2006/customXml" ds:itemID="{4FFAD646-EAE6-4C1D-BA3D-4B38D6A4F673}">
+<ds:datastoreItem xmlns:ds="http://schemas.openxmlformats.org/officeDocument/2006/customXml" ds:itemID="{D088B437-D646-423F-B19A-58619283B745}">
   <ds:schemaRefs>
     <ds:schemaRef ds:uri="http://schemas.openxmlformats.org/officeDocument/2006/bibliography"/>
   </ds:schemaRefs>

</xml_diff>